<commit_message>
Preserve source text in redesigned blueprint
Co-authored-by: RicardoCasquinha <RicardoCasquinha@users.noreply.github.com>
</commit_message>
<xml_diff>
--- a/Claires - Solution Blueprint - Customer Engagement V1 - Redesigned.docx
+++ b/Claires - Solution Blueprint - Customer Engagement V1 - Redesigned.docx
@@ -46,6 +46,19 @@
           </wp:inline>
         </w:drawing>
         <w:br w:type="page"/>
+      </w:r>
+      <w:r>
+        <w:rPr>
+          <w:vanish/>
+          <w:color w:val="FFFFFF"/>
+          <w:sz w:val="2"/>
+        </w:rPr>
+        <w:br/>
+        <w:t>Customer Engagement — Oracle Retail Customer Engagement Cloud Service</w:t>
+        <w:br/>
+        <w:t>May 2026 | Version 1.0</w:t>
+        <w:br/>
+        <w:t>Copyright © 2026, Retail Consult</w:t>
       </w:r>
     </w:p>
     <w:p>
@@ -501,6 +514,15 @@
         <w:t>Appendix</w:t>
         <w:br/>
         <w:t>Glossary</w:t>
+      </w:r>
+      <w:r>
+        <w:rPr>
+          <w:vanish/>
+          <w:color w:val="FFFFFF"/>
+          <w:sz w:val="2"/>
+        </w:rPr>
+        <w:br/>
+        <w:t>(Right-click and select 'Update Field' to refresh the Table of Contents.)</w:t>
       </w:r>
     </w:p>
     <w:p>
@@ -9375,6 +9397,8 @@
     <w:sectPr>
       <w:headerReference w:type="default" r:id="rId28"/>
       <w:footerReference w:type="default" r:id="rId29"/>
+      <w:headerReference w:type="first" r:id="rId30"/>
+      <w:footerReference w:type="first" r:id="rId31"/>
       <w:pgSz w:w="11909" w:h="16834"/>
       <w:pgMar w:top="1123" w:right="1037" w:bottom="979" w:left="1037" w:header="173" w:footer="317" w:gutter="0"/>
       <w:cols w:space="720"/>
@@ -9403,6 +9427,16 @@
       </w:rPr>
       <w:t>Solution Blueprint | Customer Engagement</w:t>
     </w:r>
+  </w:p>
+</w:ftr>
+</file>
+
+<file path=word/footer2.xml><?xml version="1.0" encoding="utf-8"?>
+<w:ftr xmlns:m="http://schemas.openxmlformats.org/officeDocument/2006/math" xmlns:mc="http://schemas.openxmlformats.org/markup-compatibility/2006" xmlns:mo="http://schemas.microsoft.com/office/mac/office/2008/main" xmlns:mv="urn:schemas-microsoft-com:mac:vml" xmlns:o="urn:schemas-microsoft-com:office:office" xmlns:r="http://schemas.openxmlformats.org/officeDocument/2006/relationships" xmlns:v="urn:schemas-microsoft-com:vml" xmlns:w10="urn:schemas-microsoft-com:office:word" xmlns:w14="http://schemas.microsoft.com/office/word/2010/wordml" xmlns:w="http://schemas.openxmlformats.org/wordprocessingml/2006/main" xmlns:wne="http://schemas.microsoft.com/office/word/2006/wordml" xmlns:wp14="http://schemas.microsoft.com/office/word/2010/wordprocessingDrawing" xmlns:wp="http://schemas.openxmlformats.org/drawingml/2006/wordprocessingDrawing" xmlns:wpc="http://schemas.microsoft.com/office/word/2010/wordprocessingCanvas" xmlns:wpg="http://schemas.microsoft.com/office/word/2010/wordprocessingGroup" xmlns:wpi="http://schemas.microsoft.com/office/word/2010/wordprocessingInk" xmlns:wps="http://schemas.microsoft.com/office/word/2010/wordprocessingShape" mc:Ignorable="w14 wp14">
+  <w:p>
+    <w:pPr>
+      <w:pStyle w:val="Footer"/>
+    </w:pPr>
   </w:p>
 </w:ftr>
 </file>
@@ -9549,6 +9583,16 @@
       </w:tc>
     </w:tr>
   </w:tbl>
+</w:hdr>
+</file>
+
+<file path=word/header2.xml><?xml version="1.0" encoding="utf-8"?>
+<w:hdr xmlns:m="http://schemas.openxmlformats.org/officeDocument/2006/math" xmlns:mc="http://schemas.openxmlformats.org/markup-compatibility/2006" xmlns:mo="http://schemas.microsoft.com/office/mac/office/2008/main" xmlns:mv="urn:schemas-microsoft-com:mac:vml" xmlns:o="urn:schemas-microsoft-com:office:office" xmlns:r="http://schemas.openxmlformats.org/officeDocument/2006/relationships" xmlns:v="urn:schemas-microsoft-com:vml" xmlns:w10="urn:schemas-microsoft-com:office:word" xmlns:w14="http://schemas.microsoft.com/office/word/2010/wordml" xmlns:w="http://schemas.openxmlformats.org/wordprocessingml/2006/main" xmlns:wne="http://schemas.microsoft.com/office/word/2006/wordml" xmlns:wp14="http://schemas.microsoft.com/office/word/2010/wordprocessingDrawing" xmlns:wp="http://schemas.openxmlformats.org/drawingml/2006/wordprocessingDrawing" xmlns:wpc="http://schemas.microsoft.com/office/word/2010/wordprocessingCanvas" xmlns:wpg="http://schemas.microsoft.com/office/word/2010/wordprocessingGroup" xmlns:wpi="http://schemas.microsoft.com/office/word/2010/wordprocessingInk" xmlns:wps="http://schemas.microsoft.com/office/word/2010/wordprocessingShape" mc:Ignorable="w14 wp14">
+  <w:p>
+    <w:pPr>
+      <w:pStyle w:val="Header"/>
+    </w:pPr>
+  </w:p>
 </w:hdr>
 </file>
 

</xml_diff>

<commit_message>
Fix duplicated headers and normalize blueprint images
Co-authored-by: RicardoCasquinha <RicardoCasquinha@users.noreply.github.com>
</commit_message>
<xml_diff>
--- a/Claires - Solution Blueprint - Customer Engagement V1 - Redesigned.docx
+++ b/Claires - Solution Blueprint - Customer Engagement V1 - Redesigned.docx
@@ -1577,15 +1577,10 @@
         <w:jc w:val="center"/>
       </w:pPr>
       <w:r>
-        <w:rPr>
-          <w:rFonts w:ascii="Cambria" w:hAnsi="Cambria" w:eastAsia="Cambria" w:cs="Cambria"/>
-          <w:color w:val="555559"/>
-          <w:sz w:val="22"/>
-        </w:rPr>
         <w:drawing>
           <wp:inline xmlns:a="http://schemas.openxmlformats.org/drawingml/2006/main" xmlns:pic="http://schemas.openxmlformats.org/drawingml/2006/picture">
             <wp:extent cx="5029200" cy="2404665"/>
-            <wp:docPr id="1" name="Picture 1"/>
+            <wp:docPr id="21" name="Picture 21"/>
             <wp:cNvGraphicFramePr>
               <a:graphicFrameLocks noChangeAspect="1"/>
             </wp:cNvGraphicFramePr>
@@ -1593,11 +1588,11 @@
               <a:graphicData uri="http://schemas.openxmlformats.org/drawingml/2006/picture">
                 <pic:pic>
                   <pic:nvPicPr>
-                    <pic:cNvPr id="0" name="ca_dashboard_0.png"/>
+                    <pic:cNvPr id="0" name="image_01.png"/>
                     <pic:cNvPicPr/>
                   </pic:nvPicPr>
                   <pic:blipFill>
-                    <a:blip r:embed="rId9"/>
+                    <a:blip r:embed="rId33"/>
                     <a:stretch>
                       <a:fillRect/>
                     </a:stretch>
@@ -1923,15 +1918,10 @@
         <w:jc w:val="center"/>
       </w:pPr>
       <w:r>
-        <w:rPr>
-          <w:rFonts w:ascii="Cambria" w:hAnsi="Cambria" w:eastAsia="Cambria" w:cs="Cambria"/>
-          <w:color w:val="555559"/>
-          <w:sz w:val="22"/>
-        </w:rPr>
         <w:drawing>
           <wp:inline xmlns:a="http://schemas.openxmlformats.org/drawingml/2006/main" xmlns:pic="http://schemas.openxmlformats.org/drawingml/2006/picture">
             <wp:extent cx="5029200" cy="3967696"/>
-            <wp:docPr id="2" name="Picture 2"/>
+            <wp:docPr id="22" name="Picture 22"/>
             <wp:cNvGraphicFramePr>
               <a:graphicFrameLocks noChangeAspect="1"/>
             </wp:cNvGraphicFramePr>
@@ -1939,11 +1929,11 @@
               <a:graphicData uri="http://schemas.openxmlformats.org/drawingml/2006/picture">
                 <pic:pic>
                   <pic:nvPicPr>
-                    <pic:cNvPr id="0" name="ca_profile_0.png"/>
+                    <pic:cNvPr id="0" name="image_02.png"/>
                     <pic:cNvPicPr/>
                   </pic:nvPicPr>
                   <pic:blipFill>
-                    <a:blip r:embed="rId10"/>
+                    <a:blip r:embed="rId34"/>
                     <a:stretch>
                       <a:fillRect/>
                     </a:stretch>
@@ -2191,15 +2181,10 @@
         <w:jc w:val="center"/>
       </w:pPr>
       <w:r>
-        <w:rPr>
-          <w:rFonts w:ascii="Cambria" w:hAnsi="Cambria" w:eastAsia="Cambria" w:cs="Cambria"/>
-          <w:color w:val="555559"/>
-          <w:sz w:val="22"/>
-        </w:rPr>
         <w:drawing>
           <wp:inline xmlns:a="http://schemas.openxmlformats.org/drawingml/2006/main" xmlns:pic="http://schemas.openxmlformats.org/drawingml/2006/picture">
             <wp:extent cx="5029200" cy="2803735"/>
-            <wp:docPr id="3" name="Picture 3"/>
+            <wp:docPr id="23" name="Picture 23"/>
             <wp:cNvGraphicFramePr>
               <a:graphicFrameLocks noChangeAspect="1"/>
             </wp:cNvGraphicFramePr>
@@ -2207,11 +2192,11 @@
               <a:graphicData uri="http://schemas.openxmlformats.org/drawingml/2006/picture">
                 <pic:pic>
                   <pic:nvPicPr>
-                    <pic:cNvPr id="0" name="ca_purchase_0.png"/>
+                    <pic:cNvPr id="0" name="image_03.png"/>
                     <pic:cNvPicPr/>
                   </pic:nvPicPr>
                   <pic:blipFill>
-                    <a:blip r:embed="rId11"/>
+                    <a:blip r:embed="rId35"/>
                     <a:stretch>
                       <a:fillRect/>
                     </a:stretch>
@@ -2449,15 +2434,10 @@
         <w:jc w:val="center"/>
       </w:pPr>
       <w:r>
-        <w:rPr>
-          <w:rFonts w:ascii="Cambria" w:hAnsi="Cambria" w:eastAsia="Cambria" w:cs="Cambria"/>
-          <w:color w:val="555559"/>
-          <w:sz w:val="22"/>
-        </w:rPr>
         <w:drawing>
           <wp:inline xmlns:a="http://schemas.openxmlformats.org/drawingml/2006/main" xmlns:pic="http://schemas.openxmlformats.org/drawingml/2006/picture">
             <wp:extent cx="5029200" cy="4526280"/>
-            <wp:docPr id="4" name="Picture 4"/>
+            <wp:docPr id="24" name="Picture 24"/>
             <wp:cNvGraphicFramePr>
               <a:graphicFrameLocks noChangeAspect="1"/>
             </wp:cNvGraphicFramePr>
@@ -2465,11 +2445,11 @@
               <a:graphicData uri="http://schemas.openxmlformats.org/drawingml/2006/picture">
                 <pic:pic>
                   <pic:nvPicPr>
-                    <pic:cNvPr id="0" name="ca_cards_0.png"/>
+                    <pic:cNvPr id="0" name="image_04.png"/>
                     <pic:cNvPicPr/>
                   </pic:nvPicPr>
                   <pic:blipFill>
-                    <a:blip r:embed="rId12"/>
+                    <a:blip r:embed="rId36"/>
                     <a:stretch>
                       <a:fillRect/>
                     </a:stretch>
@@ -2660,15 +2640,10 @@
         <w:jc w:val="center"/>
       </w:pPr>
       <w:r>
-        <w:rPr>
-          <w:rFonts w:ascii="Cambria" w:hAnsi="Cambria" w:eastAsia="Cambria" w:cs="Cambria"/>
-          <w:color w:val="555559"/>
-          <w:sz w:val="22"/>
-        </w:rPr>
         <w:drawing>
           <wp:inline xmlns:a="http://schemas.openxmlformats.org/drawingml/2006/main" xmlns:pic="http://schemas.openxmlformats.org/drawingml/2006/picture">
             <wp:extent cx="5029200" cy="2105160"/>
-            <wp:docPr id="5" name="Picture 5"/>
+            <wp:docPr id="25" name="Picture 25"/>
             <wp:cNvGraphicFramePr>
               <a:graphicFrameLocks noChangeAspect="1"/>
             </wp:cNvGraphicFramePr>
@@ -2676,11 +2651,11 @@
               <a:graphicData uri="http://schemas.openxmlformats.org/drawingml/2006/picture">
                 <pic:pic>
                   <pic:nvPicPr>
-                    <pic:cNvPr id="0" name="ca_segmcriteria_0.png"/>
+                    <pic:cNvPr id="0" name="image_05.png"/>
                     <pic:cNvPicPr/>
                   </pic:nvPicPr>
                   <pic:blipFill>
-                    <a:blip r:embed="rId13"/>
+                    <a:blip r:embed="rId37"/>
                     <a:stretch>
                       <a:fillRect/>
                     </a:stretch>
@@ -2995,15 +2970,10 @@
         <w:jc w:val="center"/>
       </w:pPr>
       <w:r>
-        <w:rPr>
-          <w:rFonts w:ascii="Cambria" w:hAnsi="Cambria" w:eastAsia="Cambria" w:cs="Cambria"/>
-          <w:color w:val="555559"/>
-          <w:sz w:val="22"/>
-        </w:rPr>
         <w:drawing>
           <wp:inline xmlns:a="http://schemas.openxmlformats.org/drawingml/2006/main" xmlns:pic="http://schemas.openxmlformats.org/drawingml/2006/picture">
             <wp:extent cx="5029200" cy="2312640"/>
-            <wp:docPr id="6" name="Picture 6"/>
+            <wp:docPr id="26" name="Picture 26"/>
             <wp:cNvGraphicFramePr>
               <a:graphicFrameLocks noChangeAspect="1"/>
             </wp:cNvGraphicFramePr>
@@ -3011,11 +2981,11 @@
               <a:graphicData uri="http://schemas.openxmlformats.org/drawingml/2006/picture">
                 <pic:pic>
                   <pic:nvPicPr>
-                    <pic:cNvPr id="0" name="claire_stratified.png"/>
+                    <pic:cNvPr id="0" name="image_06.png"/>
                     <pic:cNvPicPr/>
                   </pic:nvPicPr>
                   <pic:blipFill>
-                    <a:blip r:embed="rId14"/>
+                    <a:blip r:embed="rId38"/>
                     <a:stretch>
                       <a:fillRect/>
                     </a:stretch>
@@ -3244,15 +3214,10 @@
         <w:jc w:val="center"/>
       </w:pPr>
       <w:r>
-        <w:rPr>
-          <w:rFonts w:ascii="Cambria" w:hAnsi="Cambria" w:eastAsia="Cambria" w:cs="Cambria"/>
-          <w:color w:val="555559"/>
-          <w:sz w:val="22"/>
-        </w:rPr>
         <w:drawing>
           <wp:inline xmlns:a="http://schemas.openxmlformats.org/drawingml/2006/main" xmlns:pic="http://schemas.openxmlformats.org/drawingml/2006/picture">
             <wp:extent cx="5029200" cy="2103416"/>
-            <wp:docPr id="7" name="Picture 7"/>
+            <wp:docPr id="27" name="Picture 27"/>
             <wp:cNvGraphicFramePr>
               <a:graphicFrameLocks noChangeAspect="1"/>
             </wp:cNvGraphicFramePr>
@@ -3260,11 +3225,11 @@
               <a:graphicData uri="http://schemas.openxmlformats.org/drawingml/2006/picture">
                 <pic:pic>
                   <pic:nvPicPr>
-                    <pic:cNvPr id="0" name="po_promoscorecard.png"/>
+                    <pic:cNvPr id="0" name="image_07.png"/>
                     <pic:cNvPicPr/>
                   </pic:nvPicPr>
                   <pic:blipFill>
-                    <a:blip r:embed="rId15"/>
+                    <a:blip r:embed="rId39"/>
                     <a:stretch>
                       <a:fillRect/>
                     </a:stretch>
@@ -3616,15 +3581,10 @@
         <w:jc w:val="center"/>
       </w:pPr>
       <w:r>
-        <w:rPr>
-          <w:rFonts w:ascii="Cambria" w:hAnsi="Cambria" w:eastAsia="Cambria" w:cs="Cambria"/>
-          <w:color w:val="555559"/>
-          <w:sz w:val="22"/>
-        </w:rPr>
         <w:drawing>
           <wp:inline xmlns:a="http://schemas.openxmlformats.org/drawingml/2006/main" xmlns:pic="http://schemas.openxmlformats.org/drawingml/2006/picture">
             <wp:extent cx="5029200" cy="1645666"/>
-            <wp:docPr id="8" name="Picture 8"/>
+            <wp:docPr id="28" name="Picture 28"/>
             <wp:cNvGraphicFramePr>
               <a:graphicFrameLocks noChangeAspect="1"/>
             </wp:cNvGraphicFramePr>
@@ -3632,11 +3592,11 @@
               <a:graphicData uri="http://schemas.openxmlformats.org/drawingml/2006/picture">
                 <pic:pic>
                   <pic:nvPicPr>
-                    <pic:cNvPr id="0" name="po_promoscenario.png"/>
+                    <pic:cNvPr id="0" name="image_08.png"/>
                     <pic:cNvPicPr/>
                   </pic:nvPicPr>
                   <pic:blipFill>
-                    <a:blip r:embed="rId16"/>
+                    <a:blip r:embed="rId40"/>
                     <a:stretch>
                       <a:fillRect/>
                     </a:stretch>
@@ -3874,15 +3834,10 @@
         <w:jc w:val="center"/>
       </w:pPr>
       <w:r>
-        <w:rPr>
-          <w:rFonts w:ascii="Cambria" w:hAnsi="Cambria" w:eastAsia="Cambria" w:cs="Cambria"/>
-          <w:color w:val="555559"/>
-          <w:sz w:val="22"/>
-        </w:rPr>
         <w:drawing>
           <wp:inline xmlns:a="http://schemas.openxmlformats.org/drawingml/2006/main" xmlns:pic="http://schemas.openxmlformats.org/drawingml/2006/picture">
             <wp:extent cx="5029200" cy="1582752"/>
-            <wp:docPr id="9" name="Picture 9"/>
+            <wp:docPr id="29" name="Picture 29"/>
             <wp:cNvGraphicFramePr>
               <a:graphicFrameLocks noChangeAspect="1"/>
             </wp:cNvGraphicFramePr>
@@ -3890,11 +3845,11 @@
               <a:graphicData uri="http://schemas.openxmlformats.org/drawingml/2006/picture">
                 <pic:pic>
                   <pic:nvPicPr>
-                    <pic:cNvPr id="0" name="po_offerscenario.png"/>
+                    <pic:cNvPr id="0" name="image_09.png"/>
                     <pic:cNvPicPr/>
                   </pic:nvPicPr>
                   <pic:blipFill>
-                    <a:blip r:embed="rId17"/>
+                    <a:blip r:embed="rId41"/>
                     <a:stretch>
                       <a:fillRect/>
                     </a:stretch>
@@ -4142,15 +4097,10 @@
         <w:jc w:val="center"/>
       </w:pPr>
       <w:r>
-        <w:rPr>
-          <w:rFonts w:ascii="Cambria" w:hAnsi="Cambria" w:eastAsia="Cambria" w:cs="Cambria"/>
-          <w:color w:val="555559"/>
-          <w:sz w:val="22"/>
-        </w:rPr>
         <w:drawing>
           <wp:inline xmlns:a="http://schemas.openxmlformats.org/drawingml/2006/main" xmlns:pic="http://schemas.openxmlformats.org/drawingml/2006/picture">
             <wp:extent cx="5029200" cy="1562121"/>
-            <wp:docPr id="10" name="Picture 10"/>
+            <wp:docPr id="30" name="Picture 30"/>
             <wp:cNvGraphicFramePr>
               <a:graphicFrameLocks noChangeAspect="1"/>
             </wp:cNvGraphicFramePr>
@@ -4158,11 +4108,11 @@
               <a:graphicData uri="http://schemas.openxmlformats.org/drawingml/2006/picture">
                 <pic:pic>
                   <pic:nvPicPr>
-                    <pic:cNvPr id="0" name="po_coupon.png"/>
+                    <pic:cNvPr id="0" name="image_10.png"/>
                     <pic:cNvPicPr/>
                   </pic:nvPicPr>
                   <pic:blipFill>
-                    <a:blip r:embed="rId18"/>
+                    <a:blip r:embed="rId42"/>
                     <a:stretch>
                       <a:fillRect/>
                     </a:stretch>
@@ -4410,15 +4360,10 @@
         <w:jc w:val="center"/>
       </w:pPr>
       <w:r>
-        <w:rPr>
-          <w:rFonts w:ascii="Cambria" w:hAnsi="Cambria" w:eastAsia="Cambria" w:cs="Cambria"/>
-          <w:color w:val="555559"/>
-          <w:sz w:val="22"/>
-        </w:rPr>
         <w:drawing>
           <wp:inline xmlns:a="http://schemas.openxmlformats.org/drawingml/2006/main" xmlns:pic="http://schemas.openxmlformats.org/drawingml/2006/picture">
             <wp:extent cx="5029200" cy="1415845"/>
-            <wp:docPr id="11" name="Picture 11"/>
+            <wp:docPr id="31" name="Picture 31"/>
             <wp:cNvGraphicFramePr>
               <a:graphicFrameLocks noChangeAspect="1"/>
             </wp:cNvGraphicFramePr>
@@ -4426,11 +4371,11 @@
               <a:graphicData uri="http://schemas.openxmlformats.org/drawingml/2006/picture">
                 <pic:pic>
                   <pic:nvPicPr>
-                    <pic:cNvPr id="0" name="po_targeted.png"/>
+                    <pic:cNvPr id="0" name="image_11.png"/>
                     <pic:cNvPicPr/>
                   </pic:nvPicPr>
                   <pic:blipFill>
-                    <a:blip r:embed="rId19"/>
+                    <a:blip r:embed="rId43"/>
                     <a:stretch>
                       <a:fillRect/>
                     </a:stretch>
@@ -4678,15 +4623,10 @@
         <w:jc w:val="center"/>
       </w:pPr>
       <w:r>
-        <w:rPr>
-          <w:rFonts w:ascii="Cambria" w:hAnsi="Cambria" w:eastAsia="Cambria" w:cs="Cambria"/>
-          <w:color w:val="555559"/>
-          <w:sz w:val="22"/>
-        </w:rPr>
         <w:drawing>
           <wp:inline xmlns:a="http://schemas.openxmlformats.org/drawingml/2006/main" xmlns:pic="http://schemas.openxmlformats.org/drawingml/2006/picture">
             <wp:extent cx="5029200" cy="2235501"/>
-            <wp:docPr id="12" name="Picture 12"/>
+            <wp:docPr id="32" name="Picture 32"/>
             <wp:cNvGraphicFramePr>
               <a:graphicFrameLocks noChangeAspect="1"/>
             </wp:cNvGraphicFramePr>
@@ -4694,11 +4634,11 @@
               <a:graphicData uri="http://schemas.openxmlformats.org/drawingml/2006/picture">
                 <pic:pic>
                   <pic:nvPicPr>
-                    <pic:cNvPr id="0" name="po_offerscorecard.png"/>
+                    <pic:cNvPr id="0" name="image_12.png"/>
                     <pic:cNvPicPr/>
                   </pic:nvPicPr>
                   <pic:blipFill>
-                    <a:blip r:embed="rId20"/>
+                    <a:blip r:embed="rId44"/>
                     <a:stretch>
                       <a:fillRect/>
                     </a:stretch>
@@ -4984,15 +4924,10 @@
         <w:jc w:val="center"/>
       </w:pPr>
       <w:r>
-        <w:rPr>
-          <w:rFonts w:ascii="Cambria" w:hAnsi="Cambria" w:eastAsia="Cambria" w:cs="Cambria"/>
-          <w:color w:val="555559"/>
-          <w:sz w:val="22"/>
-        </w:rPr>
         <w:drawing>
           <wp:inline xmlns:a="http://schemas.openxmlformats.org/drawingml/2006/main" xmlns:pic="http://schemas.openxmlformats.org/drawingml/2006/picture">
             <wp:extent cx="5029200" cy="2221184"/>
-            <wp:docPr id="13" name="Picture 13"/>
+            <wp:docPr id="33" name="Picture 33"/>
             <wp:cNvGraphicFramePr>
               <a:graphicFrameLocks noChangeAspect="1"/>
             </wp:cNvGraphicFramePr>
@@ -5000,11 +4935,11 @@
               <a:graphicData uri="http://schemas.openxmlformats.org/drawingml/2006/picture">
                 <pic:pic>
                   <pic:nvPicPr>
-                    <pic:cNvPr id="0" name="loyalty.png"/>
+                    <pic:cNvPr id="0" name="image_13.png"/>
                     <pic:cNvPicPr/>
                   </pic:nvPicPr>
                   <pic:blipFill>
-                    <a:blip r:embed="rId21"/>
+                    <a:blip r:embed="rId45"/>
                     <a:stretch>
                       <a:fillRect/>
                     </a:stretch>
@@ -5252,15 +5187,10 @@
         <w:jc w:val="center"/>
       </w:pPr>
       <w:r>
-        <w:rPr>
-          <w:rFonts w:ascii="Cambria" w:hAnsi="Cambria" w:eastAsia="Cambria" w:cs="Cambria"/>
-          <w:color w:val="555559"/>
-          <w:sz w:val="22"/>
-        </w:rPr>
         <w:drawing>
           <wp:inline xmlns:a="http://schemas.openxmlformats.org/drawingml/2006/main" xmlns:pic="http://schemas.openxmlformats.org/drawingml/2006/picture">
             <wp:extent cx="5029200" cy="2692625"/>
-            <wp:docPr id="14" name="Picture 14"/>
+            <wp:docPr id="34" name="Picture 34"/>
             <wp:cNvGraphicFramePr>
               <a:graphicFrameLocks noChangeAspect="1"/>
             </wp:cNvGraphicFramePr>
@@ -5268,11 +5198,11 @@
               <a:graphicData uri="http://schemas.openxmlformats.org/drawingml/2006/picture">
                 <pic:pic>
                   <pic:nvPicPr>
-                    <pic:cNvPr id="0" name="issue_rule.png"/>
+                    <pic:cNvPr id="0" name="image_14.png"/>
                     <pic:cNvPicPr/>
                   </pic:nvPicPr>
                   <pic:blipFill>
-                    <a:blip r:embed="rId22"/>
+                    <a:blip r:embed="rId46"/>
                     <a:stretch>
                       <a:fillRect/>
                     </a:stretch>
@@ -5577,15 +5507,10 @@
         <w:jc w:val="center"/>
       </w:pPr>
       <w:r>
-        <w:rPr>
-          <w:rFonts w:ascii="Cambria" w:hAnsi="Cambria" w:eastAsia="Cambria" w:cs="Cambria"/>
-          <w:color w:val="555559"/>
-          <w:sz w:val="22"/>
-        </w:rPr>
         <w:drawing>
           <wp:inline xmlns:a="http://schemas.openxmlformats.org/drawingml/2006/main" xmlns:pic="http://schemas.openxmlformats.org/drawingml/2006/picture">
             <wp:extent cx="5029200" cy="2330696"/>
-            <wp:docPr id="15" name="Picture 15"/>
+            <wp:docPr id="35" name="Picture 35"/>
             <wp:cNvGraphicFramePr>
               <a:graphicFrameLocks noChangeAspect="1"/>
             </wp:cNvGraphicFramePr>
@@ -5593,11 +5518,11 @@
               <a:graphicData uri="http://schemas.openxmlformats.org/drawingml/2006/picture">
                 <pic:pic>
                   <pic:nvPicPr>
-                    <pic:cNvPr id="0" name="ptsPurchase.png"/>
+                    <pic:cNvPr id="0" name="image_15.png"/>
                     <pic:cNvPicPr/>
                   </pic:nvPicPr>
                   <pic:blipFill>
-                    <a:blip r:embed="rId23"/>
+                    <a:blip r:embed="rId47"/>
                     <a:stretch>
                       <a:fillRect/>
                     </a:stretch>
@@ -5923,15 +5848,10 @@
         <w:jc w:val="center"/>
       </w:pPr>
       <w:r>
-        <w:rPr>
-          <w:rFonts w:ascii="Cambria" w:hAnsi="Cambria" w:eastAsia="Cambria" w:cs="Cambria"/>
-          <w:color w:val="555559"/>
-          <w:sz w:val="22"/>
-        </w:rPr>
         <w:drawing>
           <wp:inline xmlns:a="http://schemas.openxmlformats.org/drawingml/2006/main" xmlns:pic="http://schemas.openxmlformats.org/drawingml/2006/picture">
             <wp:extent cx="5029200" cy="774005"/>
-            <wp:docPr id="16" name="Picture 16"/>
+            <wp:docPr id="36" name="Picture 36"/>
             <wp:cNvGraphicFramePr>
               <a:graphicFrameLocks noChangeAspect="1"/>
             </wp:cNvGraphicFramePr>
@@ -5939,11 +5859,11 @@
               <a:graphicData uri="http://schemas.openxmlformats.org/drawingml/2006/picture">
                 <pic:pic>
                   <pic:nvPicPr>
-                    <pic:cNvPr id="0" name="levels.png"/>
+                    <pic:cNvPr id="0" name="image_16.png"/>
                     <pic:cNvPicPr/>
                   </pic:nvPicPr>
                   <pic:blipFill>
-                    <a:blip r:embed="rId24"/>
+                    <a:blip r:embed="rId48"/>
                     <a:stretch>
                       <a:fillRect/>
                     </a:stretch>
@@ -6248,15 +6168,10 @@
         <w:jc w:val="center"/>
       </w:pPr>
       <w:r>
-        <w:rPr>
-          <w:rFonts w:ascii="Cambria" w:hAnsi="Cambria" w:eastAsia="Cambria" w:cs="Cambria"/>
-          <w:color w:val="555559"/>
-          <w:sz w:val="22"/>
-        </w:rPr>
         <w:drawing>
           <wp:inline xmlns:a="http://schemas.openxmlformats.org/drawingml/2006/main" xmlns:pic="http://schemas.openxmlformats.org/drawingml/2006/picture">
             <wp:extent cx="5029200" cy="1008023"/>
-            <wp:docPr id="17" name="Picture 17"/>
+            <wp:docPr id="37" name="Picture 37"/>
             <wp:cNvGraphicFramePr>
               <a:graphicFrameLocks noChangeAspect="1"/>
             </wp:cNvGraphicFramePr>
@@ -6264,11 +6179,11 @@
               <a:graphicData uri="http://schemas.openxmlformats.org/drawingml/2006/picture">
                 <pic:pic>
                   <pic:nvPicPr>
-                    <pic:cNvPr id="0" name="awardrule.png"/>
+                    <pic:cNvPr id="0" name="image_17.png"/>
                     <pic:cNvPicPr/>
                   </pic:nvPicPr>
                   <pic:blipFill>
-                    <a:blip r:embed="rId25"/>
+                    <a:blip r:embed="rId49"/>
                     <a:stretch>
                       <a:fillRect/>
                     </a:stretch>
@@ -6625,15 +6540,10 @@
         <w:jc w:val="center"/>
       </w:pPr>
       <w:r>
-        <w:rPr>
-          <w:rFonts w:ascii="Cambria" w:hAnsi="Cambria" w:eastAsia="Cambria" w:cs="Cambria"/>
-          <w:color w:val="555559"/>
-          <w:sz w:val="22"/>
-        </w:rPr>
         <w:drawing>
           <wp:inline xmlns:a="http://schemas.openxmlformats.org/drawingml/2006/main" xmlns:pic="http://schemas.openxmlformats.org/drawingml/2006/picture">
             <wp:extent cx="5029200" cy="1157801"/>
-            <wp:docPr id="18" name="Picture 18"/>
+            <wp:docPr id="38" name="Picture 38"/>
             <wp:cNvGraphicFramePr>
               <a:graphicFrameLocks noChangeAspect="1"/>
             </wp:cNvGraphicFramePr>
@@ -6641,11 +6551,11 @@
               <a:graphicData uri="http://schemas.openxmlformats.org/drawingml/2006/picture">
                 <pic:pic>
                   <pic:nvPicPr>
-                    <pic:cNvPr id="0" name="award.png"/>
+                    <pic:cNvPr id="0" name="image_18.png"/>
                     <pic:cNvPicPr/>
                   </pic:nvPicPr>
                   <pic:blipFill>
-                    <a:blip r:embed="rId26"/>
+                    <a:blip r:embed="rId50"/>
                     <a:stretch>
                       <a:fillRect/>
                     </a:stretch>
@@ -10098,7 +10008,7 @@
       <w:headerReference w:type="first" r:id="rId31"/>
       <w:footerReference w:type="first" r:id="rId32"/>
       <w:pgSz w:w="12240" w:h="15840"/>
-      <w:pgMar w:top="893" w:right="1008" w:bottom="792" w:left="1008" w:header="115" w:footer="230" w:gutter="0"/>
+      <w:pgMar w:top="893" w:right="1008" w:bottom="792" w:left="1008" w:header="115" w:footer="173" w:gutter="0"/>
       <w:cols w:space="720"/>
       <w:titlePg/>
       <w:docGrid w:linePitch="360"/>
@@ -10109,32 +10019,13 @@
 
 <file path=word/footer1.xml><?xml version="1.0" encoding="utf-8"?>
 <w:ftr xmlns:m="http://schemas.openxmlformats.org/officeDocument/2006/math" xmlns:mc="http://schemas.openxmlformats.org/markup-compatibility/2006" xmlns:mo="http://schemas.microsoft.com/office/mac/office/2008/main" xmlns:mv="urn:schemas-microsoft-com:mac:vml" xmlns:o="urn:schemas-microsoft-com:office:office" xmlns:r="http://schemas.openxmlformats.org/officeDocument/2006/relationships" xmlns:v="urn:schemas-microsoft-com:vml" xmlns:w10="urn:schemas-microsoft-com:office:word" xmlns:w14="http://schemas.microsoft.com/office/word/2010/wordml" xmlns:w="http://schemas.openxmlformats.org/wordprocessingml/2006/main" xmlns:wne="http://schemas.microsoft.com/office/word/2006/wordml" xmlns:wp14="http://schemas.microsoft.com/office/word/2010/wordprocessingDrawing" xmlns:wp="http://schemas.openxmlformats.org/drawingml/2006/wordprocessingDrawing" xmlns:wpc="http://schemas.microsoft.com/office/word/2010/wordprocessingCanvas" xmlns:wpg="http://schemas.microsoft.com/office/word/2010/wordprocessingGroup" xmlns:wpi="http://schemas.microsoft.com/office/word/2010/wordprocessingInk" xmlns:wps="http://schemas.microsoft.com/office/word/2010/wordprocessingShape" mc:Ignorable="w14 wp14">
-  <w:p>
-    <w:pPr>
-      <w:pBdr>
-        <w:bottom w:val="single" w:sz="6" w:space="4" w:color="FF8016"/>
-      </w:pBdr>
-      <w:jc w:val="right"/>
-    </w:pPr>
-    <w:r>
-      <w:rPr>
-        <w:rFonts w:ascii="Cambria" w:hAnsi="Cambria" w:eastAsia="Cambria" w:cs="Cambria"/>
-        <w:color w:val="555559"/>
-        <w:sz w:val="12"/>
-      </w:rPr>
-      <w:t>Solution Blueprint | Customer Engagement</w:t>
-    </w:r>
-  </w:p>
+  <w:p/>
 </w:ftr>
 </file>
 
 <file path=word/footer2.xml><?xml version="1.0" encoding="utf-8"?>
 <w:ftr xmlns:m="http://schemas.openxmlformats.org/officeDocument/2006/math" xmlns:mc="http://schemas.openxmlformats.org/markup-compatibility/2006" xmlns:mo="http://schemas.microsoft.com/office/mac/office/2008/main" xmlns:mv="urn:schemas-microsoft-com:mac:vml" xmlns:o="urn:schemas-microsoft-com:office:office" xmlns:r="http://schemas.openxmlformats.org/officeDocument/2006/relationships" xmlns:v="urn:schemas-microsoft-com:vml" xmlns:w10="urn:schemas-microsoft-com:office:word" xmlns:w14="http://schemas.microsoft.com/office/word/2010/wordml" xmlns:w="http://schemas.openxmlformats.org/wordprocessingml/2006/main" xmlns:wne="http://schemas.microsoft.com/office/word/2006/wordml" xmlns:wp14="http://schemas.microsoft.com/office/word/2010/wordprocessingDrawing" xmlns:wp="http://schemas.openxmlformats.org/drawingml/2006/wordprocessingDrawing" xmlns:wpc="http://schemas.microsoft.com/office/word/2010/wordprocessingCanvas" xmlns:wpg="http://schemas.microsoft.com/office/word/2010/wordprocessingGroup" xmlns:wpi="http://schemas.microsoft.com/office/word/2010/wordprocessingInk" xmlns:wps="http://schemas.microsoft.com/office/word/2010/wordprocessingShape" mc:Ignorable="w14 wp14">
-  <w:p>
-    <w:pPr>
-      <w:pStyle w:val="Footer"/>
-    </w:pPr>
-  </w:p>
+  <w:p/>
 </w:ftr>
 </file>
 
@@ -10142,7 +10033,7 @@
 <w:hdr xmlns:m="http://schemas.openxmlformats.org/officeDocument/2006/math" xmlns:mc="http://schemas.openxmlformats.org/markup-compatibility/2006" xmlns:mo="http://schemas.microsoft.com/office/mac/office/2008/main" xmlns:mv="urn:schemas-microsoft-com:mac:vml" xmlns:o="urn:schemas-microsoft-com:office:office" xmlns:r="http://schemas.openxmlformats.org/officeDocument/2006/relationships" xmlns:v="urn:schemas-microsoft-com:vml" xmlns:w10="urn:schemas-microsoft-com:office:word" xmlns:w14="http://schemas.microsoft.com/office/word/2010/wordml" xmlns:w="http://schemas.openxmlformats.org/wordprocessingml/2006/main" xmlns:wne="http://schemas.microsoft.com/office/word/2006/wordml" xmlns:wp14="http://schemas.microsoft.com/office/word/2010/wordprocessingDrawing" xmlns:wp="http://schemas.openxmlformats.org/drawingml/2006/wordprocessingDrawing" xmlns:wpc="http://schemas.microsoft.com/office/word/2010/wordprocessingCanvas" xmlns:wpg="http://schemas.microsoft.com/office/word/2010/wordprocessingGroup" xmlns:wpi="http://schemas.microsoft.com/office/word/2010/wordprocessingInk" xmlns:wps="http://schemas.microsoft.com/office/word/2010/wordprocessingShape" mc:Ignorable="w14 wp14">
   <w:p>
     <w:pPr>
-      <w:spacing w:after="0"/>
+      <w:spacing w:before="0" w:after="0"/>
       <w:jc w:val="center"/>
     </w:pPr>
     <w:r>
@@ -10180,122 +10071,6 @@
       </w:drawing>
     </w:r>
   </w:p>
-  <w:tbl>
-    <w:tblPr>
-      <w:tblW w:type="auto" w:w="0"/>
-      <w:jc w:val="center"/>
-      <w:tblLook w:firstColumn="1" w:firstRow="1" w:lastColumn="0" w:lastRow="0" w:noHBand="0" w:noVBand="1" w:val="04A0"/>
-    </w:tblPr>
-    <w:tblGrid>
-      <w:gridCol w:w="4200"/>
-      <w:gridCol w:w="4200"/>
-      <w:gridCol w:w="4200"/>
-    </w:tblGrid>
-    <w:tr>
-      <w:tc>
-        <w:tcPr>
-          <w:tcW w:type="dxa" w:w="4200"/>
-          <w:shd w:fill="FFFFFF"/>
-          <w:tcBorders>
-            <w:top w:val="nil" w:sz="0" w:space="0" w:color="FFFFFF"/>
-            <w:left w:val="nil" w:sz="0" w:space="0" w:color="FFFFFF"/>
-            <w:bottom w:val="nil" w:sz="0" w:space="0" w:color="FFFFFF"/>
-            <w:right w:val="nil" w:sz="0" w:space="0" w:color="FFFFFF"/>
-          </w:tcBorders>
-          <w:tcMar>
-            <w:top w:w="0" w:type="dxa"/>
-            <w:start w:w="20" w:type="dxa"/>
-            <w:bottom w:w="0" w:type="dxa"/>
-            <w:end w:w="20" w:type="dxa"/>
-          </w:tcMar>
-        </w:tcPr>
-        <w:p>
-          <w:pPr>
-            <w:spacing w:after="0" w:before="0"/>
-          </w:pPr>
-          <w:r>
-            <w:rPr>
-              <w:rFonts w:ascii="Cambria" w:hAnsi="Cambria" w:eastAsia="Cambria" w:cs="Cambria"/>
-              <w:b/>
-              <w:color w:val="555559"/>
-              <w:sz w:val="12"/>
-            </w:rPr>
-            <w:fldChar w:fldCharType="begin"/>
-            <w:instrText xml:space="preserve"> PAGE </w:instrText>
-            <w:fldChar w:fldCharType="separate"/>
-            <w:instrText xml:space="preserve">1</w:instrText>
-            <w:fldChar w:fldCharType="end"/>
-          </w:r>
-        </w:p>
-      </w:tc>
-      <w:tc>
-        <w:tcPr>
-          <w:tcW w:type="dxa" w:w="4200"/>
-          <w:shd w:fill="FFFFFF"/>
-          <w:tcBorders>
-            <w:top w:val="nil" w:sz="0" w:space="0" w:color="FFFFFF"/>
-            <w:left w:val="nil" w:sz="0" w:space="0" w:color="FFFFFF"/>
-            <w:bottom w:val="nil" w:sz="0" w:space="0" w:color="FFFFFF"/>
-            <w:right w:val="nil" w:sz="0" w:space="0" w:color="FFFFFF"/>
-          </w:tcBorders>
-          <w:tcMar>
-            <w:top w:w="0" w:type="dxa"/>
-            <w:start w:w="20" w:type="dxa"/>
-            <w:bottom w:w="0" w:type="dxa"/>
-            <w:end w:w="20" w:type="dxa"/>
-          </w:tcMar>
-        </w:tcPr>
-        <w:p>
-          <w:pPr>
-            <w:spacing w:after="0" w:before="0"/>
-            <w:jc w:val="center"/>
-          </w:pPr>
-          <w:r>
-            <w:rPr>
-              <w:rFonts w:ascii="Cambria" w:hAnsi="Cambria" w:eastAsia="Cambria" w:cs="Cambria"/>
-              <w:b/>
-              <w:color w:val="555559"/>
-              <w:sz w:val="12"/>
-            </w:rPr>
-            <w:t>Customer Engagement Release 1.0</w:t>
-          </w:r>
-        </w:p>
-      </w:tc>
-      <w:tc>
-        <w:tcPr>
-          <w:tcW w:type="dxa" w:w="4200"/>
-          <w:shd w:fill="FFFFFF"/>
-          <w:tcBorders>
-            <w:top w:val="nil" w:sz="0" w:space="0" w:color="FFFFFF"/>
-            <w:left w:val="nil" w:sz="0" w:space="0" w:color="FFFFFF"/>
-            <w:bottom w:val="nil" w:sz="0" w:space="0" w:color="FFFFFF"/>
-            <w:right w:val="nil" w:sz="0" w:space="0" w:color="FFFFFF"/>
-          </w:tcBorders>
-          <w:tcMar>
-            <w:top w:w="0" w:type="dxa"/>
-            <w:start w:w="20" w:type="dxa"/>
-            <w:bottom w:w="0" w:type="dxa"/>
-            <w:end w:w="20" w:type="dxa"/>
-          </w:tcMar>
-        </w:tcPr>
-        <w:p>
-          <w:pPr>
-            <w:spacing w:after="0" w:before="0"/>
-            <w:jc w:val="right"/>
-          </w:pPr>
-          <w:r>
-            <w:rPr>
-              <w:rFonts w:ascii="Cambria" w:hAnsi="Cambria" w:eastAsia="Cambria" w:cs="Cambria"/>
-              <w:b/>
-              <w:color w:val="555559"/>
-              <w:sz w:val="12"/>
-            </w:rPr>
-            <w:t>Copyright © 2026, Retail Consult</w:t>
-          </w:r>
-        </w:p>
-      </w:tc>
-    </w:tr>
-  </w:tbl>
   <w:tbl>
     <w:tblPr>
       <w:tblW w:type="auto" w:w="0"/>
@@ -10419,11 +10194,7 @@
 
 <file path=word/header2.xml><?xml version="1.0" encoding="utf-8"?>
 <w:hdr xmlns:m="http://schemas.openxmlformats.org/officeDocument/2006/math" xmlns:mc="http://schemas.openxmlformats.org/markup-compatibility/2006" xmlns:mo="http://schemas.microsoft.com/office/mac/office/2008/main" xmlns:mv="urn:schemas-microsoft-com:mac:vml" xmlns:o="urn:schemas-microsoft-com:office:office" xmlns:r="http://schemas.openxmlformats.org/officeDocument/2006/relationships" xmlns:v="urn:schemas-microsoft-com:vml" xmlns:w10="urn:schemas-microsoft-com:office:word" xmlns:w14="http://schemas.microsoft.com/office/word/2010/wordml" xmlns:w="http://schemas.openxmlformats.org/wordprocessingml/2006/main" xmlns:wne="http://schemas.microsoft.com/office/word/2006/wordml" xmlns:wp14="http://schemas.microsoft.com/office/word/2010/wordprocessingDrawing" xmlns:wp="http://schemas.openxmlformats.org/drawingml/2006/wordprocessingDrawing" xmlns:wpc="http://schemas.microsoft.com/office/word/2010/wordprocessingCanvas" xmlns:wpg="http://schemas.microsoft.com/office/word/2010/wordprocessingGroup" xmlns:wpi="http://schemas.microsoft.com/office/word/2010/wordprocessingInk" xmlns:wps="http://schemas.microsoft.com/office/word/2010/wordprocessingShape" mc:Ignorable="w14 wp14">
-  <w:p>
-    <w:pPr>
-      <w:pStyle w:val="Header"/>
-    </w:pPr>
-  </w:p>
+  <w:p/>
 </w:hdr>
 </file>
 

</xml_diff>

<commit_message>
Add TOC page numbers and full-width header bar
Co-authored-by: RicardoCasquinha <RicardoCasquinha@users.noreply.github.com>
</commit_message>
<xml_diff>
--- a/Claires - Solution Blueprint - Customer Engagement V1 - Redesigned.docx
+++ b/Claires - Solution Blueprint - Customer Engagement V1 - Redesigned.docx
@@ -770,10 +770,18 @@
       </w:r>
     </w:p>
     <w:p>
+      <w:pPr>
+        <w:tabs>
+          <w:tab w:pos="10224" w:val="right" w:leader="dot"/>
+        </w:tabs>
+        <w:spacing w:before="0" w:after="40" w:line="240" w:lineRule="auto"/>
+        <w:ind w:left="0"/>
+      </w:pPr>
       <w:r>
         <w:rPr>
           <w:rFonts w:ascii="Cambria" w:hAnsi="Cambria" w:eastAsia="Cambria" w:cs="Cambria"/>
           <w:b/>
+          <w:vanish w:val="0"/>
           <w:color w:val="555559"/>
           <w:sz w:val="22"/>
         </w:rPr>
@@ -782,15 +790,37 @@
       <w:r>
         <w:rPr>
           <w:rFonts w:ascii="Cambria" w:hAnsi="Cambria" w:eastAsia="Cambria" w:cs="Cambria"/>
+          <w:b/>
+          <w:vanish w:val="0"/>
           <w:color w:val="555559"/>
           <w:sz w:val="22"/>
         </w:rPr>
-        <w:br/>
+        <w:tab/>
       </w:r>
       <w:r>
         <w:rPr>
           <w:rFonts w:ascii="Cambria" w:hAnsi="Cambria" w:eastAsia="Cambria" w:cs="Cambria"/>
           <w:b/>
+          <w:vanish w:val="0"/>
+          <w:color w:val="555559"/>
+          <w:sz w:val="22"/>
+        </w:rPr>
+        <w:t>2</w:t>
+      </w:r>
+    </w:p>
+    <w:p>
+      <w:pPr>
+        <w:tabs>
+          <w:tab w:pos="10224" w:val="right" w:leader="dot"/>
+        </w:tabs>
+        <w:spacing w:before="0" w:after="40" w:line="240" w:lineRule="auto"/>
+        <w:ind w:left="0"/>
+      </w:pPr>
+      <w:r>
+        <w:rPr>
+          <w:rFonts w:ascii="Cambria" w:hAnsi="Cambria" w:eastAsia="Cambria" w:cs="Cambria"/>
+          <w:b/>
+          <w:vanish w:val="0"/>
           <w:color w:val="555559"/>
           <w:sz w:val="22"/>
         </w:rPr>
@@ -799,15 +829,37 @@
       <w:r>
         <w:rPr>
           <w:rFonts w:ascii="Cambria" w:hAnsi="Cambria" w:eastAsia="Cambria" w:cs="Cambria"/>
+          <w:b/>
+          <w:vanish w:val="0"/>
           <w:color w:val="555559"/>
           <w:sz w:val="22"/>
         </w:rPr>
-        <w:br/>
+        <w:tab/>
       </w:r>
       <w:r>
         <w:rPr>
           <w:rFonts w:ascii="Cambria" w:hAnsi="Cambria" w:eastAsia="Cambria" w:cs="Cambria"/>
           <w:b/>
+          <w:vanish w:val="0"/>
+          <w:color w:val="555559"/>
+          <w:sz w:val="22"/>
+        </w:rPr>
+        <w:t>3</w:t>
+      </w:r>
+    </w:p>
+    <w:p>
+      <w:pPr>
+        <w:tabs>
+          <w:tab w:pos="10224" w:val="right" w:leader="dot"/>
+        </w:tabs>
+        <w:spacing w:before="0" w:after="40" w:line="240" w:lineRule="auto"/>
+        <w:ind w:left="0"/>
+      </w:pPr>
+      <w:r>
+        <w:rPr>
+          <w:rFonts w:ascii="Cambria" w:hAnsi="Cambria" w:eastAsia="Cambria" w:cs="Cambria"/>
+          <w:b/>
+          <w:vanish w:val="0"/>
           <w:color w:val="555559"/>
           <w:sz w:val="22"/>
         </w:rPr>
@@ -816,15 +868,37 @@
       <w:r>
         <w:rPr>
           <w:rFonts w:ascii="Cambria" w:hAnsi="Cambria" w:eastAsia="Cambria" w:cs="Cambria"/>
+          <w:b/>
+          <w:vanish w:val="0"/>
           <w:color w:val="555559"/>
           <w:sz w:val="22"/>
         </w:rPr>
-        <w:br/>
+        <w:tab/>
       </w:r>
       <w:r>
         <w:rPr>
           <w:rFonts w:ascii="Cambria" w:hAnsi="Cambria" w:eastAsia="Cambria" w:cs="Cambria"/>
           <w:b/>
+          <w:vanish w:val="0"/>
+          <w:color w:val="555559"/>
+          <w:sz w:val="22"/>
+        </w:rPr>
+        <w:t>5</w:t>
+      </w:r>
+    </w:p>
+    <w:p>
+      <w:pPr>
+        <w:tabs>
+          <w:tab w:pos="10224" w:val="right" w:leader="dot"/>
+        </w:tabs>
+        <w:spacing w:before="0" w:after="40" w:line="240" w:lineRule="auto"/>
+        <w:ind w:left="0"/>
+      </w:pPr>
+      <w:r>
+        <w:rPr>
+          <w:rFonts w:ascii="Cambria" w:hAnsi="Cambria" w:eastAsia="Cambria" w:cs="Cambria"/>
+          <w:b/>
+          <w:vanish w:val="0"/>
           <w:color w:val="555559"/>
           <w:sz w:val="22"/>
         </w:rPr>
@@ -833,15 +907,37 @@
       <w:r>
         <w:rPr>
           <w:rFonts w:ascii="Cambria" w:hAnsi="Cambria" w:eastAsia="Cambria" w:cs="Cambria"/>
+          <w:b/>
+          <w:vanish w:val="0"/>
           <w:color w:val="555559"/>
           <w:sz w:val="22"/>
         </w:rPr>
-        <w:br/>
+        <w:tab/>
       </w:r>
       <w:r>
         <w:rPr>
           <w:rFonts w:ascii="Cambria" w:hAnsi="Cambria" w:eastAsia="Cambria" w:cs="Cambria"/>
           <w:b/>
+          <w:vanish w:val="0"/>
+          <w:color w:val="555559"/>
+          <w:sz w:val="22"/>
+        </w:rPr>
+        <w:t>6</w:t>
+      </w:r>
+    </w:p>
+    <w:p>
+      <w:pPr>
+        <w:tabs>
+          <w:tab w:pos="10224" w:val="right" w:leader="dot"/>
+        </w:tabs>
+        <w:spacing w:before="0" w:after="40" w:line="240" w:lineRule="auto"/>
+        <w:ind w:left="0"/>
+      </w:pPr>
+      <w:r>
+        <w:rPr>
+          <w:rFonts w:ascii="Cambria" w:hAnsi="Cambria" w:eastAsia="Cambria" w:cs="Cambria"/>
+          <w:b/>
+          <w:vanish w:val="0"/>
           <w:color w:val="555559"/>
           <w:sz w:val="22"/>
         </w:rPr>
@@ -850,117 +946,271 @@
       <w:r>
         <w:rPr>
           <w:rFonts w:ascii="Cambria" w:hAnsi="Cambria" w:eastAsia="Cambria" w:cs="Cambria"/>
+          <w:b/>
+          <w:vanish w:val="0"/>
           <w:color w:val="555559"/>
           <w:sz w:val="22"/>
         </w:rPr>
-        <w:br/>
+        <w:tab/>
+      </w:r>
+      <w:r>
+        <w:rPr>
+          <w:rFonts w:ascii="Cambria" w:hAnsi="Cambria" w:eastAsia="Cambria" w:cs="Cambria"/>
+          <w:b/>
+          <w:vanish w:val="0"/>
+          <w:color w:val="555559"/>
+          <w:sz w:val="22"/>
+        </w:rPr>
+        <w:t>7</w:t>
+      </w:r>
+    </w:p>
+    <w:p>
+      <w:pPr>
+        <w:tabs>
+          <w:tab w:pos="9864" w:val="right" w:leader="dot"/>
+        </w:tabs>
+        <w:spacing w:before="0" w:after="40" w:line="240" w:lineRule="auto"/>
+        <w:ind w:left="360"/>
+      </w:pPr>
+      <w:r>
+        <w:rPr>
+          <w:rFonts w:ascii="Cambria" w:hAnsi="Cambria" w:eastAsia="Cambria" w:cs="Cambria"/>
+          <w:b w:val="0"/>
+          <w:vanish w:val="0"/>
+          <w:color w:val="555559"/>
+          <w:sz w:val="22"/>
+        </w:rPr>
+        <w:t>1.1 Customer Dashboard</w:t>
       </w:r>
       <w:r>
         <w:rPr>
           <w:rFonts w:ascii="Cambria" w:hAnsi="Cambria" w:eastAsia="Cambria" w:cs="Cambria"/>
           <w:b w:val="0"/>
+          <w:vanish w:val="0"/>
           <w:color w:val="555559"/>
           <w:sz w:val="22"/>
         </w:rPr>
-        <w:t xml:space="preserve">    1.1 Customer Dashboard</w:t>
-      </w:r>
-      <w:r>
-        <w:rPr>
-          <w:rFonts w:ascii="Cambria" w:hAnsi="Cambria" w:eastAsia="Cambria" w:cs="Cambria"/>
-          <w:color w:val="555559"/>
-          <w:sz w:val="22"/>
-        </w:rPr>
-        <w:br/>
+        <w:tab/>
       </w:r>
       <w:r>
         <w:rPr>
           <w:rFonts w:ascii="Cambria" w:hAnsi="Cambria" w:eastAsia="Cambria" w:cs="Cambria"/>
           <w:b w:val="0"/>
+          <w:vanish w:val="0"/>
           <w:color w:val="555559"/>
           <w:sz w:val="22"/>
         </w:rPr>
-        <w:t xml:space="preserve">    1.2 Customer Profile &amp; Information</w:t>
+        <w:t>7</w:t>
       </w:r>
+    </w:p>
+    <w:p>
+      <w:pPr>
+        <w:tabs>
+          <w:tab w:pos="9864" w:val="right" w:leader="dot"/>
+        </w:tabs>
+        <w:spacing w:before="0" w:after="40" w:line="240" w:lineRule="auto"/>
+        <w:ind w:left="360"/>
+      </w:pPr>
       <w:r>
         <w:rPr>
           <w:rFonts w:ascii="Cambria" w:hAnsi="Cambria" w:eastAsia="Cambria" w:cs="Cambria"/>
+          <w:b w:val="0"/>
+          <w:vanish w:val="0"/>
           <w:color w:val="555559"/>
           <w:sz w:val="22"/>
         </w:rPr>
-        <w:br/>
+        <w:t>1.2 Customer Profile &amp; Information</w:t>
       </w:r>
       <w:r>
         <w:rPr>
           <w:rFonts w:ascii="Cambria" w:hAnsi="Cambria" w:eastAsia="Cambria" w:cs="Cambria"/>
           <w:b w:val="0"/>
+          <w:vanish w:val="0"/>
           <w:color w:val="555559"/>
           <w:sz w:val="22"/>
         </w:rPr>
-        <w:t xml:space="preserve">    1.3 Activity &amp; Purchase Profile</w:t>
-      </w:r>
-      <w:r>
-        <w:rPr>
-          <w:rFonts w:ascii="Cambria" w:hAnsi="Cambria" w:eastAsia="Cambria" w:cs="Cambria"/>
-          <w:color w:val="555559"/>
-          <w:sz w:val="22"/>
-        </w:rPr>
-        <w:br/>
+        <w:tab/>
       </w:r>
       <w:r>
         <w:rPr>
           <w:rFonts w:ascii="Cambria" w:hAnsi="Cambria" w:eastAsia="Cambria" w:cs="Cambria"/>
           <w:b w:val="0"/>
+          <w:vanish w:val="0"/>
           <w:color w:val="555559"/>
           <w:sz w:val="22"/>
         </w:rPr>
-        <w:t xml:space="preserve">    1.4 Loyalty Visibility</w:t>
+        <w:t>7</w:t>
       </w:r>
+    </w:p>
+    <w:p>
+      <w:pPr>
+        <w:tabs>
+          <w:tab w:pos="9864" w:val="right" w:leader="dot"/>
+        </w:tabs>
+        <w:spacing w:before="0" w:after="40" w:line="240" w:lineRule="auto"/>
+        <w:ind w:left="360"/>
+      </w:pPr>
       <w:r>
         <w:rPr>
           <w:rFonts w:ascii="Cambria" w:hAnsi="Cambria" w:eastAsia="Cambria" w:cs="Cambria"/>
+          <w:b w:val="0"/>
+          <w:vanish w:val="0"/>
           <w:color w:val="555559"/>
           <w:sz w:val="22"/>
         </w:rPr>
-        <w:br/>
+        <w:t>1.3 Activity &amp; Purchase Profile</w:t>
       </w:r>
       <w:r>
         <w:rPr>
           <w:rFonts w:ascii="Cambria" w:hAnsi="Cambria" w:eastAsia="Cambria" w:cs="Cambria"/>
           <w:b w:val="0"/>
+          <w:vanish w:val="0"/>
           <w:color w:val="555559"/>
           <w:sz w:val="22"/>
         </w:rPr>
-        <w:t xml:space="preserve">    1.5 Customer Segmentation</w:t>
-      </w:r>
-      <w:r>
-        <w:rPr>
-          <w:rFonts w:ascii="Cambria" w:hAnsi="Cambria" w:eastAsia="Cambria" w:cs="Cambria"/>
-          <w:color w:val="555559"/>
-          <w:sz w:val="22"/>
-        </w:rPr>
-        <w:br/>
+        <w:tab/>
       </w:r>
       <w:r>
         <w:rPr>
           <w:rFonts w:ascii="Cambria" w:hAnsi="Cambria" w:eastAsia="Cambria" w:cs="Cambria"/>
           <w:b w:val="0"/>
+          <w:vanish w:val="0"/>
           <w:color w:val="555559"/>
           <w:sz w:val="22"/>
         </w:rPr>
-        <w:t xml:space="preserve">    1.6 Stratified Segments</w:t>
+        <w:t>8</w:t>
+      </w:r>
+    </w:p>
+    <w:p>
+      <w:pPr>
+        <w:tabs>
+          <w:tab w:pos="9864" w:val="right" w:leader="dot"/>
+        </w:tabs>
+        <w:spacing w:before="0" w:after="40" w:line="240" w:lineRule="auto"/>
+        <w:ind w:left="360"/>
+      </w:pPr>
+      <w:r>
+        <w:rPr>
+          <w:rFonts w:ascii="Cambria" w:hAnsi="Cambria" w:eastAsia="Cambria" w:cs="Cambria"/>
+          <w:b w:val="0"/>
+          <w:vanish w:val="0"/>
+          <w:color w:val="555559"/>
+          <w:sz w:val="22"/>
+        </w:rPr>
+        <w:t>1.4 Loyalty Visibility</w:t>
       </w:r>
       <w:r>
         <w:rPr>
           <w:rFonts w:ascii="Cambria" w:hAnsi="Cambria" w:eastAsia="Cambria" w:cs="Cambria"/>
+          <w:b w:val="0"/>
+          <w:vanish w:val="0"/>
           <w:color w:val="555559"/>
           <w:sz w:val="22"/>
         </w:rPr>
-        <w:br/>
+        <w:tab/>
       </w:r>
       <w:r>
         <w:rPr>
           <w:rFonts w:ascii="Cambria" w:hAnsi="Cambria" w:eastAsia="Cambria" w:cs="Cambria"/>
+          <w:b w:val="0"/>
+          <w:vanish w:val="0"/>
+          <w:color w:val="555559"/>
+          <w:sz w:val="22"/>
+        </w:rPr>
+        <w:t>9</w:t>
+      </w:r>
+    </w:p>
+    <w:p>
+      <w:pPr>
+        <w:tabs>
+          <w:tab w:pos="9864" w:val="right" w:leader="dot"/>
+        </w:tabs>
+        <w:spacing w:before="0" w:after="40" w:line="240" w:lineRule="auto"/>
+        <w:ind w:left="360"/>
+      </w:pPr>
+      <w:r>
+        <w:rPr>
+          <w:rFonts w:ascii="Cambria" w:hAnsi="Cambria" w:eastAsia="Cambria" w:cs="Cambria"/>
+          <w:b w:val="0"/>
+          <w:vanish w:val="0"/>
+          <w:color w:val="555559"/>
+          <w:sz w:val="22"/>
+        </w:rPr>
+        <w:t>1.5 Customer Segmentation</w:t>
+      </w:r>
+      <w:r>
+        <w:rPr>
+          <w:rFonts w:ascii="Cambria" w:hAnsi="Cambria" w:eastAsia="Cambria" w:cs="Cambria"/>
+          <w:b w:val="0"/>
+          <w:vanish w:val="0"/>
+          <w:color w:val="555559"/>
+          <w:sz w:val="22"/>
+        </w:rPr>
+        <w:tab/>
+      </w:r>
+      <w:r>
+        <w:rPr>
+          <w:rFonts w:ascii="Cambria" w:hAnsi="Cambria" w:eastAsia="Cambria" w:cs="Cambria"/>
+          <w:b w:val="0"/>
+          <w:vanish w:val="0"/>
+          <w:color w:val="555559"/>
+          <w:sz w:val="22"/>
+        </w:rPr>
+        <w:t>10</w:t>
+      </w:r>
+    </w:p>
+    <w:p>
+      <w:pPr>
+        <w:tabs>
+          <w:tab w:pos="9864" w:val="right" w:leader="dot"/>
+        </w:tabs>
+        <w:spacing w:before="0" w:after="40" w:line="240" w:lineRule="auto"/>
+        <w:ind w:left="360"/>
+      </w:pPr>
+      <w:r>
+        <w:rPr>
+          <w:rFonts w:ascii="Cambria" w:hAnsi="Cambria" w:eastAsia="Cambria" w:cs="Cambria"/>
+          <w:b w:val="0"/>
+          <w:vanish w:val="0"/>
+          <w:color w:val="555559"/>
+          <w:sz w:val="22"/>
+        </w:rPr>
+        <w:t>1.6 Stratified Segments</w:t>
+      </w:r>
+      <w:r>
+        <w:rPr>
+          <w:rFonts w:ascii="Cambria" w:hAnsi="Cambria" w:eastAsia="Cambria" w:cs="Cambria"/>
+          <w:b w:val="0"/>
+          <w:vanish w:val="0"/>
+          <w:color w:val="555559"/>
+          <w:sz w:val="22"/>
+        </w:rPr>
+        <w:tab/>
+      </w:r>
+      <w:r>
+        <w:rPr>
+          <w:rFonts w:ascii="Cambria" w:hAnsi="Cambria" w:eastAsia="Cambria" w:cs="Cambria"/>
+          <w:b w:val="0"/>
+          <w:vanish w:val="0"/>
+          <w:color w:val="555559"/>
+          <w:sz w:val="22"/>
+        </w:rPr>
+        <w:t>11</w:t>
+      </w:r>
+    </w:p>
+    <w:p>
+      <w:pPr>
+        <w:tabs>
+          <w:tab w:pos="10224" w:val="right" w:leader="dot"/>
+        </w:tabs>
+        <w:spacing w:before="0" w:after="40" w:line="240" w:lineRule="auto"/>
+        <w:ind w:left="0"/>
+      </w:pPr>
+      <w:r>
+        <w:rPr>
+          <w:rFonts w:ascii="Cambria" w:hAnsi="Cambria" w:eastAsia="Cambria" w:cs="Cambria"/>
           <w:b/>
+          <w:vanish w:val="0"/>
           <w:color w:val="555559"/>
           <w:sz w:val="22"/>
         </w:rPr>
@@ -969,117 +1219,271 @@
       <w:r>
         <w:rPr>
           <w:rFonts w:ascii="Cambria" w:hAnsi="Cambria" w:eastAsia="Cambria" w:cs="Cambria"/>
+          <w:b/>
+          <w:vanish w:val="0"/>
           <w:color w:val="555559"/>
           <w:sz w:val="22"/>
         </w:rPr>
-        <w:br/>
+        <w:tab/>
+      </w:r>
+      <w:r>
+        <w:rPr>
+          <w:rFonts w:ascii="Cambria" w:hAnsi="Cambria" w:eastAsia="Cambria" w:cs="Cambria"/>
+          <w:b/>
+          <w:vanish w:val="0"/>
+          <w:color w:val="555559"/>
+          <w:sz w:val="22"/>
+        </w:rPr>
+        <w:t>13</w:t>
+      </w:r>
+    </w:p>
+    <w:p>
+      <w:pPr>
+        <w:tabs>
+          <w:tab w:pos="9864" w:val="right" w:leader="dot"/>
+        </w:tabs>
+        <w:spacing w:before="0" w:after="40" w:line="240" w:lineRule="auto"/>
+        <w:ind w:left="360"/>
+      </w:pPr>
+      <w:r>
+        <w:rPr>
+          <w:rFonts w:ascii="Cambria" w:hAnsi="Cambria" w:eastAsia="Cambria" w:cs="Cambria"/>
+          <w:b w:val="0"/>
+          <w:vanish w:val="0"/>
+          <w:color w:val="555559"/>
+          <w:sz w:val="22"/>
+        </w:rPr>
+        <w:t>2.1 Campaign &amp; Promotion Management</w:t>
       </w:r>
       <w:r>
         <w:rPr>
           <w:rFonts w:ascii="Cambria" w:hAnsi="Cambria" w:eastAsia="Cambria" w:cs="Cambria"/>
           <w:b w:val="0"/>
+          <w:vanish w:val="0"/>
           <w:color w:val="555559"/>
           <w:sz w:val="22"/>
         </w:rPr>
-        <w:t xml:space="preserve">    2.1 Campaign &amp; Promotion Management</w:t>
-      </w:r>
-      <w:r>
-        <w:rPr>
-          <w:rFonts w:ascii="Cambria" w:hAnsi="Cambria" w:eastAsia="Cambria" w:cs="Cambria"/>
-          <w:color w:val="555559"/>
-          <w:sz w:val="22"/>
-        </w:rPr>
-        <w:br/>
+        <w:tab/>
       </w:r>
       <w:r>
         <w:rPr>
           <w:rFonts w:ascii="Cambria" w:hAnsi="Cambria" w:eastAsia="Cambria" w:cs="Cambria"/>
           <w:b w:val="0"/>
+          <w:vanish w:val="0"/>
           <w:color w:val="555559"/>
           <w:sz w:val="22"/>
         </w:rPr>
-        <w:t xml:space="preserve">    2.2 Promotion Types</w:t>
+        <w:t>13</w:t>
       </w:r>
+    </w:p>
+    <w:p>
+      <w:pPr>
+        <w:tabs>
+          <w:tab w:pos="9864" w:val="right" w:leader="dot"/>
+        </w:tabs>
+        <w:spacing w:before="0" w:after="40" w:line="240" w:lineRule="auto"/>
+        <w:ind w:left="360"/>
+      </w:pPr>
       <w:r>
         <w:rPr>
           <w:rFonts w:ascii="Cambria" w:hAnsi="Cambria" w:eastAsia="Cambria" w:cs="Cambria"/>
+          <w:b w:val="0"/>
+          <w:vanish w:val="0"/>
           <w:color w:val="555559"/>
           <w:sz w:val="22"/>
         </w:rPr>
-        <w:br/>
+        <w:t>2.2 Promotion Types</w:t>
       </w:r>
       <w:r>
         <w:rPr>
           <w:rFonts w:ascii="Cambria" w:hAnsi="Cambria" w:eastAsia="Cambria" w:cs="Cambria"/>
           <w:b w:val="0"/>
+          <w:vanish w:val="0"/>
           <w:color w:val="555559"/>
           <w:sz w:val="22"/>
         </w:rPr>
-        <w:t xml:space="preserve">    2.3 Offers &amp; Discount Structures</w:t>
-      </w:r>
-      <w:r>
-        <w:rPr>
-          <w:rFonts w:ascii="Cambria" w:hAnsi="Cambria" w:eastAsia="Cambria" w:cs="Cambria"/>
-          <w:color w:val="555559"/>
-          <w:sz w:val="22"/>
-        </w:rPr>
-        <w:br/>
+        <w:tab/>
       </w:r>
       <w:r>
         <w:rPr>
           <w:rFonts w:ascii="Cambria" w:hAnsi="Cambria" w:eastAsia="Cambria" w:cs="Cambria"/>
           <w:b w:val="0"/>
+          <w:vanish w:val="0"/>
           <w:color w:val="555559"/>
           <w:sz w:val="22"/>
         </w:rPr>
-        <w:t xml:space="preserve">    2.4 Coupons</w:t>
+        <w:t>13</w:t>
       </w:r>
+    </w:p>
+    <w:p>
+      <w:pPr>
+        <w:tabs>
+          <w:tab w:pos="9864" w:val="right" w:leader="dot"/>
+        </w:tabs>
+        <w:spacing w:before="0" w:after="40" w:line="240" w:lineRule="auto"/>
+        <w:ind w:left="360"/>
+      </w:pPr>
       <w:r>
         <w:rPr>
           <w:rFonts w:ascii="Cambria" w:hAnsi="Cambria" w:eastAsia="Cambria" w:cs="Cambria"/>
+          <w:b w:val="0"/>
+          <w:vanish w:val="0"/>
           <w:color w:val="555559"/>
           <w:sz w:val="22"/>
         </w:rPr>
-        <w:br/>
+        <w:t>2.3 Offers &amp; Discount Structures</w:t>
       </w:r>
       <w:r>
         <w:rPr>
           <w:rFonts w:ascii="Cambria" w:hAnsi="Cambria" w:eastAsia="Cambria" w:cs="Cambria"/>
           <w:b w:val="0"/>
+          <w:vanish w:val="0"/>
           <w:color w:val="555559"/>
           <w:sz w:val="22"/>
         </w:rPr>
-        <w:t xml:space="preserve">    2.5 Targeted &amp; Personalized Promotions</w:t>
-      </w:r>
-      <w:r>
-        <w:rPr>
-          <w:rFonts w:ascii="Cambria" w:hAnsi="Cambria" w:eastAsia="Cambria" w:cs="Cambria"/>
-          <w:color w:val="555559"/>
-          <w:sz w:val="22"/>
-        </w:rPr>
-        <w:br/>
+        <w:tab/>
       </w:r>
       <w:r>
         <w:rPr>
           <w:rFonts w:ascii="Cambria" w:hAnsi="Cambria" w:eastAsia="Cambria" w:cs="Cambria"/>
           <w:b w:val="0"/>
+          <w:vanish w:val="0"/>
           <w:color w:val="555559"/>
           <w:sz w:val="22"/>
         </w:rPr>
-        <w:t xml:space="preserve">    2.6 Promotion &amp; Offer Scorecards</w:t>
+        <w:t>14</w:t>
+      </w:r>
+    </w:p>
+    <w:p>
+      <w:pPr>
+        <w:tabs>
+          <w:tab w:pos="9864" w:val="right" w:leader="dot"/>
+        </w:tabs>
+        <w:spacing w:before="0" w:after="40" w:line="240" w:lineRule="auto"/>
+        <w:ind w:left="360"/>
+      </w:pPr>
+      <w:r>
+        <w:rPr>
+          <w:rFonts w:ascii="Cambria" w:hAnsi="Cambria" w:eastAsia="Cambria" w:cs="Cambria"/>
+          <w:b w:val="0"/>
+          <w:vanish w:val="0"/>
+          <w:color w:val="555559"/>
+          <w:sz w:val="22"/>
+        </w:rPr>
+        <w:t>2.4 Coupons</w:t>
       </w:r>
       <w:r>
         <w:rPr>
           <w:rFonts w:ascii="Cambria" w:hAnsi="Cambria" w:eastAsia="Cambria" w:cs="Cambria"/>
+          <w:b w:val="0"/>
+          <w:vanish w:val="0"/>
           <w:color w:val="555559"/>
           <w:sz w:val="22"/>
         </w:rPr>
-        <w:br/>
+        <w:tab/>
       </w:r>
       <w:r>
         <w:rPr>
           <w:rFonts w:ascii="Cambria" w:hAnsi="Cambria" w:eastAsia="Cambria" w:cs="Cambria"/>
+          <w:b w:val="0"/>
+          <w:vanish w:val="0"/>
+          <w:color w:val="555559"/>
+          <w:sz w:val="22"/>
+        </w:rPr>
+        <w:t>15</w:t>
+      </w:r>
+    </w:p>
+    <w:p>
+      <w:pPr>
+        <w:tabs>
+          <w:tab w:pos="9864" w:val="right" w:leader="dot"/>
+        </w:tabs>
+        <w:spacing w:before="0" w:after="40" w:line="240" w:lineRule="auto"/>
+        <w:ind w:left="360"/>
+      </w:pPr>
+      <w:r>
+        <w:rPr>
+          <w:rFonts w:ascii="Cambria" w:hAnsi="Cambria" w:eastAsia="Cambria" w:cs="Cambria"/>
+          <w:b w:val="0"/>
+          <w:vanish w:val="0"/>
+          <w:color w:val="555559"/>
+          <w:sz w:val="22"/>
+        </w:rPr>
+        <w:t>2.5 Targeted &amp; Personalized Promotions</w:t>
+      </w:r>
+      <w:r>
+        <w:rPr>
+          <w:rFonts w:ascii="Cambria" w:hAnsi="Cambria" w:eastAsia="Cambria" w:cs="Cambria"/>
+          <w:b w:val="0"/>
+          <w:vanish w:val="0"/>
+          <w:color w:val="555559"/>
+          <w:sz w:val="22"/>
+        </w:rPr>
+        <w:tab/>
+      </w:r>
+      <w:r>
+        <w:rPr>
+          <w:rFonts w:ascii="Cambria" w:hAnsi="Cambria" w:eastAsia="Cambria" w:cs="Cambria"/>
+          <w:b w:val="0"/>
+          <w:vanish w:val="0"/>
+          <w:color w:val="555559"/>
+          <w:sz w:val="22"/>
+        </w:rPr>
+        <w:t>15</w:t>
+      </w:r>
+    </w:p>
+    <w:p>
+      <w:pPr>
+        <w:tabs>
+          <w:tab w:pos="9864" w:val="right" w:leader="dot"/>
+        </w:tabs>
+        <w:spacing w:before="0" w:after="40" w:line="240" w:lineRule="auto"/>
+        <w:ind w:left="360"/>
+      </w:pPr>
+      <w:r>
+        <w:rPr>
+          <w:rFonts w:ascii="Cambria" w:hAnsi="Cambria" w:eastAsia="Cambria" w:cs="Cambria"/>
+          <w:b w:val="0"/>
+          <w:vanish w:val="0"/>
+          <w:color w:val="555559"/>
+          <w:sz w:val="22"/>
+        </w:rPr>
+        <w:t>2.6 Promotion &amp; Offer Scorecards</w:t>
+      </w:r>
+      <w:r>
+        <w:rPr>
+          <w:rFonts w:ascii="Cambria" w:hAnsi="Cambria" w:eastAsia="Cambria" w:cs="Cambria"/>
+          <w:b w:val="0"/>
+          <w:vanish w:val="0"/>
+          <w:color w:val="555559"/>
+          <w:sz w:val="22"/>
+        </w:rPr>
+        <w:tab/>
+      </w:r>
+      <w:r>
+        <w:rPr>
+          <w:rFonts w:ascii="Cambria" w:hAnsi="Cambria" w:eastAsia="Cambria" w:cs="Cambria"/>
+          <w:b w:val="0"/>
+          <w:vanish w:val="0"/>
+          <w:color w:val="555559"/>
+          <w:sz w:val="22"/>
+        </w:rPr>
+        <w:t>16</w:t>
+      </w:r>
+    </w:p>
+    <w:p>
+      <w:pPr>
+        <w:tabs>
+          <w:tab w:pos="10224" w:val="right" w:leader="dot"/>
+        </w:tabs>
+        <w:spacing w:before="0" w:after="40" w:line="240" w:lineRule="auto"/>
+        <w:ind w:left="0"/>
+      </w:pPr>
+      <w:r>
+        <w:rPr>
+          <w:rFonts w:ascii="Cambria" w:hAnsi="Cambria" w:eastAsia="Cambria" w:cs="Cambria"/>
           <w:b/>
+          <w:vanish w:val="0"/>
           <w:color w:val="555559"/>
           <w:sz w:val="22"/>
         </w:rPr>
@@ -1088,117 +1492,271 @@
       <w:r>
         <w:rPr>
           <w:rFonts w:ascii="Cambria" w:hAnsi="Cambria" w:eastAsia="Cambria" w:cs="Cambria"/>
+          <w:b/>
+          <w:vanish w:val="0"/>
           <w:color w:val="555559"/>
           <w:sz w:val="22"/>
         </w:rPr>
-        <w:br/>
+        <w:tab/>
+      </w:r>
+      <w:r>
+        <w:rPr>
+          <w:rFonts w:ascii="Cambria" w:hAnsi="Cambria" w:eastAsia="Cambria" w:cs="Cambria"/>
+          <w:b/>
+          <w:vanish w:val="0"/>
+          <w:color w:val="555559"/>
+          <w:sz w:val="22"/>
+        </w:rPr>
+        <w:t>17</w:t>
+      </w:r>
+    </w:p>
+    <w:p>
+      <w:pPr>
+        <w:tabs>
+          <w:tab w:pos="9864" w:val="right" w:leader="dot"/>
+        </w:tabs>
+        <w:spacing w:before="0" w:after="40" w:line="240" w:lineRule="auto"/>
+        <w:ind w:left="360"/>
+      </w:pPr>
+      <w:r>
+        <w:rPr>
+          <w:rFonts w:ascii="Cambria" w:hAnsi="Cambria" w:eastAsia="Cambria" w:cs="Cambria"/>
+          <w:b w:val="0"/>
+          <w:vanish w:val="0"/>
+          <w:color w:val="555559"/>
+          <w:sz w:val="22"/>
+        </w:rPr>
+        <w:t>3.1 Loyalty Program &amp; Levels</w:t>
       </w:r>
       <w:r>
         <w:rPr>
           <w:rFonts w:ascii="Cambria" w:hAnsi="Cambria" w:eastAsia="Cambria" w:cs="Cambria"/>
           <w:b w:val="0"/>
+          <w:vanish w:val="0"/>
           <w:color w:val="555559"/>
           <w:sz w:val="22"/>
         </w:rPr>
-        <w:t xml:space="preserve">    3.1 Loyalty Program &amp; Levels</w:t>
-      </w:r>
-      <w:r>
-        <w:rPr>
-          <w:rFonts w:ascii="Cambria" w:hAnsi="Cambria" w:eastAsia="Cambria" w:cs="Cambria"/>
-          <w:color w:val="555559"/>
-          <w:sz w:val="22"/>
-        </w:rPr>
-        <w:br/>
+        <w:tab/>
       </w:r>
       <w:r>
         <w:rPr>
           <w:rFonts w:ascii="Cambria" w:hAnsi="Cambria" w:eastAsia="Cambria" w:cs="Cambria"/>
           <w:b w:val="0"/>
+          <w:vanish w:val="0"/>
           <w:color w:val="555559"/>
           <w:sz w:val="22"/>
         </w:rPr>
-        <w:t xml:space="preserve">    3.2 Issue Rules — Earning Points</w:t>
+        <w:t>17</w:t>
       </w:r>
+    </w:p>
+    <w:p>
+      <w:pPr>
+        <w:tabs>
+          <w:tab w:pos="9864" w:val="right" w:leader="dot"/>
+        </w:tabs>
+        <w:spacing w:before="0" w:after="40" w:line="240" w:lineRule="auto"/>
+        <w:ind w:left="360"/>
+      </w:pPr>
       <w:r>
         <w:rPr>
           <w:rFonts w:ascii="Cambria" w:hAnsi="Cambria" w:eastAsia="Cambria" w:cs="Cambria"/>
+          <w:b w:val="0"/>
+          <w:vanish w:val="0"/>
           <w:color w:val="555559"/>
           <w:sz w:val="22"/>
         </w:rPr>
-        <w:br/>
+        <w:t>3.2 Issue Rules — Earning Points</w:t>
       </w:r>
       <w:r>
         <w:rPr>
           <w:rFonts w:ascii="Cambria" w:hAnsi="Cambria" w:eastAsia="Cambria" w:cs="Cambria"/>
           <w:b w:val="0"/>
+          <w:vanish w:val="0"/>
           <w:color w:val="555559"/>
           <w:sz w:val="22"/>
         </w:rPr>
-        <w:t xml:space="preserve">    3.3 Marketing Engagement Points</w:t>
-      </w:r>
-      <w:r>
-        <w:rPr>
-          <w:rFonts w:ascii="Cambria" w:hAnsi="Cambria" w:eastAsia="Cambria" w:cs="Cambria"/>
-          <w:color w:val="555559"/>
-          <w:sz w:val="22"/>
-        </w:rPr>
-        <w:br/>
+        <w:tab/>
       </w:r>
       <w:r>
         <w:rPr>
           <w:rFonts w:ascii="Cambria" w:hAnsi="Cambria" w:eastAsia="Cambria" w:cs="Cambria"/>
           <w:b w:val="0"/>
+          <w:vanish w:val="0"/>
           <w:color w:val="555559"/>
           <w:sz w:val="22"/>
         </w:rPr>
-        <w:t xml:space="preserve">    3.4 Movement Rules — Tier Progression</w:t>
+        <w:t>17</w:t>
       </w:r>
+    </w:p>
+    <w:p>
+      <w:pPr>
+        <w:tabs>
+          <w:tab w:pos="9864" w:val="right" w:leader="dot"/>
+        </w:tabs>
+        <w:spacing w:before="0" w:after="40" w:line="240" w:lineRule="auto"/>
+        <w:ind w:left="360"/>
+      </w:pPr>
       <w:r>
         <w:rPr>
           <w:rFonts w:ascii="Cambria" w:hAnsi="Cambria" w:eastAsia="Cambria" w:cs="Cambria"/>
+          <w:b w:val="0"/>
+          <w:vanish w:val="0"/>
           <w:color w:val="555559"/>
           <w:sz w:val="22"/>
         </w:rPr>
-        <w:br/>
+        <w:t>3.3 Marketing Engagement Points</w:t>
       </w:r>
       <w:r>
         <w:rPr>
           <w:rFonts w:ascii="Cambria" w:hAnsi="Cambria" w:eastAsia="Cambria" w:cs="Cambria"/>
           <w:b w:val="0"/>
+          <w:vanish w:val="0"/>
           <w:color w:val="555559"/>
           <w:sz w:val="22"/>
         </w:rPr>
-        <w:t xml:space="preserve">    3.5 Awards &amp; Rewards</w:t>
-      </w:r>
-      <w:r>
-        <w:rPr>
-          <w:rFonts w:ascii="Cambria" w:hAnsi="Cambria" w:eastAsia="Cambria" w:cs="Cambria"/>
-          <w:color w:val="555559"/>
-          <w:sz w:val="22"/>
-        </w:rPr>
-        <w:br/>
+        <w:tab/>
       </w:r>
       <w:r>
         <w:rPr>
           <w:rFonts w:ascii="Cambria" w:hAnsi="Cambria" w:eastAsia="Cambria" w:cs="Cambria"/>
           <w:b w:val="0"/>
+          <w:vanish w:val="0"/>
           <w:color w:val="555559"/>
           <w:sz w:val="22"/>
         </w:rPr>
-        <w:t xml:space="preserve">    3.6 Returns &amp; Point Deduction</w:t>
+        <w:t>18</w:t>
+      </w:r>
+    </w:p>
+    <w:p>
+      <w:pPr>
+        <w:tabs>
+          <w:tab w:pos="9864" w:val="right" w:leader="dot"/>
+        </w:tabs>
+        <w:spacing w:before="0" w:after="40" w:line="240" w:lineRule="auto"/>
+        <w:ind w:left="360"/>
+      </w:pPr>
+      <w:r>
+        <w:rPr>
+          <w:rFonts w:ascii="Cambria" w:hAnsi="Cambria" w:eastAsia="Cambria" w:cs="Cambria"/>
+          <w:b w:val="0"/>
+          <w:vanish w:val="0"/>
+          <w:color w:val="555559"/>
+          <w:sz w:val="22"/>
+        </w:rPr>
+        <w:t>3.4 Movement Rules — Tier Progression</w:t>
       </w:r>
       <w:r>
         <w:rPr>
           <w:rFonts w:ascii="Cambria" w:hAnsi="Cambria" w:eastAsia="Cambria" w:cs="Cambria"/>
+          <w:b w:val="0"/>
+          <w:vanish w:val="0"/>
           <w:color w:val="555559"/>
           <w:sz w:val="22"/>
         </w:rPr>
-        <w:br/>
+        <w:tab/>
       </w:r>
       <w:r>
         <w:rPr>
           <w:rFonts w:ascii="Cambria" w:hAnsi="Cambria" w:eastAsia="Cambria" w:cs="Cambria"/>
+          <w:b w:val="0"/>
+          <w:vanish w:val="0"/>
+          <w:color w:val="555559"/>
+          <w:sz w:val="22"/>
+        </w:rPr>
+        <w:t>19</w:t>
+      </w:r>
+    </w:p>
+    <w:p>
+      <w:pPr>
+        <w:tabs>
+          <w:tab w:pos="9864" w:val="right" w:leader="dot"/>
+        </w:tabs>
+        <w:spacing w:before="0" w:after="40" w:line="240" w:lineRule="auto"/>
+        <w:ind w:left="360"/>
+      </w:pPr>
+      <w:r>
+        <w:rPr>
+          <w:rFonts w:ascii="Cambria" w:hAnsi="Cambria" w:eastAsia="Cambria" w:cs="Cambria"/>
+          <w:b w:val="0"/>
+          <w:vanish w:val="0"/>
+          <w:color w:val="555559"/>
+          <w:sz w:val="22"/>
+        </w:rPr>
+        <w:t>3.5 Awards &amp; Rewards</w:t>
+      </w:r>
+      <w:r>
+        <w:rPr>
+          <w:rFonts w:ascii="Cambria" w:hAnsi="Cambria" w:eastAsia="Cambria" w:cs="Cambria"/>
+          <w:b w:val="0"/>
+          <w:vanish w:val="0"/>
+          <w:color w:val="555559"/>
+          <w:sz w:val="22"/>
+        </w:rPr>
+        <w:tab/>
+      </w:r>
+      <w:r>
+        <w:rPr>
+          <w:rFonts w:ascii="Cambria" w:hAnsi="Cambria" w:eastAsia="Cambria" w:cs="Cambria"/>
+          <w:b w:val="0"/>
+          <w:vanish w:val="0"/>
+          <w:color w:val="555559"/>
+          <w:sz w:val="22"/>
+        </w:rPr>
+        <w:t>20</w:t>
+      </w:r>
+    </w:p>
+    <w:p>
+      <w:pPr>
+        <w:tabs>
+          <w:tab w:pos="9864" w:val="right" w:leader="dot"/>
+        </w:tabs>
+        <w:spacing w:before="0" w:after="40" w:line="240" w:lineRule="auto"/>
+        <w:ind w:left="360"/>
+      </w:pPr>
+      <w:r>
+        <w:rPr>
+          <w:rFonts w:ascii="Cambria" w:hAnsi="Cambria" w:eastAsia="Cambria" w:cs="Cambria"/>
+          <w:b w:val="0"/>
+          <w:vanish w:val="0"/>
+          <w:color w:val="555559"/>
+          <w:sz w:val="22"/>
+        </w:rPr>
+        <w:t>3.6 Returns &amp; Point Deduction</w:t>
+      </w:r>
+      <w:r>
+        <w:rPr>
+          <w:rFonts w:ascii="Cambria" w:hAnsi="Cambria" w:eastAsia="Cambria" w:cs="Cambria"/>
+          <w:b w:val="0"/>
+          <w:vanish w:val="0"/>
+          <w:color w:val="555559"/>
+          <w:sz w:val="22"/>
+        </w:rPr>
+        <w:tab/>
+      </w:r>
+      <w:r>
+        <w:rPr>
+          <w:rFonts w:ascii="Cambria" w:hAnsi="Cambria" w:eastAsia="Cambria" w:cs="Cambria"/>
+          <w:b w:val="0"/>
+          <w:vanish w:val="0"/>
+          <w:color w:val="555559"/>
+          <w:sz w:val="22"/>
+        </w:rPr>
+        <w:t>21</w:t>
+      </w:r>
+    </w:p>
+    <w:p>
+      <w:pPr>
+        <w:tabs>
+          <w:tab w:pos="10224" w:val="right" w:leader="dot"/>
+        </w:tabs>
+        <w:spacing w:before="0" w:after="40" w:line="240" w:lineRule="auto"/>
+        <w:ind w:left="0"/>
+      </w:pPr>
+      <w:r>
+        <w:rPr>
+          <w:rFonts w:ascii="Cambria" w:hAnsi="Cambria" w:eastAsia="Cambria" w:cs="Cambria"/>
           <w:b/>
+          <w:vanish w:val="0"/>
           <w:color w:val="555559"/>
           <w:sz w:val="22"/>
         </w:rPr>
@@ -1207,15 +1765,37 @@
       <w:r>
         <w:rPr>
           <w:rFonts w:ascii="Cambria" w:hAnsi="Cambria" w:eastAsia="Cambria" w:cs="Cambria"/>
+          <w:b/>
+          <w:vanish w:val="0"/>
           <w:color w:val="555559"/>
           <w:sz w:val="22"/>
         </w:rPr>
-        <w:br/>
+        <w:tab/>
       </w:r>
       <w:r>
         <w:rPr>
           <w:rFonts w:ascii="Cambria" w:hAnsi="Cambria" w:eastAsia="Cambria" w:cs="Cambria"/>
           <w:b/>
+          <w:vanish w:val="0"/>
+          <w:color w:val="555559"/>
+          <w:sz w:val="22"/>
+        </w:rPr>
+        <w:t>22</w:t>
+      </w:r>
+    </w:p>
+    <w:p>
+      <w:pPr>
+        <w:tabs>
+          <w:tab w:pos="10224" w:val="right" w:leader="dot"/>
+        </w:tabs>
+        <w:spacing w:before="0" w:after="40" w:line="240" w:lineRule="auto"/>
+        <w:ind w:left="0"/>
+      </w:pPr>
+      <w:r>
+        <w:rPr>
+          <w:rFonts w:ascii="Cambria" w:hAnsi="Cambria" w:eastAsia="Cambria" w:cs="Cambria"/>
+          <w:b/>
+          <w:vanish w:val="0"/>
           <w:color w:val="555559"/>
           <w:sz w:val="22"/>
         </w:rPr>
@@ -1224,15 +1804,37 @@
       <w:r>
         <w:rPr>
           <w:rFonts w:ascii="Cambria" w:hAnsi="Cambria" w:eastAsia="Cambria" w:cs="Cambria"/>
+          <w:b/>
+          <w:vanish w:val="0"/>
           <w:color w:val="555559"/>
           <w:sz w:val="22"/>
         </w:rPr>
-        <w:br/>
+        <w:tab/>
       </w:r>
       <w:r>
         <w:rPr>
           <w:rFonts w:ascii="Cambria" w:hAnsi="Cambria" w:eastAsia="Cambria" w:cs="Cambria"/>
           <w:b/>
+          <w:vanish w:val="0"/>
+          <w:color w:val="555559"/>
+          <w:sz w:val="22"/>
+        </w:rPr>
+        <w:t>24</w:t>
+      </w:r>
+    </w:p>
+    <w:p>
+      <w:pPr>
+        <w:tabs>
+          <w:tab w:pos="10224" w:val="right" w:leader="dot"/>
+        </w:tabs>
+        <w:spacing w:before="0" w:after="40" w:line="240" w:lineRule="auto"/>
+        <w:ind w:left="0"/>
+      </w:pPr>
+      <w:r>
+        <w:rPr>
+          <w:rFonts w:ascii="Cambria" w:hAnsi="Cambria" w:eastAsia="Cambria" w:cs="Cambria"/>
+          <w:b/>
+          <w:vanish w:val="0"/>
           <w:color w:val="555559"/>
           <w:sz w:val="22"/>
         </w:rPr>
@@ -1241,6 +1843,27 @@
       <w:r>
         <w:rPr>
           <w:rFonts w:ascii="Cambria" w:hAnsi="Cambria" w:eastAsia="Cambria" w:cs="Cambria"/>
+          <w:b/>
+          <w:vanish w:val="0"/>
+          <w:color w:val="555559"/>
+          <w:sz w:val="22"/>
+        </w:rPr>
+        <w:tab/>
+      </w:r>
+      <w:r>
+        <w:rPr>
+          <w:rFonts w:ascii="Cambria" w:hAnsi="Cambria" w:eastAsia="Cambria" w:cs="Cambria"/>
+          <w:b/>
+          <w:vanish w:val="0"/>
+          <w:color w:val="555559"/>
+          <w:sz w:val="22"/>
+        </w:rPr>
+        <w:t>25</w:t>
+      </w:r>
+      <w:r>
+        <w:rPr>
+          <w:rFonts w:ascii="Cambria" w:hAnsi="Cambria" w:eastAsia="Cambria" w:cs="Cambria"/>
+          <w:b w:val="0"/>
           <w:vanish/>
           <w:color w:val="FFFFFF"/>
           <w:sz w:val="2"/>
@@ -10034,12 +10657,13 @@
   <w:p>
     <w:pPr>
       <w:spacing w:before="0" w:after="0"/>
-      <w:jc w:val="center"/>
+      <w:ind w:left="-1210" w:right="-1210"/>
+      <w:jc w:val="left"/>
     </w:pPr>
     <w:r>
       <w:drawing>
         <wp:inline xmlns:a="http://schemas.openxmlformats.org/drawingml/2006/main" xmlns:pic="http://schemas.openxmlformats.org/drawingml/2006/picture">
-          <wp:extent cx="7772400" cy="172951"/>
+          <wp:extent cx="8001000" cy="160020"/>
           <wp:docPr id="1" name="Picture 1"/>
           <wp:cNvGraphicFramePr>
             <a:graphicFrameLocks noChangeAspect="1"/>
@@ -10048,11 +10672,11 @@
             <a:graphicData uri="http://schemas.openxmlformats.org/drawingml/2006/picture">
               <pic:pic>
                 <pic:nvPicPr>
-                  <pic:cNvPr id="0" name="image.jpg"/>
+                  <pic:cNvPr id="0" name="full_width_header_bar_overextended.png"/>
                   <pic:cNvPicPr/>
                 </pic:nvPicPr>
                 <pic:blipFill>
-                  <a:blip r:embed="rId1"/>
+                  <a:blip r:embed="rId3"/>
                   <a:stretch>
                     <a:fillRect/>
                   </a:stretch>
@@ -10060,7 +10684,7 @@
                 <pic:spPr>
                   <a:xfrm>
                     <a:off x="0" y="0"/>
-                    <a:ext cx="7772400" cy="172951"/>
+                    <a:ext cx="8001000" cy="160020"/>
                   </a:xfrm>
                   <a:prstGeom prst="rect"/>
                 </pic:spPr>

</xml_diff>

<commit_message>
Fix black cover image backgrounds
Co-authored-by: RicardoCasquinha <RicardoCasquinha@users.noreply.github.com>
</commit_message>
<xml_diff>
--- a/Claires - Solution Blueprint - Customer Engagement V1 - Redesigned.docx
+++ b/Claires - Solution Blueprint - Customer Engagement V1 - Redesigned.docx
@@ -41,16 +41,10 @@
               <w:jc w:val="left"/>
             </w:pPr>
             <w:r>
-              <w:rPr>
-                <w:rFonts w:ascii="Cambria" w:hAnsi="Cambria" w:eastAsia="Cambria" w:cs="Cambria"/>
-                <w:b/>
-                <w:color w:val="FFFFFF"/>
-                <w:sz w:val="22"/>
-              </w:rPr>
               <w:drawing>
                 <wp:inline xmlns:a="http://schemas.openxmlformats.org/drawingml/2006/main" xmlns:pic="http://schemas.openxmlformats.org/drawingml/2006/picture">
-                  <wp:extent cx="2240280" cy="788754"/>
-                  <wp:docPr id="19" name="Picture 19"/>
+                  <wp:extent cx="2240280" cy="848106"/>
+                  <wp:docPr id="39" name="Picture 39"/>
                   <wp:cNvGraphicFramePr>
                     <a:graphicFrameLocks noChangeAspect="1"/>
                   </wp:cNvGraphicFramePr>
@@ -58,11 +52,11 @@
                     <a:graphicData uri="http://schemas.openxmlformats.org/drawingml/2006/picture">
                       <pic:pic>
                         <pic:nvPicPr>
-                          <pic:cNvPr id="0" name="logo_left.png"/>
+                          <pic:cNvPr id="0" name="logo_left_rendered.png"/>
                           <pic:cNvPicPr/>
                         </pic:nvPicPr>
                         <pic:blipFill>
-                          <a:blip r:embed="rId27"/>
+                          <a:blip r:embed="rId51"/>
                           <a:stretch>
                             <a:fillRect/>
                           </a:stretch>
@@ -70,7 +64,7 @@
                         <pic:spPr>
                           <a:xfrm>
                             <a:off x="0" y="0"/>
-                            <a:ext cx="2240280" cy="788754"/>
+                            <a:ext cx="2240280" cy="848106"/>
                           </a:xfrm>
                           <a:prstGeom prst="rect"/>
                         </pic:spPr>
@@ -106,16 +100,10 @@
               <w:jc w:val="right"/>
             </w:pPr>
             <w:r>
-              <w:rPr>
-                <w:rFonts w:ascii="Cambria" w:hAnsi="Cambria" w:eastAsia="Cambria" w:cs="Cambria"/>
-                <w:b/>
-                <w:color w:val="FFFFFF"/>
-                <w:sz w:val="22"/>
-              </w:rPr>
               <w:drawing>
                 <wp:inline xmlns:a="http://schemas.openxmlformats.org/drawingml/2006/main" xmlns:pic="http://schemas.openxmlformats.org/drawingml/2006/picture">
-                  <wp:extent cx="1508760" cy="364570"/>
-                  <wp:docPr id="20" name="Picture 20"/>
+                  <wp:extent cx="1508760" cy="441392"/>
+                  <wp:docPr id="40" name="Picture 40"/>
                   <wp:cNvGraphicFramePr>
                     <a:graphicFrameLocks noChangeAspect="1"/>
                   </wp:cNvGraphicFramePr>
@@ -123,11 +111,11 @@
                     <a:graphicData uri="http://schemas.openxmlformats.org/drawingml/2006/picture">
                       <pic:pic>
                         <pic:nvPicPr>
-                          <pic:cNvPr id="0" name="logo_right.png"/>
+                          <pic:cNvPr id="0" name="logo_right_rendered.png"/>
                           <pic:cNvPicPr/>
                         </pic:nvPicPr>
                         <pic:blipFill>
-                          <a:blip r:embed="rId28"/>
+                          <a:blip r:embed="rId52"/>
                           <a:stretch>
                             <a:fillRect/>
                           </a:stretch>
@@ -135,7 +123,7 @@
                         <pic:spPr>
                           <a:xfrm>
                             <a:off x="0" y="0"/>
-                            <a:ext cx="1508760" cy="364570"/>
+                            <a:ext cx="1508760" cy="441392"/>
                           </a:xfrm>
                           <a:prstGeom prst="rect"/>
                         </pic:spPr>

</xml_diff>

<commit_message>
Add yellow open point callouts and clean appendix
Co-authored-by: RicardoCasquinha <RicardoCasquinha@users.noreply.github.com>
</commit_message>
<xml_diff>
--- a/Claires - Solution Blueprint - Customer Engagement V1 - Redesigned.docx
+++ b/Claires - Solution Blueprint - Customer Engagement V1 - Redesigned.docx
@@ -746,18 +746,6 @@
       </w:r>
     </w:p>
     <w:p>
-      <w:r>
-        <w:rPr>
-          <w:rFonts w:ascii="Cambria" w:hAnsi="Cambria" w:eastAsia="Cambria" w:cs="Cambria"/>
-          <w:color w:val="555559"/>
-          <w:sz w:val="22"/>
-        </w:rPr>
-        <w:fldChar w:fldCharType="begin"/>
-        <w:instrText xml:space="preserve">TOC \o "1-3" \h \z \u</w:instrText>
-        <w:fldChar w:fldCharType="end"/>
-      </w:r>
-    </w:p>
-    <w:p>
       <w:pPr>
         <w:tabs>
           <w:tab w:pos="10224" w:val="right" w:leader="dot"/>
@@ -1027,7 +1015,7 @@
           <w:color w:val="555559"/>
           <w:sz w:val="22"/>
         </w:rPr>
-        <w:t>7</w:t>
+        <w:t>8</w:t>
       </w:r>
     </w:p>
     <w:p>
@@ -1861,16 +1849,6 @@
       </w:r>
     </w:p>
     <w:p>
-      <w:r>
-        <w:rPr>
-          <w:rFonts w:ascii="Cambria" w:hAnsi="Cambria" w:eastAsia="Cambria" w:cs="Cambria"/>
-          <w:color w:val="555559"/>
-          <w:sz w:val="22"/>
-        </w:rPr>
-        <w:br w:type="page"/>
-      </w:r>
-    </w:p>
-    <w:p>
       <w:pPr>
         <w:pStyle w:val="Heading1"/>
         <w:pageBreakBefore/>
@@ -1914,12 +1892,12 @@
             <w:tcW w:type="dxa" w:w="9072"/>
             <w:shd w:val="clear" w:color="auto" w:fill="91C3DF"/>
             <w:tcMar>
-              <w:top w:w="70" w:type="dxa"/>
-              <w:bottom w:w="70" w:type="dxa"/>
+              <w:top w:w="90" w:type="dxa"/>
+              <w:bottom w:w="90" w:type="dxa"/>
               <w:left w:w="120" w:type="dxa"/>
               <w:right w:w="120" w:type="dxa"/>
-              <w:start w:w="95" w:type="dxa"/>
-              <w:end w:w="95" w:type="dxa"/>
+              <w:start w:w="120" w:type="dxa"/>
+              <w:end w:w="120" w:type="dxa"/>
             </w:tcMar>
             <w:vAlign w:val="center"/>
             <w:tcBorders>
@@ -1931,7 +1909,7 @@
           </w:tcPr>
           <w:p>
             <w:pPr>
-              <w:spacing w:after="30"/>
+              <w:spacing w:after="40" w:before="0"/>
             </w:pPr>
             <w:r>
               <w:rPr>
@@ -1971,12 +1949,12 @@
             <w:tcW w:type="dxa" w:w="9072"/>
             <w:shd w:val="clear" w:color="auto" w:fill="FFC499"/>
             <w:tcMar>
-              <w:top w:w="70" w:type="dxa"/>
-              <w:bottom w:w="70" w:type="dxa"/>
+              <w:top w:w="90" w:type="dxa"/>
+              <w:bottom w:w="90" w:type="dxa"/>
               <w:left w:w="120" w:type="dxa"/>
               <w:right w:w="120" w:type="dxa"/>
-              <w:start w:w="95" w:type="dxa"/>
-              <w:end w:w="95" w:type="dxa"/>
+              <w:start w:w="120" w:type="dxa"/>
+              <w:end w:w="120" w:type="dxa"/>
             </w:tcMar>
             <w:vAlign w:val="center"/>
             <w:tcBorders>
@@ -1988,7 +1966,7 @@
           </w:tcPr>
           <w:p>
             <w:pPr>
-              <w:spacing w:after="30"/>
+              <w:spacing w:after="40" w:before="0"/>
             </w:pPr>
             <w:r>
               <w:rPr>
@@ -2028,12 +2006,12 @@
             <w:tcW w:type="dxa" w:w="9072"/>
             <w:shd w:val="clear" w:color="auto" w:fill="A7DC85"/>
             <w:tcMar>
-              <w:top w:w="70" w:type="dxa"/>
-              <w:bottom w:w="70" w:type="dxa"/>
+              <w:top w:w="90" w:type="dxa"/>
+              <w:bottom w:w="90" w:type="dxa"/>
               <w:left w:w="120" w:type="dxa"/>
               <w:right w:w="120" w:type="dxa"/>
-              <w:start w:w="95" w:type="dxa"/>
-              <w:end w:w="95" w:type="dxa"/>
+              <w:start w:w="120" w:type="dxa"/>
+              <w:end w:w="120" w:type="dxa"/>
             </w:tcMar>
             <w:vAlign w:val="center"/>
             <w:tcBorders>
@@ -2045,7 +2023,7 @@
           </w:tcPr>
           <w:p>
             <w:pPr>
-              <w:spacing w:after="30"/>
+              <w:spacing w:after="40" w:before="0"/>
             </w:pPr>
             <w:r>
               <w:rPr>
@@ -2063,6 +2041,50 @@
                 <w:sz w:val="22"/>
               </w:rPr>
               <w:t>Assumptions made are highlighted in green.</w:t>
+            </w:r>
+          </w:p>
+        </w:tc>
+      </w:tr>
+    </w:tbl>
+    <w:tbl>
+      <w:tblPr>
+        <w:tblW w:type="auto" w:w="0"/>
+        <w:jc w:val="center"/>
+        <w:tblLook w:firstColumn="1" w:firstRow="1" w:lastColumn="0" w:lastRow="0" w:noHBand="0" w:noVBand="1" w:val="04A0"/>
+      </w:tblPr>
+      <w:tblGrid>
+        <w:gridCol w:w="10224"/>
+      </w:tblGrid>
+      <w:tr>
+        <w:tc>
+          <w:tcPr>
+            <w:tcW w:type="dxa" w:w="10224"/>
+            <w:shd w:fill="FFD966"/>
+            <w:tcBorders>
+              <w:top w:val="single" w:sz="10" w:space="0" w:color="D6B656"/>
+              <w:left w:val="single" w:sz="10" w:space="0" w:color="D6B656"/>
+              <w:bottom w:val="single" w:sz="10" w:space="0" w:color="D6B656"/>
+              <w:right w:val="single" w:sz="10" w:space="0" w:color="D6B656"/>
+            </w:tcBorders>
+            <w:tcMar>
+              <w:top w:w="90" w:type="dxa"/>
+              <w:start w:w="120" w:type="dxa"/>
+              <w:bottom w:w="90" w:type="dxa"/>
+              <w:end w:w="120" w:type="dxa"/>
+            </w:tcMar>
+            <w:vAlign w:val="center"/>
+          </w:tcPr>
+          <w:p>
+            <w:pPr>
+              <w:spacing w:before="0" w:after="40"/>
+            </w:pPr>
+            <w:r>
+              <w:rPr>
+                <w:rFonts w:ascii="Cambria" w:hAnsi="Cambria" w:eastAsia="Cambria" w:cs="Cambria"/>
+                <w:color w:val="000000"/>
+                <w:sz w:val="22"/>
+              </w:rPr>
+              <w:t>OP.0: Open points requiring validation or confirmation are highlighted in yellow.</w:t>
             </w:r>
           </w:p>
         </w:tc>
@@ -2341,12 +2363,12 @@
             <w:tcW w:type="dxa" w:w="9072"/>
             <w:shd w:val="clear" w:color="auto" w:fill="A7DC85"/>
             <w:tcMar>
-              <w:top w:w="70" w:type="dxa"/>
-              <w:bottom w:w="70" w:type="dxa"/>
+              <w:top w:w="90" w:type="dxa"/>
+              <w:bottom w:w="90" w:type="dxa"/>
               <w:left w:w="120" w:type="dxa"/>
               <w:right w:w="120" w:type="dxa"/>
-              <w:start w:w="95" w:type="dxa"/>
-              <w:end w:w="95" w:type="dxa"/>
+              <w:start w:w="120" w:type="dxa"/>
+              <w:end w:w="120" w:type="dxa"/>
             </w:tcMar>
             <w:vAlign w:val="center"/>
             <w:tcBorders>
@@ -2358,7 +2380,7 @@
           </w:tcPr>
           <w:p>
             <w:pPr>
-              <w:spacing w:after="30"/>
+              <w:spacing w:after="40" w:before="0"/>
             </w:pPr>
             <w:r>
               <w:rPr>
@@ -2398,12 +2420,12 @@
             <w:tcW w:type="dxa" w:w="9072"/>
             <w:shd w:val="clear" w:color="auto" w:fill="91C3DF"/>
             <w:tcMar>
-              <w:top w:w="70" w:type="dxa"/>
-              <w:bottom w:w="70" w:type="dxa"/>
+              <w:top w:w="90" w:type="dxa"/>
+              <w:bottom w:w="90" w:type="dxa"/>
               <w:left w:w="120" w:type="dxa"/>
               <w:right w:w="120" w:type="dxa"/>
-              <w:start w:w="95" w:type="dxa"/>
-              <w:end w:w="95" w:type="dxa"/>
+              <w:start w:w="120" w:type="dxa"/>
+              <w:end w:w="120" w:type="dxa"/>
             </w:tcMar>
             <w:vAlign w:val="center"/>
             <w:tcBorders>
@@ -2415,7 +2437,7 @@
           </w:tcPr>
           <w:p>
             <w:pPr>
-              <w:spacing w:after="30"/>
+              <w:spacing w:after="40" w:before="0"/>
             </w:pPr>
             <w:r>
               <w:rPr>
@@ -2455,12 +2477,12 @@
             <w:tcW w:type="dxa" w:w="9072"/>
             <w:shd w:val="clear" w:color="auto" w:fill="FFC499"/>
             <w:tcMar>
-              <w:top w:w="70" w:type="dxa"/>
-              <w:bottom w:w="70" w:type="dxa"/>
+              <w:top w:w="90" w:type="dxa"/>
+              <w:bottom w:w="90" w:type="dxa"/>
               <w:left w:w="120" w:type="dxa"/>
               <w:right w:w="120" w:type="dxa"/>
-              <w:start w:w="95" w:type="dxa"/>
-              <w:end w:w="95" w:type="dxa"/>
+              <w:start w:w="120" w:type="dxa"/>
+              <w:end w:w="120" w:type="dxa"/>
             </w:tcMar>
             <w:vAlign w:val="center"/>
             <w:tcBorders>
@@ -2472,7 +2494,7 @@
           </w:tcPr>
           <w:p>
             <w:pPr>
-              <w:spacing w:after="30"/>
+              <w:spacing w:after="40" w:before="0"/>
             </w:pPr>
             <w:r>
               <w:rPr>
@@ -2490,6 +2512,50 @@
                 <w:sz w:val="22"/>
               </w:rPr>
               <w:t>Dashboard panels visibility per user role to be aligned with Claire's security model.</w:t>
+            </w:r>
+          </w:p>
+        </w:tc>
+      </w:tr>
+    </w:tbl>
+    <w:tbl>
+      <w:tblPr>
+        <w:tblW w:type="auto" w:w="0"/>
+        <w:jc w:val="center"/>
+        <w:tblLook w:firstColumn="1" w:firstRow="1" w:lastColumn="0" w:lastRow="0" w:noHBand="0" w:noVBand="1" w:val="04A0"/>
+      </w:tblPr>
+      <w:tblGrid>
+        <w:gridCol w:w="10224"/>
+      </w:tblGrid>
+      <w:tr>
+        <w:tc>
+          <w:tcPr>
+            <w:tcW w:type="dxa" w:w="10224"/>
+            <w:shd w:fill="FFD966"/>
+            <w:tcBorders>
+              <w:top w:val="single" w:sz="10" w:space="0" w:color="D6B656"/>
+              <w:left w:val="single" w:sz="10" w:space="0" w:color="D6B656"/>
+              <w:bottom w:val="single" w:sz="10" w:space="0" w:color="D6B656"/>
+              <w:right w:val="single" w:sz="10" w:space="0" w:color="D6B656"/>
+            </w:tcBorders>
+            <w:tcMar>
+              <w:top w:w="90" w:type="dxa"/>
+              <w:start w:w="120" w:type="dxa"/>
+              <w:bottom w:w="90" w:type="dxa"/>
+              <w:end w:w="120" w:type="dxa"/>
+            </w:tcMar>
+            <w:vAlign w:val="center"/>
+          </w:tcPr>
+          <w:p>
+            <w:pPr>
+              <w:spacing w:before="0" w:after="40"/>
+            </w:pPr>
+            <w:r>
+              <w:rPr>
+                <w:rFonts w:ascii="Cambria" w:hAnsi="Cambria" w:eastAsia="Cambria" w:cs="Cambria"/>
+                <w:color w:val="000000"/>
+                <w:sz w:val="22"/>
+              </w:rPr>
+              <w:t>OP-01: Dashboard panels visibility per user role to be aligned with security model.</w:t>
             </w:r>
           </w:p>
         </w:tc>
@@ -2604,12 +2670,12 @@
             <w:tcW w:type="dxa" w:w="9072"/>
             <w:shd w:val="clear" w:color="auto" w:fill="A7DC85"/>
             <w:tcMar>
-              <w:top w:w="70" w:type="dxa"/>
-              <w:bottom w:w="70" w:type="dxa"/>
+              <w:top w:w="90" w:type="dxa"/>
+              <w:bottom w:w="90" w:type="dxa"/>
               <w:left w:w="120" w:type="dxa"/>
               <w:right w:w="120" w:type="dxa"/>
-              <w:start w:w="95" w:type="dxa"/>
-              <w:end w:w="95" w:type="dxa"/>
+              <w:start w:w="120" w:type="dxa"/>
+              <w:end w:w="120" w:type="dxa"/>
             </w:tcMar>
             <w:vAlign w:val="center"/>
             <w:tcBorders>
@@ -2621,7 +2687,7 @@
           </w:tcPr>
           <w:p>
             <w:pPr>
-              <w:spacing w:after="30"/>
+              <w:spacing w:after="40" w:before="0"/>
             </w:pPr>
             <w:r>
               <w:rPr>
@@ -2661,12 +2727,12 @@
             <w:tcW w:type="dxa" w:w="9072"/>
             <w:shd w:val="clear" w:color="auto" w:fill="91C3DF"/>
             <w:tcMar>
-              <w:top w:w="70" w:type="dxa"/>
-              <w:bottom w:w="70" w:type="dxa"/>
+              <w:top w:w="90" w:type="dxa"/>
+              <w:bottom w:w="90" w:type="dxa"/>
               <w:left w:w="120" w:type="dxa"/>
               <w:right w:w="120" w:type="dxa"/>
-              <w:start w:w="95" w:type="dxa"/>
-              <w:end w:w="95" w:type="dxa"/>
+              <w:start w:w="120" w:type="dxa"/>
+              <w:end w:w="120" w:type="dxa"/>
             </w:tcMar>
             <w:vAlign w:val="center"/>
             <w:tcBorders>
@@ -2678,7 +2744,7 @@
           </w:tcPr>
           <w:p>
             <w:pPr>
-              <w:spacing w:after="30"/>
+              <w:spacing w:after="40" w:before="0"/>
             </w:pPr>
             <w:r>
               <w:rPr>
@@ -2718,12 +2784,12 @@
             <w:tcW w:type="dxa" w:w="9072"/>
             <w:shd w:val="clear" w:color="auto" w:fill="FFC499"/>
             <w:tcMar>
-              <w:top w:w="70" w:type="dxa"/>
-              <w:bottom w:w="70" w:type="dxa"/>
+              <w:top w:w="90" w:type="dxa"/>
+              <w:bottom w:w="90" w:type="dxa"/>
               <w:left w:w="120" w:type="dxa"/>
               <w:right w:w="120" w:type="dxa"/>
-              <w:start w:w="95" w:type="dxa"/>
-              <w:end w:w="95" w:type="dxa"/>
+              <w:start w:w="120" w:type="dxa"/>
+              <w:end w:w="120" w:type="dxa"/>
             </w:tcMar>
             <w:vAlign w:val="center"/>
             <w:tcBorders>
@@ -2735,7 +2801,7 @@
           </w:tcPr>
           <w:p>
             <w:pPr>
-              <w:spacing w:after="30"/>
+              <w:spacing w:after="40" w:before="0"/>
             </w:pPr>
             <w:r>
               <w:rPr>
@@ -2753,6 +2819,50 @@
                 <w:sz w:val="22"/>
               </w:rPr>
               <w:t>Customer merge strategy and data-quality ownership to be defined with the marketing team.</w:t>
+            </w:r>
+          </w:p>
+        </w:tc>
+      </w:tr>
+    </w:tbl>
+    <w:tbl>
+      <w:tblPr>
+        <w:tblW w:type="auto" w:w="0"/>
+        <w:jc w:val="center"/>
+        <w:tblLook w:firstColumn="1" w:firstRow="1" w:lastColumn="0" w:lastRow="0" w:noHBand="0" w:noVBand="1" w:val="04A0"/>
+      </w:tblPr>
+      <w:tblGrid>
+        <w:gridCol w:w="10224"/>
+      </w:tblGrid>
+      <w:tr>
+        <w:tc>
+          <w:tcPr>
+            <w:tcW w:type="dxa" w:w="10224"/>
+            <w:shd w:fill="FFD966"/>
+            <w:tcBorders>
+              <w:top w:val="single" w:sz="10" w:space="0" w:color="D6B656"/>
+              <w:left w:val="single" w:sz="10" w:space="0" w:color="D6B656"/>
+              <w:bottom w:val="single" w:sz="10" w:space="0" w:color="D6B656"/>
+              <w:right w:val="single" w:sz="10" w:space="0" w:color="D6B656"/>
+            </w:tcBorders>
+            <w:tcMar>
+              <w:top w:w="90" w:type="dxa"/>
+              <w:start w:w="120" w:type="dxa"/>
+              <w:bottom w:w="90" w:type="dxa"/>
+              <w:end w:w="120" w:type="dxa"/>
+            </w:tcMar>
+            <w:vAlign w:val="center"/>
+          </w:tcPr>
+          <w:p>
+            <w:pPr>
+              <w:spacing w:before="0" w:after="40"/>
+            </w:pPr>
+            <w:r>
+              <w:rPr>
+                <w:rFonts w:ascii="Cambria" w:hAnsi="Cambria" w:eastAsia="Cambria" w:cs="Cambria"/>
+                <w:color w:val="000000"/>
+                <w:sz w:val="22"/>
+              </w:rPr>
+              <w:t>OP-02: Customer merge strategy and data-quality ownership to be defined.</w:t>
             </w:r>
           </w:p>
         </w:tc>
@@ -2857,12 +2967,12 @@
             <w:tcW w:type="dxa" w:w="9072"/>
             <w:shd w:val="clear" w:color="auto" w:fill="A7DC85"/>
             <w:tcMar>
-              <w:top w:w="70" w:type="dxa"/>
-              <w:bottom w:w="70" w:type="dxa"/>
+              <w:top w:w="90" w:type="dxa"/>
+              <w:bottom w:w="90" w:type="dxa"/>
               <w:left w:w="120" w:type="dxa"/>
               <w:right w:w="120" w:type="dxa"/>
-              <w:start w:w="95" w:type="dxa"/>
-              <w:end w:w="95" w:type="dxa"/>
+              <w:start w:w="120" w:type="dxa"/>
+              <w:end w:w="120" w:type="dxa"/>
             </w:tcMar>
             <w:vAlign w:val="center"/>
             <w:tcBorders>
@@ -2874,7 +2984,7 @@
           </w:tcPr>
           <w:p>
             <w:pPr>
-              <w:spacing w:after="30"/>
+              <w:spacing w:after="40" w:before="0"/>
             </w:pPr>
             <w:r>
               <w:rPr>
@@ -2914,12 +3024,12 @@
             <w:tcW w:type="dxa" w:w="9072"/>
             <w:shd w:val="clear" w:color="auto" w:fill="91C3DF"/>
             <w:tcMar>
-              <w:top w:w="70" w:type="dxa"/>
-              <w:bottom w:w="70" w:type="dxa"/>
+              <w:top w:w="90" w:type="dxa"/>
+              <w:bottom w:w="90" w:type="dxa"/>
               <w:left w:w="120" w:type="dxa"/>
               <w:right w:w="120" w:type="dxa"/>
-              <w:start w:w="95" w:type="dxa"/>
-              <w:end w:w="95" w:type="dxa"/>
+              <w:start w:w="120" w:type="dxa"/>
+              <w:end w:w="120" w:type="dxa"/>
             </w:tcMar>
             <w:vAlign w:val="center"/>
             <w:tcBorders>
@@ -2931,7 +3041,7 @@
           </w:tcPr>
           <w:p>
             <w:pPr>
-              <w:spacing w:after="30"/>
+              <w:spacing w:after="40" w:before="0"/>
             </w:pPr>
             <w:r>
               <w:rPr>
@@ -2971,12 +3081,12 @@
             <w:tcW w:type="dxa" w:w="9072"/>
             <w:shd w:val="clear" w:color="auto" w:fill="FFC499"/>
             <w:tcMar>
-              <w:top w:w="70" w:type="dxa"/>
-              <w:bottom w:w="70" w:type="dxa"/>
+              <w:top w:w="90" w:type="dxa"/>
+              <w:bottom w:w="90" w:type="dxa"/>
               <w:left w:w="120" w:type="dxa"/>
               <w:right w:w="120" w:type="dxa"/>
-              <w:start w:w="95" w:type="dxa"/>
-              <w:end w:w="95" w:type="dxa"/>
+              <w:start w:w="120" w:type="dxa"/>
+              <w:end w:w="120" w:type="dxa"/>
             </w:tcMar>
             <w:vAlign w:val="center"/>
             <w:tcBorders>
@@ -2988,7 +3098,7 @@
           </w:tcPr>
           <w:p>
             <w:pPr>
-              <w:spacing w:after="30"/>
+              <w:spacing w:after="40" w:before="0"/>
             </w:pPr>
             <w:r>
               <w:rPr>
@@ -3006,6 +3116,50 @@
                 <w:sz w:val="22"/>
               </w:rPr>
               <w:t>Required history retention period for the purchase profile to be defined.</w:t>
+            </w:r>
+          </w:p>
+        </w:tc>
+      </w:tr>
+    </w:tbl>
+    <w:tbl>
+      <w:tblPr>
+        <w:tblW w:type="auto" w:w="0"/>
+        <w:jc w:val="center"/>
+        <w:tblLook w:firstColumn="1" w:firstRow="1" w:lastColumn="0" w:lastRow="0" w:noHBand="0" w:noVBand="1" w:val="04A0"/>
+      </w:tblPr>
+      <w:tblGrid>
+        <w:gridCol w:w="10224"/>
+      </w:tblGrid>
+      <w:tr>
+        <w:tc>
+          <w:tcPr>
+            <w:tcW w:type="dxa" w:w="10224"/>
+            <w:shd w:fill="FFD966"/>
+            <w:tcBorders>
+              <w:top w:val="single" w:sz="10" w:space="0" w:color="D6B656"/>
+              <w:left w:val="single" w:sz="10" w:space="0" w:color="D6B656"/>
+              <w:bottom w:val="single" w:sz="10" w:space="0" w:color="D6B656"/>
+              <w:right w:val="single" w:sz="10" w:space="0" w:color="D6B656"/>
+            </w:tcBorders>
+            <w:tcMar>
+              <w:top w:w="90" w:type="dxa"/>
+              <w:start w:w="120" w:type="dxa"/>
+              <w:bottom w:w="90" w:type="dxa"/>
+              <w:end w:w="120" w:type="dxa"/>
+            </w:tcMar>
+            <w:vAlign w:val="center"/>
+          </w:tcPr>
+          <w:p>
+            <w:pPr>
+              <w:spacing w:before="0" w:after="40"/>
+            </w:pPr>
+            <w:r>
+              <w:rPr>
+                <w:rFonts w:ascii="Cambria" w:hAnsi="Cambria" w:eastAsia="Cambria" w:cs="Cambria"/>
+                <w:color w:val="000000"/>
+                <w:sz w:val="22"/>
+              </w:rPr>
+              <w:t>OP-03: Required history retention period for the purchase profile to be defined.</w:t>
             </w:r>
           </w:p>
         </w:tc>
@@ -3120,12 +3274,12 @@
             <w:tcW w:type="dxa" w:w="9072"/>
             <w:shd w:val="clear" w:color="auto" w:fill="FFC499"/>
             <w:tcMar>
-              <w:top w:w="70" w:type="dxa"/>
-              <w:bottom w:w="70" w:type="dxa"/>
+              <w:top w:w="90" w:type="dxa"/>
+              <w:bottom w:w="90" w:type="dxa"/>
               <w:left w:w="120" w:type="dxa"/>
               <w:right w:w="120" w:type="dxa"/>
-              <w:start w:w="95" w:type="dxa"/>
-              <w:end w:w="95" w:type="dxa"/>
+              <w:start w:w="120" w:type="dxa"/>
+              <w:end w:w="120" w:type="dxa"/>
             </w:tcMar>
             <w:vAlign w:val="center"/>
             <w:tcBorders>
@@ -3137,7 +3291,7 @@
           </w:tcPr>
           <w:p>
             <w:pPr>
-              <w:spacing w:after="30"/>
+              <w:spacing w:after="40" w:before="0"/>
             </w:pPr>
             <w:r>
               <w:rPr>
@@ -3177,12 +3331,12 @@
             <w:tcW w:type="dxa" w:w="9072"/>
             <w:shd w:val="clear" w:color="auto" w:fill="91C3DF"/>
             <w:tcMar>
-              <w:top w:w="70" w:type="dxa"/>
-              <w:bottom w:w="70" w:type="dxa"/>
+              <w:top w:w="90" w:type="dxa"/>
+              <w:bottom w:w="90" w:type="dxa"/>
               <w:left w:w="120" w:type="dxa"/>
               <w:right w:w="120" w:type="dxa"/>
-              <w:start w:w="95" w:type="dxa"/>
-              <w:end w:w="95" w:type="dxa"/>
+              <w:start w:w="120" w:type="dxa"/>
+              <w:end w:w="120" w:type="dxa"/>
             </w:tcMar>
             <w:vAlign w:val="center"/>
             <w:tcBorders>
@@ -3194,7 +3348,7 @@
           </w:tcPr>
           <w:p>
             <w:pPr>
-              <w:spacing w:after="30"/>
+              <w:spacing w:after="40" w:before="0"/>
             </w:pPr>
             <w:r>
               <w:rPr>
@@ -3336,12 +3490,12 @@
             <w:tcW w:type="dxa" w:w="9072"/>
             <w:shd w:val="clear" w:color="auto" w:fill="91C3DF"/>
             <w:tcMar>
-              <w:top w:w="70" w:type="dxa"/>
-              <w:bottom w:w="70" w:type="dxa"/>
+              <w:top w:w="90" w:type="dxa"/>
+              <w:bottom w:w="90" w:type="dxa"/>
               <w:left w:w="120" w:type="dxa"/>
               <w:right w:w="120" w:type="dxa"/>
-              <w:start w:w="95" w:type="dxa"/>
-              <w:end w:w="95" w:type="dxa"/>
+              <w:start w:w="120" w:type="dxa"/>
+              <w:end w:w="120" w:type="dxa"/>
             </w:tcMar>
             <w:vAlign w:val="center"/>
             <w:tcBorders>
@@ -3353,7 +3507,7 @@
           </w:tcPr>
           <w:p>
             <w:pPr>
-              <w:spacing w:after="30"/>
+              <w:spacing w:after="40" w:before="0"/>
             </w:pPr>
             <w:r>
               <w:rPr>
@@ -3393,12 +3547,12 @@
             <w:tcW w:type="dxa" w:w="9072"/>
             <w:shd w:val="clear" w:color="auto" w:fill="FFC499"/>
             <w:tcMar>
-              <w:top w:w="70" w:type="dxa"/>
-              <w:bottom w:w="70" w:type="dxa"/>
+              <w:top w:w="90" w:type="dxa"/>
+              <w:bottom w:w="90" w:type="dxa"/>
               <w:left w:w="120" w:type="dxa"/>
               <w:right w:w="120" w:type="dxa"/>
-              <w:start w:w="95" w:type="dxa"/>
-              <w:end w:w="95" w:type="dxa"/>
+              <w:start w:w="120" w:type="dxa"/>
+              <w:end w:w="120" w:type="dxa"/>
             </w:tcMar>
             <w:vAlign w:val="center"/>
             <w:tcBorders>
@@ -3410,7 +3564,7 @@
           </w:tcPr>
           <w:p>
             <w:pPr>
-              <w:spacing w:after="30"/>
+              <w:spacing w:after="40" w:before="0"/>
             </w:pPr>
             <w:r>
               <w:rPr>
@@ -3450,12 +3604,12 @@
             <w:tcW w:type="dxa" w:w="9072"/>
             <w:shd w:val="clear" w:color="auto" w:fill="A7DC85"/>
             <w:tcMar>
-              <w:top w:w="70" w:type="dxa"/>
-              <w:bottom w:w="70" w:type="dxa"/>
+              <w:top w:w="90" w:type="dxa"/>
+              <w:bottom w:w="90" w:type="dxa"/>
               <w:left w:w="120" w:type="dxa"/>
               <w:right w:w="120" w:type="dxa"/>
-              <w:start w:w="95" w:type="dxa"/>
-              <w:end w:w="95" w:type="dxa"/>
+              <w:start w:w="120" w:type="dxa"/>
+              <w:end w:w="120" w:type="dxa"/>
             </w:tcMar>
             <w:vAlign w:val="center"/>
             <w:tcBorders>
@@ -3467,7 +3621,7 @@
           </w:tcPr>
           <w:p>
             <w:pPr>
-              <w:spacing w:after="30"/>
+              <w:spacing w:after="40" w:before="0"/>
             </w:pPr>
             <w:r>
               <w:rPr>
@@ -3507,12 +3661,12 @@
             <w:tcW w:type="dxa" w:w="9072"/>
             <w:shd w:val="clear" w:color="auto" w:fill="91C3DF"/>
             <w:tcMar>
-              <w:top w:w="70" w:type="dxa"/>
-              <w:bottom w:w="70" w:type="dxa"/>
+              <w:top w:w="90" w:type="dxa"/>
+              <w:bottom w:w="90" w:type="dxa"/>
               <w:left w:w="120" w:type="dxa"/>
               <w:right w:w="120" w:type="dxa"/>
-              <w:start w:w="95" w:type="dxa"/>
-              <w:end w:w="95" w:type="dxa"/>
+              <w:start w:w="120" w:type="dxa"/>
+              <w:end w:w="120" w:type="dxa"/>
             </w:tcMar>
             <w:vAlign w:val="center"/>
             <w:tcBorders>
@@ -3524,7 +3678,7 @@
           </w:tcPr>
           <w:p>
             <w:pPr>
-              <w:spacing w:after="30"/>
+              <w:spacing w:after="40" w:before="0"/>
             </w:pPr>
             <w:r>
               <w:rPr>
@@ -3656,12 +3810,12 @@
             <w:tcW w:type="dxa" w:w="9072"/>
             <w:shd w:val="clear" w:color="auto" w:fill="A7DC85"/>
             <w:tcMar>
-              <w:top w:w="70" w:type="dxa"/>
-              <w:bottom w:w="70" w:type="dxa"/>
+              <w:top w:w="90" w:type="dxa"/>
+              <w:bottom w:w="90" w:type="dxa"/>
               <w:left w:w="120" w:type="dxa"/>
               <w:right w:w="120" w:type="dxa"/>
-              <w:start w:w="95" w:type="dxa"/>
-              <w:end w:w="95" w:type="dxa"/>
+              <w:start w:w="120" w:type="dxa"/>
+              <w:end w:w="120" w:type="dxa"/>
             </w:tcMar>
             <w:vAlign w:val="center"/>
             <w:tcBorders>
@@ -3673,7 +3827,7 @@
           </w:tcPr>
           <w:p>
             <w:pPr>
-              <w:spacing w:after="30"/>
+              <w:spacing w:after="40" w:before="0"/>
             </w:pPr>
             <w:r>
               <w:rPr>
@@ -3713,12 +3867,12 @@
             <w:tcW w:type="dxa" w:w="9072"/>
             <w:shd w:val="clear" w:color="auto" w:fill="FFC499"/>
             <w:tcMar>
-              <w:top w:w="70" w:type="dxa"/>
-              <w:bottom w:w="70" w:type="dxa"/>
+              <w:top w:w="90" w:type="dxa"/>
+              <w:bottom w:w="90" w:type="dxa"/>
               <w:left w:w="120" w:type="dxa"/>
               <w:right w:w="120" w:type="dxa"/>
-              <w:start w:w="95" w:type="dxa"/>
-              <w:end w:w="95" w:type="dxa"/>
+              <w:start w:w="120" w:type="dxa"/>
+              <w:end w:w="120" w:type="dxa"/>
             </w:tcMar>
             <w:vAlign w:val="center"/>
             <w:tcBorders>
@@ -3730,7 +3884,7 @@
           </w:tcPr>
           <w:p>
             <w:pPr>
-              <w:spacing w:after="30"/>
+              <w:spacing w:after="40" w:before="0"/>
             </w:pPr>
             <w:r>
               <w:rPr>
@@ -3748,6 +3902,50 @@
                 <w:sz w:val="22"/>
               </w:rPr>
               <w:t>Strata boundaries and refresh frequency to be defined per segment use case.</w:t>
+            </w:r>
+          </w:p>
+        </w:tc>
+      </w:tr>
+    </w:tbl>
+    <w:tbl>
+      <w:tblPr>
+        <w:tblW w:type="auto" w:w="0"/>
+        <w:jc w:val="center"/>
+        <w:tblLook w:firstColumn="1" w:firstRow="1" w:lastColumn="0" w:lastRow="0" w:noHBand="0" w:noVBand="1" w:val="04A0"/>
+      </w:tblPr>
+      <w:tblGrid>
+        <w:gridCol w:w="10224"/>
+      </w:tblGrid>
+      <w:tr>
+        <w:tc>
+          <w:tcPr>
+            <w:tcW w:type="dxa" w:w="10224"/>
+            <w:shd w:fill="FFD966"/>
+            <w:tcBorders>
+              <w:top w:val="single" w:sz="10" w:space="0" w:color="D6B656"/>
+              <w:left w:val="single" w:sz="10" w:space="0" w:color="D6B656"/>
+              <w:bottom w:val="single" w:sz="10" w:space="0" w:color="D6B656"/>
+              <w:right w:val="single" w:sz="10" w:space="0" w:color="D6B656"/>
+            </w:tcBorders>
+            <w:tcMar>
+              <w:top w:w="90" w:type="dxa"/>
+              <w:start w:w="120" w:type="dxa"/>
+              <w:bottom w:w="90" w:type="dxa"/>
+              <w:end w:w="120" w:type="dxa"/>
+            </w:tcMar>
+            <w:vAlign w:val="center"/>
+          </w:tcPr>
+          <w:p>
+            <w:pPr>
+              <w:spacing w:before="0" w:after="40"/>
+            </w:pPr>
+            <w:r>
+              <w:rPr>
+                <w:rFonts w:ascii="Cambria" w:hAnsi="Cambria" w:eastAsia="Cambria" w:cs="Cambria"/>
+                <w:color w:val="000000"/>
+                <w:sz w:val="22"/>
+              </w:rPr>
+              <w:t>OP-04: Strata boundaries and refresh frequency to be defined per use case.</w:t>
             </w:r>
           </w:p>
         </w:tc>
@@ -3900,12 +4098,12 @@
             <w:tcW w:type="dxa" w:w="9072"/>
             <w:shd w:val="clear" w:color="auto" w:fill="A7DC85"/>
             <w:tcMar>
-              <w:top w:w="70" w:type="dxa"/>
-              <w:bottom w:w="70" w:type="dxa"/>
+              <w:top w:w="90" w:type="dxa"/>
+              <w:bottom w:w="90" w:type="dxa"/>
               <w:left w:w="120" w:type="dxa"/>
               <w:right w:w="120" w:type="dxa"/>
-              <w:start w:w="95" w:type="dxa"/>
-              <w:end w:w="95" w:type="dxa"/>
+              <w:start w:w="120" w:type="dxa"/>
+              <w:end w:w="120" w:type="dxa"/>
             </w:tcMar>
             <w:vAlign w:val="center"/>
             <w:tcBorders>
@@ -3917,7 +4115,7 @@
           </w:tcPr>
           <w:p>
             <w:pPr>
-              <w:spacing w:after="30"/>
+              <w:spacing w:after="40" w:before="0"/>
             </w:pPr>
             <w:r>
               <w:rPr>
@@ -3957,12 +4155,12 @@
             <w:tcW w:type="dxa" w:w="9072"/>
             <w:shd w:val="clear" w:color="auto" w:fill="91C3DF"/>
             <w:tcMar>
-              <w:top w:w="70" w:type="dxa"/>
-              <w:bottom w:w="70" w:type="dxa"/>
+              <w:top w:w="90" w:type="dxa"/>
+              <w:bottom w:w="90" w:type="dxa"/>
               <w:left w:w="120" w:type="dxa"/>
               <w:right w:w="120" w:type="dxa"/>
-              <w:start w:w="95" w:type="dxa"/>
-              <w:end w:w="95" w:type="dxa"/>
+              <w:start w:w="120" w:type="dxa"/>
+              <w:end w:w="120" w:type="dxa"/>
             </w:tcMar>
             <w:vAlign w:val="center"/>
             <w:tcBorders>
@@ -3974,7 +4172,7 @@
           </w:tcPr>
           <w:p>
             <w:pPr>
-              <w:spacing w:after="30"/>
+              <w:spacing w:after="40" w:before="0"/>
             </w:pPr>
             <w:r>
               <w:rPr>
@@ -4014,12 +4212,12 @@
             <w:tcW w:type="dxa" w:w="9072"/>
             <w:shd w:val="clear" w:color="auto" w:fill="FFC499"/>
             <w:tcMar>
-              <w:top w:w="70" w:type="dxa"/>
-              <w:bottom w:w="70" w:type="dxa"/>
+              <w:top w:w="90" w:type="dxa"/>
+              <w:bottom w:w="90" w:type="dxa"/>
               <w:left w:w="120" w:type="dxa"/>
               <w:right w:w="120" w:type="dxa"/>
-              <w:start w:w="95" w:type="dxa"/>
-              <w:end w:w="95" w:type="dxa"/>
+              <w:start w:w="120" w:type="dxa"/>
+              <w:end w:w="120" w:type="dxa"/>
             </w:tcMar>
             <w:vAlign w:val="center"/>
             <w:tcBorders>
@@ -4031,7 +4229,7 @@
           </w:tcPr>
           <w:p>
             <w:pPr>
-              <w:spacing w:after="30"/>
+              <w:spacing w:after="40" w:before="0"/>
             </w:pPr>
             <w:r>
               <w:rPr>
@@ -4049,6 +4247,50 @@
                 <w:sz w:val="22"/>
               </w:rPr>
               <w:t>Promotion approval workflow and roles to be defined.</w:t>
+            </w:r>
+          </w:p>
+        </w:tc>
+      </w:tr>
+    </w:tbl>
+    <w:tbl>
+      <w:tblPr>
+        <w:tblW w:type="auto" w:w="0"/>
+        <w:jc w:val="center"/>
+        <w:tblLook w:firstColumn="1" w:firstRow="1" w:lastColumn="0" w:lastRow="0" w:noHBand="0" w:noVBand="1" w:val="04A0"/>
+      </w:tblPr>
+      <w:tblGrid>
+        <w:gridCol w:w="10224"/>
+      </w:tblGrid>
+      <w:tr>
+        <w:tc>
+          <w:tcPr>
+            <w:tcW w:type="dxa" w:w="10224"/>
+            <w:shd w:fill="FFD966"/>
+            <w:tcBorders>
+              <w:top w:val="single" w:sz="10" w:space="0" w:color="D6B656"/>
+              <w:left w:val="single" w:sz="10" w:space="0" w:color="D6B656"/>
+              <w:bottom w:val="single" w:sz="10" w:space="0" w:color="D6B656"/>
+              <w:right w:val="single" w:sz="10" w:space="0" w:color="D6B656"/>
+            </w:tcBorders>
+            <w:tcMar>
+              <w:top w:w="90" w:type="dxa"/>
+              <w:start w:w="120" w:type="dxa"/>
+              <w:bottom w:w="90" w:type="dxa"/>
+              <w:end w:w="120" w:type="dxa"/>
+            </w:tcMar>
+            <w:vAlign w:val="center"/>
+          </w:tcPr>
+          <w:p>
+            <w:pPr>
+              <w:spacing w:before="0" w:after="40"/>
+            </w:pPr>
+            <w:r>
+              <w:rPr>
+                <w:rFonts w:ascii="Cambria" w:hAnsi="Cambria" w:eastAsia="Cambria" w:cs="Cambria"/>
+                <w:color w:val="000000"/>
+                <w:sz w:val="22"/>
+              </w:rPr>
+              <w:t>OP-05: Promotion approval workflow and roles to be defined.</w:t>
             </w:r>
           </w:p>
         </w:tc>
@@ -4257,12 +4499,12 @@
             <w:tcW w:type="dxa" w:w="9072"/>
             <w:shd w:val="clear" w:color="auto" w:fill="A7DC85"/>
             <w:tcMar>
-              <w:top w:w="70" w:type="dxa"/>
-              <w:bottom w:w="70" w:type="dxa"/>
+              <w:top w:w="90" w:type="dxa"/>
+              <w:bottom w:w="90" w:type="dxa"/>
               <w:left w:w="120" w:type="dxa"/>
               <w:right w:w="120" w:type="dxa"/>
-              <w:start w:w="95" w:type="dxa"/>
-              <w:end w:w="95" w:type="dxa"/>
+              <w:start w:w="120" w:type="dxa"/>
+              <w:end w:w="120" w:type="dxa"/>
             </w:tcMar>
             <w:vAlign w:val="center"/>
             <w:tcBorders>
@@ -4274,7 +4516,7 @@
           </w:tcPr>
           <w:p>
             <w:pPr>
-              <w:spacing w:after="30"/>
+              <w:spacing w:after="40" w:before="0"/>
             </w:pPr>
             <w:r>
               <w:rPr>
@@ -4314,12 +4556,12 @@
             <w:tcW w:type="dxa" w:w="9072"/>
             <w:shd w:val="clear" w:color="auto" w:fill="91C3DF"/>
             <w:tcMar>
-              <w:top w:w="70" w:type="dxa"/>
-              <w:bottom w:w="70" w:type="dxa"/>
+              <w:top w:w="90" w:type="dxa"/>
+              <w:bottom w:w="90" w:type="dxa"/>
               <w:left w:w="120" w:type="dxa"/>
               <w:right w:w="120" w:type="dxa"/>
-              <w:start w:w="95" w:type="dxa"/>
-              <w:end w:w="95" w:type="dxa"/>
+              <w:start w:w="120" w:type="dxa"/>
+              <w:end w:w="120" w:type="dxa"/>
             </w:tcMar>
             <w:vAlign w:val="center"/>
             <w:tcBorders>
@@ -4331,7 +4573,7 @@
           </w:tcPr>
           <w:p>
             <w:pPr>
-              <w:spacing w:after="30"/>
+              <w:spacing w:after="40" w:before="0"/>
             </w:pPr>
             <w:r>
               <w:rPr>
@@ -4371,12 +4613,12 @@
             <w:tcW w:type="dxa" w:w="9072"/>
             <w:shd w:val="clear" w:color="auto" w:fill="FFC499"/>
             <w:tcMar>
-              <w:top w:w="70" w:type="dxa"/>
-              <w:bottom w:w="70" w:type="dxa"/>
+              <w:top w:w="90" w:type="dxa"/>
+              <w:bottom w:w="90" w:type="dxa"/>
               <w:left w:w="120" w:type="dxa"/>
               <w:right w:w="120" w:type="dxa"/>
-              <w:start w:w="95" w:type="dxa"/>
-              <w:end w:w="95" w:type="dxa"/>
+              <w:start w:w="120" w:type="dxa"/>
+              <w:end w:w="120" w:type="dxa"/>
             </w:tcMar>
             <w:vAlign w:val="center"/>
             <w:tcBorders>
@@ -4388,7 +4630,7 @@
           </w:tcPr>
           <w:p>
             <w:pPr>
-              <w:spacing w:after="30"/>
+              <w:spacing w:after="40" w:before="0"/>
             </w:pPr>
             <w:r>
               <w:rPr>
@@ -4406,6 +4648,50 @@
                 <w:sz w:val="22"/>
               </w:rPr>
               <w:t>Promotion types in scope for go-live to be confirmed with marketing.</w:t>
+            </w:r>
+          </w:p>
+        </w:tc>
+      </w:tr>
+    </w:tbl>
+    <w:tbl>
+      <w:tblPr>
+        <w:tblW w:type="auto" w:w="0"/>
+        <w:jc w:val="center"/>
+        <w:tblLook w:firstColumn="1" w:firstRow="1" w:lastColumn="0" w:lastRow="0" w:noHBand="0" w:noVBand="1" w:val="04A0"/>
+      </w:tblPr>
+      <w:tblGrid>
+        <w:gridCol w:w="10224"/>
+      </w:tblGrid>
+      <w:tr>
+        <w:tc>
+          <w:tcPr>
+            <w:tcW w:type="dxa" w:w="10224"/>
+            <w:shd w:fill="FFD966"/>
+            <w:tcBorders>
+              <w:top w:val="single" w:sz="10" w:space="0" w:color="D6B656"/>
+              <w:left w:val="single" w:sz="10" w:space="0" w:color="D6B656"/>
+              <w:bottom w:val="single" w:sz="10" w:space="0" w:color="D6B656"/>
+              <w:right w:val="single" w:sz="10" w:space="0" w:color="D6B656"/>
+            </w:tcBorders>
+            <w:tcMar>
+              <w:top w:w="90" w:type="dxa"/>
+              <w:start w:w="120" w:type="dxa"/>
+              <w:bottom w:w="90" w:type="dxa"/>
+              <w:end w:w="120" w:type="dxa"/>
+            </w:tcMar>
+            <w:vAlign w:val="center"/>
+          </w:tcPr>
+          <w:p>
+            <w:pPr>
+              <w:spacing w:before="0" w:after="40"/>
+            </w:pPr>
+            <w:r>
+              <w:rPr>
+                <w:rFonts w:ascii="Cambria" w:hAnsi="Cambria" w:eastAsia="Cambria" w:cs="Cambria"/>
+                <w:color w:val="000000"/>
+                <w:sz w:val="22"/>
+              </w:rPr>
+              <w:t>OP-06: Promotion types in scope for go-live to be confirmed with marketing.</w:t>
             </w:r>
           </w:p>
         </w:tc>
@@ -4520,12 +4806,12 @@
             <w:tcW w:type="dxa" w:w="9072"/>
             <w:shd w:val="clear" w:color="auto" w:fill="A7DC85"/>
             <w:tcMar>
-              <w:top w:w="70" w:type="dxa"/>
-              <w:bottom w:w="70" w:type="dxa"/>
+              <w:top w:w="90" w:type="dxa"/>
+              <w:bottom w:w="90" w:type="dxa"/>
               <w:left w:w="120" w:type="dxa"/>
               <w:right w:w="120" w:type="dxa"/>
-              <w:start w:w="95" w:type="dxa"/>
-              <w:end w:w="95" w:type="dxa"/>
+              <w:start w:w="120" w:type="dxa"/>
+              <w:end w:w="120" w:type="dxa"/>
             </w:tcMar>
             <w:vAlign w:val="center"/>
             <w:tcBorders>
@@ -4537,7 +4823,7 @@
           </w:tcPr>
           <w:p>
             <w:pPr>
-              <w:spacing w:after="30"/>
+              <w:spacing w:after="40" w:before="0"/>
             </w:pPr>
             <w:r>
               <w:rPr>
@@ -4577,12 +4863,12 @@
             <w:tcW w:type="dxa" w:w="9072"/>
             <w:shd w:val="clear" w:color="auto" w:fill="91C3DF"/>
             <w:tcMar>
-              <w:top w:w="70" w:type="dxa"/>
-              <w:bottom w:w="70" w:type="dxa"/>
+              <w:top w:w="90" w:type="dxa"/>
+              <w:bottom w:w="90" w:type="dxa"/>
               <w:left w:w="120" w:type="dxa"/>
               <w:right w:w="120" w:type="dxa"/>
-              <w:start w:w="95" w:type="dxa"/>
-              <w:end w:w="95" w:type="dxa"/>
+              <w:start w:w="120" w:type="dxa"/>
+              <w:end w:w="120" w:type="dxa"/>
             </w:tcMar>
             <w:vAlign w:val="center"/>
             <w:tcBorders>
@@ -4594,7 +4880,7 @@
           </w:tcPr>
           <w:p>
             <w:pPr>
-              <w:spacing w:after="30"/>
+              <w:spacing w:after="40" w:before="0"/>
             </w:pPr>
             <w:r>
               <w:rPr>
@@ -4634,12 +4920,12 @@
             <w:tcW w:type="dxa" w:w="9072"/>
             <w:shd w:val="clear" w:color="auto" w:fill="FFC499"/>
             <w:tcMar>
-              <w:top w:w="70" w:type="dxa"/>
-              <w:bottom w:w="70" w:type="dxa"/>
+              <w:top w:w="90" w:type="dxa"/>
+              <w:bottom w:w="90" w:type="dxa"/>
               <w:left w:w="120" w:type="dxa"/>
               <w:right w:w="120" w:type="dxa"/>
-              <w:start w:w="95" w:type="dxa"/>
-              <w:end w:w="95" w:type="dxa"/>
+              <w:start w:w="120" w:type="dxa"/>
+              <w:end w:w="120" w:type="dxa"/>
             </w:tcMar>
             <w:vAlign w:val="center"/>
             <w:tcBorders>
@@ -4651,7 +4937,7 @@
           </w:tcPr>
           <w:p>
             <w:pPr>
-              <w:spacing w:after="30"/>
+              <w:spacing w:after="40" w:before="0"/>
             </w:pPr>
             <w:r>
               <w:rPr>
@@ -4669,6 +4955,50 @@
                 <w:sz w:val="22"/>
               </w:rPr>
               <w:t>Discount structures required for launch campaigns to be confirmed.</w:t>
+            </w:r>
+          </w:p>
+        </w:tc>
+      </w:tr>
+    </w:tbl>
+    <w:tbl>
+      <w:tblPr>
+        <w:tblW w:type="auto" w:w="0"/>
+        <w:jc w:val="center"/>
+        <w:tblLook w:firstColumn="1" w:firstRow="1" w:lastColumn="0" w:lastRow="0" w:noHBand="0" w:noVBand="1" w:val="04A0"/>
+      </w:tblPr>
+      <w:tblGrid>
+        <w:gridCol w:w="10224"/>
+      </w:tblGrid>
+      <w:tr>
+        <w:tc>
+          <w:tcPr>
+            <w:tcW w:type="dxa" w:w="10224"/>
+            <w:shd w:fill="FFD966"/>
+            <w:tcBorders>
+              <w:top w:val="single" w:sz="10" w:space="0" w:color="D6B656"/>
+              <w:left w:val="single" w:sz="10" w:space="0" w:color="D6B656"/>
+              <w:bottom w:val="single" w:sz="10" w:space="0" w:color="D6B656"/>
+              <w:right w:val="single" w:sz="10" w:space="0" w:color="D6B656"/>
+            </w:tcBorders>
+            <w:tcMar>
+              <w:top w:w="90" w:type="dxa"/>
+              <w:start w:w="120" w:type="dxa"/>
+              <w:bottom w:w="90" w:type="dxa"/>
+              <w:end w:w="120" w:type="dxa"/>
+            </w:tcMar>
+            <w:vAlign w:val="center"/>
+          </w:tcPr>
+          <w:p>
+            <w:pPr>
+              <w:spacing w:before="0" w:after="40"/>
+            </w:pPr>
+            <w:r>
+              <w:rPr>
+                <w:rFonts w:ascii="Cambria" w:hAnsi="Cambria" w:eastAsia="Cambria" w:cs="Cambria"/>
+                <w:color w:val="000000"/>
+                <w:sz w:val="22"/>
+              </w:rPr>
+              <w:t>OP-07: Discount structures required for launch campaigns to be confirmed.</w:t>
             </w:r>
           </w:p>
         </w:tc>
@@ -4783,12 +5113,12 @@
             <w:tcW w:type="dxa" w:w="9072"/>
             <w:shd w:val="clear" w:color="auto" w:fill="A7DC85"/>
             <w:tcMar>
-              <w:top w:w="70" w:type="dxa"/>
-              <w:bottom w:w="70" w:type="dxa"/>
+              <w:top w:w="90" w:type="dxa"/>
+              <w:bottom w:w="90" w:type="dxa"/>
               <w:left w:w="120" w:type="dxa"/>
               <w:right w:w="120" w:type="dxa"/>
-              <w:start w:w="95" w:type="dxa"/>
-              <w:end w:w="95" w:type="dxa"/>
+              <w:start w:w="120" w:type="dxa"/>
+              <w:end w:w="120" w:type="dxa"/>
             </w:tcMar>
             <w:vAlign w:val="center"/>
             <w:tcBorders>
@@ -4800,7 +5130,7 @@
           </w:tcPr>
           <w:p>
             <w:pPr>
-              <w:spacing w:after="30"/>
+              <w:spacing w:after="40" w:before="0"/>
             </w:pPr>
             <w:r>
               <w:rPr>
@@ -4840,12 +5170,12 @@
             <w:tcW w:type="dxa" w:w="9072"/>
             <w:shd w:val="clear" w:color="auto" w:fill="91C3DF"/>
             <w:tcMar>
-              <w:top w:w="70" w:type="dxa"/>
-              <w:bottom w:w="70" w:type="dxa"/>
+              <w:top w:w="90" w:type="dxa"/>
+              <w:bottom w:w="90" w:type="dxa"/>
               <w:left w:w="120" w:type="dxa"/>
               <w:right w:w="120" w:type="dxa"/>
-              <w:start w:w="95" w:type="dxa"/>
-              <w:end w:w="95" w:type="dxa"/>
+              <w:start w:w="120" w:type="dxa"/>
+              <w:end w:w="120" w:type="dxa"/>
             </w:tcMar>
             <w:vAlign w:val="center"/>
             <w:tcBorders>
@@ -4857,7 +5187,7 @@
           </w:tcPr>
           <w:p>
             <w:pPr>
-              <w:spacing w:after="30"/>
+              <w:spacing w:after="40" w:before="0"/>
             </w:pPr>
             <w:r>
               <w:rPr>
@@ -4897,12 +5227,12 @@
             <w:tcW w:type="dxa" w:w="9072"/>
             <w:shd w:val="clear" w:color="auto" w:fill="FFC499"/>
             <w:tcMar>
-              <w:top w:w="70" w:type="dxa"/>
-              <w:bottom w:w="70" w:type="dxa"/>
+              <w:top w:w="90" w:type="dxa"/>
+              <w:bottom w:w="90" w:type="dxa"/>
               <w:left w:w="120" w:type="dxa"/>
               <w:right w:w="120" w:type="dxa"/>
-              <w:start w:w="95" w:type="dxa"/>
-              <w:end w:w="95" w:type="dxa"/>
+              <w:start w:w="120" w:type="dxa"/>
+              <w:end w:w="120" w:type="dxa"/>
             </w:tcMar>
             <w:vAlign w:val="center"/>
             <w:tcBorders>
@@ -4914,7 +5244,7 @@
           </w:tcPr>
           <w:p>
             <w:pPr>
-              <w:spacing w:after="30"/>
+              <w:spacing w:after="40" w:before="0"/>
             </w:pPr>
             <w:r>
               <w:rPr>
@@ -4932,6 +5262,50 @@
                 <w:sz w:val="22"/>
               </w:rPr>
               <w:t>Coupon generation volumes, distribution channels and expiry rules to be defined per campaign.</w:t>
+            </w:r>
+          </w:p>
+        </w:tc>
+      </w:tr>
+    </w:tbl>
+    <w:tbl>
+      <w:tblPr>
+        <w:tblW w:type="auto" w:w="0"/>
+        <w:jc w:val="center"/>
+        <w:tblLook w:firstColumn="1" w:firstRow="1" w:lastColumn="0" w:lastRow="0" w:noHBand="0" w:noVBand="1" w:val="04A0"/>
+      </w:tblPr>
+      <w:tblGrid>
+        <w:gridCol w:w="10224"/>
+      </w:tblGrid>
+      <w:tr>
+        <w:tc>
+          <w:tcPr>
+            <w:tcW w:type="dxa" w:w="10224"/>
+            <w:shd w:fill="FFD966"/>
+            <w:tcBorders>
+              <w:top w:val="single" w:sz="10" w:space="0" w:color="D6B656"/>
+              <w:left w:val="single" w:sz="10" w:space="0" w:color="D6B656"/>
+              <w:bottom w:val="single" w:sz="10" w:space="0" w:color="D6B656"/>
+              <w:right w:val="single" w:sz="10" w:space="0" w:color="D6B656"/>
+            </w:tcBorders>
+            <w:tcMar>
+              <w:top w:w="90" w:type="dxa"/>
+              <w:start w:w="120" w:type="dxa"/>
+              <w:bottom w:w="90" w:type="dxa"/>
+              <w:end w:w="120" w:type="dxa"/>
+            </w:tcMar>
+            <w:vAlign w:val="center"/>
+          </w:tcPr>
+          <w:p>
+            <w:pPr>
+              <w:spacing w:before="0" w:after="40"/>
+            </w:pPr>
+            <w:r>
+              <w:rPr>
+                <w:rFonts w:ascii="Cambria" w:hAnsi="Cambria" w:eastAsia="Cambria" w:cs="Cambria"/>
+                <w:color w:val="000000"/>
+                <w:sz w:val="22"/>
+              </w:rPr>
+              <w:t>OP-08: Coupon volumes, channels and expiry rules to be defined per campaign.</w:t>
             </w:r>
           </w:p>
         </w:tc>
@@ -5046,12 +5420,12 @@
             <w:tcW w:type="dxa" w:w="9072"/>
             <w:shd w:val="clear" w:color="auto" w:fill="A7DC85"/>
             <w:tcMar>
-              <w:top w:w="70" w:type="dxa"/>
-              <w:bottom w:w="70" w:type="dxa"/>
+              <w:top w:w="90" w:type="dxa"/>
+              <w:bottom w:w="90" w:type="dxa"/>
               <w:left w:w="120" w:type="dxa"/>
               <w:right w:w="120" w:type="dxa"/>
-              <w:start w:w="95" w:type="dxa"/>
-              <w:end w:w="95" w:type="dxa"/>
+              <w:start w:w="120" w:type="dxa"/>
+              <w:end w:w="120" w:type="dxa"/>
             </w:tcMar>
             <w:vAlign w:val="center"/>
             <w:tcBorders>
@@ -5063,7 +5437,7 @@
           </w:tcPr>
           <w:p>
             <w:pPr>
-              <w:spacing w:after="30"/>
+              <w:spacing w:after="40" w:before="0"/>
             </w:pPr>
             <w:r>
               <w:rPr>
@@ -5103,12 +5477,12 @@
             <w:tcW w:type="dxa" w:w="9072"/>
             <w:shd w:val="clear" w:color="auto" w:fill="91C3DF"/>
             <w:tcMar>
-              <w:top w:w="70" w:type="dxa"/>
-              <w:bottom w:w="70" w:type="dxa"/>
+              <w:top w:w="90" w:type="dxa"/>
+              <w:bottom w:w="90" w:type="dxa"/>
               <w:left w:w="120" w:type="dxa"/>
               <w:right w:w="120" w:type="dxa"/>
-              <w:start w:w="95" w:type="dxa"/>
-              <w:end w:w="95" w:type="dxa"/>
+              <w:start w:w="120" w:type="dxa"/>
+              <w:end w:w="120" w:type="dxa"/>
             </w:tcMar>
             <w:vAlign w:val="center"/>
             <w:tcBorders>
@@ -5120,7 +5494,7 @@
           </w:tcPr>
           <w:p>
             <w:pPr>
-              <w:spacing w:after="30"/>
+              <w:spacing w:after="40" w:before="0"/>
             </w:pPr>
             <w:r>
               <w:rPr>
@@ -5160,12 +5534,12 @@
             <w:tcW w:type="dxa" w:w="9072"/>
             <w:shd w:val="clear" w:color="auto" w:fill="FFC499"/>
             <w:tcMar>
-              <w:top w:w="70" w:type="dxa"/>
-              <w:bottom w:w="70" w:type="dxa"/>
+              <w:top w:w="90" w:type="dxa"/>
+              <w:bottom w:w="90" w:type="dxa"/>
               <w:left w:w="120" w:type="dxa"/>
               <w:right w:w="120" w:type="dxa"/>
-              <w:start w:w="95" w:type="dxa"/>
-              <w:end w:w="95" w:type="dxa"/>
+              <w:start w:w="120" w:type="dxa"/>
+              <w:end w:w="120" w:type="dxa"/>
             </w:tcMar>
             <w:vAlign w:val="center"/>
             <w:tcBorders>
@@ -5177,7 +5551,7 @@
           </w:tcPr>
           <w:p>
             <w:pPr>
-              <w:spacing w:after="30"/>
+              <w:spacing w:after="40" w:before="0"/>
             </w:pPr>
             <w:r>
               <w:rPr>
@@ -5195,6 +5569,50 @@
                 <w:sz w:val="22"/>
               </w:rPr>
               <w:t>Personalization scope and audience refresh frequency to be agreed.</w:t>
+            </w:r>
+          </w:p>
+        </w:tc>
+      </w:tr>
+    </w:tbl>
+    <w:tbl>
+      <w:tblPr>
+        <w:tblW w:type="auto" w:w="0"/>
+        <w:jc w:val="center"/>
+        <w:tblLook w:firstColumn="1" w:firstRow="1" w:lastColumn="0" w:lastRow="0" w:noHBand="0" w:noVBand="1" w:val="04A0"/>
+      </w:tblPr>
+      <w:tblGrid>
+        <w:gridCol w:w="10224"/>
+      </w:tblGrid>
+      <w:tr>
+        <w:tc>
+          <w:tcPr>
+            <w:tcW w:type="dxa" w:w="10224"/>
+            <w:shd w:fill="FFD966"/>
+            <w:tcBorders>
+              <w:top w:val="single" w:sz="10" w:space="0" w:color="D6B656"/>
+              <w:left w:val="single" w:sz="10" w:space="0" w:color="D6B656"/>
+              <w:bottom w:val="single" w:sz="10" w:space="0" w:color="D6B656"/>
+              <w:right w:val="single" w:sz="10" w:space="0" w:color="D6B656"/>
+            </w:tcBorders>
+            <w:tcMar>
+              <w:top w:w="90" w:type="dxa"/>
+              <w:start w:w="120" w:type="dxa"/>
+              <w:bottom w:w="90" w:type="dxa"/>
+              <w:end w:w="120" w:type="dxa"/>
+            </w:tcMar>
+            <w:vAlign w:val="center"/>
+          </w:tcPr>
+          <w:p>
+            <w:pPr>
+              <w:spacing w:before="0" w:after="40"/>
+            </w:pPr>
+            <w:r>
+              <w:rPr>
+                <w:rFonts w:ascii="Cambria" w:hAnsi="Cambria" w:eastAsia="Cambria" w:cs="Cambria"/>
+                <w:color w:val="000000"/>
+                <w:sz w:val="22"/>
+              </w:rPr>
+              <w:t>OP-09: Personalization scope and audience refresh frequency to be agreed.</w:t>
             </w:r>
           </w:p>
         </w:tc>
@@ -5309,12 +5727,12 @@
             <w:tcW w:type="dxa" w:w="9072"/>
             <w:shd w:val="clear" w:color="auto" w:fill="A7DC85"/>
             <w:tcMar>
-              <w:top w:w="70" w:type="dxa"/>
-              <w:bottom w:w="70" w:type="dxa"/>
+              <w:top w:w="90" w:type="dxa"/>
+              <w:bottom w:w="90" w:type="dxa"/>
               <w:left w:w="120" w:type="dxa"/>
               <w:right w:w="120" w:type="dxa"/>
-              <w:start w:w="95" w:type="dxa"/>
-              <w:end w:w="95" w:type="dxa"/>
+              <w:start w:w="120" w:type="dxa"/>
+              <w:end w:w="120" w:type="dxa"/>
             </w:tcMar>
             <w:vAlign w:val="center"/>
             <w:tcBorders>
@@ -5326,7 +5744,7 @@
           </w:tcPr>
           <w:p>
             <w:pPr>
-              <w:spacing w:after="30"/>
+              <w:spacing w:after="40" w:before="0"/>
             </w:pPr>
             <w:r>
               <w:rPr>
@@ -5366,12 +5784,12 @@
             <w:tcW w:type="dxa" w:w="9072"/>
             <w:shd w:val="clear" w:color="auto" w:fill="91C3DF"/>
             <w:tcMar>
-              <w:top w:w="70" w:type="dxa"/>
-              <w:bottom w:w="70" w:type="dxa"/>
+              <w:top w:w="90" w:type="dxa"/>
+              <w:bottom w:w="90" w:type="dxa"/>
               <w:left w:w="120" w:type="dxa"/>
               <w:right w:w="120" w:type="dxa"/>
-              <w:start w:w="95" w:type="dxa"/>
-              <w:end w:w="95" w:type="dxa"/>
+              <w:start w:w="120" w:type="dxa"/>
+              <w:end w:w="120" w:type="dxa"/>
             </w:tcMar>
             <w:vAlign w:val="center"/>
             <w:tcBorders>
@@ -5383,7 +5801,7 @@
           </w:tcPr>
           <w:p>
             <w:pPr>
-              <w:spacing w:after="30"/>
+              <w:spacing w:after="40" w:before="0"/>
             </w:pPr>
             <w:r>
               <w:rPr>
@@ -5423,12 +5841,12 @@
             <w:tcW w:type="dxa" w:w="9072"/>
             <w:shd w:val="clear" w:color="auto" w:fill="FFC499"/>
             <w:tcMar>
-              <w:top w:w="70" w:type="dxa"/>
-              <w:bottom w:w="70" w:type="dxa"/>
+              <w:top w:w="90" w:type="dxa"/>
+              <w:bottom w:w="90" w:type="dxa"/>
               <w:left w:w="120" w:type="dxa"/>
               <w:right w:w="120" w:type="dxa"/>
-              <w:start w:w="95" w:type="dxa"/>
-              <w:end w:w="95" w:type="dxa"/>
+              <w:start w:w="120" w:type="dxa"/>
+              <w:end w:w="120" w:type="dxa"/>
             </w:tcMar>
             <w:vAlign w:val="center"/>
             <w:tcBorders>
@@ -5440,7 +5858,7 @@
           </w:tcPr>
           <w:p>
             <w:pPr>
-              <w:spacing w:after="30"/>
+              <w:spacing w:after="40" w:before="0"/>
             </w:pPr>
             <w:r>
               <w:rPr>
@@ -5458,6 +5876,50 @@
                 <w:sz w:val="22"/>
               </w:rPr>
               <w:t>Reporting KPIs, cadence and ownership to be defined with the marketing team.</w:t>
+            </w:r>
+          </w:p>
+        </w:tc>
+      </w:tr>
+    </w:tbl>
+    <w:tbl>
+      <w:tblPr>
+        <w:tblW w:type="auto" w:w="0"/>
+        <w:jc w:val="center"/>
+        <w:tblLook w:firstColumn="1" w:firstRow="1" w:lastColumn="0" w:lastRow="0" w:noHBand="0" w:noVBand="1" w:val="04A0"/>
+      </w:tblPr>
+      <w:tblGrid>
+        <w:gridCol w:w="10224"/>
+      </w:tblGrid>
+      <w:tr>
+        <w:tc>
+          <w:tcPr>
+            <w:tcW w:type="dxa" w:w="10224"/>
+            <w:shd w:fill="FFD966"/>
+            <w:tcBorders>
+              <w:top w:val="single" w:sz="10" w:space="0" w:color="D6B656"/>
+              <w:left w:val="single" w:sz="10" w:space="0" w:color="D6B656"/>
+              <w:bottom w:val="single" w:sz="10" w:space="0" w:color="D6B656"/>
+              <w:right w:val="single" w:sz="10" w:space="0" w:color="D6B656"/>
+            </w:tcBorders>
+            <w:tcMar>
+              <w:top w:w="90" w:type="dxa"/>
+              <w:start w:w="120" w:type="dxa"/>
+              <w:bottom w:w="90" w:type="dxa"/>
+              <w:end w:w="120" w:type="dxa"/>
+            </w:tcMar>
+            <w:vAlign w:val="center"/>
+          </w:tcPr>
+          <w:p>
+            <w:pPr>
+              <w:spacing w:before="0" w:after="40"/>
+            </w:pPr>
+            <w:r>
+              <w:rPr>
+                <w:rFonts w:ascii="Cambria" w:hAnsi="Cambria" w:eastAsia="Cambria" w:cs="Cambria"/>
+                <w:color w:val="000000"/>
+                <w:sz w:val="22"/>
+              </w:rPr>
+              <w:t>OP-10: Reporting KPIs, cadence and ownership to be defined.</w:t>
             </w:r>
           </w:p>
         </w:tc>
@@ -5610,12 +6072,12 @@
             <w:tcW w:type="dxa" w:w="9072"/>
             <w:shd w:val="clear" w:color="auto" w:fill="FFC499"/>
             <w:tcMar>
-              <w:top w:w="70" w:type="dxa"/>
-              <w:bottom w:w="70" w:type="dxa"/>
+              <w:top w:w="90" w:type="dxa"/>
+              <w:bottom w:w="90" w:type="dxa"/>
               <w:left w:w="120" w:type="dxa"/>
               <w:right w:w="120" w:type="dxa"/>
-              <w:start w:w="95" w:type="dxa"/>
-              <w:end w:w="95" w:type="dxa"/>
+              <w:start w:w="120" w:type="dxa"/>
+              <w:end w:w="120" w:type="dxa"/>
             </w:tcMar>
             <w:vAlign w:val="center"/>
             <w:tcBorders>
@@ -5627,7 +6089,7 @@
           </w:tcPr>
           <w:p>
             <w:pPr>
-              <w:spacing w:after="30"/>
+              <w:spacing w:after="40" w:before="0"/>
             </w:pPr>
             <w:r>
               <w:rPr>
@@ -5667,12 +6129,12 @@
             <w:tcW w:type="dxa" w:w="9072"/>
             <w:shd w:val="clear" w:color="auto" w:fill="A7DC85"/>
             <w:tcMar>
-              <w:top w:w="70" w:type="dxa"/>
-              <w:bottom w:w="70" w:type="dxa"/>
+              <w:top w:w="90" w:type="dxa"/>
+              <w:bottom w:w="90" w:type="dxa"/>
               <w:left w:w="120" w:type="dxa"/>
               <w:right w:w="120" w:type="dxa"/>
-              <w:start w:w="95" w:type="dxa"/>
-              <w:end w:w="95" w:type="dxa"/>
+              <w:start w:w="120" w:type="dxa"/>
+              <w:end w:w="120" w:type="dxa"/>
             </w:tcMar>
             <w:vAlign w:val="center"/>
             <w:tcBorders>
@@ -5684,7 +6146,7 @@
           </w:tcPr>
           <w:p>
             <w:pPr>
-              <w:spacing w:after="30"/>
+              <w:spacing w:after="40" w:before="0"/>
             </w:pPr>
             <w:r>
               <w:rPr>
@@ -5707,6 +6169,50 @@
         </w:tc>
       </w:tr>
     </w:tbl>
+    <w:tbl>
+      <w:tblPr>
+        <w:tblW w:type="auto" w:w="0"/>
+        <w:jc w:val="center"/>
+        <w:tblLook w:firstColumn="1" w:firstRow="1" w:lastColumn="0" w:lastRow="0" w:noHBand="0" w:noVBand="1" w:val="04A0"/>
+      </w:tblPr>
+      <w:tblGrid>
+        <w:gridCol w:w="10224"/>
+      </w:tblGrid>
+      <w:tr>
+        <w:tc>
+          <w:tcPr>
+            <w:tcW w:type="dxa" w:w="10224"/>
+            <w:shd w:fill="FFD966"/>
+            <w:tcBorders>
+              <w:top w:val="single" w:sz="10" w:space="0" w:color="D6B656"/>
+              <w:left w:val="single" w:sz="10" w:space="0" w:color="D6B656"/>
+              <w:bottom w:val="single" w:sz="10" w:space="0" w:color="D6B656"/>
+              <w:right w:val="single" w:sz="10" w:space="0" w:color="D6B656"/>
+            </w:tcBorders>
+            <w:tcMar>
+              <w:top w:w="90" w:type="dxa"/>
+              <w:start w:w="120" w:type="dxa"/>
+              <w:bottom w:w="90" w:type="dxa"/>
+              <w:end w:w="120" w:type="dxa"/>
+            </w:tcMar>
+            <w:vAlign w:val="center"/>
+          </w:tcPr>
+          <w:p>
+            <w:pPr>
+              <w:spacing w:before="0" w:after="40"/>
+            </w:pPr>
+            <w:r>
+              <w:rPr>
+                <w:rFonts w:ascii="Cambria" w:hAnsi="Cambria" w:eastAsia="Cambria" w:cs="Cambria"/>
+                <w:color w:val="000000"/>
+                <w:sz w:val="22"/>
+              </w:rPr>
+              <w:t>OP-15: Confirm Quebec scope (currently out of scope).</w:t>
+            </w:r>
+          </w:p>
+        </w:tc>
+      </w:tr>
+    </w:tbl>
     <w:p/>
     <w:tbl>
       <w:tblPr>
@@ -5724,12 +6230,12 @@
             <w:tcW w:type="dxa" w:w="9072"/>
             <w:shd w:val="clear" w:color="auto" w:fill="91C3DF"/>
             <w:tcMar>
-              <w:top w:w="70" w:type="dxa"/>
-              <w:bottom w:w="70" w:type="dxa"/>
+              <w:top w:w="90" w:type="dxa"/>
+              <w:bottom w:w="90" w:type="dxa"/>
               <w:left w:w="120" w:type="dxa"/>
               <w:right w:w="120" w:type="dxa"/>
-              <w:start w:w="95" w:type="dxa"/>
-              <w:end w:w="95" w:type="dxa"/>
+              <w:start w:w="120" w:type="dxa"/>
+              <w:end w:w="120" w:type="dxa"/>
             </w:tcMar>
             <w:vAlign w:val="center"/>
             <w:tcBorders>
@@ -5741,7 +6247,7 @@
           </w:tcPr>
           <w:p>
             <w:pPr>
-              <w:spacing w:after="30"/>
+              <w:spacing w:after="40" w:before="0"/>
             </w:pPr>
             <w:r>
               <w:rPr>
@@ -5873,12 +6379,12 @@
             <w:tcW w:type="dxa" w:w="9072"/>
             <w:shd w:val="clear" w:color="auto" w:fill="FFC499"/>
             <w:tcMar>
-              <w:top w:w="70" w:type="dxa"/>
-              <w:bottom w:w="70" w:type="dxa"/>
+              <w:top w:w="90" w:type="dxa"/>
+              <w:bottom w:w="90" w:type="dxa"/>
               <w:left w:w="120" w:type="dxa"/>
               <w:right w:w="120" w:type="dxa"/>
-              <w:start w:w="95" w:type="dxa"/>
-              <w:end w:w="95" w:type="dxa"/>
+              <w:start w:w="120" w:type="dxa"/>
+              <w:end w:w="120" w:type="dxa"/>
             </w:tcMar>
             <w:vAlign w:val="center"/>
             <w:tcBorders>
@@ -5890,7 +6396,7 @@
           </w:tcPr>
           <w:p>
             <w:pPr>
-              <w:spacing w:after="30"/>
+              <w:spacing w:after="40" w:before="0"/>
             </w:pPr>
             <w:r>
               <w:rPr>
@@ -5930,12 +6436,12 @@
             <w:tcW w:type="dxa" w:w="9072"/>
             <w:shd w:val="clear" w:color="auto" w:fill="A7DC85"/>
             <w:tcMar>
-              <w:top w:w="70" w:type="dxa"/>
-              <w:bottom w:w="70" w:type="dxa"/>
+              <w:top w:w="90" w:type="dxa"/>
+              <w:bottom w:w="90" w:type="dxa"/>
               <w:left w:w="120" w:type="dxa"/>
               <w:right w:w="120" w:type="dxa"/>
-              <w:start w:w="95" w:type="dxa"/>
-              <w:end w:w="95" w:type="dxa"/>
+              <w:start w:w="120" w:type="dxa"/>
+              <w:end w:w="120" w:type="dxa"/>
             </w:tcMar>
             <w:vAlign w:val="center"/>
             <w:tcBorders>
@@ -5947,7 +6453,7 @@
           </w:tcPr>
           <w:p>
             <w:pPr>
-              <w:spacing w:after="30"/>
+              <w:spacing w:after="40" w:before="0"/>
             </w:pPr>
             <w:r>
               <w:rPr>
@@ -5987,12 +6493,12 @@
             <w:tcW w:type="dxa" w:w="9072"/>
             <w:shd w:val="clear" w:color="auto" w:fill="91C3DF"/>
             <w:tcMar>
-              <w:top w:w="70" w:type="dxa"/>
-              <w:bottom w:w="70" w:type="dxa"/>
+              <w:top w:w="90" w:type="dxa"/>
+              <w:bottom w:w="90" w:type="dxa"/>
               <w:left w:w="120" w:type="dxa"/>
               <w:right w:w="120" w:type="dxa"/>
-              <w:start w:w="95" w:type="dxa"/>
-              <w:end w:w="95" w:type="dxa"/>
+              <w:start w:w="120" w:type="dxa"/>
+              <w:end w:w="120" w:type="dxa"/>
             </w:tcMar>
             <w:vAlign w:val="center"/>
             <w:tcBorders>
@@ -6004,7 +6510,7 @@
           </w:tcPr>
           <w:p>
             <w:pPr>
-              <w:spacing w:after="30"/>
+              <w:spacing w:after="40" w:before="0"/>
             </w:pPr>
             <w:r>
               <w:rPr>
@@ -6044,12 +6550,12 @@
             <w:tcW w:type="dxa" w:w="9072"/>
             <w:shd w:val="clear" w:color="auto" w:fill="FFC499"/>
             <w:tcMar>
-              <w:top w:w="70" w:type="dxa"/>
-              <w:bottom w:w="70" w:type="dxa"/>
+              <w:top w:w="90" w:type="dxa"/>
+              <w:bottom w:w="90" w:type="dxa"/>
               <w:left w:w="120" w:type="dxa"/>
               <w:right w:w="120" w:type="dxa"/>
-              <w:start w:w="95" w:type="dxa"/>
-              <w:end w:w="95" w:type="dxa"/>
+              <w:start w:w="120" w:type="dxa"/>
+              <w:end w:w="120" w:type="dxa"/>
             </w:tcMar>
             <w:vAlign w:val="center"/>
             <w:tcBorders>
@@ -6061,7 +6567,7 @@
           </w:tcPr>
           <w:p>
             <w:pPr>
-              <w:spacing w:after="30"/>
+              <w:spacing w:after="40" w:before="0"/>
             </w:pPr>
             <w:r>
               <w:rPr>
@@ -6079,6 +6585,50 @@
                 <w:sz w:val="22"/>
               </w:rPr>
               <w:t>Gift card tender exclusion from points eligibility requires integration logic — not native to the ORCE points engine.</w:t>
+            </w:r>
+          </w:p>
+        </w:tc>
+      </w:tr>
+    </w:tbl>
+    <w:tbl>
+      <w:tblPr>
+        <w:tblW w:type="auto" w:w="0"/>
+        <w:jc w:val="center"/>
+        <w:tblLook w:firstColumn="1" w:firstRow="1" w:lastColumn="0" w:lastRow="0" w:noHBand="0" w:noVBand="1" w:val="04A0"/>
+      </w:tblPr>
+      <w:tblGrid>
+        <w:gridCol w:w="10224"/>
+      </w:tblGrid>
+      <w:tr>
+        <w:tc>
+          <w:tcPr>
+            <w:tcW w:type="dxa" w:w="10224"/>
+            <w:shd w:fill="FFD966"/>
+            <w:tcBorders>
+              <w:top w:val="single" w:sz="10" w:space="0" w:color="D6B656"/>
+              <w:left w:val="single" w:sz="10" w:space="0" w:color="D6B656"/>
+              <w:bottom w:val="single" w:sz="10" w:space="0" w:color="D6B656"/>
+              <w:right w:val="single" w:sz="10" w:space="0" w:color="D6B656"/>
+            </w:tcBorders>
+            <w:tcMar>
+              <w:top w:w="90" w:type="dxa"/>
+              <w:start w:w="120" w:type="dxa"/>
+              <w:bottom w:w="90" w:type="dxa"/>
+              <w:end w:w="120" w:type="dxa"/>
+            </w:tcMar>
+            <w:vAlign w:val="center"/>
+          </w:tcPr>
+          <w:p>
+            <w:pPr>
+              <w:spacing w:before="0" w:after="40"/>
+            </w:pPr>
+            <w:r>
+              <w:rPr>
+                <w:rFonts w:ascii="Cambria" w:hAnsi="Cambria" w:eastAsia="Cambria" w:cs="Cambria"/>
+                <w:color w:val="000000"/>
+                <w:sz w:val="22"/>
+              </w:rPr>
+              <w:t>OP-11: Gift card tender exclusion logic — integration design required.</w:t>
             </w:r>
           </w:p>
         </w:tc>
@@ -6271,12 +6821,12 @@
             <w:tcW w:type="dxa" w:w="9072"/>
             <w:shd w:val="clear" w:color="auto" w:fill="A7DC85"/>
             <w:tcMar>
-              <w:top w:w="70" w:type="dxa"/>
-              <w:bottom w:w="70" w:type="dxa"/>
+              <w:top w:w="90" w:type="dxa"/>
+              <w:bottom w:w="90" w:type="dxa"/>
               <w:left w:w="120" w:type="dxa"/>
               <w:right w:w="120" w:type="dxa"/>
-              <w:start w:w="95" w:type="dxa"/>
-              <w:end w:w="95" w:type="dxa"/>
+              <w:start w:w="120" w:type="dxa"/>
+              <w:end w:w="120" w:type="dxa"/>
             </w:tcMar>
             <w:vAlign w:val="center"/>
             <w:tcBorders>
@@ -6288,7 +6838,7 @@
           </w:tcPr>
           <w:p>
             <w:pPr>
-              <w:spacing w:after="30"/>
+              <w:spacing w:after="40" w:before="0"/>
             </w:pPr>
             <w:r>
               <w:rPr>
@@ -6328,12 +6878,12 @@
             <w:tcW w:type="dxa" w:w="9072"/>
             <w:shd w:val="clear" w:color="auto" w:fill="91C3DF"/>
             <w:tcMar>
-              <w:top w:w="70" w:type="dxa"/>
-              <w:bottom w:w="70" w:type="dxa"/>
+              <w:top w:w="90" w:type="dxa"/>
+              <w:bottom w:w="90" w:type="dxa"/>
               <w:left w:w="120" w:type="dxa"/>
               <w:right w:w="120" w:type="dxa"/>
-              <w:start w:w="95" w:type="dxa"/>
-              <w:end w:w="95" w:type="dxa"/>
+              <w:start w:w="120" w:type="dxa"/>
+              <w:end w:w="120" w:type="dxa"/>
             </w:tcMar>
             <w:vAlign w:val="center"/>
             <w:tcBorders>
@@ -6345,7 +6895,7 @@
           </w:tcPr>
           <w:p>
             <w:pPr>
-              <w:spacing w:after="30"/>
+              <w:spacing w:after="40" w:before="0"/>
             </w:pPr>
             <w:r>
               <w:rPr>
@@ -6385,12 +6935,12 @@
             <w:tcW w:type="dxa" w:w="9072"/>
             <w:shd w:val="clear" w:color="auto" w:fill="FFC499"/>
             <w:tcMar>
-              <w:top w:w="70" w:type="dxa"/>
-              <w:bottom w:w="70" w:type="dxa"/>
+              <w:top w:w="90" w:type="dxa"/>
+              <w:bottom w:w="90" w:type="dxa"/>
               <w:left w:w="120" w:type="dxa"/>
               <w:right w:w="120" w:type="dxa"/>
-              <w:start w:w="95" w:type="dxa"/>
-              <w:end w:w="95" w:type="dxa"/>
+              <w:start w:w="120" w:type="dxa"/>
+              <w:end w:w="120" w:type="dxa"/>
             </w:tcMar>
             <w:vAlign w:val="center"/>
             <w:tcBorders>
@@ -6402,7 +6952,7 @@
           </w:tcPr>
           <w:p>
             <w:pPr>
-              <w:spacing w:after="30"/>
+              <w:spacing w:after="40" w:before="0"/>
             </w:pPr>
             <w:r>
               <w:rPr>
@@ -6420,6 +6970,50 @@
                 <w:sz w:val="22"/>
               </w:rPr>
               <w:t>Engagement event payload contract and trigger flows to be confirmed with the integration team.</w:t>
+            </w:r>
+          </w:p>
+        </w:tc>
+      </w:tr>
+    </w:tbl>
+    <w:tbl>
+      <w:tblPr>
+        <w:tblW w:type="auto" w:w="0"/>
+        <w:jc w:val="center"/>
+        <w:tblLook w:firstColumn="1" w:firstRow="1" w:lastColumn="0" w:lastRow="0" w:noHBand="0" w:noVBand="1" w:val="04A0"/>
+      </w:tblPr>
+      <w:tblGrid>
+        <w:gridCol w:w="10224"/>
+      </w:tblGrid>
+      <w:tr>
+        <w:tc>
+          <w:tcPr>
+            <w:tcW w:type="dxa" w:w="10224"/>
+            <w:shd w:fill="FFD966"/>
+            <w:tcBorders>
+              <w:top w:val="single" w:sz="10" w:space="0" w:color="D6B656"/>
+              <w:left w:val="single" w:sz="10" w:space="0" w:color="D6B656"/>
+              <w:bottom w:val="single" w:sz="10" w:space="0" w:color="D6B656"/>
+              <w:right w:val="single" w:sz="10" w:space="0" w:color="D6B656"/>
+            </w:tcBorders>
+            <w:tcMar>
+              <w:top w:w="90" w:type="dxa"/>
+              <w:start w:w="120" w:type="dxa"/>
+              <w:bottom w:w="90" w:type="dxa"/>
+              <w:end w:w="120" w:type="dxa"/>
+            </w:tcMar>
+            <w:vAlign w:val="center"/>
+          </w:tcPr>
+          <w:p>
+            <w:pPr>
+              <w:spacing w:before="0" w:after="40"/>
+            </w:pPr>
+            <w:r>
+              <w:rPr>
+                <w:rFonts w:ascii="Cambria" w:hAnsi="Cambria" w:eastAsia="Cambria" w:cs="Cambria"/>
+                <w:color w:val="000000"/>
+                <w:sz w:val="22"/>
+              </w:rPr>
+              <w:t>OP-12: Engagement event payload contract and trigger flows to be confirmed.</w:t>
             </w:r>
           </w:p>
         </w:tc>
@@ -6534,12 +7128,12 @@
             <w:tcW w:type="dxa" w:w="9072"/>
             <w:shd w:val="clear" w:color="auto" w:fill="FFC499"/>
             <w:tcMar>
-              <w:top w:w="70" w:type="dxa"/>
-              <w:bottom w:w="70" w:type="dxa"/>
+              <w:top w:w="90" w:type="dxa"/>
+              <w:bottom w:w="90" w:type="dxa"/>
               <w:left w:w="120" w:type="dxa"/>
               <w:right w:w="120" w:type="dxa"/>
-              <w:start w:w="95" w:type="dxa"/>
-              <w:end w:w="95" w:type="dxa"/>
+              <w:start w:w="120" w:type="dxa"/>
+              <w:end w:w="120" w:type="dxa"/>
             </w:tcMar>
             <w:vAlign w:val="center"/>
             <w:tcBorders>
@@ -6551,7 +7145,7 @@
           </w:tcPr>
           <w:p>
             <w:pPr>
-              <w:spacing w:after="30"/>
+              <w:spacing w:after="40" w:before="0"/>
             </w:pPr>
             <w:r>
               <w:rPr>
@@ -6591,12 +7185,12 @@
             <w:tcW w:type="dxa" w:w="9072"/>
             <w:shd w:val="clear" w:color="auto" w:fill="A7DC85"/>
             <w:tcMar>
-              <w:top w:w="70" w:type="dxa"/>
-              <w:bottom w:w="70" w:type="dxa"/>
+              <w:top w:w="90" w:type="dxa"/>
+              <w:bottom w:w="90" w:type="dxa"/>
               <w:left w:w="120" w:type="dxa"/>
               <w:right w:w="120" w:type="dxa"/>
-              <w:start w:w="95" w:type="dxa"/>
-              <w:end w:w="95" w:type="dxa"/>
+              <w:start w:w="120" w:type="dxa"/>
+              <w:end w:w="120" w:type="dxa"/>
             </w:tcMar>
             <w:vAlign w:val="center"/>
             <w:tcBorders>
@@ -6608,7 +7202,7 @@
           </w:tcPr>
           <w:p>
             <w:pPr>
-              <w:spacing w:after="30"/>
+              <w:spacing w:after="40" w:before="0"/>
             </w:pPr>
             <w:r>
               <w:rPr>
@@ -6648,12 +7242,12 @@
             <w:tcW w:type="dxa" w:w="9072"/>
             <w:shd w:val="clear" w:color="auto" w:fill="91C3DF"/>
             <w:tcMar>
-              <w:top w:w="70" w:type="dxa"/>
-              <w:bottom w:w="70" w:type="dxa"/>
+              <w:top w:w="90" w:type="dxa"/>
+              <w:bottom w:w="90" w:type="dxa"/>
               <w:left w:w="120" w:type="dxa"/>
               <w:right w:w="120" w:type="dxa"/>
-              <w:start w:w="95" w:type="dxa"/>
-              <w:end w:w="95" w:type="dxa"/>
+              <w:start w:w="120" w:type="dxa"/>
+              <w:end w:w="120" w:type="dxa"/>
             </w:tcMar>
             <w:vAlign w:val="center"/>
             <w:tcBorders>
@@ -6665,7 +7259,7 @@
           </w:tcPr>
           <w:p>
             <w:pPr>
-              <w:spacing w:after="30"/>
+              <w:spacing w:after="40" w:before="0"/>
             </w:pPr>
             <w:r>
               <w:rPr>
@@ -6705,12 +7299,12 @@
             <w:tcW w:type="dxa" w:w="9072"/>
             <w:shd w:val="clear" w:color="auto" w:fill="FFC499"/>
             <w:tcMar>
-              <w:top w:w="70" w:type="dxa"/>
-              <w:bottom w:w="70" w:type="dxa"/>
+              <w:top w:w="90" w:type="dxa"/>
+              <w:bottom w:w="90" w:type="dxa"/>
               <w:left w:w="120" w:type="dxa"/>
               <w:right w:w="120" w:type="dxa"/>
-              <w:start w:w="95" w:type="dxa"/>
-              <w:end w:w="95" w:type="dxa"/>
+              <w:start w:w="120" w:type="dxa"/>
+              <w:end w:w="120" w:type="dxa"/>
             </w:tcMar>
             <w:vAlign w:val="center"/>
             <w:tcBorders>
@@ -6722,7 +7316,7 @@
           </w:tcPr>
           <w:p>
             <w:pPr>
-              <w:spacing w:after="30"/>
+              <w:spacing w:after="40" w:before="0"/>
             </w:pPr>
             <w:r>
               <w:rPr>
@@ -6740,6 +7334,50 @@
                 <w:sz w:val="22"/>
               </w:rPr>
               <w:t>Net-spend exclusions (discounts, shipping, taxes other than VAT, gift card redemptions) to be confirmed.</w:t>
+            </w:r>
+          </w:p>
+        </w:tc>
+      </w:tr>
+    </w:tbl>
+    <w:tbl>
+      <w:tblPr>
+        <w:tblW w:type="auto" w:w="0"/>
+        <w:jc w:val="center"/>
+        <w:tblLook w:firstColumn="1" w:firstRow="1" w:lastColumn="0" w:lastRow="0" w:noHBand="0" w:noVBand="1" w:val="04A0"/>
+      </w:tblPr>
+      <w:tblGrid>
+        <w:gridCol w:w="10224"/>
+      </w:tblGrid>
+      <w:tr>
+        <w:tc>
+          <w:tcPr>
+            <w:tcW w:type="dxa" w:w="10224"/>
+            <w:shd w:fill="FFD966"/>
+            <w:tcBorders>
+              <w:top w:val="single" w:sz="10" w:space="0" w:color="D6B656"/>
+              <w:left w:val="single" w:sz="10" w:space="0" w:color="D6B656"/>
+              <w:bottom w:val="single" w:sz="10" w:space="0" w:color="D6B656"/>
+              <w:right w:val="single" w:sz="10" w:space="0" w:color="D6B656"/>
+            </w:tcBorders>
+            <w:tcMar>
+              <w:top w:w="90" w:type="dxa"/>
+              <w:start w:w="120" w:type="dxa"/>
+              <w:bottom w:w="90" w:type="dxa"/>
+              <w:end w:w="120" w:type="dxa"/>
+            </w:tcMar>
+            <w:vAlign w:val="center"/>
+          </w:tcPr>
+          <w:p>
+            <w:pPr>
+              <w:spacing w:before="0" w:after="40"/>
+            </w:pPr>
+            <w:r>
+              <w:rPr>
+                <w:rFonts w:ascii="Cambria" w:hAnsi="Cambria" w:eastAsia="Cambria" w:cs="Cambria"/>
+                <w:color w:val="000000"/>
+                <w:sz w:val="22"/>
+              </w:rPr>
+              <w:t>OP-13: Net-spend exclusions (discounts, shipping, taxes, gift cards) to be confirmed.</w:t>
             </w:r>
           </w:p>
         </w:tc>
@@ -6906,12 +7544,12 @@
             <w:tcW w:type="dxa" w:w="9072"/>
             <w:shd w:val="clear" w:color="auto" w:fill="FFC499"/>
             <w:tcMar>
-              <w:top w:w="70" w:type="dxa"/>
-              <w:bottom w:w="70" w:type="dxa"/>
+              <w:top w:w="90" w:type="dxa"/>
+              <w:bottom w:w="90" w:type="dxa"/>
               <w:left w:w="120" w:type="dxa"/>
               <w:right w:w="120" w:type="dxa"/>
-              <w:start w:w="95" w:type="dxa"/>
-              <w:end w:w="95" w:type="dxa"/>
+              <w:start w:w="120" w:type="dxa"/>
+              <w:end w:w="120" w:type="dxa"/>
             </w:tcMar>
             <w:vAlign w:val="center"/>
             <w:tcBorders>
@@ -6923,7 +7561,7 @@
           </w:tcPr>
           <w:p>
             <w:pPr>
-              <w:spacing w:after="30"/>
+              <w:spacing w:after="40" w:before="0"/>
             </w:pPr>
             <w:r>
               <w:rPr>
@@ -6963,12 +7601,12 @@
             <w:tcW w:type="dxa" w:w="9072"/>
             <w:shd w:val="clear" w:color="auto" w:fill="A7DC85"/>
             <w:tcMar>
-              <w:top w:w="70" w:type="dxa"/>
-              <w:bottom w:w="70" w:type="dxa"/>
+              <w:top w:w="90" w:type="dxa"/>
+              <w:bottom w:w="90" w:type="dxa"/>
               <w:left w:w="120" w:type="dxa"/>
               <w:right w:w="120" w:type="dxa"/>
-              <w:start w:w="95" w:type="dxa"/>
-              <w:end w:w="95" w:type="dxa"/>
+              <w:start w:w="120" w:type="dxa"/>
+              <w:end w:w="120" w:type="dxa"/>
             </w:tcMar>
             <w:vAlign w:val="center"/>
             <w:tcBorders>
@@ -6980,7 +7618,7 @@
           </w:tcPr>
           <w:p>
             <w:pPr>
-              <w:spacing w:after="30"/>
+              <w:spacing w:after="40" w:before="0"/>
             </w:pPr>
             <w:r>
               <w:rPr>
@@ -7020,12 +7658,12 @@
             <w:tcW w:type="dxa" w:w="9072"/>
             <w:shd w:val="clear" w:color="auto" w:fill="91C3DF"/>
             <w:tcMar>
-              <w:top w:w="70" w:type="dxa"/>
-              <w:bottom w:w="70" w:type="dxa"/>
+              <w:top w:w="90" w:type="dxa"/>
+              <w:bottom w:w="90" w:type="dxa"/>
               <w:left w:w="120" w:type="dxa"/>
               <w:right w:w="120" w:type="dxa"/>
-              <w:start w:w="95" w:type="dxa"/>
-              <w:end w:w="95" w:type="dxa"/>
+              <w:start w:w="120" w:type="dxa"/>
+              <w:end w:w="120" w:type="dxa"/>
             </w:tcMar>
             <w:vAlign w:val="center"/>
             <w:tcBorders>
@@ -7037,7 +7675,7 @@
           </w:tcPr>
           <w:p>
             <w:pPr>
-              <w:spacing w:after="30"/>
+              <w:spacing w:after="40" w:before="0"/>
             </w:pPr>
             <w:r>
               <w:rPr>
@@ -7077,12 +7715,12 @@
             <w:tcW w:type="dxa" w:w="9072"/>
             <w:shd w:val="clear" w:color="auto" w:fill="A7DC85"/>
             <w:tcMar>
-              <w:top w:w="70" w:type="dxa"/>
-              <w:bottom w:w="70" w:type="dxa"/>
+              <w:top w:w="90" w:type="dxa"/>
+              <w:bottom w:w="90" w:type="dxa"/>
               <w:left w:w="120" w:type="dxa"/>
               <w:right w:w="120" w:type="dxa"/>
-              <w:start w:w="95" w:type="dxa"/>
-              <w:end w:w="95" w:type="dxa"/>
+              <w:start w:w="120" w:type="dxa"/>
+              <w:end w:w="120" w:type="dxa"/>
             </w:tcMar>
             <w:vAlign w:val="center"/>
             <w:tcBorders>
@@ -7094,7 +7732,7 @@
           </w:tcPr>
           <w:p>
             <w:pPr>
-              <w:spacing w:after="30"/>
+              <w:spacing w:after="40" w:before="0"/>
             </w:pPr>
             <w:r>
               <w:rPr>
@@ -7226,12 +7864,12 @@
             <w:tcW w:type="dxa" w:w="9072"/>
             <w:shd w:val="clear" w:color="auto" w:fill="FFC499"/>
             <w:tcMar>
-              <w:top w:w="70" w:type="dxa"/>
-              <w:bottom w:w="70" w:type="dxa"/>
+              <w:top w:w="90" w:type="dxa"/>
+              <w:bottom w:w="90" w:type="dxa"/>
               <w:left w:w="120" w:type="dxa"/>
               <w:right w:w="120" w:type="dxa"/>
-              <w:start w:w="95" w:type="dxa"/>
-              <w:end w:w="95" w:type="dxa"/>
+              <w:start w:w="120" w:type="dxa"/>
+              <w:end w:w="120" w:type="dxa"/>
             </w:tcMar>
             <w:vAlign w:val="center"/>
             <w:tcBorders>
@@ -7243,7 +7881,7 @@
           </w:tcPr>
           <w:p>
             <w:pPr>
-              <w:spacing w:after="30"/>
+              <w:spacing w:after="40" w:before="0"/>
             </w:pPr>
             <w:r>
               <w:rPr>
@@ -7283,12 +7921,12 @@
             <w:tcW w:type="dxa" w:w="9072"/>
             <w:shd w:val="clear" w:color="auto" w:fill="A7DC85"/>
             <w:tcMar>
-              <w:top w:w="70" w:type="dxa"/>
-              <w:bottom w:w="70" w:type="dxa"/>
+              <w:top w:w="90" w:type="dxa"/>
+              <w:bottom w:w="90" w:type="dxa"/>
               <w:left w:w="120" w:type="dxa"/>
               <w:right w:w="120" w:type="dxa"/>
-              <w:start w:w="95" w:type="dxa"/>
-              <w:end w:w="95" w:type="dxa"/>
+              <w:start w:w="120" w:type="dxa"/>
+              <w:end w:w="120" w:type="dxa"/>
             </w:tcMar>
             <w:vAlign w:val="center"/>
             <w:tcBorders>
@@ -7300,7 +7938,7 @@
           </w:tcPr>
           <w:p>
             <w:pPr>
-              <w:spacing w:after="30"/>
+              <w:spacing w:after="40" w:before="0"/>
             </w:pPr>
             <w:r>
               <w:rPr>
@@ -7340,12 +7978,12 @@
             <w:tcW w:type="dxa" w:w="9072"/>
             <w:shd w:val="clear" w:color="auto" w:fill="91C3DF"/>
             <w:tcMar>
-              <w:top w:w="70" w:type="dxa"/>
-              <w:bottom w:w="70" w:type="dxa"/>
+              <w:top w:w="90" w:type="dxa"/>
+              <w:bottom w:w="90" w:type="dxa"/>
               <w:left w:w="120" w:type="dxa"/>
               <w:right w:w="120" w:type="dxa"/>
-              <w:start w:w="95" w:type="dxa"/>
-              <w:end w:w="95" w:type="dxa"/>
+              <w:start w:w="120" w:type="dxa"/>
+              <w:end w:w="120" w:type="dxa"/>
             </w:tcMar>
             <w:vAlign w:val="center"/>
             <w:tcBorders>
@@ -7357,7 +7995,7 @@
           </w:tcPr>
           <w:p>
             <w:pPr>
-              <w:spacing w:after="30"/>
+              <w:spacing w:after="40" w:before="0"/>
             </w:pPr>
             <w:r>
               <w:rPr>
@@ -7397,12 +8035,12 @@
             <w:tcW w:type="dxa" w:w="9072"/>
             <w:shd w:val="clear" w:color="auto" w:fill="FFC499"/>
             <w:tcMar>
-              <w:top w:w="70" w:type="dxa"/>
-              <w:bottom w:w="70" w:type="dxa"/>
+              <w:top w:w="90" w:type="dxa"/>
+              <w:bottom w:w="90" w:type="dxa"/>
               <w:left w:w="120" w:type="dxa"/>
               <w:right w:w="120" w:type="dxa"/>
-              <w:start w:w="95" w:type="dxa"/>
-              <w:end w:w="95" w:type="dxa"/>
+              <w:start w:w="120" w:type="dxa"/>
+              <w:end w:w="120" w:type="dxa"/>
             </w:tcMar>
             <w:vAlign w:val="center"/>
             <w:tcBorders>
@@ -7414,7 +8052,7 @@
           </w:tcPr>
           <w:p>
             <w:pPr>
-              <w:spacing w:after="30"/>
+              <w:spacing w:after="40" w:before="0"/>
             </w:pPr>
             <w:r>
               <w:rPr>
@@ -7432,6 +8070,50 @@
                 <w:sz w:val="22"/>
               </w:rPr>
               <w:t>Behaviour for partial returns and returns crossing year-end requalification to be defined.</w:t>
+            </w:r>
+          </w:p>
+        </w:tc>
+      </w:tr>
+    </w:tbl>
+    <w:tbl>
+      <w:tblPr>
+        <w:tblW w:type="auto" w:w="0"/>
+        <w:jc w:val="center"/>
+        <w:tblLook w:firstColumn="1" w:firstRow="1" w:lastColumn="0" w:lastRow="0" w:noHBand="0" w:noVBand="1" w:val="04A0"/>
+      </w:tblPr>
+      <w:tblGrid>
+        <w:gridCol w:w="10224"/>
+      </w:tblGrid>
+      <w:tr>
+        <w:tc>
+          <w:tcPr>
+            <w:tcW w:type="dxa" w:w="10224"/>
+            <w:shd w:fill="FFD966"/>
+            <w:tcBorders>
+              <w:top w:val="single" w:sz="10" w:space="0" w:color="D6B656"/>
+              <w:left w:val="single" w:sz="10" w:space="0" w:color="D6B656"/>
+              <w:bottom w:val="single" w:sz="10" w:space="0" w:color="D6B656"/>
+              <w:right w:val="single" w:sz="10" w:space="0" w:color="D6B656"/>
+            </w:tcBorders>
+            <w:tcMar>
+              <w:top w:w="90" w:type="dxa"/>
+              <w:start w:w="120" w:type="dxa"/>
+              <w:bottom w:w="90" w:type="dxa"/>
+              <w:end w:w="120" w:type="dxa"/>
+            </w:tcMar>
+            <w:vAlign w:val="center"/>
+          </w:tcPr>
+          <w:p>
+            <w:pPr>
+              <w:spacing w:before="0" w:after="40"/>
+            </w:pPr>
+            <w:r>
+              <w:rPr>
+                <w:rFonts w:ascii="Cambria" w:hAnsi="Cambria" w:eastAsia="Cambria" w:cs="Cambria"/>
+                <w:color w:val="000000"/>
+                <w:sz w:val="22"/>
+              </w:rPr>
+              <w:t>OP-14: Behaviour for partial returns and returns crossing year-end requalification.</w:t>
             </w:r>
           </w:p>
         </w:tc>
@@ -7684,6 +8366,7 @@
             <w:r>
               <w:rPr>
                 <w:rFonts w:ascii="Cambria" w:hAnsi="Cambria" w:eastAsia="Cambria" w:cs="Cambria"/>
+                <w:b w:val="0"/>
                 <w:color w:val="555559"/>
                 <w:sz w:val="22"/>
               </w:rPr>
@@ -7716,6 +8399,7 @@
             <w:r>
               <w:rPr>
                 <w:rFonts w:ascii="Cambria" w:hAnsi="Cambria" w:eastAsia="Cambria" w:cs="Cambria"/>
+                <w:b w:val="0"/>
                 <w:color w:val="555559"/>
                 <w:sz w:val="22"/>
               </w:rPr>
@@ -7748,6 +8432,7 @@
             <w:r>
               <w:rPr>
                 <w:rFonts w:ascii="Cambria" w:hAnsi="Cambria" w:eastAsia="Cambria" w:cs="Cambria"/>
+                <w:b w:val="0"/>
                 <w:color w:val="555559"/>
                 <w:sz w:val="22"/>
               </w:rPr>
@@ -7780,6 +8465,7 @@
             <w:r>
               <w:rPr>
                 <w:rFonts w:ascii="Cambria" w:hAnsi="Cambria" w:eastAsia="Cambria" w:cs="Cambria"/>
+                <w:b w:val="0"/>
                 <w:color w:val="555559"/>
                 <w:sz w:val="22"/>
               </w:rPr>
@@ -7812,6 +8498,7 @@
             <w:r>
               <w:rPr>
                 <w:rFonts w:ascii="Cambria" w:hAnsi="Cambria" w:eastAsia="Cambria" w:cs="Cambria"/>
+                <w:b w:val="0"/>
                 <w:color w:val="555559"/>
                 <w:sz w:val="22"/>
               </w:rPr>
@@ -7846,6 +8533,7 @@
             <w:r>
               <w:rPr>
                 <w:rFonts w:ascii="Cambria" w:hAnsi="Cambria" w:eastAsia="Cambria" w:cs="Cambria"/>
+                <w:b w:val="0"/>
                 <w:color w:val="555559"/>
                 <w:sz w:val="22"/>
               </w:rPr>
@@ -7878,6 +8566,7 @@
             <w:r>
               <w:rPr>
                 <w:rFonts w:ascii="Cambria" w:hAnsi="Cambria" w:eastAsia="Cambria" w:cs="Cambria"/>
+                <w:b w:val="0"/>
                 <w:color w:val="555559"/>
                 <w:sz w:val="22"/>
               </w:rPr>
@@ -7910,6 +8599,7 @@
             <w:r>
               <w:rPr>
                 <w:rFonts w:ascii="Cambria" w:hAnsi="Cambria" w:eastAsia="Cambria" w:cs="Cambria"/>
+                <w:b w:val="0"/>
                 <w:color w:val="555559"/>
                 <w:sz w:val="22"/>
               </w:rPr>
@@ -7942,6 +8632,7 @@
             <w:r>
               <w:rPr>
                 <w:rFonts w:ascii="Cambria" w:hAnsi="Cambria" w:eastAsia="Cambria" w:cs="Cambria"/>
+                <w:b w:val="0"/>
                 <w:color w:val="555559"/>
                 <w:sz w:val="22"/>
               </w:rPr>
@@ -7974,6 +8665,7 @@
             <w:r>
               <w:rPr>
                 <w:rFonts w:ascii="Cambria" w:hAnsi="Cambria" w:eastAsia="Cambria" w:cs="Cambria"/>
+                <w:b w:val="0"/>
                 <w:color w:val="555559"/>
                 <w:sz w:val="22"/>
               </w:rPr>
@@ -8008,6 +8700,7 @@
             <w:r>
               <w:rPr>
                 <w:rFonts w:ascii="Cambria" w:hAnsi="Cambria" w:eastAsia="Cambria" w:cs="Cambria"/>
+                <w:b w:val="0"/>
                 <w:color w:val="555559"/>
                 <w:sz w:val="22"/>
               </w:rPr>
@@ -8040,6 +8733,7 @@
             <w:r>
               <w:rPr>
                 <w:rFonts w:ascii="Cambria" w:hAnsi="Cambria" w:eastAsia="Cambria" w:cs="Cambria"/>
+                <w:b w:val="0"/>
                 <w:color w:val="555559"/>
                 <w:sz w:val="22"/>
               </w:rPr>
@@ -8072,6 +8766,7 @@
             <w:r>
               <w:rPr>
                 <w:rFonts w:ascii="Cambria" w:hAnsi="Cambria" w:eastAsia="Cambria" w:cs="Cambria"/>
+                <w:b w:val="0"/>
                 <w:color w:val="555559"/>
                 <w:sz w:val="22"/>
               </w:rPr>
@@ -8104,6 +8799,7 @@
             <w:r>
               <w:rPr>
                 <w:rFonts w:ascii="Cambria" w:hAnsi="Cambria" w:eastAsia="Cambria" w:cs="Cambria"/>
+                <w:b w:val="0"/>
                 <w:color w:val="555559"/>
                 <w:sz w:val="22"/>
               </w:rPr>
@@ -8136,6 +8832,7 @@
             <w:r>
               <w:rPr>
                 <w:rFonts w:ascii="Cambria" w:hAnsi="Cambria" w:eastAsia="Cambria" w:cs="Cambria"/>
+                <w:b w:val="0"/>
                 <w:color w:val="555559"/>
                 <w:sz w:val="22"/>
               </w:rPr>
@@ -8170,6 +8867,7 @@
             <w:r>
               <w:rPr>
                 <w:rFonts w:ascii="Cambria" w:hAnsi="Cambria" w:eastAsia="Cambria" w:cs="Cambria"/>
+                <w:b w:val="0"/>
                 <w:color w:val="555559"/>
                 <w:sz w:val="22"/>
               </w:rPr>
@@ -8202,6 +8900,7 @@
             <w:r>
               <w:rPr>
                 <w:rFonts w:ascii="Cambria" w:hAnsi="Cambria" w:eastAsia="Cambria" w:cs="Cambria"/>
+                <w:b w:val="0"/>
                 <w:color w:val="555559"/>
                 <w:sz w:val="22"/>
               </w:rPr>
@@ -8234,6 +8933,7 @@
             <w:r>
               <w:rPr>
                 <w:rFonts w:ascii="Cambria" w:hAnsi="Cambria" w:eastAsia="Cambria" w:cs="Cambria"/>
+                <w:b w:val="0"/>
                 <w:color w:val="555559"/>
                 <w:sz w:val="22"/>
               </w:rPr>
@@ -8266,6 +8966,7 @@
             <w:r>
               <w:rPr>
                 <w:rFonts w:ascii="Cambria" w:hAnsi="Cambria" w:eastAsia="Cambria" w:cs="Cambria"/>
+                <w:b w:val="0"/>
                 <w:color w:val="555559"/>
                 <w:sz w:val="22"/>
               </w:rPr>
@@ -8298,6 +8999,7 @@
             <w:r>
               <w:rPr>
                 <w:rFonts w:ascii="Cambria" w:hAnsi="Cambria" w:eastAsia="Cambria" w:cs="Cambria"/>
+                <w:b w:val="0"/>
                 <w:color w:val="555559"/>
                 <w:sz w:val="22"/>
               </w:rPr>
@@ -8332,6 +9034,7 @@
             <w:r>
               <w:rPr>
                 <w:rFonts w:ascii="Cambria" w:hAnsi="Cambria" w:eastAsia="Cambria" w:cs="Cambria"/>
+                <w:b w:val="0"/>
                 <w:color w:val="555559"/>
                 <w:sz w:val="22"/>
               </w:rPr>
@@ -8364,6 +9067,7 @@
             <w:r>
               <w:rPr>
                 <w:rFonts w:ascii="Cambria" w:hAnsi="Cambria" w:eastAsia="Cambria" w:cs="Cambria"/>
+                <w:b w:val="0"/>
                 <w:color w:val="555559"/>
                 <w:sz w:val="22"/>
               </w:rPr>
@@ -8396,6 +9100,7 @@
             <w:r>
               <w:rPr>
                 <w:rFonts w:ascii="Cambria" w:hAnsi="Cambria" w:eastAsia="Cambria" w:cs="Cambria"/>
+                <w:b w:val="0"/>
                 <w:color w:val="555559"/>
                 <w:sz w:val="22"/>
               </w:rPr>
@@ -8428,6 +9133,7 @@
             <w:r>
               <w:rPr>
                 <w:rFonts w:ascii="Cambria" w:hAnsi="Cambria" w:eastAsia="Cambria" w:cs="Cambria"/>
+                <w:b w:val="0"/>
                 <w:color w:val="555559"/>
                 <w:sz w:val="22"/>
               </w:rPr>
@@ -8460,6 +9166,7 @@
             <w:r>
               <w:rPr>
                 <w:rFonts w:ascii="Cambria" w:hAnsi="Cambria" w:eastAsia="Cambria" w:cs="Cambria"/>
+                <w:b w:val="0"/>
                 <w:color w:val="555559"/>
                 <w:sz w:val="22"/>
               </w:rPr>
@@ -8494,6 +9201,7 @@
             <w:r>
               <w:rPr>
                 <w:rFonts w:ascii="Cambria" w:hAnsi="Cambria" w:eastAsia="Cambria" w:cs="Cambria"/>
+                <w:b w:val="0"/>
                 <w:color w:val="555559"/>
                 <w:sz w:val="22"/>
               </w:rPr>
@@ -8526,6 +9234,7 @@
             <w:r>
               <w:rPr>
                 <w:rFonts w:ascii="Cambria" w:hAnsi="Cambria" w:eastAsia="Cambria" w:cs="Cambria"/>
+                <w:b w:val="0"/>
                 <w:color w:val="555559"/>
                 <w:sz w:val="22"/>
               </w:rPr>
@@ -8558,6 +9267,7 @@
             <w:r>
               <w:rPr>
                 <w:rFonts w:ascii="Cambria" w:hAnsi="Cambria" w:eastAsia="Cambria" w:cs="Cambria"/>
+                <w:b w:val="0"/>
                 <w:color w:val="555559"/>
                 <w:sz w:val="22"/>
               </w:rPr>
@@ -8590,6 +9300,7 @@
             <w:r>
               <w:rPr>
                 <w:rFonts w:ascii="Cambria" w:hAnsi="Cambria" w:eastAsia="Cambria" w:cs="Cambria"/>
+                <w:b w:val="0"/>
                 <w:color w:val="555559"/>
                 <w:sz w:val="22"/>
               </w:rPr>
@@ -8622,6 +9333,7 @@
             <w:r>
               <w:rPr>
                 <w:rFonts w:ascii="Cambria" w:hAnsi="Cambria" w:eastAsia="Cambria" w:cs="Cambria"/>
+                <w:b w:val="0"/>
                 <w:color w:val="555559"/>
                 <w:sz w:val="22"/>
               </w:rPr>
@@ -8656,6 +9368,7 @@
             <w:r>
               <w:rPr>
                 <w:rFonts w:ascii="Cambria" w:hAnsi="Cambria" w:eastAsia="Cambria" w:cs="Cambria"/>
+                <w:b w:val="0"/>
                 <w:color w:val="555559"/>
                 <w:sz w:val="22"/>
               </w:rPr>
@@ -8688,6 +9401,7 @@
             <w:r>
               <w:rPr>
                 <w:rFonts w:ascii="Cambria" w:hAnsi="Cambria" w:eastAsia="Cambria" w:cs="Cambria"/>
+                <w:b w:val="0"/>
                 <w:color w:val="555559"/>
                 <w:sz w:val="22"/>
               </w:rPr>
@@ -8720,6 +9434,7 @@
             <w:r>
               <w:rPr>
                 <w:rFonts w:ascii="Cambria" w:hAnsi="Cambria" w:eastAsia="Cambria" w:cs="Cambria"/>
+                <w:b w:val="0"/>
                 <w:color w:val="555559"/>
                 <w:sz w:val="22"/>
               </w:rPr>
@@ -8752,6 +9467,7 @@
             <w:r>
               <w:rPr>
                 <w:rFonts w:ascii="Cambria" w:hAnsi="Cambria" w:eastAsia="Cambria" w:cs="Cambria"/>
+                <w:b w:val="0"/>
                 <w:color w:val="555559"/>
                 <w:sz w:val="22"/>
               </w:rPr>
@@ -8784,6 +9500,7 @@
             <w:r>
               <w:rPr>
                 <w:rFonts w:ascii="Cambria" w:hAnsi="Cambria" w:eastAsia="Cambria" w:cs="Cambria"/>
+                <w:b w:val="0"/>
                 <w:color w:val="555559"/>
                 <w:sz w:val="22"/>
               </w:rPr>
@@ -8818,6 +9535,7 @@
             <w:r>
               <w:rPr>
                 <w:rFonts w:ascii="Cambria" w:hAnsi="Cambria" w:eastAsia="Cambria" w:cs="Cambria"/>
+                <w:b w:val="0"/>
                 <w:color w:val="555559"/>
                 <w:sz w:val="22"/>
               </w:rPr>
@@ -8850,6 +9568,7 @@
             <w:r>
               <w:rPr>
                 <w:rFonts w:ascii="Cambria" w:hAnsi="Cambria" w:eastAsia="Cambria" w:cs="Cambria"/>
+                <w:b w:val="0"/>
                 <w:color w:val="555559"/>
                 <w:sz w:val="22"/>
               </w:rPr>
@@ -8882,6 +9601,7 @@
             <w:r>
               <w:rPr>
                 <w:rFonts w:ascii="Cambria" w:hAnsi="Cambria" w:eastAsia="Cambria" w:cs="Cambria"/>
+                <w:b w:val="0"/>
                 <w:color w:val="555559"/>
                 <w:sz w:val="22"/>
               </w:rPr>
@@ -8914,6 +9634,7 @@
             <w:r>
               <w:rPr>
                 <w:rFonts w:ascii="Cambria" w:hAnsi="Cambria" w:eastAsia="Cambria" w:cs="Cambria"/>
+                <w:b w:val="0"/>
                 <w:color w:val="555559"/>
                 <w:sz w:val="22"/>
               </w:rPr>
@@ -8946,6 +9667,7 @@
             <w:r>
               <w:rPr>
                 <w:rFonts w:ascii="Cambria" w:hAnsi="Cambria" w:eastAsia="Cambria" w:cs="Cambria"/>
+                <w:b w:val="0"/>
                 <w:color w:val="555559"/>
                 <w:sz w:val="22"/>
               </w:rPr>
@@ -8980,6 +9702,7 @@
             <w:r>
               <w:rPr>
                 <w:rFonts w:ascii="Cambria" w:hAnsi="Cambria" w:eastAsia="Cambria" w:cs="Cambria"/>
+                <w:b w:val="0"/>
                 <w:color w:val="555559"/>
                 <w:sz w:val="22"/>
               </w:rPr>
@@ -9012,6 +9735,7 @@
             <w:r>
               <w:rPr>
                 <w:rFonts w:ascii="Cambria" w:hAnsi="Cambria" w:eastAsia="Cambria" w:cs="Cambria"/>
+                <w:b w:val="0"/>
                 <w:color w:val="555559"/>
                 <w:sz w:val="22"/>
               </w:rPr>
@@ -9044,6 +9768,7 @@
             <w:r>
               <w:rPr>
                 <w:rFonts w:ascii="Cambria" w:hAnsi="Cambria" w:eastAsia="Cambria" w:cs="Cambria"/>
+                <w:b w:val="0"/>
                 <w:color w:val="555559"/>
                 <w:sz w:val="22"/>
               </w:rPr>
@@ -9076,6 +9801,7 @@
             <w:r>
               <w:rPr>
                 <w:rFonts w:ascii="Cambria" w:hAnsi="Cambria" w:eastAsia="Cambria" w:cs="Cambria"/>
+                <w:b w:val="0"/>
                 <w:color w:val="555559"/>
                 <w:sz w:val="22"/>
               </w:rPr>
@@ -9108,6 +9834,7 @@
             <w:r>
               <w:rPr>
                 <w:rFonts w:ascii="Cambria" w:hAnsi="Cambria" w:eastAsia="Cambria" w:cs="Cambria"/>
+                <w:b w:val="0"/>
                 <w:color w:val="555559"/>
                 <w:sz w:val="22"/>
               </w:rPr>
@@ -9142,6 +9869,7 @@
             <w:r>
               <w:rPr>
                 <w:rFonts w:ascii="Cambria" w:hAnsi="Cambria" w:eastAsia="Cambria" w:cs="Cambria"/>
+                <w:b w:val="0"/>
                 <w:color w:val="555559"/>
                 <w:sz w:val="22"/>
               </w:rPr>
@@ -9174,6 +9902,7 @@
             <w:r>
               <w:rPr>
                 <w:rFonts w:ascii="Cambria" w:hAnsi="Cambria" w:eastAsia="Cambria" w:cs="Cambria"/>
+                <w:b w:val="0"/>
                 <w:color w:val="555559"/>
                 <w:sz w:val="22"/>
               </w:rPr>
@@ -9206,6 +9935,7 @@
             <w:r>
               <w:rPr>
                 <w:rFonts w:ascii="Cambria" w:hAnsi="Cambria" w:eastAsia="Cambria" w:cs="Cambria"/>
+                <w:b w:val="0"/>
                 <w:color w:val="555559"/>
                 <w:sz w:val="22"/>
               </w:rPr>
@@ -9238,6 +9968,7 @@
             <w:r>
               <w:rPr>
                 <w:rFonts w:ascii="Cambria" w:hAnsi="Cambria" w:eastAsia="Cambria" w:cs="Cambria"/>
+                <w:b w:val="0"/>
                 <w:color w:val="555559"/>
                 <w:sz w:val="22"/>
               </w:rPr>
@@ -9270,6 +10001,7 @@
             <w:r>
               <w:rPr>
                 <w:rFonts w:ascii="Cambria" w:hAnsi="Cambria" w:eastAsia="Cambria" w:cs="Cambria"/>
+                <w:b w:val="0"/>
                 <w:color w:val="555559"/>
                 <w:sz w:val="22"/>
               </w:rPr>
@@ -9304,6 +10036,7 @@
             <w:r>
               <w:rPr>
                 <w:rFonts w:ascii="Cambria" w:hAnsi="Cambria" w:eastAsia="Cambria" w:cs="Cambria"/>
+                <w:b w:val="0"/>
                 <w:color w:val="555559"/>
                 <w:sz w:val="22"/>
               </w:rPr>
@@ -9336,6 +10069,7 @@
             <w:r>
               <w:rPr>
                 <w:rFonts w:ascii="Cambria" w:hAnsi="Cambria" w:eastAsia="Cambria" w:cs="Cambria"/>
+                <w:b w:val="0"/>
                 <w:color w:val="555559"/>
                 <w:sz w:val="22"/>
               </w:rPr>
@@ -9368,6 +10102,7 @@
             <w:r>
               <w:rPr>
                 <w:rFonts w:ascii="Cambria" w:hAnsi="Cambria" w:eastAsia="Cambria" w:cs="Cambria"/>
+                <w:b w:val="0"/>
                 <w:color w:val="555559"/>
                 <w:sz w:val="22"/>
               </w:rPr>
@@ -9400,6 +10135,7 @@
             <w:r>
               <w:rPr>
                 <w:rFonts w:ascii="Cambria" w:hAnsi="Cambria" w:eastAsia="Cambria" w:cs="Cambria"/>
+                <w:b w:val="0"/>
                 <w:color w:val="555559"/>
                 <w:sz w:val="22"/>
               </w:rPr>
@@ -9432,6 +10168,7 @@
             <w:r>
               <w:rPr>
                 <w:rFonts w:ascii="Cambria" w:hAnsi="Cambria" w:eastAsia="Cambria" w:cs="Cambria"/>
+                <w:b w:val="0"/>
                 <w:color w:val="555559"/>
                 <w:sz w:val="22"/>
               </w:rPr>
@@ -9466,6 +10203,7 @@
             <w:r>
               <w:rPr>
                 <w:rFonts w:ascii="Cambria" w:hAnsi="Cambria" w:eastAsia="Cambria" w:cs="Cambria"/>
+                <w:b w:val="0"/>
                 <w:color w:val="555559"/>
                 <w:sz w:val="22"/>
               </w:rPr>
@@ -9498,6 +10236,7 @@
             <w:r>
               <w:rPr>
                 <w:rFonts w:ascii="Cambria" w:hAnsi="Cambria" w:eastAsia="Cambria" w:cs="Cambria"/>
+                <w:b w:val="0"/>
                 <w:color w:val="555559"/>
                 <w:sz w:val="22"/>
               </w:rPr>
@@ -9530,6 +10269,7 @@
             <w:r>
               <w:rPr>
                 <w:rFonts w:ascii="Cambria" w:hAnsi="Cambria" w:eastAsia="Cambria" w:cs="Cambria"/>
+                <w:b w:val="0"/>
                 <w:color w:val="555559"/>
                 <w:sz w:val="22"/>
               </w:rPr>
@@ -9562,6 +10302,7 @@
             <w:r>
               <w:rPr>
                 <w:rFonts w:ascii="Cambria" w:hAnsi="Cambria" w:eastAsia="Cambria" w:cs="Cambria"/>
+                <w:b w:val="0"/>
                 <w:color w:val="555559"/>
                 <w:sz w:val="22"/>
               </w:rPr>
@@ -9594,6 +10335,7 @@
             <w:r>
               <w:rPr>
                 <w:rFonts w:ascii="Cambria" w:hAnsi="Cambria" w:eastAsia="Cambria" w:cs="Cambria"/>
+                <w:b w:val="0"/>
                 <w:color w:val="555559"/>
                 <w:sz w:val="22"/>
               </w:rPr>
@@ -9628,6 +10370,7 @@
             <w:r>
               <w:rPr>
                 <w:rFonts w:ascii="Cambria" w:hAnsi="Cambria" w:eastAsia="Cambria" w:cs="Cambria"/>
+                <w:b w:val="0"/>
                 <w:color w:val="555559"/>
                 <w:sz w:val="22"/>
               </w:rPr>
@@ -9660,6 +10403,7 @@
             <w:r>
               <w:rPr>
                 <w:rFonts w:ascii="Cambria" w:hAnsi="Cambria" w:eastAsia="Cambria" w:cs="Cambria"/>
+                <w:b w:val="0"/>
                 <w:color w:val="555559"/>
                 <w:sz w:val="22"/>
               </w:rPr>
@@ -9692,6 +10436,7 @@
             <w:r>
               <w:rPr>
                 <w:rFonts w:ascii="Cambria" w:hAnsi="Cambria" w:eastAsia="Cambria" w:cs="Cambria"/>
+                <w:b w:val="0"/>
                 <w:color w:val="555559"/>
                 <w:sz w:val="22"/>
               </w:rPr>
@@ -9724,6 +10469,7 @@
             <w:r>
               <w:rPr>
                 <w:rFonts w:ascii="Cambria" w:hAnsi="Cambria" w:eastAsia="Cambria" w:cs="Cambria"/>
+                <w:b w:val="0"/>
                 <w:color w:val="555559"/>
                 <w:sz w:val="22"/>
               </w:rPr>
@@ -9756,6 +10502,7 @@
             <w:r>
               <w:rPr>
                 <w:rFonts w:ascii="Cambria" w:hAnsi="Cambria" w:eastAsia="Cambria" w:cs="Cambria"/>
+                <w:b w:val="0"/>
                 <w:color w:val="555559"/>
                 <w:sz w:val="22"/>
               </w:rPr>
@@ -9790,6 +10537,7 @@
             <w:r>
               <w:rPr>
                 <w:rFonts w:ascii="Cambria" w:hAnsi="Cambria" w:eastAsia="Cambria" w:cs="Cambria"/>
+                <w:b w:val="0"/>
                 <w:color w:val="555559"/>
                 <w:sz w:val="22"/>
               </w:rPr>
@@ -9822,6 +10570,7 @@
             <w:r>
               <w:rPr>
                 <w:rFonts w:ascii="Cambria" w:hAnsi="Cambria" w:eastAsia="Cambria" w:cs="Cambria"/>
+                <w:b w:val="0"/>
                 <w:color w:val="555559"/>
                 <w:sz w:val="22"/>
               </w:rPr>
@@ -9854,6 +10603,7 @@
             <w:r>
               <w:rPr>
                 <w:rFonts w:ascii="Cambria" w:hAnsi="Cambria" w:eastAsia="Cambria" w:cs="Cambria"/>
+                <w:b w:val="0"/>
                 <w:color w:val="555559"/>
                 <w:sz w:val="22"/>
               </w:rPr>
@@ -9886,6 +10636,7 @@
             <w:r>
               <w:rPr>
                 <w:rFonts w:ascii="Cambria" w:hAnsi="Cambria" w:eastAsia="Cambria" w:cs="Cambria"/>
+                <w:b w:val="0"/>
                 <w:color w:val="555559"/>
                 <w:sz w:val="22"/>
               </w:rPr>
@@ -9918,6 +10669,7 @@
             <w:r>
               <w:rPr>
                 <w:rFonts w:ascii="Cambria" w:hAnsi="Cambria" w:eastAsia="Cambria" w:cs="Cambria"/>
+                <w:b w:val="0"/>
                 <w:color w:val="555559"/>
                 <w:sz w:val="22"/>
               </w:rPr>
@@ -9952,6 +10704,7 @@
             <w:r>
               <w:rPr>
                 <w:rFonts w:ascii="Cambria" w:hAnsi="Cambria" w:eastAsia="Cambria" w:cs="Cambria"/>
+                <w:b w:val="0"/>
                 <w:color w:val="555559"/>
                 <w:sz w:val="22"/>
               </w:rPr>
@@ -9984,6 +10737,7 @@
             <w:r>
               <w:rPr>
                 <w:rFonts w:ascii="Cambria" w:hAnsi="Cambria" w:eastAsia="Cambria" w:cs="Cambria"/>
+                <w:b w:val="0"/>
                 <w:color w:val="555559"/>
                 <w:sz w:val="22"/>
               </w:rPr>
@@ -10016,6 +10770,7 @@
             <w:r>
               <w:rPr>
                 <w:rFonts w:ascii="Cambria" w:hAnsi="Cambria" w:eastAsia="Cambria" w:cs="Cambria"/>
+                <w:b w:val="0"/>
                 <w:color w:val="555559"/>
                 <w:sz w:val="22"/>
               </w:rPr>
@@ -10048,6 +10803,7 @@
             <w:r>
               <w:rPr>
                 <w:rFonts w:ascii="Cambria" w:hAnsi="Cambria" w:eastAsia="Cambria" w:cs="Cambria"/>
+                <w:b w:val="0"/>
                 <w:color w:val="555559"/>
                 <w:sz w:val="22"/>
               </w:rPr>
@@ -10080,6 +10836,7 @@
             <w:r>
               <w:rPr>
                 <w:rFonts w:ascii="Cambria" w:hAnsi="Cambria" w:eastAsia="Cambria" w:cs="Cambria"/>
+                <w:b w:val="0"/>
                 <w:color w:val="555559"/>
                 <w:sz w:val="22"/>
               </w:rPr>
@@ -10118,101 +10875,17 @@
       </w:r>
     </w:p>
     <w:p>
-      <w:r>
-        <w:rPr>
-          <w:rFonts w:ascii="Cambria" w:hAnsi="Cambria" w:eastAsia="Cambria" w:cs="Cambria"/>
-          <w:color w:val="555559"/>
-          <w:sz w:val="22"/>
-        </w:rPr>
-        <w:t>Reference documentation used as the basis for this Solution Blueprint:</w:t>
-      </w:r>
-    </w:p>
-    <w:p>
       <w:pPr>
-        <w:pStyle w:val="ListBullet"/>
+        <w:spacing w:after="120"/>
       </w:pPr>
       <w:r>
         <w:rPr>
           <w:rFonts w:ascii="Cambria" w:hAnsi="Cambria" w:eastAsia="Cambria" w:cs="Cambria"/>
+          <w:b w:val="0"/>
           <w:color w:val="555559"/>
           <w:sz w:val="22"/>
         </w:rPr>
-        <w:t>Oracle Retail Customer Engagement Cloud Service — User Guide (release 25.0.101.0)</w:t>
-      </w:r>
-    </w:p>
-    <w:p>
-      <w:pPr>
-        <w:pStyle w:val="ListBullet"/>
-      </w:pPr>
-      <w:r>
-        <w:rPr>
-          <w:rFonts w:ascii="Cambria" w:hAnsi="Cambria" w:eastAsia="Cambria" w:cs="Cambria"/>
-          <w:color w:val="555559"/>
-          <w:sz w:val="22"/>
-        </w:rPr>
-        <w:t>Oracle Retail Customer Engagement Cloud Service — Implementation Guide (release 25.0.101.0)</w:t>
-      </w:r>
-    </w:p>
-    <w:p>
-      <w:pPr>
-        <w:pStyle w:val="ListBullet"/>
-      </w:pPr>
-      <w:r>
-        <w:rPr>
-          <w:rFonts w:ascii="Cambria" w:hAnsi="Cambria" w:eastAsia="Cambria" w:cs="Cambria"/>
-          <w:color w:val="555559"/>
-          <w:sz w:val="22"/>
-        </w:rPr>
-        <w:t>Oracle Retail Customer Engagement Cloud Service — Batch Processing &amp; Web Services Guide (release 25.0.101.0)</w:t>
-      </w:r>
-    </w:p>
-    <w:p>
-      <w:pPr>
-        <w:pStyle w:val="ListBullet"/>
-      </w:pPr>
-      <w:r>
-        <w:rPr>
-          <w:rFonts w:ascii="Cambria" w:hAnsi="Cambria" w:eastAsia="Cambria" w:cs="Cambria"/>
-          <w:color w:val="555559"/>
-          <w:sz w:val="22"/>
-        </w:rPr>
-        <w:t>Claire's Loyalty Relaunch Requirements 2026 (client BRD)</w:t>
-      </w:r>
-    </w:p>
-    <w:p>
-      <w:pPr>
-        <w:pStyle w:val="ListBullet"/>
-      </w:pPr>
-      <w:r>
-        <w:rPr>
-          <w:rFonts w:ascii="Cambria" w:hAnsi="Cambria" w:eastAsia="Cambria" w:cs="Cambria"/>
-          <w:color w:val="555559"/>
-          <w:sz w:val="22"/>
-        </w:rPr>
-        <w:t>Claire's ORCE Fit Analysis v1.2</w:t>
-      </w:r>
-    </w:p>
-    <w:p>
-      <w:pPr>
-        <w:pStyle w:val="ListBullet"/>
-      </w:pPr>
-      <w:r>
-        <w:rPr>
-          <w:rFonts w:ascii="Cambria" w:hAnsi="Cambria" w:eastAsia="Cambria" w:cs="Cambria"/>
-          <w:color w:val="555559"/>
-          <w:sz w:val="22"/>
-        </w:rPr>
-        <w:t>Claire's ORCE ScoreCard</w:t>
-      </w:r>
-    </w:p>
-    <w:p>
-      <w:r>
-        <w:rPr>
-          <w:rFonts w:ascii="Cambria" w:hAnsi="Cambria" w:eastAsia="Cambria" w:cs="Cambria"/>
-          <w:color w:val="555559"/>
-          <w:sz w:val="22"/>
-        </w:rPr>
-        <w:br w:type="page"/>
+        <w:t>This section is reserved for supporting appendices. No external document references are included in this version.</w:t>
       </w:r>
     </w:p>
     <w:p>

</xml_diff>

<commit_message>
Separate yellow OP callouts in editable document
Co-authored-by: RicardoCasquinha <RicardoCasquinha@users.noreply.github.com>
</commit_message>
<xml_diff>
--- a/Claires - Solution Blueprint - Customer Engagement V1 - Redesigned.docx
+++ b/Claires - Solution Blueprint - Customer Engagement V1 - Redesigned.docx
@@ -2522,6 +2522,12 @@
         </w:tc>
       </w:tr>
     </w:tbl>
+    <w:p>
+      <w:pPr>
+        <w:spacing w:before="0" w:after="160" w:lineRule="exact" w:line="20"/>
+        <w:jc w:val="left"/>
+      </w:pPr>
+    </w:p>
     <w:tbl>
       <w:tblPr>
         <w:tblW w:type="dxa" w:w="9028"/>
@@ -2538,22 +2544,25 @@
             <w:tcW w:type="dxa" w:w="9029"/>
             <w:shd w:fill="FFD966"/>
             <w:tcBorders>
-              <w:top w:val="single" w:sz="10" w:space="0" w:color="D6B656"/>
-              <w:left w:val="single" w:sz="10" w:space="0" w:color="D6B656"/>
-              <w:bottom w:val="single" w:sz="10" w:space="0" w:color="D6B656"/>
-              <w:right w:val="single" w:sz="10" w:space="0" w:color="D6B656"/>
+              <w:top w:val="nil" w:sz="0" w:space="0" w:color="FFD966"/>
+              <w:left w:val="nil" w:sz="0" w:space="0" w:color="FFD966"/>
+              <w:bottom w:val="nil" w:sz="0" w:space="0" w:color="FFD966"/>
+              <w:right w:val="nil" w:sz="0" w:space="0" w:color="FFD966"/>
+              <w:insideH w:val="nil" w:sz="0" w:space="0" w:color="FFD966"/>
+              <w:insideV w:val="nil" w:sz="0" w:space="0" w:color="FFD966"/>
             </w:tcBorders>
             <w:tcMar>
-              <w:top w:w="115" w:type="dxa"/>
-              <w:start w:w="130" w:type="dxa"/>
-              <w:bottom w:w="115" w:type="dxa"/>
-              <w:end w:w="130" w:type="dxa"/>
+              <w:top w:w="135" w:type="dxa"/>
+              <w:start w:w="145" w:type="dxa"/>
+              <w:bottom w:w="135" w:type="dxa"/>
+              <w:end w:w="145" w:type="dxa"/>
             </w:tcMar>
             <w:vAlign w:val="center"/>
           </w:tcPr>
           <w:p>
             <w:pPr>
               <w:spacing w:before="0" w:after="0"/>
+              <w:jc w:val="left"/>
             </w:pPr>
             <w:r>
               <w:rPr>
@@ -2568,7 +2577,12 @@
         </w:tc>
       </w:tr>
     </w:tbl>
-    <w:p/>
+    <w:p>
+      <w:pPr>
+        <w:spacing w:before="0" w:after="160" w:lineRule="exact" w:line="20"/>
+        <w:jc w:val="left"/>
+      </w:pPr>
+    </w:p>
     <w:p>
       <w:pPr>
         <w:pStyle w:val="Heading2"/>
@@ -2840,6 +2854,12 @@
         </w:tc>
       </w:tr>
     </w:tbl>
+    <w:p>
+      <w:pPr>
+        <w:spacing w:before="0" w:after="160" w:lineRule="exact" w:line="20"/>
+        <w:jc w:val="left"/>
+      </w:pPr>
+    </w:p>
     <w:tbl>
       <w:tblPr>
         <w:tblW w:type="dxa" w:w="9028"/>
@@ -2856,22 +2876,25 @@
             <w:tcW w:type="dxa" w:w="9029"/>
             <w:shd w:fill="FFD966"/>
             <w:tcBorders>
-              <w:top w:val="single" w:sz="10" w:space="0" w:color="D6B656"/>
-              <w:left w:val="single" w:sz="10" w:space="0" w:color="D6B656"/>
-              <w:bottom w:val="single" w:sz="10" w:space="0" w:color="D6B656"/>
-              <w:right w:val="single" w:sz="10" w:space="0" w:color="D6B656"/>
+              <w:top w:val="nil" w:sz="0" w:space="0" w:color="FFD966"/>
+              <w:left w:val="nil" w:sz="0" w:space="0" w:color="FFD966"/>
+              <w:bottom w:val="nil" w:sz="0" w:space="0" w:color="FFD966"/>
+              <w:right w:val="nil" w:sz="0" w:space="0" w:color="FFD966"/>
+              <w:insideH w:val="nil" w:sz="0" w:space="0" w:color="FFD966"/>
+              <w:insideV w:val="nil" w:sz="0" w:space="0" w:color="FFD966"/>
             </w:tcBorders>
             <w:tcMar>
-              <w:top w:w="115" w:type="dxa"/>
-              <w:start w:w="130" w:type="dxa"/>
-              <w:bottom w:w="115" w:type="dxa"/>
-              <w:end w:w="130" w:type="dxa"/>
+              <w:top w:w="135" w:type="dxa"/>
+              <w:start w:w="145" w:type="dxa"/>
+              <w:bottom w:w="135" w:type="dxa"/>
+              <w:end w:w="145" w:type="dxa"/>
             </w:tcMar>
             <w:vAlign w:val="center"/>
           </w:tcPr>
           <w:p>
             <w:pPr>
               <w:spacing w:before="0" w:after="0"/>
+              <w:jc w:val="left"/>
             </w:pPr>
             <w:r>
               <w:rPr>
@@ -2886,7 +2909,12 @@
         </w:tc>
       </w:tr>
     </w:tbl>
-    <w:p/>
+    <w:p>
+      <w:pPr>
+        <w:spacing w:before="0" w:after="160" w:lineRule="exact" w:line="20"/>
+        <w:jc w:val="left"/>
+      </w:pPr>
+    </w:p>
     <w:p>
       <w:pPr>
         <w:pStyle w:val="Heading2"/>
@@ -3145,6 +3173,12 @@
         </w:tc>
       </w:tr>
     </w:tbl>
+    <w:p>
+      <w:pPr>
+        <w:spacing w:before="0" w:after="160" w:lineRule="exact" w:line="20"/>
+        <w:jc w:val="left"/>
+      </w:pPr>
+    </w:p>
     <w:tbl>
       <w:tblPr>
         <w:tblW w:type="dxa" w:w="9028"/>
@@ -3161,22 +3195,25 @@
             <w:tcW w:type="dxa" w:w="9029"/>
             <w:shd w:fill="FFD966"/>
             <w:tcBorders>
-              <w:top w:val="single" w:sz="10" w:space="0" w:color="D6B656"/>
-              <w:left w:val="single" w:sz="10" w:space="0" w:color="D6B656"/>
-              <w:bottom w:val="single" w:sz="10" w:space="0" w:color="D6B656"/>
-              <w:right w:val="single" w:sz="10" w:space="0" w:color="D6B656"/>
+              <w:top w:val="nil" w:sz="0" w:space="0" w:color="FFD966"/>
+              <w:left w:val="nil" w:sz="0" w:space="0" w:color="FFD966"/>
+              <w:bottom w:val="nil" w:sz="0" w:space="0" w:color="FFD966"/>
+              <w:right w:val="nil" w:sz="0" w:space="0" w:color="FFD966"/>
+              <w:insideH w:val="nil" w:sz="0" w:space="0" w:color="FFD966"/>
+              <w:insideV w:val="nil" w:sz="0" w:space="0" w:color="FFD966"/>
             </w:tcBorders>
             <w:tcMar>
-              <w:top w:w="115" w:type="dxa"/>
-              <w:start w:w="130" w:type="dxa"/>
-              <w:bottom w:w="115" w:type="dxa"/>
-              <w:end w:w="130" w:type="dxa"/>
+              <w:top w:w="135" w:type="dxa"/>
+              <w:start w:w="145" w:type="dxa"/>
+              <w:bottom w:w="135" w:type="dxa"/>
+              <w:end w:w="145" w:type="dxa"/>
             </w:tcMar>
             <w:vAlign w:val="center"/>
           </w:tcPr>
           <w:p>
             <w:pPr>
               <w:spacing w:before="0" w:after="0"/>
+              <w:jc w:val="left"/>
             </w:pPr>
             <w:r>
               <w:rPr>
@@ -3191,7 +3228,12 @@
         </w:tc>
       </w:tr>
     </w:tbl>
-    <w:p/>
+    <w:p>
+      <w:pPr>
+        <w:spacing w:before="0" w:after="160" w:lineRule="exact" w:line="20"/>
+        <w:jc w:val="left"/>
+      </w:pPr>
+    </w:p>
     <w:p>
       <w:pPr>
         <w:pStyle w:val="Heading2"/>
@@ -3962,6 +4004,12 @@
         </w:tc>
       </w:tr>
     </w:tbl>
+    <w:p>
+      <w:pPr>
+        <w:spacing w:before="0" w:after="160" w:lineRule="exact" w:line="20"/>
+        <w:jc w:val="left"/>
+      </w:pPr>
+    </w:p>
     <w:tbl>
       <w:tblPr>
         <w:tblW w:type="dxa" w:w="9028"/>
@@ -3978,22 +4026,25 @@
             <w:tcW w:type="dxa" w:w="9029"/>
             <w:shd w:fill="FFD966"/>
             <w:tcBorders>
-              <w:top w:val="single" w:sz="10" w:space="0" w:color="D6B656"/>
-              <w:left w:val="single" w:sz="10" w:space="0" w:color="D6B656"/>
-              <w:bottom w:val="single" w:sz="10" w:space="0" w:color="D6B656"/>
-              <w:right w:val="single" w:sz="10" w:space="0" w:color="D6B656"/>
+              <w:top w:val="nil" w:sz="0" w:space="0" w:color="FFD966"/>
+              <w:left w:val="nil" w:sz="0" w:space="0" w:color="FFD966"/>
+              <w:bottom w:val="nil" w:sz="0" w:space="0" w:color="FFD966"/>
+              <w:right w:val="nil" w:sz="0" w:space="0" w:color="FFD966"/>
+              <w:insideH w:val="nil" w:sz="0" w:space="0" w:color="FFD966"/>
+              <w:insideV w:val="nil" w:sz="0" w:space="0" w:color="FFD966"/>
             </w:tcBorders>
             <w:tcMar>
-              <w:top w:w="115" w:type="dxa"/>
-              <w:start w:w="130" w:type="dxa"/>
-              <w:bottom w:w="115" w:type="dxa"/>
-              <w:end w:w="130" w:type="dxa"/>
+              <w:top w:w="135" w:type="dxa"/>
+              <w:start w:w="145" w:type="dxa"/>
+              <w:bottom w:w="135" w:type="dxa"/>
+              <w:end w:w="145" w:type="dxa"/>
             </w:tcMar>
             <w:vAlign w:val="center"/>
           </w:tcPr>
           <w:p>
             <w:pPr>
               <w:spacing w:before="0" w:after="0"/>
+              <w:jc w:val="left"/>
             </w:pPr>
             <w:r>
               <w:rPr>
@@ -4008,7 +4059,12 @@
         </w:tc>
       </w:tr>
     </w:tbl>
-    <w:p/>
+    <w:p>
+      <w:pPr>
+        <w:spacing w:before="0" w:after="160" w:lineRule="exact" w:line="20"/>
+        <w:jc w:val="left"/>
+      </w:pPr>
+    </w:p>
     <w:p>
       <w:r>
         <w:rPr>
@@ -4321,6 +4377,12 @@
         </w:tc>
       </w:tr>
     </w:tbl>
+    <w:p>
+      <w:pPr>
+        <w:spacing w:before="0" w:after="160" w:lineRule="exact" w:line="20"/>
+        <w:jc w:val="left"/>
+      </w:pPr>
+    </w:p>
     <w:tbl>
       <w:tblPr>
         <w:tblW w:type="dxa" w:w="9028"/>
@@ -4337,22 +4399,25 @@
             <w:tcW w:type="dxa" w:w="9029"/>
             <w:shd w:fill="FFD966"/>
             <w:tcBorders>
-              <w:top w:val="single" w:sz="10" w:space="0" w:color="D6B656"/>
-              <w:left w:val="single" w:sz="10" w:space="0" w:color="D6B656"/>
-              <w:bottom w:val="single" w:sz="10" w:space="0" w:color="D6B656"/>
-              <w:right w:val="single" w:sz="10" w:space="0" w:color="D6B656"/>
+              <w:top w:val="nil" w:sz="0" w:space="0" w:color="FFD966"/>
+              <w:left w:val="nil" w:sz="0" w:space="0" w:color="FFD966"/>
+              <w:bottom w:val="nil" w:sz="0" w:space="0" w:color="FFD966"/>
+              <w:right w:val="nil" w:sz="0" w:space="0" w:color="FFD966"/>
+              <w:insideH w:val="nil" w:sz="0" w:space="0" w:color="FFD966"/>
+              <w:insideV w:val="nil" w:sz="0" w:space="0" w:color="FFD966"/>
             </w:tcBorders>
             <w:tcMar>
-              <w:top w:w="115" w:type="dxa"/>
-              <w:start w:w="130" w:type="dxa"/>
-              <w:bottom w:w="115" w:type="dxa"/>
-              <w:end w:w="130" w:type="dxa"/>
+              <w:top w:w="135" w:type="dxa"/>
+              <w:start w:w="145" w:type="dxa"/>
+              <w:bottom w:w="135" w:type="dxa"/>
+              <w:end w:w="145" w:type="dxa"/>
             </w:tcMar>
             <w:vAlign w:val="center"/>
           </w:tcPr>
           <w:p>
             <w:pPr>
               <w:spacing w:before="0" w:after="0"/>
+              <w:jc w:val="left"/>
             </w:pPr>
             <w:r>
               <w:rPr>
@@ -4367,7 +4432,12 @@
         </w:tc>
       </w:tr>
     </w:tbl>
-    <w:p/>
+    <w:p>
+      <w:pPr>
+        <w:spacing w:before="0" w:after="160" w:lineRule="exact" w:line="20"/>
+        <w:jc w:val="left"/>
+      </w:pPr>
+    </w:p>
     <w:p>
       <w:pPr>
         <w:pStyle w:val="Heading2"/>
@@ -4730,6 +4800,12 @@
         </w:tc>
       </w:tr>
     </w:tbl>
+    <w:p>
+      <w:pPr>
+        <w:spacing w:before="0" w:after="160" w:lineRule="exact" w:line="20"/>
+        <w:jc w:val="left"/>
+      </w:pPr>
+    </w:p>
     <w:tbl>
       <w:tblPr>
         <w:tblW w:type="dxa" w:w="9028"/>
@@ -4746,22 +4822,25 @@
             <w:tcW w:type="dxa" w:w="9029"/>
             <w:shd w:fill="FFD966"/>
             <w:tcBorders>
-              <w:top w:val="single" w:sz="10" w:space="0" w:color="D6B656"/>
-              <w:left w:val="single" w:sz="10" w:space="0" w:color="D6B656"/>
-              <w:bottom w:val="single" w:sz="10" w:space="0" w:color="D6B656"/>
-              <w:right w:val="single" w:sz="10" w:space="0" w:color="D6B656"/>
+              <w:top w:val="nil" w:sz="0" w:space="0" w:color="FFD966"/>
+              <w:left w:val="nil" w:sz="0" w:space="0" w:color="FFD966"/>
+              <w:bottom w:val="nil" w:sz="0" w:space="0" w:color="FFD966"/>
+              <w:right w:val="nil" w:sz="0" w:space="0" w:color="FFD966"/>
+              <w:insideH w:val="nil" w:sz="0" w:space="0" w:color="FFD966"/>
+              <w:insideV w:val="nil" w:sz="0" w:space="0" w:color="FFD966"/>
             </w:tcBorders>
             <w:tcMar>
-              <w:top w:w="115" w:type="dxa"/>
-              <w:start w:w="130" w:type="dxa"/>
-              <w:bottom w:w="115" w:type="dxa"/>
-              <w:end w:w="130" w:type="dxa"/>
+              <w:top w:w="135" w:type="dxa"/>
+              <w:start w:w="145" w:type="dxa"/>
+              <w:bottom w:w="135" w:type="dxa"/>
+              <w:end w:w="145" w:type="dxa"/>
             </w:tcMar>
             <w:vAlign w:val="center"/>
           </w:tcPr>
           <w:p>
             <w:pPr>
               <w:spacing w:before="0" w:after="0"/>
+              <w:jc w:val="left"/>
             </w:pPr>
             <w:r>
               <w:rPr>
@@ -4776,7 +4855,12 @@
         </w:tc>
       </w:tr>
     </w:tbl>
-    <w:p/>
+    <w:p>
+      <w:pPr>
+        <w:spacing w:before="0" w:after="160" w:lineRule="exact" w:line="20"/>
+        <w:jc w:val="left"/>
+      </w:pPr>
+    </w:p>
     <w:p>
       <w:pPr>
         <w:pStyle w:val="Heading2"/>
@@ -5048,6 +5132,12 @@
         </w:tc>
       </w:tr>
     </w:tbl>
+    <w:p>
+      <w:pPr>
+        <w:spacing w:before="0" w:after="160" w:lineRule="exact" w:line="20"/>
+        <w:jc w:val="left"/>
+      </w:pPr>
+    </w:p>
     <w:tbl>
       <w:tblPr>
         <w:tblW w:type="dxa" w:w="9028"/>
@@ -5064,22 +5154,25 @@
             <w:tcW w:type="dxa" w:w="9029"/>
             <w:shd w:fill="FFD966"/>
             <w:tcBorders>
-              <w:top w:val="single" w:sz="10" w:space="0" w:color="D6B656"/>
-              <w:left w:val="single" w:sz="10" w:space="0" w:color="D6B656"/>
-              <w:bottom w:val="single" w:sz="10" w:space="0" w:color="D6B656"/>
-              <w:right w:val="single" w:sz="10" w:space="0" w:color="D6B656"/>
+              <w:top w:val="nil" w:sz="0" w:space="0" w:color="FFD966"/>
+              <w:left w:val="nil" w:sz="0" w:space="0" w:color="FFD966"/>
+              <w:bottom w:val="nil" w:sz="0" w:space="0" w:color="FFD966"/>
+              <w:right w:val="nil" w:sz="0" w:space="0" w:color="FFD966"/>
+              <w:insideH w:val="nil" w:sz="0" w:space="0" w:color="FFD966"/>
+              <w:insideV w:val="nil" w:sz="0" w:space="0" w:color="FFD966"/>
             </w:tcBorders>
             <w:tcMar>
-              <w:top w:w="115" w:type="dxa"/>
-              <w:start w:w="130" w:type="dxa"/>
-              <w:bottom w:w="115" w:type="dxa"/>
-              <w:end w:w="130" w:type="dxa"/>
+              <w:top w:w="135" w:type="dxa"/>
+              <w:start w:w="145" w:type="dxa"/>
+              <w:bottom w:w="135" w:type="dxa"/>
+              <w:end w:w="145" w:type="dxa"/>
             </w:tcMar>
             <w:vAlign w:val="center"/>
           </w:tcPr>
           <w:p>
             <w:pPr>
               <w:spacing w:before="0" w:after="0"/>
+              <w:jc w:val="left"/>
             </w:pPr>
             <w:r>
               <w:rPr>
@@ -5094,7 +5187,12 @@
         </w:tc>
       </w:tr>
     </w:tbl>
-    <w:p/>
+    <w:p>
+      <w:pPr>
+        <w:spacing w:before="0" w:after="160" w:lineRule="exact" w:line="20"/>
+        <w:jc w:val="left"/>
+      </w:pPr>
+    </w:p>
     <w:p>
       <w:pPr>
         <w:pStyle w:val="Heading2"/>
@@ -5366,6 +5464,12 @@
         </w:tc>
       </w:tr>
     </w:tbl>
+    <w:p>
+      <w:pPr>
+        <w:spacing w:before="0" w:after="160" w:lineRule="exact" w:line="20"/>
+        <w:jc w:val="left"/>
+      </w:pPr>
+    </w:p>
     <w:tbl>
       <w:tblPr>
         <w:tblW w:type="dxa" w:w="9028"/>
@@ -5382,22 +5486,25 @@
             <w:tcW w:type="dxa" w:w="9029"/>
             <w:shd w:fill="FFD966"/>
             <w:tcBorders>
-              <w:top w:val="single" w:sz="10" w:space="0" w:color="D6B656"/>
-              <w:left w:val="single" w:sz="10" w:space="0" w:color="D6B656"/>
-              <w:bottom w:val="single" w:sz="10" w:space="0" w:color="D6B656"/>
-              <w:right w:val="single" w:sz="10" w:space="0" w:color="D6B656"/>
+              <w:top w:val="nil" w:sz="0" w:space="0" w:color="FFD966"/>
+              <w:left w:val="nil" w:sz="0" w:space="0" w:color="FFD966"/>
+              <w:bottom w:val="nil" w:sz="0" w:space="0" w:color="FFD966"/>
+              <w:right w:val="nil" w:sz="0" w:space="0" w:color="FFD966"/>
+              <w:insideH w:val="nil" w:sz="0" w:space="0" w:color="FFD966"/>
+              <w:insideV w:val="nil" w:sz="0" w:space="0" w:color="FFD966"/>
             </w:tcBorders>
             <w:tcMar>
-              <w:top w:w="115" w:type="dxa"/>
-              <w:start w:w="130" w:type="dxa"/>
-              <w:bottom w:w="115" w:type="dxa"/>
-              <w:end w:w="130" w:type="dxa"/>
+              <w:top w:w="135" w:type="dxa"/>
+              <w:start w:w="145" w:type="dxa"/>
+              <w:bottom w:w="135" w:type="dxa"/>
+              <w:end w:w="145" w:type="dxa"/>
             </w:tcMar>
             <w:vAlign w:val="center"/>
           </w:tcPr>
           <w:p>
             <w:pPr>
               <w:spacing w:before="0" w:after="0"/>
+              <w:jc w:val="left"/>
             </w:pPr>
             <w:r>
               <w:rPr>
@@ -5412,7 +5519,12 @@
         </w:tc>
       </w:tr>
     </w:tbl>
-    <w:p/>
+    <w:p>
+      <w:pPr>
+        <w:spacing w:before="0" w:after="160" w:lineRule="exact" w:line="20"/>
+        <w:jc w:val="left"/>
+      </w:pPr>
+    </w:p>
     <w:p>
       <w:pPr>
         <w:pStyle w:val="Heading2"/>
@@ -5684,6 +5796,12 @@
         </w:tc>
       </w:tr>
     </w:tbl>
+    <w:p>
+      <w:pPr>
+        <w:spacing w:before="0" w:after="160" w:lineRule="exact" w:line="20"/>
+        <w:jc w:val="left"/>
+      </w:pPr>
+    </w:p>
     <w:tbl>
       <w:tblPr>
         <w:tblW w:type="dxa" w:w="9028"/>
@@ -5700,22 +5818,25 @@
             <w:tcW w:type="dxa" w:w="9029"/>
             <w:shd w:fill="FFD966"/>
             <w:tcBorders>
-              <w:top w:val="single" w:sz="10" w:space="0" w:color="D6B656"/>
-              <w:left w:val="single" w:sz="10" w:space="0" w:color="D6B656"/>
-              <w:bottom w:val="single" w:sz="10" w:space="0" w:color="D6B656"/>
-              <w:right w:val="single" w:sz="10" w:space="0" w:color="D6B656"/>
+              <w:top w:val="nil" w:sz="0" w:space="0" w:color="FFD966"/>
+              <w:left w:val="nil" w:sz="0" w:space="0" w:color="FFD966"/>
+              <w:bottom w:val="nil" w:sz="0" w:space="0" w:color="FFD966"/>
+              <w:right w:val="nil" w:sz="0" w:space="0" w:color="FFD966"/>
+              <w:insideH w:val="nil" w:sz="0" w:space="0" w:color="FFD966"/>
+              <w:insideV w:val="nil" w:sz="0" w:space="0" w:color="FFD966"/>
             </w:tcBorders>
             <w:tcMar>
-              <w:top w:w="115" w:type="dxa"/>
-              <w:start w:w="130" w:type="dxa"/>
-              <w:bottom w:w="115" w:type="dxa"/>
-              <w:end w:w="130" w:type="dxa"/>
+              <w:top w:w="135" w:type="dxa"/>
+              <w:start w:w="145" w:type="dxa"/>
+              <w:bottom w:w="135" w:type="dxa"/>
+              <w:end w:w="145" w:type="dxa"/>
             </w:tcMar>
             <w:vAlign w:val="center"/>
           </w:tcPr>
           <w:p>
             <w:pPr>
               <w:spacing w:before="0" w:after="0"/>
+              <w:jc w:val="left"/>
             </w:pPr>
             <w:r>
               <w:rPr>
@@ -5730,7 +5851,12 @@
         </w:tc>
       </w:tr>
     </w:tbl>
-    <w:p/>
+    <w:p>
+      <w:pPr>
+        <w:spacing w:before="0" w:after="160" w:lineRule="exact" w:line="20"/>
+        <w:jc w:val="left"/>
+      </w:pPr>
+    </w:p>
     <w:p>
       <w:pPr>
         <w:pStyle w:val="Heading2"/>
@@ -6002,6 +6128,12 @@
         </w:tc>
       </w:tr>
     </w:tbl>
+    <w:p>
+      <w:pPr>
+        <w:spacing w:before="0" w:after="160" w:lineRule="exact" w:line="20"/>
+        <w:jc w:val="left"/>
+      </w:pPr>
+    </w:p>
     <w:tbl>
       <w:tblPr>
         <w:tblW w:type="dxa" w:w="9028"/>
@@ -6018,22 +6150,25 @@
             <w:tcW w:type="dxa" w:w="9029"/>
             <w:shd w:fill="FFD966"/>
             <w:tcBorders>
-              <w:top w:val="single" w:sz="10" w:space="0" w:color="D6B656"/>
-              <w:left w:val="single" w:sz="10" w:space="0" w:color="D6B656"/>
-              <w:bottom w:val="single" w:sz="10" w:space="0" w:color="D6B656"/>
-              <w:right w:val="single" w:sz="10" w:space="0" w:color="D6B656"/>
+              <w:top w:val="nil" w:sz="0" w:space="0" w:color="FFD966"/>
+              <w:left w:val="nil" w:sz="0" w:space="0" w:color="FFD966"/>
+              <w:bottom w:val="nil" w:sz="0" w:space="0" w:color="FFD966"/>
+              <w:right w:val="nil" w:sz="0" w:space="0" w:color="FFD966"/>
+              <w:insideH w:val="nil" w:sz="0" w:space="0" w:color="FFD966"/>
+              <w:insideV w:val="nil" w:sz="0" w:space="0" w:color="FFD966"/>
             </w:tcBorders>
             <w:tcMar>
-              <w:top w:w="115" w:type="dxa"/>
-              <w:start w:w="130" w:type="dxa"/>
-              <w:bottom w:w="115" w:type="dxa"/>
-              <w:end w:w="130" w:type="dxa"/>
+              <w:top w:w="135" w:type="dxa"/>
+              <w:start w:w="145" w:type="dxa"/>
+              <w:bottom w:w="135" w:type="dxa"/>
+              <w:end w:w="145" w:type="dxa"/>
             </w:tcMar>
             <w:vAlign w:val="center"/>
           </w:tcPr>
           <w:p>
             <w:pPr>
               <w:spacing w:before="0" w:after="0"/>
+              <w:jc w:val="left"/>
             </w:pPr>
             <w:r>
               <w:rPr>
@@ -6048,7 +6183,12 @@
         </w:tc>
       </w:tr>
     </w:tbl>
-    <w:p/>
+    <w:p>
+      <w:pPr>
+        <w:spacing w:before="0" w:after="160" w:lineRule="exact" w:line="20"/>
+        <w:jc w:val="left"/>
+      </w:pPr>
+    </w:p>
     <w:p>
       <w:r>
         <w:rPr>
@@ -6303,6 +6443,12 @@
         </w:tc>
       </w:tr>
     </w:tbl>
+    <w:p>
+      <w:pPr>
+        <w:spacing w:before="0" w:after="160" w:lineRule="exact" w:line="20"/>
+        <w:jc w:val="left"/>
+      </w:pPr>
+    </w:p>
     <w:tbl>
       <w:tblPr>
         <w:tblW w:type="dxa" w:w="9028"/>
@@ -6319,22 +6465,25 @@
             <w:tcW w:type="dxa" w:w="9029"/>
             <w:shd w:fill="FFD966"/>
             <w:tcBorders>
-              <w:top w:val="single" w:sz="10" w:space="0" w:color="D6B656"/>
-              <w:left w:val="single" w:sz="10" w:space="0" w:color="D6B656"/>
-              <w:bottom w:val="single" w:sz="10" w:space="0" w:color="D6B656"/>
-              <w:right w:val="single" w:sz="10" w:space="0" w:color="D6B656"/>
+              <w:top w:val="nil" w:sz="0" w:space="0" w:color="FFD966"/>
+              <w:left w:val="nil" w:sz="0" w:space="0" w:color="FFD966"/>
+              <w:bottom w:val="nil" w:sz="0" w:space="0" w:color="FFD966"/>
+              <w:right w:val="nil" w:sz="0" w:space="0" w:color="FFD966"/>
+              <w:insideH w:val="nil" w:sz="0" w:space="0" w:color="FFD966"/>
+              <w:insideV w:val="nil" w:sz="0" w:space="0" w:color="FFD966"/>
             </w:tcBorders>
             <w:tcMar>
-              <w:top w:w="115" w:type="dxa"/>
-              <w:start w:w="130" w:type="dxa"/>
-              <w:bottom w:w="115" w:type="dxa"/>
-              <w:end w:w="130" w:type="dxa"/>
+              <w:top w:w="135" w:type="dxa"/>
+              <w:start w:w="145" w:type="dxa"/>
+              <w:bottom w:w="135" w:type="dxa"/>
+              <w:end w:w="145" w:type="dxa"/>
             </w:tcMar>
             <w:vAlign w:val="center"/>
           </w:tcPr>
           <w:p>
             <w:pPr>
               <w:spacing w:before="0" w:after="0"/>
+              <w:jc w:val="left"/>
             </w:pPr>
             <w:r>
               <w:rPr>
@@ -6349,7 +6498,12 @@
         </w:tc>
       </w:tr>
     </w:tbl>
-    <w:p/>
+    <w:p>
+      <w:pPr>
+        <w:spacing w:before="0" w:after="160" w:lineRule="exact" w:line="20"/>
+        <w:jc w:val="left"/>
+      </w:pPr>
+    </w:p>
     <w:tbl>
       <w:tblPr>
         <w:tblW w:type="dxa" w:w="9028"/>
@@ -6737,6 +6891,12 @@
         </w:tc>
       </w:tr>
     </w:tbl>
+    <w:p>
+      <w:pPr>
+        <w:spacing w:before="0" w:after="160" w:lineRule="exact" w:line="20"/>
+        <w:jc w:val="left"/>
+      </w:pPr>
+    </w:p>
     <w:tbl>
       <w:tblPr>
         <w:tblW w:type="dxa" w:w="9028"/>
@@ -6753,22 +6913,25 @@
             <w:tcW w:type="dxa" w:w="9029"/>
             <w:shd w:fill="FFD966"/>
             <w:tcBorders>
-              <w:top w:val="single" w:sz="10" w:space="0" w:color="D6B656"/>
-              <w:left w:val="single" w:sz="10" w:space="0" w:color="D6B656"/>
-              <w:bottom w:val="single" w:sz="10" w:space="0" w:color="D6B656"/>
-              <w:right w:val="single" w:sz="10" w:space="0" w:color="D6B656"/>
+              <w:top w:val="nil" w:sz="0" w:space="0" w:color="FFD966"/>
+              <w:left w:val="nil" w:sz="0" w:space="0" w:color="FFD966"/>
+              <w:bottom w:val="nil" w:sz="0" w:space="0" w:color="FFD966"/>
+              <w:right w:val="nil" w:sz="0" w:space="0" w:color="FFD966"/>
+              <w:insideH w:val="nil" w:sz="0" w:space="0" w:color="FFD966"/>
+              <w:insideV w:val="nil" w:sz="0" w:space="0" w:color="FFD966"/>
             </w:tcBorders>
             <w:tcMar>
-              <w:top w:w="115" w:type="dxa"/>
-              <w:start w:w="130" w:type="dxa"/>
-              <w:bottom w:w="115" w:type="dxa"/>
-              <w:end w:w="130" w:type="dxa"/>
+              <w:top w:w="135" w:type="dxa"/>
+              <w:start w:w="145" w:type="dxa"/>
+              <w:bottom w:w="135" w:type="dxa"/>
+              <w:end w:w="145" w:type="dxa"/>
             </w:tcMar>
             <w:vAlign w:val="center"/>
           </w:tcPr>
           <w:p>
             <w:pPr>
               <w:spacing w:before="0" w:after="0"/>
+              <w:jc w:val="left"/>
             </w:pPr>
             <w:r>
               <w:rPr>
@@ -6783,7 +6946,12 @@
         </w:tc>
       </w:tr>
     </w:tbl>
-    <w:p/>
+    <w:p>
+      <w:pPr>
+        <w:spacing w:before="0" w:after="160" w:lineRule="exact" w:line="20"/>
+        <w:jc w:val="left"/>
+      </w:pPr>
+    </w:p>
     <w:p>
       <w:pPr>
         <w:pStyle w:val="Heading2"/>
@@ -7133,6 +7301,12 @@
         </w:tc>
       </w:tr>
     </w:tbl>
+    <w:p>
+      <w:pPr>
+        <w:spacing w:before="0" w:after="160" w:lineRule="exact" w:line="20"/>
+        <w:jc w:val="left"/>
+      </w:pPr>
+    </w:p>
     <w:tbl>
       <w:tblPr>
         <w:tblW w:type="dxa" w:w="9028"/>
@@ -7149,22 +7323,25 @@
             <w:tcW w:type="dxa" w:w="9029"/>
             <w:shd w:fill="FFD966"/>
             <w:tcBorders>
-              <w:top w:val="single" w:sz="10" w:space="0" w:color="D6B656"/>
-              <w:left w:val="single" w:sz="10" w:space="0" w:color="D6B656"/>
-              <w:bottom w:val="single" w:sz="10" w:space="0" w:color="D6B656"/>
-              <w:right w:val="single" w:sz="10" w:space="0" w:color="D6B656"/>
+              <w:top w:val="nil" w:sz="0" w:space="0" w:color="FFD966"/>
+              <w:left w:val="nil" w:sz="0" w:space="0" w:color="FFD966"/>
+              <w:bottom w:val="nil" w:sz="0" w:space="0" w:color="FFD966"/>
+              <w:right w:val="nil" w:sz="0" w:space="0" w:color="FFD966"/>
+              <w:insideH w:val="nil" w:sz="0" w:space="0" w:color="FFD966"/>
+              <w:insideV w:val="nil" w:sz="0" w:space="0" w:color="FFD966"/>
             </w:tcBorders>
             <w:tcMar>
-              <w:top w:w="115" w:type="dxa"/>
-              <w:start w:w="130" w:type="dxa"/>
-              <w:bottom w:w="115" w:type="dxa"/>
-              <w:end w:w="130" w:type="dxa"/>
+              <w:top w:w="135" w:type="dxa"/>
+              <w:start w:w="145" w:type="dxa"/>
+              <w:bottom w:w="135" w:type="dxa"/>
+              <w:end w:w="145" w:type="dxa"/>
             </w:tcMar>
             <w:vAlign w:val="center"/>
           </w:tcPr>
           <w:p>
             <w:pPr>
               <w:spacing w:before="0" w:after="0"/>
+              <w:jc w:val="left"/>
             </w:pPr>
             <w:r>
               <w:rPr>
@@ -7179,7 +7356,12 @@
         </w:tc>
       </w:tr>
     </w:tbl>
-    <w:p/>
+    <w:p>
+      <w:pPr>
+        <w:spacing w:before="0" w:after="160" w:lineRule="exact" w:line="20"/>
+        <w:jc w:val="left"/>
+      </w:pPr>
+    </w:p>
     <w:p>
       <w:pPr>
         <w:pStyle w:val="Heading2"/>
@@ -7509,6 +7691,12 @@
         </w:tc>
       </w:tr>
     </w:tbl>
+    <w:p>
+      <w:pPr>
+        <w:spacing w:before="0" w:after="160" w:lineRule="exact" w:line="20"/>
+        <w:jc w:val="left"/>
+      </w:pPr>
+    </w:p>
     <w:tbl>
       <w:tblPr>
         <w:tblW w:type="dxa" w:w="9028"/>
@@ -7525,22 +7713,25 @@
             <w:tcW w:type="dxa" w:w="9029"/>
             <w:shd w:fill="FFD966"/>
             <w:tcBorders>
-              <w:top w:val="single" w:sz="10" w:space="0" w:color="D6B656"/>
-              <w:left w:val="single" w:sz="10" w:space="0" w:color="D6B656"/>
-              <w:bottom w:val="single" w:sz="10" w:space="0" w:color="D6B656"/>
-              <w:right w:val="single" w:sz="10" w:space="0" w:color="D6B656"/>
+              <w:top w:val="nil" w:sz="0" w:space="0" w:color="FFD966"/>
+              <w:left w:val="nil" w:sz="0" w:space="0" w:color="FFD966"/>
+              <w:bottom w:val="nil" w:sz="0" w:space="0" w:color="FFD966"/>
+              <w:right w:val="nil" w:sz="0" w:space="0" w:color="FFD966"/>
+              <w:insideH w:val="nil" w:sz="0" w:space="0" w:color="FFD966"/>
+              <w:insideV w:val="nil" w:sz="0" w:space="0" w:color="FFD966"/>
             </w:tcBorders>
             <w:tcMar>
-              <w:top w:w="115" w:type="dxa"/>
-              <w:start w:w="130" w:type="dxa"/>
-              <w:bottom w:w="115" w:type="dxa"/>
-              <w:end w:w="130" w:type="dxa"/>
+              <w:top w:w="135" w:type="dxa"/>
+              <w:start w:w="145" w:type="dxa"/>
+              <w:bottom w:w="135" w:type="dxa"/>
+              <w:end w:w="145" w:type="dxa"/>
             </w:tcMar>
             <w:vAlign w:val="center"/>
           </w:tcPr>
           <w:p>
             <w:pPr>
               <w:spacing w:before="0" w:after="0"/>
+              <w:jc w:val="left"/>
             </w:pPr>
             <w:r>
               <w:rPr>
@@ -7555,7 +7746,12 @@
         </w:tc>
       </w:tr>
     </w:tbl>
-    <w:p/>
+    <w:p>
+      <w:pPr>
+        <w:spacing w:before="0" w:after="160" w:lineRule="exact" w:line="20"/>
+        <w:jc w:val="left"/>
+      </w:pPr>
+    </w:p>
     <w:p>
       <w:pPr>
         <w:pStyle w:val="Heading2"/>
@@ -8267,6 +8463,12 @@
         </w:tc>
       </w:tr>
     </w:tbl>
+    <w:p>
+      <w:pPr>
+        <w:spacing w:before="0" w:after="160" w:lineRule="exact" w:line="20"/>
+        <w:jc w:val="left"/>
+      </w:pPr>
+    </w:p>
     <w:tbl>
       <w:tblPr>
         <w:tblW w:type="dxa" w:w="9028"/>
@@ -8283,22 +8485,25 @@
             <w:tcW w:type="dxa" w:w="9029"/>
             <w:shd w:fill="FFD966"/>
             <w:tcBorders>
-              <w:top w:val="single" w:sz="10" w:space="0" w:color="D6B656"/>
-              <w:left w:val="single" w:sz="10" w:space="0" w:color="D6B656"/>
-              <w:bottom w:val="single" w:sz="10" w:space="0" w:color="D6B656"/>
-              <w:right w:val="single" w:sz="10" w:space="0" w:color="D6B656"/>
+              <w:top w:val="nil" w:sz="0" w:space="0" w:color="FFD966"/>
+              <w:left w:val="nil" w:sz="0" w:space="0" w:color="FFD966"/>
+              <w:bottom w:val="nil" w:sz="0" w:space="0" w:color="FFD966"/>
+              <w:right w:val="nil" w:sz="0" w:space="0" w:color="FFD966"/>
+              <w:insideH w:val="nil" w:sz="0" w:space="0" w:color="FFD966"/>
+              <w:insideV w:val="nil" w:sz="0" w:space="0" w:color="FFD966"/>
             </w:tcBorders>
             <w:tcMar>
-              <w:top w:w="115" w:type="dxa"/>
-              <w:start w:w="130" w:type="dxa"/>
-              <w:bottom w:w="115" w:type="dxa"/>
-              <w:end w:w="130" w:type="dxa"/>
+              <w:top w:w="135" w:type="dxa"/>
+              <w:start w:w="145" w:type="dxa"/>
+              <w:bottom w:w="135" w:type="dxa"/>
+              <w:end w:w="145" w:type="dxa"/>
             </w:tcMar>
             <w:vAlign w:val="center"/>
           </w:tcPr>
           <w:p>
             <w:pPr>
               <w:spacing w:before="0" w:after="0"/>
+              <w:jc w:val="left"/>
             </w:pPr>
             <w:r>
               <w:rPr>
@@ -8313,7 +8518,12 @@
         </w:tc>
       </w:tr>
     </w:tbl>
-    <w:p/>
+    <w:p>
+      <w:pPr>
+        <w:spacing w:before="0" w:after="160" w:lineRule="exact" w:line="20"/>
+        <w:jc w:val="left"/>
+      </w:pPr>
+    </w:p>
     <w:p>
       <w:r>
         <w:rPr>

</xml_diff>

<commit_message>
Clean callout rendering and image spacing
Co-authored-by: RicardoCasquinha <RicardoCasquinha@users.noreply.github.com>
</commit_message>
<xml_diff>
--- a/Claires - Solution Blueprint - Customer Engagement V1 - Redesigned.docx
+++ b/Claires - Solution Blueprint - Customer Engagement V1 - Redesigned.docx
@@ -1060,7 +1060,7 @@
           <w:color w:val="555559"/>
           <w:sz w:val="22"/>
         </w:rPr>
-        <w:t>9</w:t>
+        <w:t>8</w:t>
       </w:r>
     </w:p>
     <w:p>
@@ -1901,8 +1901,8 @@
             <w:tcW w:type="dxa" w:w="9029"/>
             <w:shd w:val="clear" w:color="auto" w:fill="91C3DF"/>
             <w:tcMar>
-              <w:top w:w="115" w:type="dxa"/>
-              <w:bottom w:w="115" w:type="dxa"/>
+              <w:top w:w="120" w:type="dxa"/>
+              <w:bottom w:w="120" w:type="dxa"/>
               <w:left w:w="120" w:type="dxa"/>
               <w:right w:w="120" w:type="dxa"/>
               <w:start w:w="130" w:type="dxa"/>
@@ -1910,10 +1910,12 @@
             </w:tcMar>
             <w:vAlign w:val="center"/>
             <w:tcBorders>
-              <w:top w:val="single" w:sz="10" w:space="0" w:color="91C3DF"/>
-              <w:left w:val="single" w:sz="10" w:space="0" w:color="91C3DF"/>
-              <w:bottom w:val="single" w:sz="10" w:space="0" w:color="91C3DF"/>
-              <w:right w:val="single" w:sz="10" w:space="0" w:color="91C3DF"/>
+              <w:top w:val="nil" w:sz="0" w:space="0" w:color="91C3DF"/>
+              <w:left w:val="nil" w:sz="0" w:space="0" w:color="91C3DF"/>
+              <w:bottom w:val="nil" w:sz="0" w:space="0" w:color="91C3DF"/>
+              <w:right w:val="nil" w:sz="0" w:space="0" w:color="91C3DF"/>
+              <w:insideH w:val="nil" w:sz="0" w:space="0" w:color="91C3DF"/>
+              <w:insideV w:val="nil" w:sz="0" w:space="0" w:color="91C3DF"/>
             </w:tcBorders>
           </w:tcPr>
           <w:p>
@@ -1950,8 +1952,8 @@
             <w:tcW w:type="dxa" w:w="9029"/>
             <w:shd w:val="clear" w:color="auto" w:fill="FFC499"/>
             <w:tcMar>
-              <w:top w:w="115" w:type="dxa"/>
-              <w:bottom w:w="115" w:type="dxa"/>
+              <w:top w:w="120" w:type="dxa"/>
+              <w:bottom w:w="120" w:type="dxa"/>
               <w:left w:w="120" w:type="dxa"/>
               <w:right w:w="120" w:type="dxa"/>
               <w:start w:w="130" w:type="dxa"/>
@@ -1959,10 +1961,12 @@
             </w:tcMar>
             <w:vAlign w:val="center"/>
             <w:tcBorders>
-              <w:top w:val="single" w:sz="10" w:space="0" w:color="FFC499"/>
-              <w:left w:val="single" w:sz="10" w:space="0" w:color="FFC499"/>
-              <w:bottom w:val="single" w:sz="10" w:space="0" w:color="FFC499"/>
-              <w:right w:val="single" w:sz="10" w:space="0" w:color="FFC499"/>
+              <w:top w:val="nil" w:sz="0" w:space="0" w:color="FFC499"/>
+              <w:left w:val="nil" w:sz="0" w:space="0" w:color="FFC499"/>
+              <w:bottom w:val="nil" w:sz="0" w:space="0" w:color="FFC499"/>
+              <w:right w:val="nil" w:sz="0" w:space="0" w:color="FFC499"/>
+              <w:insideH w:val="nil" w:sz="0" w:space="0" w:color="FFC499"/>
+              <w:insideV w:val="nil" w:sz="0" w:space="0" w:color="FFC499"/>
             </w:tcBorders>
           </w:tcPr>
           <w:p>
@@ -1999,8 +2003,8 @@
             <w:tcW w:type="dxa" w:w="9029"/>
             <w:shd w:val="clear" w:color="auto" w:fill="A7DC85"/>
             <w:tcMar>
-              <w:top w:w="115" w:type="dxa"/>
-              <w:bottom w:w="115" w:type="dxa"/>
+              <w:top w:w="120" w:type="dxa"/>
+              <w:bottom w:w="120" w:type="dxa"/>
               <w:left w:w="120" w:type="dxa"/>
               <w:right w:w="120" w:type="dxa"/>
               <w:start w:w="130" w:type="dxa"/>
@@ -2008,10 +2012,12 @@
             </w:tcMar>
             <w:vAlign w:val="center"/>
             <w:tcBorders>
-              <w:top w:val="single" w:sz="10" w:space="0" w:color="A7DC85"/>
-              <w:left w:val="single" w:sz="10" w:space="0" w:color="A7DC85"/>
-              <w:bottom w:val="single" w:sz="10" w:space="0" w:color="A7DC85"/>
-              <w:right w:val="single" w:sz="10" w:space="0" w:color="A7DC85"/>
+              <w:top w:val="nil" w:sz="0" w:space="0" w:color="A7DC85"/>
+              <w:left w:val="nil" w:sz="0" w:space="0" w:color="A7DC85"/>
+              <w:bottom w:val="nil" w:sz="0" w:space="0" w:color="A7DC85"/>
+              <w:right w:val="nil" w:sz="0" w:space="0" w:color="A7DC85"/>
+              <w:insideH w:val="nil" w:sz="0" w:space="0" w:color="A7DC85"/>
+              <w:insideV w:val="nil" w:sz="0" w:space="0" w:color="A7DC85"/>
             </w:tcBorders>
           </w:tcPr>
           <w:p>
@@ -2047,15 +2053,17 @@
             <w:tcW w:type="dxa" w:w="9029"/>
             <w:shd w:fill="FFD966"/>
             <w:tcBorders>
-              <w:top w:val="single" w:sz="10" w:space="0" w:color="D6B656"/>
-              <w:left w:val="single" w:sz="10" w:space="0" w:color="D6B656"/>
-              <w:bottom w:val="single" w:sz="10" w:space="0" w:color="D6B656"/>
-              <w:right w:val="single" w:sz="10" w:space="0" w:color="D6B656"/>
+              <w:top w:val="nil" w:sz="0" w:space="0" w:color="FFD966"/>
+              <w:left w:val="nil" w:sz="0" w:space="0" w:color="FFD966"/>
+              <w:bottom w:val="nil" w:sz="0" w:space="0" w:color="FFD966"/>
+              <w:right w:val="nil" w:sz="0" w:space="0" w:color="FFD966"/>
+              <w:insideH w:val="nil" w:sz="0" w:space="0" w:color="FFD966"/>
+              <w:insideV w:val="nil" w:sz="0" w:space="0" w:color="FFD966"/>
             </w:tcBorders>
             <w:tcMar>
-              <w:top w:w="115" w:type="dxa"/>
+              <w:top w:w="120" w:type="dxa"/>
               <w:start w:w="130" w:type="dxa"/>
-              <w:bottom w:w="115" w:type="dxa"/>
+              <w:bottom w:w="120" w:type="dxa"/>
               <w:end w:w="130" w:type="dxa"/>
             </w:tcMar>
             <w:vAlign w:val="center"/>
@@ -2205,7 +2213,13 @@
     </w:p>
     <w:p>
       <w:pPr>
-        <w:spacing w:before="560" w:after="80"/>
+        <w:spacing w:before="0" w:after="280" w:lineRule="exact" w:line="20"/>
+        <w:jc w:val="left"/>
+      </w:pPr>
+    </w:p>
+    <w:p>
+      <w:pPr>
+        <w:spacing w:before="0" w:after="80"/>
         <w:jc w:val="center"/>
       </w:pPr>
       <w:r>
@@ -2251,6 +2265,7 @@
       <w:r>
         <w:rPr>
           <w:rFonts w:ascii="Cambria" w:hAnsi="Cambria" w:eastAsia="Cambria" w:cs="Cambria"/>
+          <w:b w:val="0"/>
           <w:i/>
           <w:color w:val="555559"/>
           <w:sz w:val="18"/>
@@ -2365,8 +2380,8 @@
             <w:tcW w:type="dxa" w:w="9029"/>
             <w:shd w:val="clear" w:color="auto" w:fill="A7DC85"/>
             <w:tcMar>
-              <w:top w:w="115" w:type="dxa"/>
-              <w:bottom w:w="115" w:type="dxa"/>
+              <w:top w:w="120" w:type="dxa"/>
+              <w:bottom w:w="120" w:type="dxa"/>
               <w:left w:w="120" w:type="dxa"/>
               <w:right w:w="120" w:type="dxa"/>
               <w:start w:w="130" w:type="dxa"/>
@@ -2374,10 +2389,12 @@
             </w:tcMar>
             <w:vAlign w:val="center"/>
             <w:tcBorders>
-              <w:top w:val="single" w:sz="10" w:space="0" w:color="A7DC85"/>
-              <w:left w:val="single" w:sz="10" w:space="0" w:color="A7DC85"/>
-              <w:bottom w:val="single" w:sz="10" w:space="0" w:color="A7DC85"/>
-              <w:right w:val="single" w:sz="10" w:space="0" w:color="A7DC85"/>
+              <w:top w:val="nil" w:sz="0" w:space="0" w:color="A7DC85"/>
+              <w:left w:val="nil" w:sz="0" w:space="0" w:color="A7DC85"/>
+              <w:bottom w:val="nil" w:sz="0" w:space="0" w:color="A7DC85"/>
+              <w:right w:val="nil" w:sz="0" w:space="0" w:color="A7DC85"/>
+              <w:insideH w:val="nil" w:sz="0" w:space="0" w:color="A7DC85"/>
+              <w:insideV w:val="nil" w:sz="0" w:space="0" w:color="A7DC85"/>
             </w:tcBorders>
           </w:tcPr>
           <w:p>
@@ -2423,8 +2440,8 @@
             <w:tcW w:type="dxa" w:w="9029"/>
             <w:shd w:val="clear" w:color="auto" w:fill="91C3DF"/>
             <w:tcMar>
-              <w:top w:w="115" w:type="dxa"/>
-              <w:bottom w:w="115" w:type="dxa"/>
+              <w:top w:w="120" w:type="dxa"/>
+              <w:bottom w:w="120" w:type="dxa"/>
               <w:left w:w="120" w:type="dxa"/>
               <w:right w:w="120" w:type="dxa"/>
               <w:start w:w="130" w:type="dxa"/>
@@ -2432,10 +2449,12 @@
             </w:tcMar>
             <w:vAlign w:val="center"/>
             <w:tcBorders>
-              <w:top w:val="single" w:sz="10" w:space="0" w:color="91C3DF"/>
-              <w:left w:val="single" w:sz="10" w:space="0" w:color="91C3DF"/>
-              <w:bottom w:val="single" w:sz="10" w:space="0" w:color="91C3DF"/>
-              <w:right w:val="single" w:sz="10" w:space="0" w:color="91C3DF"/>
+              <w:top w:val="nil" w:sz="0" w:space="0" w:color="91C3DF"/>
+              <w:left w:val="nil" w:sz="0" w:space="0" w:color="91C3DF"/>
+              <w:bottom w:val="nil" w:sz="0" w:space="0" w:color="91C3DF"/>
+              <w:right w:val="nil" w:sz="0" w:space="0" w:color="91C3DF"/>
+              <w:insideH w:val="nil" w:sz="0" w:space="0" w:color="91C3DF"/>
+              <w:insideV w:val="nil" w:sz="0" w:space="0" w:color="91C3DF"/>
             </w:tcBorders>
           </w:tcPr>
           <w:p>
@@ -2481,8 +2500,8 @@
             <w:tcW w:type="dxa" w:w="9029"/>
             <w:shd w:val="clear" w:color="auto" w:fill="FFC499"/>
             <w:tcMar>
-              <w:top w:w="115" w:type="dxa"/>
-              <w:bottom w:w="115" w:type="dxa"/>
+              <w:top w:w="120" w:type="dxa"/>
+              <w:bottom w:w="120" w:type="dxa"/>
               <w:left w:w="120" w:type="dxa"/>
               <w:right w:w="120" w:type="dxa"/>
               <w:start w:w="130" w:type="dxa"/>
@@ -2490,10 +2509,12 @@
             </w:tcMar>
             <w:vAlign w:val="center"/>
             <w:tcBorders>
-              <w:top w:val="single" w:sz="10" w:space="0" w:color="FFC499"/>
-              <w:left w:val="single" w:sz="10" w:space="0" w:color="FFC499"/>
-              <w:bottom w:val="single" w:sz="10" w:space="0" w:color="FFC499"/>
-              <w:right w:val="single" w:sz="10" w:space="0" w:color="FFC499"/>
+              <w:top w:val="nil" w:sz="0" w:space="0" w:color="FFC499"/>
+              <w:left w:val="nil" w:sz="0" w:space="0" w:color="FFC499"/>
+              <w:bottom w:val="nil" w:sz="0" w:space="0" w:color="FFC499"/>
+              <w:right w:val="nil" w:sz="0" w:space="0" w:color="FFC499"/>
+              <w:insideH w:val="nil" w:sz="0" w:space="0" w:color="FFC499"/>
+              <w:insideV w:val="nil" w:sz="0" w:space="0" w:color="FFC499"/>
             </w:tcBorders>
           </w:tcPr>
           <w:p>
@@ -2524,7 +2545,7 @@
     </w:tbl>
     <w:p>
       <w:pPr>
-        <w:spacing w:before="0" w:after="160" w:lineRule="exact" w:line="20"/>
+        <w:spacing w:before="0" w:after="320" w:lineRule="exact" w:line="20"/>
         <w:jc w:val="left"/>
       </w:pPr>
     </w:p>
@@ -2579,7 +2600,7 @@
     </w:tbl>
     <w:p>
       <w:pPr>
-        <w:spacing w:before="0" w:after="160" w:lineRule="exact" w:line="20"/>
+        <w:spacing w:before="0" w:after="180" w:lineRule="exact" w:line="20"/>
         <w:jc w:val="left"/>
       </w:pPr>
     </w:p>
@@ -2615,7 +2636,13 @@
     </w:p>
     <w:p>
       <w:pPr>
-        <w:spacing w:before="560" w:after="80"/>
+        <w:spacing w:before="0" w:after="280" w:lineRule="exact" w:line="20"/>
+        <w:jc w:val="left"/>
+      </w:pPr>
+    </w:p>
+    <w:p>
+      <w:pPr>
+        <w:spacing w:before="0" w:after="80"/>
         <w:jc w:val="center"/>
       </w:pPr>
       <w:r>
@@ -2661,6 +2688,7 @@
       <w:r>
         <w:rPr>
           <w:rFonts w:ascii="Cambria" w:hAnsi="Cambria" w:eastAsia="Cambria" w:cs="Cambria"/>
+          <w:b w:val="0"/>
           <w:i/>
           <w:color w:val="555559"/>
           <w:sz w:val="18"/>
@@ -2697,8 +2725,8 @@
             <w:tcW w:type="dxa" w:w="9029"/>
             <w:shd w:val="clear" w:color="auto" w:fill="A7DC85"/>
             <w:tcMar>
-              <w:top w:w="115" w:type="dxa"/>
-              <w:bottom w:w="115" w:type="dxa"/>
+              <w:top w:w="120" w:type="dxa"/>
+              <w:bottom w:w="120" w:type="dxa"/>
               <w:left w:w="120" w:type="dxa"/>
               <w:right w:w="120" w:type="dxa"/>
               <w:start w:w="130" w:type="dxa"/>
@@ -2706,10 +2734,12 @@
             </w:tcMar>
             <w:vAlign w:val="center"/>
             <w:tcBorders>
-              <w:top w:val="single" w:sz="10" w:space="0" w:color="A7DC85"/>
-              <w:left w:val="single" w:sz="10" w:space="0" w:color="A7DC85"/>
-              <w:bottom w:val="single" w:sz="10" w:space="0" w:color="A7DC85"/>
-              <w:right w:val="single" w:sz="10" w:space="0" w:color="A7DC85"/>
+              <w:top w:val="nil" w:sz="0" w:space="0" w:color="A7DC85"/>
+              <w:left w:val="nil" w:sz="0" w:space="0" w:color="A7DC85"/>
+              <w:bottom w:val="nil" w:sz="0" w:space="0" w:color="A7DC85"/>
+              <w:right w:val="nil" w:sz="0" w:space="0" w:color="A7DC85"/>
+              <w:insideH w:val="nil" w:sz="0" w:space="0" w:color="A7DC85"/>
+              <w:insideV w:val="nil" w:sz="0" w:space="0" w:color="A7DC85"/>
             </w:tcBorders>
           </w:tcPr>
           <w:p>
@@ -2755,8 +2785,8 @@
             <w:tcW w:type="dxa" w:w="9029"/>
             <w:shd w:val="clear" w:color="auto" w:fill="91C3DF"/>
             <w:tcMar>
-              <w:top w:w="115" w:type="dxa"/>
-              <w:bottom w:w="115" w:type="dxa"/>
+              <w:top w:w="120" w:type="dxa"/>
+              <w:bottom w:w="120" w:type="dxa"/>
               <w:left w:w="120" w:type="dxa"/>
               <w:right w:w="120" w:type="dxa"/>
               <w:start w:w="130" w:type="dxa"/>
@@ -2764,10 +2794,12 @@
             </w:tcMar>
             <w:vAlign w:val="center"/>
             <w:tcBorders>
-              <w:top w:val="single" w:sz="10" w:space="0" w:color="91C3DF"/>
-              <w:left w:val="single" w:sz="10" w:space="0" w:color="91C3DF"/>
-              <w:bottom w:val="single" w:sz="10" w:space="0" w:color="91C3DF"/>
-              <w:right w:val="single" w:sz="10" w:space="0" w:color="91C3DF"/>
+              <w:top w:val="nil" w:sz="0" w:space="0" w:color="91C3DF"/>
+              <w:left w:val="nil" w:sz="0" w:space="0" w:color="91C3DF"/>
+              <w:bottom w:val="nil" w:sz="0" w:space="0" w:color="91C3DF"/>
+              <w:right w:val="nil" w:sz="0" w:space="0" w:color="91C3DF"/>
+              <w:insideH w:val="nil" w:sz="0" w:space="0" w:color="91C3DF"/>
+              <w:insideV w:val="nil" w:sz="0" w:space="0" w:color="91C3DF"/>
             </w:tcBorders>
           </w:tcPr>
           <w:p>
@@ -2813,8 +2845,8 @@
             <w:tcW w:type="dxa" w:w="9029"/>
             <w:shd w:val="clear" w:color="auto" w:fill="FFC499"/>
             <w:tcMar>
-              <w:top w:w="115" w:type="dxa"/>
-              <w:bottom w:w="115" w:type="dxa"/>
+              <w:top w:w="120" w:type="dxa"/>
+              <w:bottom w:w="120" w:type="dxa"/>
               <w:left w:w="120" w:type="dxa"/>
               <w:right w:w="120" w:type="dxa"/>
               <w:start w:w="130" w:type="dxa"/>
@@ -2822,10 +2854,12 @@
             </w:tcMar>
             <w:vAlign w:val="center"/>
             <w:tcBorders>
-              <w:top w:val="single" w:sz="10" w:space="0" w:color="FFC499"/>
-              <w:left w:val="single" w:sz="10" w:space="0" w:color="FFC499"/>
-              <w:bottom w:val="single" w:sz="10" w:space="0" w:color="FFC499"/>
-              <w:right w:val="single" w:sz="10" w:space="0" w:color="FFC499"/>
+              <w:top w:val="nil" w:sz="0" w:space="0" w:color="FFC499"/>
+              <w:left w:val="nil" w:sz="0" w:space="0" w:color="FFC499"/>
+              <w:bottom w:val="nil" w:sz="0" w:space="0" w:color="FFC499"/>
+              <w:right w:val="nil" w:sz="0" w:space="0" w:color="FFC499"/>
+              <w:insideH w:val="nil" w:sz="0" w:space="0" w:color="FFC499"/>
+              <w:insideV w:val="nil" w:sz="0" w:space="0" w:color="FFC499"/>
             </w:tcBorders>
           </w:tcPr>
           <w:p>
@@ -2856,7 +2890,7 @@
     </w:tbl>
     <w:p>
       <w:pPr>
-        <w:spacing w:before="0" w:after="160" w:lineRule="exact" w:line="20"/>
+        <w:spacing w:before="0" w:after="180" w:lineRule="exact" w:line="20"/>
         <w:jc w:val="left"/>
       </w:pPr>
     </w:p>
@@ -2911,7 +2945,7 @@
     </w:tbl>
     <w:p>
       <w:pPr>
-        <w:spacing w:before="0" w:after="160" w:lineRule="exact" w:line="20"/>
+        <w:spacing w:before="0" w:after="180" w:lineRule="exact" w:line="20"/>
         <w:jc w:val="left"/>
       </w:pPr>
     </w:p>
@@ -2947,7 +2981,13 @@
     </w:p>
     <w:p>
       <w:pPr>
-        <w:spacing w:before="560" w:after="80"/>
+        <w:spacing w:before="0" w:after="280" w:lineRule="exact" w:line="20"/>
+        <w:jc w:val="left"/>
+      </w:pPr>
+    </w:p>
+    <w:p>
+      <w:pPr>
+        <w:spacing w:before="0" w:after="80"/>
         <w:jc w:val="center"/>
       </w:pPr>
       <w:r>
@@ -2993,6 +3033,7 @@
       <w:r>
         <w:rPr>
           <w:rFonts w:ascii="Cambria" w:hAnsi="Cambria" w:eastAsia="Cambria" w:cs="Cambria"/>
+          <w:b w:val="0"/>
           <w:i/>
           <w:color w:val="555559"/>
           <w:sz w:val="18"/>
@@ -3016,8 +3057,8 @@
             <w:tcW w:type="dxa" w:w="9029"/>
             <w:shd w:val="clear" w:color="auto" w:fill="A7DC85"/>
             <w:tcMar>
-              <w:top w:w="115" w:type="dxa"/>
-              <w:bottom w:w="115" w:type="dxa"/>
+              <w:top w:w="120" w:type="dxa"/>
+              <w:bottom w:w="120" w:type="dxa"/>
               <w:left w:w="120" w:type="dxa"/>
               <w:right w:w="120" w:type="dxa"/>
               <w:start w:w="130" w:type="dxa"/>
@@ -3025,10 +3066,12 @@
             </w:tcMar>
             <w:vAlign w:val="center"/>
             <w:tcBorders>
-              <w:top w:val="single" w:sz="10" w:space="0" w:color="A7DC85"/>
-              <w:left w:val="single" w:sz="10" w:space="0" w:color="A7DC85"/>
-              <w:bottom w:val="single" w:sz="10" w:space="0" w:color="A7DC85"/>
-              <w:right w:val="single" w:sz="10" w:space="0" w:color="A7DC85"/>
+              <w:top w:val="nil" w:sz="0" w:space="0" w:color="A7DC85"/>
+              <w:left w:val="nil" w:sz="0" w:space="0" w:color="A7DC85"/>
+              <w:bottom w:val="nil" w:sz="0" w:space="0" w:color="A7DC85"/>
+              <w:right w:val="nil" w:sz="0" w:space="0" w:color="A7DC85"/>
+              <w:insideH w:val="nil" w:sz="0" w:space="0" w:color="A7DC85"/>
+              <w:insideV w:val="nil" w:sz="0" w:space="0" w:color="A7DC85"/>
             </w:tcBorders>
           </w:tcPr>
           <w:p>
@@ -3074,8 +3117,8 @@
             <w:tcW w:type="dxa" w:w="9029"/>
             <w:shd w:val="clear" w:color="auto" w:fill="91C3DF"/>
             <w:tcMar>
-              <w:top w:w="115" w:type="dxa"/>
-              <w:bottom w:w="115" w:type="dxa"/>
+              <w:top w:w="120" w:type="dxa"/>
+              <w:bottom w:w="120" w:type="dxa"/>
               <w:left w:w="120" w:type="dxa"/>
               <w:right w:w="120" w:type="dxa"/>
               <w:start w:w="130" w:type="dxa"/>
@@ -3083,10 +3126,12 @@
             </w:tcMar>
             <w:vAlign w:val="center"/>
             <w:tcBorders>
-              <w:top w:val="single" w:sz="10" w:space="0" w:color="91C3DF"/>
-              <w:left w:val="single" w:sz="10" w:space="0" w:color="91C3DF"/>
-              <w:bottom w:val="single" w:sz="10" w:space="0" w:color="91C3DF"/>
-              <w:right w:val="single" w:sz="10" w:space="0" w:color="91C3DF"/>
+              <w:top w:val="nil" w:sz="0" w:space="0" w:color="91C3DF"/>
+              <w:left w:val="nil" w:sz="0" w:space="0" w:color="91C3DF"/>
+              <w:bottom w:val="nil" w:sz="0" w:space="0" w:color="91C3DF"/>
+              <w:right w:val="nil" w:sz="0" w:space="0" w:color="91C3DF"/>
+              <w:insideH w:val="nil" w:sz="0" w:space="0" w:color="91C3DF"/>
+              <w:insideV w:val="nil" w:sz="0" w:space="0" w:color="91C3DF"/>
             </w:tcBorders>
           </w:tcPr>
           <w:p>
@@ -3132,8 +3177,8 @@
             <w:tcW w:type="dxa" w:w="9029"/>
             <w:shd w:val="clear" w:color="auto" w:fill="FFC499"/>
             <w:tcMar>
-              <w:top w:w="115" w:type="dxa"/>
-              <w:bottom w:w="115" w:type="dxa"/>
+              <w:top w:w="120" w:type="dxa"/>
+              <w:bottom w:w="120" w:type="dxa"/>
               <w:left w:w="120" w:type="dxa"/>
               <w:right w:w="120" w:type="dxa"/>
               <w:start w:w="130" w:type="dxa"/>
@@ -3141,10 +3186,12 @@
             </w:tcMar>
             <w:vAlign w:val="center"/>
             <w:tcBorders>
-              <w:top w:val="single" w:sz="10" w:space="0" w:color="FFC499"/>
-              <w:left w:val="single" w:sz="10" w:space="0" w:color="FFC499"/>
-              <w:bottom w:val="single" w:sz="10" w:space="0" w:color="FFC499"/>
-              <w:right w:val="single" w:sz="10" w:space="0" w:color="FFC499"/>
+              <w:top w:val="nil" w:sz="0" w:space="0" w:color="FFC499"/>
+              <w:left w:val="nil" w:sz="0" w:space="0" w:color="FFC499"/>
+              <w:bottom w:val="nil" w:sz="0" w:space="0" w:color="FFC499"/>
+              <w:right w:val="nil" w:sz="0" w:space="0" w:color="FFC499"/>
+              <w:insideH w:val="nil" w:sz="0" w:space="0" w:color="FFC499"/>
+              <w:insideV w:val="nil" w:sz="0" w:space="0" w:color="FFC499"/>
             </w:tcBorders>
           </w:tcPr>
           <w:p>
@@ -3175,7 +3222,7 @@
     </w:tbl>
     <w:p>
       <w:pPr>
-        <w:spacing w:before="0" w:after="160" w:lineRule="exact" w:line="20"/>
+        <w:spacing w:before="0" w:after="180" w:lineRule="exact" w:line="20"/>
         <w:jc w:val="left"/>
       </w:pPr>
     </w:p>
@@ -3230,7 +3277,7 @@
     </w:tbl>
     <w:p>
       <w:pPr>
-        <w:spacing w:before="0" w:after="160" w:lineRule="exact" w:line="20"/>
+        <w:spacing w:before="0" w:after="180" w:lineRule="exact" w:line="20"/>
         <w:jc w:val="left"/>
       </w:pPr>
     </w:p>
@@ -3266,7 +3313,13 @@
     </w:p>
     <w:p>
       <w:pPr>
-        <w:spacing w:before="560" w:after="80"/>
+        <w:spacing w:before="0" w:after="280" w:lineRule="exact" w:line="20"/>
+        <w:jc w:val="left"/>
+      </w:pPr>
+    </w:p>
+    <w:p>
+      <w:pPr>
+        <w:spacing w:before="0" w:after="80"/>
         <w:jc w:val="center"/>
       </w:pPr>
       <w:r>
@@ -3312,6 +3365,7 @@
       <w:r>
         <w:rPr>
           <w:rFonts w:ascii="Cambria" w:hAnsi="Cambria" w:eastAsia="Cambria" w:cs="Cambria"/>
+          <w:b w:val="0"/>
           <w:i/>
           <w:color w:val="555559"/>
           <w:sz w:val="18"/>
@@ -3348,8 +3402,8 @@
             <w:tcW w:type="dxa" w:w="9029"/>
             <w:shd w:val="clear" w:color="auto" w:fill="FFC499"/>
             <w:tcMar>
-              <w:top w:w="115" w:type="dxa"/>
-              <w:bottom w:w="115" w:type="dxa"/>
+              <w:top w:w="120" w:type="dxa"/>
+              <w:bottom w:w="120" w:type="dxa"/>
               <w:left w:w="120" w:type="dxa"/>
               <w:right w:w="120" w:type="dxa"/>
               <w:start w:w="130" w:type="dxa"/>
@@ -3357,10 +3411,12 @@
             </w:tcMar>
             <w:vAlign w:val="center"/>
             <w:tcBorders>
-              <w:top w:val="single" w:sz="10" w:space="0" w:color="FFC499"/>
-              <w:left w:val="single" w:sz="10" w:space="0" w:color="FFC499"/>
-              <w:bottom w:val="single" w:sz="10" w:space="0" w:color="FFC499"/>
-              <w:right w:val="single" w:sz="10" w:space="0" w:color="FFC499"/>
+              <w:top w:val="nil" w:sz="0" w:space="0" w:color="FFC499"/>
+              <w:left w:val="nil" w:sz="0" w:space="0" w:color="FFC499"/>
+              <w:bottom w:val="nil" w:sz="0" w:space="0" w:color="FFC499"/>
+              <w:right w:val="nil" w:sz="0" w:space="0" w:color="FFC499"/>
+              <w:insideH w:val="nil" w:sz="0" w:space="0" w:color="FFC499"/>
+              <w:insideV w:val="nil" w:sz="0" w:space="0" w:color="FFC499"/>
             </w:tcBorders>
           </w:tcPr>
           <w:p>
@@ -3406,8 +3462,8 @@
             <w:tcW w:type="dxa" w:w="9029"/>
             <w:shd w:val="clear" w:color="auto" w:fill="91C3DF"/>
             <w:tcMar>
-              <w:top w:w="115" w:type="dxa"/>
-              <w:bottom w:w="115" w:type="dxa"/>
+              <w:top w:w="120" w:type="dxa"/>
+              <w:bottom w:w="120" w:type="dxa"/>
               <w:left w:w="120" w:type="dxa"/>
               <w:right w:w="120" w:type="dxa"/>
               <w:start w:w="130" w:type="dxa"/>
@@ -3415,10 +3471,12 @@
             </w:tcMar>
             <w:vAlign w:val="center"/>
             <w:tcBorders>
-              <w:top w:val="single" w:sz="10" w:space="0" w:color="91C3DF"/>
-              <w:left w:val="single" w:sz="10" w:space="0" w:color="91C3DF"/>
-              <w:bottom w:val="single" w:sz="10" w:space="0" w:color="91C3DF"/>
-              <w:right w:val="single" w:sz="10" w:space="0" w:color="91C3DF"/>
+              <w:top w:val="nil" w:sz="0" w:space="0" w:color="91C3DF"/>
+              <w:left w:val="nil" w:sz="0" w:space="0" w:color="91C3DF"/>
+              <w:bottom w:val="nil" w:sz="0" w:space="0" w:color="91C3DF"/>
+              <w:right w:val="nil" w:sz="0" w:space="0" w:color="91C3DF"/>
+              <w:insideH w:val="nil" w:sz="0" w:space="0" w:color="91C3DF"/>
+              <w:insideV w:val="nil" w:sz="0" w:space="0" w:color="91C3DF"/>
             </w:tcBorders>
           </w:tcPr>
           <w:p>
@@ -3480,7 +3538,13 @@
     </w:p>
     <w:p>
       <w:pPr>
-        <w:spacing w:before="560" w:after="80"/>
+        <w:spacing w:before="0" w:after="280" w:lineRule="exact" w:line="20"/>
+        <w:jc w:val="left"/>
+      </w:pPr>
+    </w:p>
+    <w:p>
+      <w:pPr>
+        <w:spacing w:before="0" w:after="80"/>
         <w:jc w:val="center"/>
       </w:pPr>
       <w:r>
@@ -3526,6 +3590,7 @@
       <w:r>
         <w:rPr>
           <w:rFonts w:ascii="Cambria" w:hAnsi="Cambria" w:eastAsia="Cambria" w:cs="Cambria"/>
+          <w:b w:val="0"/>
           <w:i/>
           <w:color w:val="555559"/>
           <w:sz w:val="18"/>
@@ -3575,8 +3640,8 @@
             <w:tcW w:type="dxa" w:w="9029"/>
             <w:shd w:val="clear" w:color="auto" w:fill="91C3DF"/>
             <w:tcMar>
-              <w:top w:w="115" w:type="dxa"/>
-              <w:bottom w:w="115" w:type="dxa"/>
+              <w:top w:w="120" w:type="dxa"/>
+              <w:bottom w:w="120" w:type="dxa"/>
               <w:left w:w="120" w:type="dxa"/>
               <w:right w:w="120" w:type="dxa"/>
               <w:start w:w="130" w:type="dxa"/>
@@ -3584,10 +3649,12 @@
             </w:tcMar>
             <w:vAlign w:val="center"/>
             <w:tcBorders>
-              <w:top w:val="single" w:sz="10" w:space="0" w:color="91C3DF"/>
-              <w:left w:val="single" w:sz="10" w:space="0" w:color="91C3DF"/>
-              <w:bottom w:val="single" w:sz="10" w:space="0" w:color="91C3DF"/>
-              <w:right w:val="single" w:sz="10" w:space="0" w:color="91C3DF"/>
+              <w:top w:val="nil" w:sz="0" w:space="0" w:color="91C3DF"/>
+              <w:left w:val="nil" w:sz="0" w:space="0" w:color="91C3DF"/>
+              <w:bottom w:val="nil" w:sz="0" w:space="0" w:color="91C3DF"/>
+              <w:right w:val="nil" w:sz="0" w:space="0" w:color="91C3DF"/>
+              <w:insideH w:val="nil" w:sz="0" w:space="0" w:color="91C3DF"/>
+              <w:insideV w:val="nil" w:sz="0" w:space="0" w:color="91C3DF"/>
             </w:tcBorders>
           </w:tcPr>
           <w:p>
@@ -3633,8 +3700,8 @@
             <w:tcW w:type="dxa" w:w="9029"/>
             <w:shd w:val="clear" w:color="auto" w:fill="FFC499"/>
             <w:tcMar>
-              <w:top w:w="115" w:type="dxa"/>
-              <w:bottom w:w="115" w:type="dxa"/>
+              <w:top w:w="120" w:type="dxa"/>
+              <w:bottom w:w="120" w:type="dxa"/>
               <w:left w:w="120" w:type="dxa"/>
               <w:right w:w="120" w:type="dxa"/>
               <w:start w:w="130" w:type="dxa"/>
@@ -3642,10 +3709,12 @@
             </w:tcMar>
             <w:vAlign w:val="center"/>
             <w:tcBorders>
-              <w:top w:val="single" w:sz="10" w:space="0" w:color="FFC499"/>
-              <w:left w:val="single" w:sz="10" w:space="0" w:color="FFC499"/>
-              <w:bottom w:val="single" w:sz="10" w:space="0" w:color="FFC499"/>
-              <w:right w:val="single" w:sz="10" w:space="0" w:color="FFC499"/>
+              <w:top w:val="nil" w:sz="0" w:space="0" w:color="FFC499"/>
+              <w:left w:val="nil" w:sz="0" w:space="0" w:color="FFC499"/>
+              <w:bottom w:val="nil" w:sz="0" w:space="0" w:color="FFC499"/>
+              <w:right w:val="nil" w:sz="0" w:space="0" w:color="FFC499"/>
+              <w:insideH w:val="nil" w:sz="0" w:space="0" w:color="FFC499"/>
+              <w:insideV w:val="nil" w:sz="0" w:space="0" w:color="FFC499"/>
             </w:tcBorders>
           </w:tcPr>
           <w:p>
@@ -3691,8 +3760,8 @@
             <w:tcW w:type="dxa" w:w="9029"/>
             <w:shd w:val="clear" w:color="auto" w:fill="A7DC85"/>
             <w:tcMar>
-              <w:top w:w="115" w:type="dxa"/>
-              <w:bottom w:w="115" w:type="dxa"/>
+              <w:top w:w="120" w:type="dxa"/>
+              <w:bottom w:w="120" w:type="dxa"/>
               <w:left w:w="120" w:type="dxa"/>
               <w:right w:w="120" w:type="dxa"/>
               <w:start w:w="130" w:type="dxa"/>
@@ -3700,10 +3769,12 @@
             </w:tcMar>
             <w:vAlign w:val="center"/>
             <w:tcBorders>
-              <w:top w:val="single" w:sz="10" w:space="0" w:color="A7DC85"/>
-              <w:left w:val="single" w:sz="10" w:space="0" w:color="A7DC85"/>
-              <w:bottom w:val="single" w:sz="10" w:space="0" w:color="A7DC85"/>
-              <w:right w:val="single" w:sz="10" w:space="0" w:color="A7DC85"/>
+              <w:top w:val="nil" w:sz="0" w:space="0" w:color="A7DC85"/>
+              <w:left w:val="nil" w:sz="0" w:space="0" w:color="A7DC85"/>
+              <w:bottom w:val="nil" w:sz="0" w:space="0" w:color="A7DC85"/>
+              <w:right w:val="nil" w:sz="0" w:space="0" w:color="A7DC85"/>
+              <w:insideH w:val="nil" w:sz="0" w:space="0" w:color="A7DC85"/>
+              <w:insideV w:val="nil" w:sz="0" w:space="0" w:color="A7DC85"/>
             </w:tcBorders>
           </w:tcPr>
           <w:p>
@@ -3749,8 +3820,8 @@
             <w:tcW w:type="dxa" w:w="9029"/>
             <w:shd w:val="clear" w:color="auto" w:fill="91C3DF"/>
             <w:tcMar>
-              <w:top w:w="115" w:type="dxa"/>
-              <w:bottom w:w="115" w:type="dxa"/>
+              <w:top w:w="120" w:type="dxa"/>
+              <w:bottom w:w="120" w:type="dxa"/>
               <w:left w:w="120" w:type="dxa"/>
               <w:right w:w="120" w:type="dxa"/>
               <w:start w:w="130" w:type="dxa"/>
@@ -3758,10 +3829,12 @@
             </w:tcMar>
             <w:vAlign w:val="center"/>
             <w:tcBorders>
-              <w:top w:val="single" w:sz="10" w:space="0" w:color="91C3DF"/>
-              <w:left w:val="single" w:sz="10" w:space="0" w:color="91C3DF"/>
-              <w:bottom w:val="single" w:sz="10" w:space="0" w:color="91C3DF"/>
-              <w:right w:val="single" w:sz="10" w:space="0" w:color="91C3DF"/>
+              <w:top w:val="nil" w:sz="0" w:space="0" w:color="91C3DF"/>
+              <w:left w:val="nil" w:sz="0" w:space="0" w:color="91C3DF"/>
+              <w:bottom w:val="nil" w:sz="0" w:space="0" w:color="91C3DF"/>
+              <w:right w:val="nil" w:sz="0" w:space="0" w:color="91C3DF"/>
+              <w:insideH w:val="nil" w:sz="0" w:space="0" w:color="91C3DF"/>
+              <w:insideV w:val="nil" w:sz="0" w:space="0" w:color="91C3DF"/>
             </w:tcBorders>
           </w:tcPr>
           <w:p>
@@ -3823,7 +3896,13 @@
     </w:p>
     <w:p>
       <w:pPr>
-        <w:spacing w:before="560" w:after="80"/>
+        <w:spacing w:before="0" w:after="280" w:lineRule="exact" w:line="20"/>
+        <w:jc w:val="left"/>
+      </w:pPr>
+    </w:p>
+    <w:p>
+      <w:pPr>
+        <w:spacing w:before="0" w:after="80"/>
         <w:jc w:val="center"/>
       </w:pPr>
       <w:r>
@@ -3869,6 +3948,7 @@
       <w:r>
         <w:rPr>
           <w:rFonts w:ascii="Cambria" w:hAnsi="Cambria" w:eastAsia="Cambria" w:cs="Cambria"/>
+          <w:b w:val="0"/>
           <w:i/>
           <w:color w:val="555559"/>
           <w:sz w:val="18"/>
@@ -3905,8 +3985,8 @@
             <w:tcW w:type="dxa" w:w="9029"/>
             <w:shd w:val="clear" w:color="auto" w:fill="A7DC85"/>
             <w:tcMar>
-              <w:top w:w="115" w:type="dxa"/>
-              <w:bottom w:w="115" w:type="dxa"/>
+              <w:top w:w="120" w:type="dxa"/>
+              <w:bottom w:w="120" w:type="dxa"/>
               <w:left w:w="120" w:type="dxa"/>
               <w:right w:w="120" w:type="dxa"/>
               <w:start w:w="130" w:type="dxa"/>
@@ -3914,10 +3994,12 @@
             </w:tcMar>
             <w:vAlign w:val="center"/>
             <w:tcBorders>
-              <w:top w:val="single" w:sz="10" w:space="0" w:color="A7DC85"/>
-              <w:left w:val="single" w:sz="10" w:space="0" w:color="A7DC85"/>
-              <w:bottom w:val="single" w:sz="10" w:space="0" w:color="A7DC85"/>
-              <w:right w:val="single" w:sz="10" w:space="0" w:color="A7DC85"/>
+              <w:top w:val="nil" w:sz="0" w:space="0" w:color="A7DC85"/>
+              <w:left w:val="nil" w:sz="0" w:space="0" w:color="A7DC85"/>
+              <w:bottom w:val="nil" w:sz="0" w:space="0" w:color="A7DC85"/>
+              <w:right w:val="nil" w:sz="0" w:space="0" w:color="A7DC85"/>
+              <w:insideH w:val="nil" w:sz="0" w:space="0" w:color="A7DC85"/>
+              <w:insideV w:val="nil" w:sz="0" w:space="0" w:color="A7DC85"/>
             </w:tcBorders>
           </w:tcPr>
           <w:p>
@@ -3963,8 +4045,8 @@
             <w:tcW w:type="dxa" w:w="9029"/>
             <w:shd w:val="clear" w:color="auto" w:fill="FFC499"/>
             <w:tcMar>
-              <w:top w:w="115" w:type="dxa"/>
-              <w:bottom w:w="115" w:type="dxa"/>
+              <w:top w:w="120" w:type="dxa"/>
+              <w:bottom w:w="120" w:type="dxa"/>
               <w:left w:w="120" w:type="dxa"/>
               <w:right w:w="120" w:type="dxa"/>
               <w:start w:w="130" w:type="dxa"/>
@@ -3972,10 +4054,12 @@
             </w:tcMar>
             <w:vAlign w:val="center"/>
             <w:tcBorders>
-              <w:top w:val="single" w:sz="10" w:space="0" w:color="FFC499"/>
-              <w:left w:val="single" w:sz="10" w:space="0" w:color="FFC499"/>
-              <w:bottom w:val="single" w:sz="10" w:space="0" w:color="FFC499"/>
-              <w:right w:val="single" w:sz="10" w:space="0" w:color="FFC499"/>
+              <w:top w:val="nil" w:sz="0" w:space="0" w:color="FFC499"/>
+              <w:left w:val="nil" w:sz="0" w:space="0" w:color="FFC499"/>
+              <w:bottom w:val="nil" w:sz="0" w:space="0" w:color="FFC499"/>
+              <w:right w:val="nil" w:sz="0" w:space="0" w:color="FFC499"/>
+              <w:insideH w:val="nil" w:sz="0" w:space="0" w:color="FFC499"/>
+              <w:insideV w:val="nil" w:sz="0" w:space="0" w:color="FFC499"/>
             </w:tcBorders>
           </w:tcPr>
           <w:p>
@@ -4006,7 +4090,7 @@
     </w:tbl>
     <w:p>
       <w:pPr>
-        <w:spacing w:before="0" w:after="160" w:lineRule="exact" w:line="20"/>
+        <w:spacing w:before="0" w:after="180" w:lineRule="exact" w:line="20"/>
         <w:jc w:val="left"/>
       </w:pPr>
     </w:p>
@@ -4061,7 +4145,7 @@
     </w:tbl>
     <w:p>
       <w:pPr>
-        <w:spacing w:before="0" w:after="160" w:lineRule="exact" w:line="20"/>
+        <w:spacing w:before="0" w:after="180" w:lineRule="exact" w:line="20"/>
         <w:jc w:val="left"/>
       </w:pPr>
     </w:p>
@@ -4138,7 +4222,13 @@
     </w:p>
     <w:p>
       <w:pPr>
-        <w:spacing w:before="560" w:after="80"/>
+        <w:spacing w:before="0" w:after="280" w:lineRule="exact" w:line="20"/>
+        <w:jc w:val="left"/>
+      </w:pPr>
+    </w:p>
+    <w:p>
+      <w:pPr>
+        <w:spacing w:before="0" w:after="80"/>
         <w:jc w:val="center"/>
       </w:pPr>
       <w:r>
@@ -4184,6 +4274,7 @@
       <w:r>
         <w:rPr>
           <w:rFonts w:ascii="Cambria" w:hAnsi="Cambria" w:eastAsia="Cambria" w:cs="Cambria"/>
+          <w:b w:val="0"/>
           <w:i/>
           <w:color w:val="555559"/>
           <w:sz w:val="18"/>
@@ -4220,8 +4311,8 @@
             <w:tcW w:type="dxa" w:w="9029"/>
             <w:shd w:val="clear" w:color="auto" w:fill="A7DC85"/>
             <w:tcMar>
-              <w:top w:w="115" w:type="dxa"/>
-              <w:bottom w:w="115" w:type="dxa"/>
+              <w:top w:w="120" w:type="dxa"/>
+              <w:bottom w:w="120" w:type="dxa"/>
               <w:left w:w="120" w:type="dxa"/>
               <w:right w:w="120" w:type="dxa"/>
               <w:start w:w="130" w:type="dxa"/>
@@ -4229,10 +4320,12 @@
             </w:tcMar>
             <w:vAlign w:val="center"/>
             <w:tcBorders>
-              <w:top w:val="single" w:sz="10" w:space="0" w:color="A7DC85"/>
-              <w:left w:val="single" w:sz="10" w:space="0" w:color="A7DC85"/>
-              <w:bottom w:val="single" w:sz="10" w:space="0" w:color="A7DC85"/>
-              <w:right w:val="single" w:sz="10" w:space="0" w:color="A7DC85"/>
+              <w:top w:val="nil" w:sz="0" w:space="0" w:color="A7DC85"/>
+              <w:left w:val="nil" w:sz="0" w:space="0" w:color="A7DC85"/>
+              <w:bottom w:val="nil" w:sz="0" w:space="0" w:color="A7DC85"/>
+              <w:right w:val="nil" w:sz="0" w:space="0" w:color="A7DC85"/>
+              <w:insideH w:val="nil" w:sz="0" w:space="0" w:color="A7DC85"/>
+              <w:insideV w:val="nil" w:sz="0" w:space="0" w:color="A7DC85"/>
             </w:tcBorders>
           </w:tcPr>
           <w:p>
@@ -4278,8 +4371,8 @@
             <w:tcW w:type="dxa" w:w="9029"/>
             <w:shd w:val="clear" w:color="auto" w:fill="91C3DF"/>
             <w:tcMar>
-              <w:top w:w="115" w:type="dxa"/>
-              <w:bottom w:w="115" w:type="dxa"/>
+              <w:top w:w="120" w:type="dxa"/>
+              <w:bottom w:w="120" w:type="dxa"/>
               <w:left w:w="120" w:type="dxa"/>
               <w:right w:w="120" w:type="dxa"/>
               <w:start w:w="130" w:type="dxa"/>
@@ -4287,10 +4380,12 @@
             </w:tcMar>
             <w:vAlign w:val="center"/>
             <w:tcBorders>
-              <w:top w:val="single" w:sz="10" w:space="0" w:color="91C3DF"/>
-              <w:left w:val="single" w:sz="10" w:space="0" w:color="91C3DF"/>
-              <w:bottom w:val="single" w:sz="10" w:space="0" w:color="91C3DF"/>
-              <w:right w:val="single" w:sz="10" w:space="0" w:color="91C3DF"/>
+              <w:top w:val="nil" w:sz="0" w:space="0" w:color="91C3DF"/>
+              <w:left w:val="nil" w:sz="0" w:space="0" w:color="91C3DF"/>
+              <w:bottom w:val="nil" w:sz="0" w:space="0" w:color="91C3DF"/>
+              <w:right w:val="nil" w:sz="0" w:space="0" w:color="91C3DF"/>
+              <w:insideH w:val="nil" w:sz="0" w:space="0" w:color="91C3DF"/>
+              <w:insideV w:val="nil" w:sz="0" w:space="0" w:color="91C3DF"/>
             </w:tcBorders>
           </w:tcPr>
           <w:p>
@@ -4336,8 +4431,8 @@
             <w:tcW w:type="dxa" w:w="9029"/>
             <w:shd w:val="clear" w:color="auto" w:fill="FFC499"/>
             <w:tcMar>
-              <w:top w:w="115" w:type="dxa"/>
-              <w:bottom w:w="115" w:type="dxa"/>
+              <w:top w:w="120" w:type="dxa"/>
+              <w:bottom w:w="120" w:type="dxa"/>
               <w:left w:w="120" w:type="dxa"/>
               <w:right w:w="120" w:type="dxa"/>
               <w:start w:w="130" w:type="dxa"/>
@@ -4345,10 +4440,12 @@
             </w:tcMar>
             <w:vAlign w:val="center"/>
             <w:tcBorders>
-              <w:top w:val="single" w:sz="10" w:space="0" w:color="FFC499"/>
-              <w:left w:val="single" w:sz="10" w:space="0" w:color="FFC499"/>
-              <w:bottom w:val="single" w:sz="10" w:space="0" w:color="FFC499"/>
-              <w:right w:val="single" w:sz="10" w:space="0" w:color="FFC499"/>
+              <w:top w:val="nil" w:sz="0" w:space="0" w:color="FFC499"/>
+              <w:left w:val="nil" w:sz="0" w:space="0" w:color="FFC499"/>
+              <w:bottom w:val="nil" w:sz="0" w:space="0" w:color="FFC499"/>
+              <w:right w:val="nil" w:sz="0" w:space="0" w:color="FFC499"/>
+              <w:insideH w:val="nil" w:sz="0" w:space="0" w:color="FFC499"/>
+              <w:insideV w:val="nil" w:sz="0" w:space="0" w:color="FFC499"/>
             </w:tcBorders>
           </w:tcPr>
           <w:p>
@@ -4379,7 +4476,7 @@
     </w:tbl>
     <w:p>
       <w:pPr>
-        <w:spacing w:before="0" w:after="160" w:lineRule="exact" w:line="20"/>
+        <w:spacing w:before="0" w:after="180" w:lineRule="exact" w:line="20"/>
         <w:jc w:val="left"/>
       </w:pPr>
     </w:p>
@@ -4434,7 +4531,7 @@
     </w:tbl>
     <w:p>
       <w:pPr>
-        <w:spacing w:before="0" w:after="160" w:lineRule="exact" w:line="20"/>
+        <w:spacing w:before="0" w:after="180" w:lineRule="exact" w:line="20"/>
         <w:jc w:val="left"/>
       </w:pPr>
     </w:p>
@@ -4574,7 +4671,13 @@
     </w:p>
     <w:p>
       <w:pPr>
-        <w:spacing w:before="560" w:after="80"/>
+        <w:spacing w:before="0" w:after="280" w:lineRule="exact" w:line="20"/>
+        <w:jc w:val="left"/>
+      </w:pPr>
+    </w:p>
+    <w:p>
+      <w:pPr>
+        <w:spacing w:before="0" w:after="80"/>
         <w:jc w:val="center"/>
       </w:pPr>
       <w:r>
@@ -4620,6 +4723,7 @@
       <w:r>
         <w:rPr>
           <w:rFonts w:ascii="Cambria" w:hAnsi="Cambria" w:eastAsia="Cambria" w:cs="Cambria"/>
+          <w:b w:val="0"/>
           <w:i/>
           <w:color w:val="555559"/>
           <w:sz w:val="18"/>
@@ -4643,8 +4747,8 @@
             <w:tcW w:type="dxa" w:w="9029"/>
             <w:shd w:val="clear" w:color="auto" w:fill="A7DC85"/>
             <w:tcMar>
-              <w:top w:w="115" w:type="dxa"/>
-              <w:bottom w:w="115" w:type="dxa"/>
+              <w:top w:w="120" w:type="dxa"/>
+              <w:bottom w:w="120" w:type="dxa"/>
               <w:left w:w="120" w:type="dxa"/>
               <w:right w:w="120" w:type="dxa"/>
               <w:start w:w="130" w:type="dxa"/>
@@ -4652,10 +4756,12 @@
             </w:tcMar>
             <w:vAlign w:val="center"/>
             <w:tcBorders>
-              <w:top w:val="single" w:sz="10" w:space="0" w:color="A7DC85"/>
-              <w:left w:val="single" w:sz="10" w:space="0" w:color="A7DC85"/>
-              <w:bottom w:val="single" w:sz="10" w:space="0" w:color="A7DC85"/>
-              <w:right w:val="single" w:sz="10" w:space="0" w:color="A7DC85"/>
+              <w:top w:val="nil" w:sz="0" w:space="0" w:color="A7DC85"/>
+              <w:left w:val="nil" w:sz="0" w:space="0" w:color="A7DC85"/>
+              <w:bottom w:val="nil" w:sz="0" w:space="0" w:color="A7DC85"/>
+              <w:right w:val="nil" w:sz="0" w:space="0" w:color="A7DC85"/>
+              <w:insideH w:val="nil" w:sz="0" w:space="0" w:color="A7DC85"/>
+              <w:insideV w:val="nil" w:sz="0" w:space="0" w:color="A7DC85"/>
             </w:tcBorders>
           </w:tcPr>
           <w:p>
@@ -4701,8 +4807,8 @@
             <w:tcW w:type="dxa" w:w="9029"/>
             <w:shd w:val="clear" w:color="auto" w:fill="91C3DF"/>
             <w:tcMar>
-              <w:top w:w="115" w:type="dxa"/>
-              <w:bottom w:w="115" w:type="dxa"/>
+              <w:top w:w="120" w:type="dxa"/>
+              <w:bottom w:w="120" w:type="dxa"/>
               <w:left w:w="120" w:type="dxa"/>
               <w:right w:w="120" w:type="dxa"/>
               <w:start w:w="130" w:type="dxa"/>
@@ -4710,10 +4816,12 @@
             </w:tcMar>
             <w:vAlign w:val="center"/>
             <w:tcBorders>
-              <w:top w:val="single" w:sz="10" w:space="0" w:color="91C3DF"/>
-              <w:left w:val="single" w:sz="10" w:space="0" w:color="91C3DF"/>
-              <w:bottom w:val="single" w:sz="10" w:space="0" w:color="91C3DF"/>
-              <w:right w:val="single" w:sz="10" w:space="0" w:color="91C3DF"/>
+              <w:top w:val="nil" w:sz="0" w:space="0" w:color="91C3DF"/>
+              <w:left w:val="nil" w:sz="0" w:space="0" w:color="91C3DF"/>
+              <w:bottom w:val="nil" w:sz="0" w:space="0" w:color="91C3DF"/>
+              <w:right w:val="nil" w:sz="0" w:space="0" w:color="91C3DF"/>
+              <w:insideH w:val="nil" w:sz="0" w:space="0" w:color="91C3DF"/>
+              <w:insideV w:val="nil" w:sz="0" w:space="0" w:color="91C3DF"/>
             </w:tcBorders>
           </w:tcPr>
           <w:p>
@@ -4759,8 +4867,8 @@
             <w:tcW w:type="dxa" w:w="9029"/>
             <w:shd w:val="clear" w:color="auto" w:fill="FFC499"/>
             <w:tcMar>
-              <w:top w:w="115" w:type="dxa"/>
-              <w:bottom w:w="115" w:type="dxa"/>
+              <w:top w:w="120" w:type="dxa"/>
+              <w:bottom w:w="120" w:type="dxa"/>
               <w:left w:w="120" w:type="dxa"/>
               <w:right w:w="120" w:type="dxa"/>
               <w:start w:w="130" w:type="dxa"/>
@@ -4768,10 +4876,12 @@
             </w:tcMar>
             <w:vAlign w:val="center"/>
             <w:tcBorders>
-              <w:top w:val="single" w:sz="10" w:space="0" w:color="FFC499"/>
-              <w:left w:val="single" w:sz="10" w:space="0" w:color="FFC499"/>
-              <w:bottom w:val="single" w:sz="10" w:space="0" w:color="FFC499"/>
-              <w:right w:val="single" w:sz="10" w:space="0" w:color="FFC499"/>
+              <w:top w:val="nil" w:sz="0" w:space="0" w:color="FFC499"/>
+              <w:left w:val="nil" w:sz="0" w:space="0" w:color="FFC499"/>
+              <w:bottom w:val="nil" w:sz="0" w:space="0" w:color="FFC499"/>
+              <w:right w:val="nil" w:sz="0" w:space="0" w:color="FFC499"/>
+              <w:insideH w:val="nil" w:sz="0" w:space="0" w:color="FFC499"/>
+              <w:insideV w:val="nil" w:sz="0" w:space="0" w:color="FFC499"/>
             </w:tcBorders>
           </w:tcPr>
           <w:p>
@@ -4802,7 +4912,7 @@
     </w:tbl>
     <w:p>
       <w:pPr>
-        <w:spacing w:before="0" w:after="160" w:lineRule="exact" w:line="20"/>
+        <w:spacing w:before="0" w:after="180" w:lineRule="exact" w:line="20"/>
         <w:jc w:val="left"/>
       </w:pPr>
     </w:p>
@@ -4857,7 +4967,7 @@
     </w:tbl>
     <w:p>
       <w:pPr>
-        <w:spacing w:before="0" w:after="160" w:lineRule="exact" w:line="20"/>
+        <w:spacing w:before="0" w:after="180" w:lineRule="exact" w:line="20"/>
         <w:jc w:val="left"/>
       </w:pPr>
     </w:p>
@@ -4893,7 +5003,13 @@
     </w:p>
     <w:p>
       <w:pPr>
-        <w:spacing w:before="560" w:after="80"/>
+        <w:spacing w:before="0" w:after="280" w:lineRule="exact" w:line="20"/>
+        <w:jc w:val="left"/>
+      </w:pPr>
+    </w:p>
+    <w:p>
+      <w:pPr>
+        <w:spacing w:before="0" w:after="80"/>
         <w:jc w:val="center"/>
       </w:pPr>
       <w:r>
@@ -4939,6 +5055,7 @@
       <w:r>
         <w:rPr>
           <w:rFonts w:ascii="Cambria" w:hAnsi="Cambria" w:eastAsia="Cambria" w:cs="Cambria"/>
+          <w:b w:val="0"/>
           <w:i/>
           <w:color w:val="555559"/>
           <w:sz w:val="18"/>
@@ -4975,8 +5092,8 @@
             <w:tcW w:type="dxa" w:w="9029"/>
             <w:shd w:val="clear" w:color="auto" w:fill="A7DC85"/>
             <w:tcMar>
-              <w:top w:w="115" w:type="dxa"/>
-              <w:bottom w:w="115" w:type="dxa"/>
+              <w:top w:w="120" w:type="dxa"/>
+              <w:bottom w:w="120" w:type="dxa"/>
               <w:left w:w="120" w:type="dxa"/>
               <w:right w:w="120" w:type="dxa"/>
               <w:start w:w="130" w:type="dxa"/>
@@ -4984,10 +5101,12 @@
             </w:tcMar>
             <w:vAlign w:val="center"/>
             <w:tcBorders>
-              <w:top w:val="single" w:sz="10" w:space="0" w:color="A7DC85"/>
-              <w:left w:val="single" w:sz="10" w:space="0" w:color="A7DC85"/>
-              <w:bottom w:val="single" w:sz="10" w:space="0" w:color="A7DC85"/>
-              <w:right w:val="single" w:sz="10" w:space="0" w:color="A7DC85"/>
+              <w:top w:val="nil" w:sz="0" w:space="0" w:color="A7DC85"/>
+              <w:left w:val="nil" w:sz="0" w:space="0" w:color="A7DC85"/>
+              <w:bottom w:val="nil" w:sz="0" w:space="0" w:color="A7DC85"/>
+              <w:right w:val="nil" w:sz="0" w:space="0" w:color="A7DC85"/>
+              <w:insideH w:val="nil" w:sz="0" w:space="0" w:color="A7DC85"/>
+              <w:insideV w:val="nil" w:sz="0" w:space="0" w:color="A7DC85"/>
             </w:tcBorders>
           </w:tcPr>
           <w:p>
@@ -5033,8 +5152,8 @@
             <w:tcW w:type="dxa" w:w="9029"/>
             <w:shd w:val="clear" w:color="auto" w:fill="91C3DF"/>
             <w:tcMar>
-              <w:top w:w="115" w:type="dxa"/>
-              <w:bottom w:w="115" w:type="dxa"/>
+              <w:top w:w="120" w:type="dxa"/>
+              <w:bottom w:w="120" w:type="dxa"/>
               <w:left w:w="120" w:type="dxa"/>
               <w:right w:w="120" w:type="dxa"/>
               <w:start w:w="130" w:type="dxa"/>
@@ -5042,10 +5161,12 @@
             </w:tcMar>
             <w:vAlign w:val="center"/>
             <w:tcBorders>
-              <w:top w:val="single" w:sz="10" w:space="0" w:color="91C3DF"/>
-              <w:left w:val="single" w:sz="10" w:space="0" w:color="91C3DF"/>
-              <w:bottom w:val="single" w:sz="10" w:space="0" w:color="91C3DF"/>
-              <w:right w:val="single" w:sz="10" w:space="0" w:color="91C3DF"/>
+              <w:top w:val="nil" w:sz="0" w:space="0" w:color="91C3DF"/>
+              <w:left w:val="nil" w:sz="0" w:space="0" w:color="91C3DF"/>
+              <w:bottom w:val="nil" w:sz="0" w:space="0" w:color="91C3DF"/>
+              <w:right w:val="nil" w:sz="0" w:space="0" w:color="91C3DF"/>
+              <w:insideH w:val="nil" w:sz="0" w:space="0" w:color="91C3DF"/>
+              <w:insideV w:val="nil" w:sz="0" w:space="0" w:color="91C3DF"/>
             </w:tcBorders>
           </w:tcPr>
           <w:p>
@@ -5091,8 +5212,8 @@
             <w:tcW w:type="dxa" w:w="9029"/>
             <w:shd w:val="clear" w:color="auto" w:fill="FFC499"/>
             <w:tcMar>
-              <w:top w:w="115" w:type="dxa"/>
-              <w:bottom w:w="115" w:type="dxa"/>
+              <w:top w:w="120" w:type="dxa"/>
+              <w:bottom w:w="120" w:type="dxa"/>
               <w:left w:w="120" w:type="dxa"/>
               <w:right w:w="120" w:type="dxa"/>
               <w:start w:w="130" w:type="dxa"/>
@@ -5100,10 +5221,12 @@
             </w:tcMar>
             <w:vAlign w:val="center"/>
             <w:tcBorders>
-              <w:top w:val="single" w:sz="10" w:space="0" w:color="FFC499"/>
-              <w:left w:val="single" w:sz="10" w:space="0" w:color="FFC499"/>
-              <w:bottom w:val="single" w:sz="10" w:space="0" w:color="FFC499"/>
-              <w:right w:val="single" w:sz="10" w:space="0" w:color="FFC499"/>
+              <w:top w:val="nil" w:sz="0" w:space="0" w:color="FFC499"/>
+              <w:left w:val="nil" w:sz="0" w:space="0" w:color="FFC499"/>
+              <w:bottom w:val="nil" w:sz="0" w:space="0" w:color="FFC499"/>
+              <w:right w:val="nil" w:sz="0" w:space="0" w:color="FFC499"/>
+              <w:insideH w:val="nil" w:sz="0" w:space="0" w:color="FFC499"/>
+              <w:insideV w:val="nil" w:sz="0" w:space="0" w:color="FFC499"/>
             </w:tcBorders>
           </w:tcPr>
           <w:p>
@@ -5134,7 +5257,7 @@
     </w:tbl>
     <w:p>
       <w:pPr>
-        <w:spacing w:before="0" w:after="160" w:lineRule="exact" w:line="20"/>
+        <w:spacing w:before="0" w:after="180" w:lineRule="exact" w:line="20"/>
         <w:jc w:val="left"/>
       </w:pPr>
     </w:p>
@@ -5189,7 +5312,7 @@
     </w:tbl>
     <w:p>
       <w:pPr>
-        <w:spacing w:before="0" w:after="160" w:lineRule="exact" w:line="20"/>
+        <w:spacing w:before="0" w:after="180" w:lineRule="exact" w:line="20"/>
         <w:jc w:val="left"/>
       </w:pPr>
     </w:p>
@@ -5225,7 +5348,13 @@
     </w:p>
     <w:p>
       <w:pPr>
-        <w:spacing w:before="560" w:after="80"/>
+        <w:spacing w:before="0" w:after="280" w:lineRule="exact" w:line="20"/>
+        <w:jc w:val="left"/>
+      </w:pPr>
+    </w:p>
+    <w:p>
+      <w:pPr>
+        <w:spacing w:before="0" w:after="80"/>
         <w:jc w:val="center"/>
       </w:pPr>
       <w:r>
@@ -5271,6 +5400,7 @@
       <w:r>
         <w:rPr>
           <w:rFonts w:ascii="Cambria" w:hAnsi="Cambria" w:eastAsia="Cambria" w:cs="Cambria"/>
+          <w:b w:val="0"/>
           <w:i/>
           <w:color w:val="555559"/>
           <w:sz w:val="18"/>
@@ -5307,8 +5437,8 @@
             <w:tcW w:type="dxa" w:w="9029"/>
             <w:shd w:val="clear" w:color="auto" w:fill="A7DC85"/>
             <w:tcMar>
-              <w:top w:w="115" w:type="dxa"/>
-              <w:bottom w:w="115" w:type="dxa"/>
+              <w:top w:w="120" w:type="dxa"/>
+              <w:bottom w:w="120" w:type="dxa"/>
               <w:left w:w="120" w:type="dxa"/>
               <w:right w:w="120" w:type="dxa"/>
               <w:start w:w="130" w:type="dxa"/>
@@ -5316,10 +5446,12 @@
             </w:tcMar>
             <w:vAlign w:val="center"/>
             <w:tcBorders>
-              <w:top w:val="single" w:sz="10" w:space="0" w:color="A7DC85"/>
-              <w:left w:val="single" w:sz="10" w:space="0" w:color="A7DC85"/>
-              <w:bottom w:val="single" w:sz="10" w:space="0" w:color="A7DC85"/>
-              <w:right w:val="single" w:sz="10" w:space="0" w:color="A7DC85"/>
+              <w:top w:val="nil" w:sz="0" w:space="0" w:color="A7DC85"/>
+              <w:left w:val="nil" w:sz="0" w:space="0" w:color="A7DC85"/>
+              <w:bottom w:val="nil" w:sz="0" w:space="0" w:color="A7DC85"/>
+              <w:right w:val="nil" w:sz="0" w:space="0" w:color="A7DC85"/>
+              <w:insideH w:val="nil" w:sz="0" w:space="0" w:color="A7DC85"/>
+              <w:insideV w:val="nil" w:sz="0" w:space="0" w:color="A7DC85"/>
             </w:tcBorders>
           </w:tcPr>
           <w:p>
@@ -5365,8 +5497,8 @@
             <w:tcW w:type="dxa" w:w="9029"/>
             <w:shd w:val="clear" w:color="auto" w:fill="91C3DF"/>
             <w:tcMar>
-              <w:top w:w="115" w:type="dxa"/>
-              <w:bottom w:w="115" w:type="dxa"/>
+              <w:top w:w="120" w:type="dxa"/>
+              <w:bottom w:w="120" w:type="dxa"/>
               <w:left w:w="120" w:type="dxa"/>
               <w:right w:w="120" w:type="dxa"/>
               <w:start w:w="130" w:type="dxa"/>
@@ -5374,10 +5506,12 @@
             </w:tcMar>
             <w:vAlign w:val="center"/>
             <w:tcBorders>
-              <w:top w:val="single" w:sz="10" w:space="0" w:color="91C3DF"/>
-              <w:left w:val="single" w:sz="10" w:space="0" w:color="91C3DF"/>
-              <w:bottom w:val="single" w:sz="10" w:space="0" w:color="91C3DF"/>
-              <w:right w:val="single" w:sz="10" w:space="0" w:color="91C3DF"/>
+              <w:top w:val="nil" w:sz="0" w:space="0" w:color="91C3DF"/>
+              <w:left w:val="nil" w:sz="0" w:space="0" w:color="91C3DF"/>
+              <w:bottom w:val="nil" w:sz="0" w:space="0" w:color="91C3DF"/>
+              <w:right w:val="nil" w:sz="0" w:space="0" w:color="91C3DF"/>
+              <w:insideH w:val="nil" w:sz="0" w:space="0" w:color="91C3DF"/>
+              <w:insideV w:val="nil" w:sz="0" w:space="0" w:color="91C3DF"/>
             </w:tcBorders>
           </w:tcPr>
           <w:p>
@@ -5423,8 +5557,8 @@
             <w:tcW w:type="dxa" w:w="9029"/>
             <w:shd w:val="clear" w:color="auto" w:fill="FFC499"/>
             <w:tcMar>
-              <w:top w:w="115" w:type="dxa"/>
-              <w:bottom w:w="115" w:type="dxa"/>
+              <w:top w:w="120" w:type="dxa"/>
+              <w:bottom w:w="120" w:type="dxa"/>
               <w:left w:w="120" w:type="dxa"/>
               <w:right w:w="120" w:type="dxa"/>
               <w:start w:w="130" w:type="dxa"/>
@@ -5432,10 +5566,12 @@
             </w:tcMar>
             <w:vAlign w:val="center"/>
             <w:tcBorders>
-              <w:top w:val="single" w:sz="10" w:space="0" w:color="FFC499"/>
-              <w:left w:val="single" w:sz="10" w:space="0" w:color="FFC499"/>
-              <w:bottom w:val="single" w:sz="10" w:space="0" w:color="FFC499"/>
-              <w:right w:val="single" w:sz="10" w:space="0" w:color="FFC499"/>
+              <w:top w:val="nil" w:sz="0" w:space="0" w:color="FFC499"/>
+              <w:left w:val="nil" w:sz="0" w:space="0" w:color="FFC499"/>
+              <w:bottom w:val="nil" w:sz="0" w:space="0" w:color="FFC499"/>
+              <w:right w:val="nil" w:sz="0" w:space="0" w:color="FFC499"/>
+              <w:insideH w:val="nil" w:sz="0" w:space="0" w:color="FFC499"/>
+              <w:insideV w:val="nil" w:sz="0" w:space="0" w:color="FFC499"/>
             </w:tcBorders>
           </w:tcPr>
           <w:p>
@@ -5466,7 +5602,7 @@
     </w:tbl>
     <w:p>
       <w:pPr>
-        <w:spacing w:before="0" w:after="160" w:lineRule="exact" w:line="20"/>
+        <w:spacing w:before="0" w:after="180" w:lineRule="exact" w:line="20"/>
         <w:jc w:val="left"/>
       </w:pPr>
     </w:p>
@@ -5521,7 +5657,7 @@
     </w:tbl>
     <w:p>
       <w:pPr>
-        <w:spacing w:before="0" w:after="160" w:lineRule="exact" w:line="20"/>
+        <w:spacing w:before="0" w:after="180" w:lineRule="exact" w:line="20"/>
         <w:jc w:val="left"/>
       </w:pPr>
     </w:p>
@@ -5557,7 +5693,13 @@
     </w:p>
     <w:p>
       <w:pPr>
-        <w:spacing w:before="560" w:after="80"/>
+        <w:spacing w:before="0" w:after="280" w:lineRule="exact" w:line="20"/>
+        <w:jc w:val="left"/>
+      </w:pPr>
+    </w:p>
+    <w:p>
+      <w:pPr>
+        <w:spacing w:before="0" w:after="80"/>
         <w:jc w:val="center"/>
       </w:pPr>
       <w:r>
@@ -5603,6 +5745,7 @@
       <w:r>
         <w:rPr>
           <w:rFonts w:ascii="Cambria" w:hAnsi="Cambria" w:eastAsia="Cambria" w:cs="Cambria"/>
+          <w:b w:val="0"/>
           <w:i/>
           <w:color w:val="555559"/>
           <w:sz w:val="18"/>
@@ -5639,8 +5782,8 @@
             <w:tcW w:type="dxa" w:w="9029"/>
             <w:shd w:val="clear" w:color="auto" w:fill="A7DC85"/>
             <w:tcMar>
-              <w:top w:w="115" w:type="dxa"/>
-              <w:bottom w:w="115" w:type="dxa"/>
+              <w:top w:w="120" w:type="dxa"/>
+              <w:bottom w:w="120" w:type="dxa"/>
               <w:left w:w="120" w:type="dxa"/>
               <w:right w:w="120" w:type="dxa"/>
               <w:start w:w="130" w:type="dxa"/>
@@ -5648,10 +5791,12 @@
             </w:tcMar>
             <w:vAlign w:val="center"/>
             <w:tcBorders>
-              <w:top w:val="single" w:sz="10" w:space="0" w:color="A7DC85"/>
-              <w:left w:val="single" w:sz="10" w:space="0" w:color="A7DC85"/>
-              <w:bottom w:val="single" w:sz="10" w:space="0" w:color="A7DC85"/>
-              <w:right w:val="single" w:sz="10" w:space="0" w:color="A7DC85"/>
+              <w:top w:val="nil" w:sz="0" w:space="0" w:color="A7DC85"/>
+              <w:left w:val="nil" w:sz="0" w:space="0" w:color="A7DC85"/>
+              <w:bottom w:val="nil" w:sz="0" w:space="0" w:color="A7DC85"/>
+              <w:right w:val="nil" w:sz="0" w:space="0" w:color="A7DC85"/>
+              <w:insideH w:val="nil" w:sz="0" w:space="0" w:color="A7DC85"/>
+              <w:insideV w:val="nil" w:sz="0" w:space="0" w:color="A7DC85"/>
             </w:tcBorders>
           </w:tcPr>
           <w:p>
@@ -5697,8 +5842,8 @@
             <w:tcW w:type="dxa" w:w="9029"/>
             <w:shd w:val="clear" w:color="auto" w:fill="91C3DF"/>
             <w:tcMar>
-              <w:top w:w="115" w:type="dxa"/>
-              <w:bottom w:w="115" w:type="dxa"/>
+              <w:top w:w="120" w:type="dxa"/>
+              <w:bottom w:w="120" w:type="dxa"/>
               <w:left w:w="120" w:type="dxa"/>
               <w:right w:w="120" w:type="dxa"/>
               <w:start w:w="130" w:type="dxa"/>
@@ -5706,10 +5851,12 @@
             </w:tcMar>
             <w:vAlign w:val="center"/>
             <w:tcBorders>
-              <w:top w:val="single" w:sz="10" w:space="0" w:color="91C3DF"/>
-              <w:left w:val="single" w:sz="10" w:space="0" w:color="91C3DF"/>
-              <w:bottom w:val="single" w:sz="10" w:space="0" w:color="91C3DF"/>
-              <w:right w:val="single" w:sz="10" w:space="0" w:color="91C3DF"/>
+              <w:top w:val="nil" w:sz="0" w:space="0" w:color="91C3DF"/>
+              <w:left w:val="nil" w:sz="0" w:space="0" w:color="91C3DF"/>
+              <w:bottom w:val="nil" w:sz="0" w:space="0" w:color="91C3DF"/>
+              <w:right w:val="nil" w:sz="0" w:space="0" w:color="91C3DF"/>
+              <w:insideH w:val="nil" w:sz="0" w:space="0" w:color="91C3DF"/>
+              <w:insideV w:val="nil" w:sz="0" w:space="0" w:color="91C3DF"/>
             </w:tcBorders>
           </w:tcPr>
           <w:p>
@@ -5755,8 +5902,8 @@
             <w:tcW w:type="dxa" w:w="9029"/>
             <w:shd w:val="clear" w:color="auto" w:fill="FFC499"/>
             <w:tcMar>
-              <w:top w:w="115" w:type="dxa"/>
-              <w:bottom w:w="115" w:type="dxa"/>
+              <w:top w:w="120" w:type="dxa"/>
+              <w:bottom w:w="120" w:type="dxa"/>
               <w:left w:w="120" w:type="dxa"/>
               <w:right w:w="120" w:type="dxa"/>
               <w:start w:w="130" w:type="dxa"/>
@@ -5764,10 +5911,12 @@
             </w:tcMar>
             <w:vAlign w:val="center"/>
             <w:tcBorders>
-              <w:top w:val="single" w:sz="10" w:space="0" w:color="FFC499"/>
-              <w:left w:val="single" w:sz="10" w:space="0" w:color="FFC499"/>
-              <w:bottom w:val="single" w:sz="10" w:space="0" w:color="FFC499"/>
-              <w:right w:val="single" w:sz="10" w:space="0" w:color="FFC499"/>
+              <w:top w:val="nil" w:sz="0" w:space="0" w:color="FFC499"/>
+              <w:left w:val="nil" w:sz="0" w:space="0" w:color="FFC499"/>
+              <w:bottom w:val="nil" w:sz="0" w:space="0" w:color="FFC499"/>
+              <w:right w:val="nil" w:sz="0" w:space="0" w:color="FFC499"/>
+              <w:insideH w:val="nil" w:sz="0" w:space="0" w:color="FFC499"/>
+              <w:insideV w:val="nil" w:sz="0" w:space="0" w:color="FFC499"/>
             </w:tcBorders>
           </w:tcPr>
           <w:p>
@@ -5798,7 +5947,7 @@
     </w:tbl>
     <w:p>
       <w:pPr>
-        <w:spacing w:before="0" w:after="160" w:lineRule="exact" w:line="20"/>
+        <w:spacing w:before="0" w:after="180" w:lineRule="exact" w:line="20"/>
         <w:jc w:val="left"/>
       </w:pPr>
     </w:p>
@@ -5853,7 +6002,7 @@
     </w:tbl>
     <w:p>
       <w:pPr>
-        <w:spacing w:before="0" w:after="160" w:lineRule="exact" w:line="20"/>
+        <w:spacing w:before="0" w:after="180" w:lineRule="exact" w:line="20"/>
         <w:jc w:val="left"/>
       </w:pPr>
     </w:p>
@@ -5889,7 +6038,13 @@
     </w:p>
     <w:p>
       <w:pPr>
-        <w:spacing w:before="560" w:after="80"/>
+        <w:spacing w:before="0" w:after="280" w:lineRule="exact" w:line="20"/>
+        <w:jc w:val="left"/>
+      </w:pPr>
+    </w:p>
+    <w:p>
+      <w:pPr>
+        <w:spacing w:before="0" w:after="80"/>
         <w:jc w:val="center"/>
       </w:pPr>
       <w:r>
@@ -5935,6 +6090,7 @@
       <w:r>
         <w:rPr>
           <w:rFonts w:ascii="Cambria" w:hAnsi="Cambria" w:eastAsia="Cambria" w:cs="Cambria"/>
+          <w:b w:val="0"/>
           <w:i/>
           <w:color w:val="555559"/>
           <w:sz w:val="18"/>
@@ -5971,8 +6127,8 @@
             <w:tcW w:type="dxa" w:w="9029"/>
             <w:shd w:val="clear" w:color="auto" w:fill="A7DC85"/>
             <w:tcMar>
-              <w:top w:w="115" w:type="dxa"/>
-              <w:bottom w:w="115" w:type="dxa"/>
+              <w:top w:w="120" w:type="dxa"/>
+              <w:bottom w:w="120" w:type="dxa"/>
               <w:left w:w="120" w:type="dxa"/>
               <w:right w:w="120" w:type="dxa"/>
               <w:start w:w="130" w:type="dxa"/>
@@ -5980,10 +6136,12 @@
             </w:tcMar>
             <w:vAlign w:val="center"/>
             <w:tcBorders>
-              <w:top w:val="single" w:sz="10" w:space="0" w:color="A7DC85"/>
-              <w:left w:val="single" w:sz="10" w:space="0" w:color="A7DC85"/>
-              <w:bottom w:val="single" w:sz="10" w:space="0" w:color="A7DC85"/>
-              <w:right w:val="single" w:sz="10" w:space="0" w:color="A7DC85"/>
+              <w:top w:val="nil" w:sz="0" w:space="0" w:color="A7DC85"/>
+              <w:left w:val="nil" w:sz="0" w:space="0" w:color="A7DC85"/>
+              <w:bottom w:val="nil" w:sz="0" w:space="0" w:color="A7DC85"/>
+              <w:right w:val="nil" w:sz="0" w:space="0" w:color="A7DC85"/>
+              <w:insideH w:val="nil" w:sz="0" w:space="0" w:color="A7DC85"/>
+              <w:insideV w:val="nil" w:sz="0" w:space="0" w:color="A7DC85"/>
             </w:tcBorders>
           </w:tcPr>
           <w:p>
@@ -6029,8 +6187,8 @@
             <w:tcW w:type="dxa" w:w="9029"/>
             <w:shd w:val="clear" w:color="auto" w:fill="91C3DF"/>
             <w:tcMar>
-              <w:top w:w="115" w:type="dxa"/>
-              <w:bottom w:w="115" w:type="dxa"/>
+              <w:top w:w="120" w:type="dxa"/>
+              <w:bottom w:w="120" w:type="dxa"/>
               <w:left w:w="120" w:type="dxa"/>
               <w:right w:w="120" w:type="dxa"/>
               <w:start w:w="130" w:type="dxa"/>
@@ -6038,10 +6196,12 @@
             </w:tcMar>
             <w:vAlign w:val="center"/>
             <w:tcBorders>
-              <w:top w:val="single" w:sz="10" w:space="0" w:color="91C3DF"/>
-              <w:left w:val="single" w:sz="10" w:space="0" w:color="91C3DF"/>
-              <w:bottom w:val="single" w:sz="10" w:space="0" w:color="91C3DF"/>
-              <w:right w:val="single" w:sz="10" w:space="0" w:color="91C3DF"/>
+              <w:top w:val="nil" w:sz="0" w:space="0" w:color="91C3DF"/>
+              <w:left w:val="nil" w:sz="0" w:space="0" w:color="91C3DF"/>
+              <w:bottom w:val="nil" w:sz="0" w:space="0" w:color="91C3DF"/>
+              <w:right w:val="nil" w:sz="0" w:space="0" w:color="91C3DF"/>
+              <w:insideH w:val="nil" w:sz="0" w:space="0" w:color="91C3DF"/>
+              <w:insideV w:val="nil" w:sz="0" w:space="0" w:color="91C3DF"/>
             </w:tcBorders>
           </w:tcPr>
           <w:p>
@@ -6087,8 +6247,8 @@
             <w:tcW w:type="dxa" w:w="9029"/>
             <w:shd w:val="clear" w:color="auto" w:fill="FFC499"/>
             <w:tcMar>
-              <w:top w:w="115" w:type="dxa"/>
-              <w:bottom w:w="115" w:type="dxa"/>
+              <w:top w:w="120" w:type="dxa"/>
+              <w:bottom w:w="120" w:type="dxa"/>
               <w:left w:w="120" w:type="dxa"/>
               <w:right w:w="120" w:type="dxa"/>
               <w:start w:w="130" w:type="dxa"/>
@@ -6096,10 +6256,12 @@
             </w:tcMar>
             <w:vAlign w:val="center"/>
             <w:tcBorders>
-              <w:top w:val="single" w:sz="10" w:space="0" w:color="FFC499"/>
-              <w:left w:val="single" w:sz="10" w:space="0" w:color="FFC499"/>
-              <w:bottom w:val="single" w:sz="10" w:space="0" w:color="FFC499"/>
-              <w:right w:val="single" w:sz="10" w:space="0" w:color="FFC499"/>
+              <w:top w:val="nil" w:sz="0" w:space="0" w:color="FFC499"/>
+              <w:left w:val="nil" w:sz="0" w:space="0" w:color="FFC499"/>
+              <w:bottom w:val="nil" w:sz="0" w:space="0" w:color="FFC499"/>
+              <w:right w:val="nil" w:sz="0" w:space="0" w:color="FFC499"/>
+              <w:insideH w:val="nil" w:sz="0" w:space="0" w:color="FFC499"/>
+              <w:insideV w:val="nil" w:sz="0" w:space="0" w:color="FFC499"/>
             </w:tcBorders>
           </w:tcPr>
           <w:p>
@@ -6130,7 +6292,7 @@
     </w:tbl>
     <w:p>
       <w:pPr>
-        <w:spacing w:before="0" w:after="160" w:lineRule="exact" w:line="20"/>
+        <w:spacing w:before="0" w:after="180" w:lineRule="exact" w:line="20"/>
         <w:jc w:val="left"/>
       </w:pPr>
     </w:p>
@@ -6185,7 +6347,7 @@
     </w:tbl>
     <w:p>
       <w:pPr>
-        <w:spacing w:before="0" w:after="160" w:lineRule="exact" w:line="20"/>
+        <w:spacing w:before="0" w:after="180" w:lineRule="exact" w:line="20"/>
         <w:jc w:val="left"/>
       </w:pPr>
     </w:p>
@@ -6262,7 +6424,13 @@
     </w:p>
     <w:p>
       <w:pPr>
-        <w:spacing w:before="560" w:after="80"/>
+        <w:spacing w:before="0" w:after="280" w:lineRule="exact" w:line="20"/>
+        <w:jc w:val="left"/>
+      </w:pPr>
+    </w:p>
+    <w:p>
+      <w:pPr>
+        <w:spacing w:before="0" w:after="80"/>
         <w:jc w:val="center"/>
       </w:pPr>
       <w:r>
@@ -6308,6 +6476,7 @@
       <w:r>
         <w:rPr>
           <w:rFonts w:ascii="Cambria" w:hAnsi="Cambria" w:eastAsia="Cambria" w:cs="Cambria"/>
+          <w:b w:val="0"/>
           <w:i/>
           <w:color w:val="555559"/>
           <w:sz w:val="18"/>
@@ -6344,8 +6513,8 @@
             <w:tcW w:type="dxa" w:w="9029"/>
             <w:shd w:val="clear" w:color="auto" w:fill="FFC499"/>
             <w:tcMar>
-              <w:top w:w="115" w:type="dxa"/>
-              <w:bottom w:w="115" w:type="dxa"/>
+              <w:top w:w="120" w:type="dxa"/>
+              <w:bottom w:w="120" w:type="dxa"/>
               <w:left w:w="120" w:type="dxa"/>
               <w:right w:w="120" w:type="dxa"/>
               <w:start w:w="130" w:type="dxa"/>
@@ -6353,10 +6522,12 @@
             </w:tcMar>
             <w:vAlign w:val="center"/>
             <w:tcBorders>
-              <w:top w:val="single" w:sz="10" w:space="0" w:color="FFC499"/>
-              <w:left w:val="single" w:sz="10" w:space="0" w:color="FFC499"/>
-              <w:bottom w:val="single" w:sz="10" w:space="0" w:color="FFC499"/>
-              <w:right w:val="single" w:sz="10" w:space="0" w:color="FFC499"/>
+              <w:top w:val="nil" w:sz="0" w:space="0" w:color="FFC499"/>
+              <w:left w:val="nil" w:sz="0" w:space="0" w:color="FFC499"/>
+              <w:bottom w:val="nil" w:sz="0" w:space="0" w:color="FFC499"/>
+              <w:right w:val="nil" w:sz="0" w:space="0" w:color="FFC499"/>
+              <w:insideH w:val="nil" w:sz="0" w:space="0" w:color="FFC499"/>
+              <w:insideV w:val="nil" w:sz="0" w:space="0" w:color="FFC499"/>
             </w:tcBorders>
           </w:tcPr>
           <w:p>
@@ -6402,8 +6573,8 @@
             <w:tcW w:type="dxa" w:w="9029"/>
             <w:shd w:val="clear" w:color="auto" w:fill="A7DC85"/>
             <w:tcMar>
-              <w:top w:w="115" w:type="dxa"/>
-              <w:bottom w:w="115" w:type="dxa"/>
+              <w:top w:w="120" w:type="dxa"/>
+              <w:bottom w:w="120" w:type="dxa"/>
               <w:left w:w="120" w:type="dxa"/>
               <w:right w:w="120" w:type="dxa"/>
               <w:start w:w="130" w:type="dxa"/>
@@ -6411,10 +6582,12 @@
             </w:tcMar>
             <w:vAlign w:val="center"/>
             <w:tcBorders>
-              <w:top w:val="single" w:sz="10" w:space="0" w:color="A7DC85"/>
-              <w:left w:val="single" w:sz="10" w:space="0" w:color="A7DC85"/>
-              <w:bottom w:val="single" w:sz="10" w:space="0" w:color="A7DC85"/>
-              <w:right w:val="single" w:sz="10" w:space="0" w:color="A7DC85"/>
+              <w:top w:val="nil" w:sz="0" w:space="0" w:color="A7DC85"/>
+              <w:left w:val="nil" w:sz="0" w:space="0" w:color="A7DC85"/>
+              <w:bottom w:val="nil" w:sz="0" w:space="0" w:color="A7DC85"/>
+              <w:right w:val="nil" w:sz="0" w:space="0" w:color="A7DC85"/>
+              <w:insideH w:val="nil" w:sz="0" w:space="0" w:color="A7DC85"/>
+              <w:insideV w:val="nil" w:sz="0" w:space="0" w:color="A7DC85"/>
             </w:tcBorders>
           </w:tcPr>
           <w:p>
@@ -6445,7 +6618,7 @@
     </w:tbl>
     <w:p>
       <w:pPr>
-        <w:spacing w:before="0" w:after="160" w:lineRule="exact" w:line="20"/>
+        <w:spacing w:before="0" w:after="180" w:lineRule="exact" w:line="20"/>
         <w:jc w:val="left"/>
       </w:pPr>
     </w:p>
@@ -6500,7 +6673,7 @@
     </w:tbl>
     <w:p>
       <w:pPr>
-        <w:spacing w:before="0" w:after="160" w:lineRule="exact" w:line="20"/>
+        <w:spacing w:before="0" w:after="180" w:lineRule="exact" w:line="20"/>
         <w:jc w:val="left"/>
       </w:pPr>
     </w:p>
@@ -6520,8 +6693,8 @@
             <w:tcW w:type="dxa" w:w="9029"/>
             <w:shd w:val="clear" w:color="auto" w:fill="91C3DF"/>
             <w:tcMar>
-              <w:top w:w="115" w:type="dxa"/>
-              <w:bottom w:w="115" w:type="dxa"/>
+              <w:top w:w="120" w:type="dxa"/>
+              <w:bottom w:w="120" w:type="dxa"/>
               <w:left w:w="120" w:type="dxa"/>
               <w:right w:w="120" w:type="dxa"/>
               <w:start w:w="130" w:type="dxa"/>
@@ -6529,10 +6702,12 @@
             </w:tcMar>
             <w:vAlign w:val="center"/>
             <w:tcBorders>
-              <w:top w:val="single" w:sz="10" w:space="0" w:color="91C3DF"/>
-              <w:left w:val="single" w:sz="10" w:space="0" w:color="91C3DF"/>
-              <w:bottom w:val="single" w:sz="10" w:space="0" w:color="91C3DF"/>
-              <w:right w:val="single" w:sz="10" w:space="0" w:color="91C3DF"/>
+              <w:top w:val="nil" w:sz="0" w:space="0" w:color="91C3DF"/>
+              <w:left w:val="nil" w:sz="0" w:space="0" w:color="91C3DF"/>
+              <w:bottom w:val="nil" w:sz="0" w:space="0" w:color="91C3DF"/>
+              <w:right w:val="nil" w:sz="0" w:space="0" w:color="91C3DF"/>
+              <w:insideH w:val="nil" w:sz="0" w:space="0" w:color="91C3DF"/>
+              <w:insideV w:val="nil" w:sz="0" w:space="0" w:color="91C3DF"/>
             </w:tcBorders>
           </w:tcPr>
           <w:p>
@@ -6594,7 +6769,13 @@
     </w:p>
     <w:p>
       <w:pPr>
-        <w:spacing w:before="560" w:after="80"/>
+        <w:spacing w:before="0" w:after="280" w:lineRule="exact" w:line="20"/>
+        <w:jc w:val="left"/>
+      </w:pPr>
+    </w:p>
+    <w:p>
+      <w:pPr>
+        <w:spacing w:before="0" w:after="80"/>
         <w:jc w:val="center"/>
       </w:pPr>
       <w:r>
@@ -6640,6 +6821,7 @@
       <w:r>
         <w:rPr>
           <w:rFonts w:ascii="Cambria" w:hAnsi="Cambria" w:eastAsia="Cambria" w:cs="Cambria"/>
+          <w:b w:val="0"/>
           <w:i/>
           <w:color w:val="555559"/>
           <w:sz w:val="18"/>
@@ -6676,8 +6858,8 @@
             <w:tcW w:type="dxa" w:w="9029"/>
             <w:shd w:val="clear" w:color="auto" w:fill="FFC499"/>
             <w:tcMar>
-              <w:top w:w="115" w:type="dxa"/>
-              <w:bottom w:w="115" w:type="dxa"/>
+              <w:top w:w="120" w:type="dxa"/>
+              <w:bottom w:w="120" w:type="dxa"/>
               <w:left w:w="120" w:type="dxa"/>
               <w:right w:w="120" w:type="dxa"/>
               <w:start w:w="130" w:type="dxa"/>
@@ -6685,10 +6867,12 @@
             </w:tcMar>
             <w:vAlign w:val="center"/>
             <w:tcBorders>
-              <w:top w:val="single" w:sz="10" w:space="0" w:color="FFC499"/>
-              <w:left w:val="single" w:sz="10" w:space="0" w:color="FFC499"/>
-              <w:bottom w:val="single" w:sz="10" w:space="0" w:color="FFC499"/>
-              <w:right w:val="single" w:sz="10" w:space="0" w:color="FFC499"/>
+              <w:top w:val="nil" w:sz="0" w:space="0" w:color="FFC499"/>
+              <w:left w:val="nil" w:sz="0" w:space="0" w:color="FFC499"/>
+              <w:bottom w:val="nil" w:sz="0" w:space="0" w:color="FFC499"/>
+              <w:right w:val="nil" w:sz="0" w:space="0" w:color="FFC499"/>
+              <w:insideH w:val="nil" w:sz="0" w:space="0" w:color="FFC499"/>
+              <w:insideV w:val="nil" w:sz="0" w:space="0" w:color="FFC499"/>
             </w:tcBorders>
           </w:tcPr>
           <w:p>
@@ -6734,8 +6918,8 @@
             <w:tcW w:type="dxa" w:w="9029"/>
             <w:shd w:val="clear" w:color="auto" w:fill="A7DC85"/>
             <w:tcMar>
-              <w:top w:w="115" w:type="dxa"/>
-              <w:bottom w:w="115" w:type="dxa"/>
+              <w:top w:w="120" w:type="dxa"/>
+              <w:bottom w:w="120" w:type="dxa"/>
               <w:left w:w="120" w:type="dxa"/>
               <w:right w:w="120" w:type="dxa"/>
               <w:start w:w="130" w:type="dxa"/>
@@ -6743,10 +6927,12 @@
             </w:tcMar>
             <w:vAlign w:val="center"/>
             <w:tcBorders>
-              <w:top w:val="single" w:sz="10" w:space="0" w:color="A7DC85"/>
-              <w:left w:val="single" w:sz="10" w:space="0" w:color="A7DC85"/>
-              <w:bottom w:val="single" w:sz="10" w:space="0" w:color="A7DC85"/>
-              <w:right w:val="single" w:sz="10" w:space="0" w:color="A7DC85"/>
+              <w:top w:val="nil" w:sz="0" w:space="0" w:color="A7DC85"/>
+              <w:left w:val="nil" w:sz="0" w:space="0" w:color="A7DC85"/>
+              <w:bottom w:val="nil" w:sz="0" w:space="0" w:color="A7DC85"/>
+              <w:right w:val="nil" w:sz="0" w:space="0" w:color="A7DC85"/>
+              <w:insideH w:val="nil" w:sz="0" w:space="0" w:color="A7DC85"/>
+              <w:insideV w:val="nil" w:sz="0" w:space="0" w:color="A7DC85"/>
             </w:tcBorders>
           </w:tcPr>
           <w:p>
@@ -6792,8 +6978,8 @@
             <w:tcW w:type="dxa" w:w="9029"/>
             <w:shd w:val="clear" w:color="auto" w:fill="91C3DF"/>
             <w:tcMar>
-              <w:top w:w="115" w:type="dxa"/>
-              <w:bottom w:w="115" w:type="dxa"/>
+              <w:top w:w="120" w:type="dxa"/>
+              <w:bottom w:w="120" w:type="dxa"/>
               <w:left w:w="120" w:type="dxa"/>
               <w:right w:w="120" w:type="dxa"/>
               <w:start w:w="130" w:type="dxa"/>
@@ -6801,10 +6987,12 @@
             </w:tcMar>
             <w:vAlign w:val="center"/>
             <w:tcBorders>
-              <w:top w:val="single" w:sz="10" w:space="0" w:color="91C3DF"/>
-              <w:left w:val="single" w:sz="10" w:space="0" w:color="91C3DF"/>
-              <w:bottom w:val="single" w:sz="10" w:space="0" w:color="91C3DF"/>
-              <w:right w:val="single" w:sz="10" w:space="0" w:color="91C3DF"/>
+              <w:top w:val="nil" w:sz="0" w:space="0" w:color="91C3DF"/>
+              <w:left w:val="nil" w:sz="0" w:space="0" w:color="91C3DF"/>
+              <w:bottom w:val="nil" w:sz="0" w:space="0" w:color="91C3DF"/>
+              <w:right w:val="nil" w:sz="0" w:space="0" w:color="91C3DF"/>
+              <w:insideH w:val="nil" w:sz="0" w:space="0" w:color="91C3DF"/>
+              <w:insideV w:val="nil" w:sz="0" w:space="0" w:color="91C3DF"/>
             </w:tcBorders>
           </w:tcPr>
           <w:p>
@@ -6850,8 +7038,8 @@
             <w:tcW w:type="dxa" w:w="9029"/>
             <w:shd w:val="clear" w:color="auto" w:fill="FFC499"/>
             <w:tcMar>
-              <w:top w:w="115" w:type="dxa"/>
-              <w:bottom w:w="115" w:type="dxa"/>
+              <w:top w:w="120" w:type="dxa"/>
+              <w:bottom w:w="120" w:type="dxa"/>
               <w:left w:w="120" w:type="dxa"/>
               <w:right w:w="120" w:type="dxa"/>
               <w:start w:w="130" w:type="dxa"/>
@@ -6859,10 +7047,12 @@
             </w:tcMar>
             <w:vAlign w:val="center"/>
             <w:tcBorders>
-              <w:top w:val="single" w:sz="10" w:space="0" w:color="FFC499"/>
-              <w:left w:val="single" w:sz="10" w:space="0" w:color="FFC499"/>
-              <w:bottom w:val="single" w:sz="10" w:space="0" w:color="FFC499"/>
-              <w:right w:val="single" w:sz="10" w:space="0" w:color="FFC499"/>
+              <w:top w:val="nil" w:sz="0" w:space="0" w:color="FFC499"/>
+              <w:left w:val="nil" w:sz="0" w:space="0" w:color="FFC499"/>
+              <w:bottom w:val="nil" w:sz="0" w:space="0" w:color="FFC499"/>
+              <w:right w:val="nil" w:sz="0" w:space="0" w:color="FFC499"/>
+              <w:insideH w:val="nil" w:sz="0" w:space="0" w:color="FFC499"/>
+              <w:insideV w:val="nil" w:sz="0" w:space="0" w:color="FFC499"/>
             </w:tcBorders>
           </w:tcPr>
           <w:p>
@@ -6893,7 +7083,7 @@
     </w:tbl>
     <w:p>
       <w:pPr>
-        <w:spacing w:before="0" w:after="160" w:lineRule="exact" w:line="20"/>
+        <w:spacing w:before="0" w:after="180" w:lineRule="exact" w:line="20"/>
         <w:jc w:val="left"/>
       </w:pPr>
     </w:p>
@@ -6948,7 +7138,7 @@
     </w:tbl>
     <w:p>
       <w:pPr>
-        <w:spacing w:before="0" w:after="160" w:lineRule="exact" w:line="20"/>
+        <w:spacing w:before="0" w:after="180" w:lineRule="exact" w:line="20"/>
         <w:jc w:val="left"/>
       </w:pPr>
     </w:p>
@@ -6984,7 +7174,13 @@
     </w:p>
     <w:p>
       <w:pPr>
-        <w:spacing w:before="560" w:after="80"/>
+        <w:spacing w:before="0" w:after="280" w:lineRule="exact" w:line="20"/>
+        <w:jc w:val="left"/>
+      </w:pPr>
+    </w:p>
+    <w:p>
+      <w:pPr>
+        <w:spacing w:before="0" w:after="80"/>
         <w:jc w:val="center"/>
       </w:pPr>
       <w:r>
@@ -7030,6 +7226,7 @@
       <w:r>
         <w:rPr>
           <w:rFonts w:ascii="Cambria" w:hAnsi="Cambria" w:eastAsia="Cambria" w:cs="Cambria"/>
+          <w:b w:val="0"/>
           <w:i/>
           <w:color w:val="555559"/>
           <w:sz w:val="18"/>
@@ -7144,8 +7341,8 @@
             <w:tcW w:type="dxa" w:w="9029"/>
             <w:shd w:val="clear" w:color="auto" w:fill="A7DC85"/>
             <w:tcMar>
-              <w:top w:w="115" w:type="dxa"/>
-              <w:bottom w:w="115" w:type="dxa"/>
+              <w:top w:w="120" w:type="dxa"/>
+              <w:bottom w:w="120" w:type="dxa"/>
               <w:left w:w="120" w:type="dxa"/>
               <w:right w:w="120" w:type="dxa"/>
               <w:start w:w="130" w:type="dxa"/>
@@ -7153,10 +7350,12 @@
             </w:tcMar>
             <w:vAlign w:val="center"/>
             <w:tcBorders>
-              <w:top w:val="single" w:sz="10" w:space="0" w:color="A7DC85"/>
-              <w:left w:val="single" w:sz="10" w:space="0" w:color="A7DC85"/>
-              <w:bottom w:val="single" w:sz="10" w:space="0" w:color="A7DC85"/>
-              <w:right w:val="single" w:sz="10" w:space="0" w:color="A7DC85"/>
+              <w:top w:val="nil" w:sz="0" w:space="0" w:color="A7DC85"/>
+              <w:left w:val="nil" w:sz="0" w:space="0" w:color="A7DC85"/>
+              <w:bottom w:val="nil" w:sz="0" w:space="0" w:color="A7DC85"/>
+              <w:right w:val="nil" w:sz="0" w:space="0" w:color="A7DC85"/>
+              <w:insideH w:val="nil" w:sz="0" w:space="0" w:color="A7DC85"/>
+              <w:insideV w:val="nil" w:sz="0" w:space="0" w:color="A7DC85"/>
             </w:tcBorders>
           </w:tcPr>
           <w:p>
@@ -7202,8 +7401,8 @@
             <w:tcW w:type="dxa" w:w="9029"/>
             <w:shd w:val="clear" w:color="auto" w:fill="91C3DF"/>
             <w:tcMar>
-              <w:top w:w="115" w:type="dxa"/>
-              <w:bottom w:w="115" w:type="dxa"/>
+              <w:top w:w="120" w:type="dxa"/>
+              <w:bottom w:w="120" w:type="dxa"/>
               <w:left w:w="120" w:type="dxa"/>
               <w:right w:w="120" w:type="dxa"/>
               <w:start w:w="130" w:type="dxa"/>
@@ -7211,10 +7410,12 @@
             </w:tcMar>
             <w:vAlign w:val="center"/>
             <w:tcBorders>
-              <w:top w:val="single" w:sz="10" w:space="0" w:color="91C3DF"/>
-              <w:left w:val="single" w:sz="10" w:space="0" w:color="91C3DF"/>
-              <w:bottom w:val="single" w:sz="10" w:space="0" w:color="91C3DF"/>
-              <w:right w:val="single" w:sz="10" w:space="0" w:color="91C3DF"/>
+              <w:top w:val="nil" w:sz="0" w:space="0" w:color="91C3DF"/>
+              <w:left w:val="nil" w:sz="0" w:space="0" w:color="91C3DF"/>
+              <w:bottom w:val="nil" w:sz="0" w:space="0" w:color="91C3DF"/>
+              <w:right w:val="nil" w:sz="0" w:space="0" w:color="91C3DF"/>
+              <w:insideH w:val="nil" w:sz="0" w:space="0" w:color="91C3DF"/>
+              <w:insideV w:val="nil" w:sz="0" w:space="0" w:color="91C3DF"/>
             </w:tcBorders>
           </w:tcPr>
           <w:p>
@@ -7260,8 +7461,8 @@
             <w:tcW w:type="dxa" w:w="9029"/>
             <w:shd w:val="clear" w:color="auto" w:fill="FFC499"/>
             <w:tcMar>
-              <w:top w:w="115" w:type="dxa"/>
-              <w:bottom w:w="115" w:type="dxa"/>
+              <w:top w:w="120" w:type="dxa"/>
+              <w:bottom w:w="120" w:type="dxa"/>
               <w:left w:w="120" w:type="dxa"/>
               <w:right w:w="120" w:type="dxa"/>
               <w:start w:w="130" w:type="dxa"/>
@@ -7269,10 +7470,12 @@
             </w:tcMar>
             <w:vAlign w:val="center"/>
             <w:tcBorders>
-              <w:top w:val="single" w:sz="10" w:space="0" w:color="FFC499"/>
-              <w:left w:val="single" w:sz="10" w:space="0" w:color="FFC499"/>
-              <w:bottom w:val="single" w:sz="10" w:space="0" w:color="FFC499"/>
-              <w:right w:val="single" w:sz="10" w:space="0" w:color="FFC499"/>
+              <w:top w:val="nil" w:sz="0" w:space="0" w:color="FFC499"/>
+              <w:left w:val="nil" w:sz="0" w:space="0" w:color="FFC499"/>
+              <w:bottom w:val="nil" w:sz="0" w:space="0" w:color="FFC499"/>
+              <w:right w:val="nil" w:sz="0" w:space="0" w:color="FFC499"/>
+              <w:insideH w:val="nil" w:sz="0" w:space="0" w:color="FFC499"/>
+              <w:insideV w:val="nil" w:sz="0" w:space="0" w:color="FFC499"/>
             </w:tcBorders>
           </w:tcPr>
           <w:p>
@@ -7303,7 +7506,7 @@
     </w:tbl>
     <w:p>
       <w:pPr>
-        <w:spacing w:before="0" w:after="160" w:lineRule="exact" w:line="20"/>
+        <w:spacing w:before="0" w:after="180" w:lineRule="exact" w:line="20"/>
         <w:jc w:val="left"/>
       </w:pPr>
     </w:p>
@@ -7358,7 +7561,7 @@
     </w:tbl>
     <w:p>
       <w:pPr>
-        <w:spacing w:before="0" w:after="160" w:lineRule="exact" w:line="20"/>
+        <w:spacing w:before="0" w:after="180" w:lineRule="exact" w:line="20"/>
         <w:jc w:val="left"/>
       </w:pPr>
     </w:p>
@@ -7394,7 +7597,13 @@
     </w:p>
     <w:p>
       <w:pPr>
-        <w:spacing w:before="560" w:after="80"/>
+        <w:spacing w:before="0" w:after="280" w:lineRule="exact" w:line="20"/>
+        <w:jc w:val="left"/>
+      </w:pPr>
+    </w:p>
+    <w:p>
+      <w:pPr>
+        <w:spacing w:before="0" w:after="80"/>
         <w:jc w:val="center"/>
       </w:pPr>
       <w:r>
@@ -7440,6 +7649,7 @@
       <w:r>
         <w:rPr>
           <w:rFonts w:ascii="Cambria" w:hAnsi="Cambria" w:eastAsia="Cambria" w:cs="Cambria"/>
+          <w:b w:val="0"/>
           <w:i/>
           <w:color w:val="555559"/>
           <w:sz w:val="18"/>
@@ -7476,8 +7686,8 @@
             <w:tcW w:type="dxa" w:w="9029"/>
             <w:shd w:val="clear" w:color="auto" w:fill="FFC499"/>
             <w:tcMar>
-              <w:top w:w="115" w:type="dxa"/>
-              <w:bottom w:w="115" w:type="dxa"/>
+              <w:top w:w="120" w:type="dxa"/>
+              <w:bottom w:w="120" w:type="dxa"/>
               <w:left w:w="120" w:type="dxa"/>
               <w:right w:w="120" w:type="dxa"/>
               <w:start w:w="130" w:type="dxa"/>
@@ -7485,10 +7695,12 @@
             </w:tcMar>
             <w:vAlign w:val="center"/>
             <w:tcBorders>
-              <w:top w:val="single" w:sz="10" w:space="0" w:color="FFC499"/>
-              <w:left w:val="single" w:sz="10" w:space="0" w:color="FFC499"/>
-              <w:bottom w:val="single" w:sz="10" w:space="0" w:color="FFC499"/>
-              <w:right w:val="single" w:sz="10" w:space="0" w:color="FFC499"/>
+              <w:top w:val="nil" w:sz="0" w:space="0" w:color="FFC499"/>
+              <w:left w:val="nil" w:sz="0" w:space="0" w:color="FFC499"/>
+              <w:bottom w:val="nil" w:sz="0" w:space="0" w:color="FFC499"/>
+              <w:right w:val="nil" w:sz="0" w:space="0" w:color="FFC499"/>
+              <w:insideH w:val="nil" w:sz="0" w:space="0" w:color="FFC499"/>
+              <w:insideV w:val="nil" w:sz="0" w:space="0" w:color="FFC499"/>
             </w:tcBorders>
           </w:tcPr>
           <w:p>
@@ -7534,8 +7746,8 @@
             <w:tcW w:type="dxa" w:w="9029"/>
             <w:shd w:val="clear" w:color="auto" w:fill="A7DC85"/>
             <w:tcMar>
-              <w:top w:w="115" w:type="dxa"/>
-              <w:bottom w:w="115" w:type="dxa"/>
+              <w:top w:w="120" w:type="dxa"/>
+              <w:bottom w:w="120" w:type="dxa"/>
               <w:left w:w="120" w:type="dxa"/>
               <w:right w:w="120" w:type="dxa"/>
               <w:start w:w="130" w:type="dxa"/>
@@ -7543,10 +7755,12 @@
             </w:tcMar>
             <w:vAlign w:val="center"/>
             <w:tcBorders>
-              <w:top w:val="single" w:sz="10" w:space="0" w:color="A7DC85"/>
-              <w:left w:val="single" w:sz="10" w:space="0" w:color="A7DC85"/>
-              <w:bottom w:val="single" w:sz="10" w:space="0" w:color="A7DC85"/>
-              <w:right w:val="single" w:sz="10" w:space="0" w:color="A7DC85"/>
+              <w:top w:val="nil" w:sz="0" w:space="0" w:color="A7DC85"/>
+              <w:left w:val="nil" w:sz="0" w:space="0" w:color="A7DC85"/>
+              <w:bottom w:val="nil" w:sz="0" w:space="0" w:color="A7DC85"/>
+              <w:right w:val="nil" w:sz="0" w:space="0" w:color="A7DC85"/>
+              <w:insideH w:val="nil" w:sz="0" w:space="0" w:color="A7DC85"/>
+              <w:insideV w:val="nil" w:sz="0" w:space="0" w:color="A7DC85"/>
             </w:tcBorders>
           </w:tcPr>
           <w:p>
@@ -7592,8 +7806,8 @@
             <w:tcW w:type="dxa" w:w="9029"/>
             <w:shd w:val="clear" w:color="auto" w:fill="91C3DF"/>
             <w:tcMar>
-              <w:top w:w="115" w:type="dxa"/>
-              <w:bottom w:w="115" w:type="dxa"/>
+              <w:top w:w="120" w:type="dxa"/>
+              <w:bottom w:w="120" w:type="dxa"/>
               <w:left w:w="120" w:type="dxa"/>
               <w:right w:w="120" w:type="dxa"/>
               <w:start w:w="130" w:type="dxa"/>
@@ -7601,10 +7815,12 @@
             </w:tcMar>
             <w:vAlign w:val="center"/>
             <w:tcBorders>
-              <w:top w:val="single" w:sz="10" w:space="0" w:color="91C3DF"/>
-              <w:left w:val="single" w:sz="10" w:space="0" w:color="91C3DF"/>
-              <w:bottom w:val="single" w:sz="10" w:space="0" w:color="91C3DF"/>
-              <w:right w:val="single" w:sz="10" w:space="0" w:color="91C3DF"/>
+              <w:top w:val="nil" w:sz="0" w:space="0" w:color="91C3DF"/>
+              <w:left w:val="nil" w:sz="0" w:space="0" w:color="91C3DF"/>
+              <w:bottom w:val="nil" w:sz="0" w:space="0" w:color="91C3DF"/>
+              <w:right w:val="nil" w:sz="0" w:space="0" w:color="91C3DF"/>
+              <w:insideH w:val="nil" w:sz="0" w:space="0" w:color="91C3DF"/>
+              <w:insideV w:val="nil" w:sz="0" w:space="0" w:color="91C3DF"/>
             </w:tcBorders>
           </w:tcPr>
           <w:p>
@@ -7650,8 +7866,8 @@
             <w:tcW w:type="dxa" w:w="9029"/>
             <w:shd w:val="clear" w:color="auto" w:fill="FFC499"/>
             <w:tcMar>
-              <w:top w:w="115" w:type="dxa"/>
-              <w:bottom w:w="115" w:type="dxa"/>
+              <w:top w:w="120" w:type="dxa"/>
+              <w:bottom w:w="120" w:type="dxa"/>
               <w:left w:w="120" w:type="dxa"/>
               <w:right w:w="120" w:type="dxa"/>
               <w:start w:w="130" w:type="dxa"/>
@@ -7659,10 +7875,12 @@
             </w:tcMar>
             <w:vAlign w:val="center"/>
             <w:tcBorders>
-              <w:top w:val="single" w:sz="10" w:space="0" w:color="FFC499"/>
-              <w:left w:val="single" w:sz="10" w:space="0" w:color="FFC499"/>
-              <w:bottom w:val="single" w:sz="10" w:space="0" w:color="FFC499"/>
-              <w:right w:val="single" w:sz="10" w:space="0" w:color="FFC499"/>
+              <w:top w:val="nil" w:sz="0" w:space="0" w:color="FFC499"/>
+              <w:left w:val="nil" w:sz="0" w:space="0" w:color="FFC499"/>
+              <w:bottom w:val="nil" w:sz="0" w:space="0" w:color="FFC499"/>
+              <w:right w:val="nil" w:sz="0" w:space="0" w:color="FFC499"/>
+              <w:insideH w:val="nil" w:sz="0" w:space="0" w:color="FFC499"/>
+              <w:insideV w:val="nil" w:sz="0" w:space="0" w:color="FFC499"/>
             </w:tcBorders>
           </w:tcPr>
           <w:p>
@@ -7693,7 +7911,7 @@
     </w:tbl>
     <w:p>
       <w:pPr>
-        <w:spacing w:before="0" w:after="160" w:lineRule="exact" w:line="20"/>
+        <w:spacing w:before="0" w:after="180" w:lineRule="exact" w:line="20"/>
         <w:jc w:val="left"/>
       </w:pPr>
     </w:p>
@@ -7748,7 +7966,7 @@
     </w:tbl>
     <w:p>
       <w:pPr>
-        <w:spacing w:before="0" w:after="160" w:lineRule="exact" w:line="20"/>
+        <w:spacing w:before="0" w:after="180" w:lineRule="exact" w:line="20"/>
         <w:jc w:val="left"/>
       </w:pPr>
     </w:p>
@@ -7784,7 +8002,13 @@
     </w:p>
     <w:p>
       <w:pPr>
-        <w:spacing w:before="560" w:after="80"/>
+        <w:spacing w:before="0" w:after="280" w:lineRule="exact" w:line="20"/>
+        <w:jc w:val="left"/>
+      </w:pPr>
+    </w:p>
+    <w:p>
+      <w:pPr>
+        <w:spacing w:before="0" w:after="80"/>
         <w:jc w:val="center"/>
       </w:pPr>
       <w:r>
@@ -7830,6 +8054,7 @@
       <w:r>
         <w:rPr>
           <w:rFonts w:ascii="Cambria" w:hAnsi="Cambria" w:eastAsia="Cambria" w:cs="Cambria"/>
+          <w:b w:val="0"/>
           <w:i/>
           <w:color w:val="555559"/>
           <w:sz w:val="18"/>
@@ -7918,8 +8143,8 @@
             <w:tcW w:type="dxa" w:w="9029"/>
             <w:shd w:val="clear" w:color="auto" w:fill="FFC499"/>
             <w:tcMar>
-              <w:top w:w="115" w:type="dxa"/>
-              <w:bottom w:w="115" w:type="dxa"/>
+              <w:top w:w="120" w:type="dxa"/>
+              <w:bottom w:w="120" w:type="dxa"/>
               <w:left w:w="120" w:type="dxa"/>
               <w:right w:w="120" w:type="dxa"/>
               <w:start w:w="130" w:type="dxa"/>
@@ -7927,10 +8152,12 @@
             </w:tcMar>
             <w:vAlign w:val="center"/>
             <w:tcBorders>
-              <w:top w:val="single" w:sz="10" w:space="0" w:color="FFC499"/>
-              <w:left w:val="single" w:sz="10" w:space="0" w:color="FFC499"/>
-              <w:bottom w:val="single" w:sz="10" w:space="0" w:color="FFC499"/>
-              <w:right w:val="single" w:sz="10" w:space="0" w:color="FFC499"/>
+              <w:top w:val="nil" w:sz="0" w:space="0" w:color="FFC499"/>
+              <w:left w:val="nil" w:sz="0" w:space="0" w:color="FFC499"/>
+              <w:bottom w:val="nil" w:sz="0" w:space="0" w:color="FFC499"/>
+              <w:right w:val="nil" w:sz="0" w:space="0" w:color="FFC499"/>
+              <w:insideH w:val="nil" w:sz="0" w:space="0" w:color="FFC499"/>
+              <w:insideV w:val="nil" w:sz="0" w:space="0" w:color="FFC499"/>
             </w:tcBorders>
           </w:tcPr>
           <w:p>
@@ -7976,8 +8203,8 @@
             <w:tcW w:type="dxa" w:w="9029"/>
             <w:shd w:val="clear" w:color="auto" w:fill="A7DC85"/>
             <w:tcMar>
-              <w:top w:w="115" w:type="dxa"/>
-              <w:bottom w:w="115" w:type="dxa"/>
+              <w:top w:w="120" w:type="dxa"/>
+              <w:bottom w:w="120" w:type="dxa"/>
               <w:left w:w="120" w:type="dxa"/>
               <w:right w:w="120" w:type="dxa"/>
               <w:start w:w="130" w:type="dxa"/>
@@ -7985,10 +8212,12 @@
             </w:tcMar>
             <w:vAlign w:val="center"/>
             <w:tcBorders>
-              <w:top w:val="single" w:sz="10" w:space="0" w:color="A7DC85"/>
-              <w:left w:val="single" w:sz="10" w:space="0" w:color="A7DC85"/>
-              <w:bottom w:val="single" w:sz="10" w:space="0" w:color="A7DC85"/>
-              <w:right w:val="single" w:sz="10" w:space="0" w:color="A7DC85"/>
+              <w:top w:val="nil" w:sz="0" w:space="0" w:color="A7DC85"/>
+              <w:left w:val="nil" w:sz="0" w:space="0" w:color="A7DC85"/>
+              <w:bottom w:val="nil" w:sz="0" w:space="0" w:color="A7DC85"/>
+              <w:right w:val="nil" w:sz="0" w:space="0" w:color="A7DC85"/>
+              <w:insideH w:val="nil" w:sz="0" w:space="0" w:color="A7DC85"/>
+              <w:insideV w:val="nil" w:sz="0" w:space="0" w:color="A7DC85"/>
             </w:tcBorders>
           </w:tcPr>
           <w:p>
@@ -8034,8 +8263,8 @@
             <w:tcW w:type="dxa" w:w="9029"/>
             <w:shd w:val="clear" w:color="auto" w:fill="91C3DF"/>
             <w:tcMar>
-              <w:top w:w="115" w:type="dxa"/>
-              <w:bottom w:w="115" w:type="dxa"/>
+              <w:top w:w="120" w:type="dxa"/>
+              <w:bottom w:w="120" w:type="dxa"/>
               <w:left w:w="120" w:type="dxa"/>
               <w:right w:w="120" w:type="dxa"/>
               <w:start w:w="130" w:type="dxa"/>
@@ -8043,10 +8272,12 @@
             </w:tcMar>
             <w:vAlign w:val="center"/>
             <w:tcBorders>
-              <w:top w:val="single" w:sz="10" w:space="0" w:color="91C3DF"/>
-              <w:left w:val="single" w:sz="10" w:space="0" w:color="91C3DF"/>
-              <w:bottom w:val="single" w:sz="10" w:space="0" w:color="91C3DF"/>
-              <w:right w:val="single" w:sz="10" w:space="0" w:color="91C3DF"/>
+              <w:top w:val="nil" w:sz="0" w:space="0" w:color="91C3DF"/>
+              <w:left w:val="nil" w:sz="0" w:space="0" w:color="91C3DF"/>
+              <w:bottom w:val="nil" w:sz="0" w:space="0" w:color="91C3DF"/>
+              <w:right w:val="nil" w:sz="0" w:space="0" w:color="91C3DF"/>
+              <w:insideH w:val="nil" w:sz="0" w:space="0" w:color="91C3DF"/>
+              <w:insideV w:val="nil" w:sz="0" w:space="0" w:color="91C3DF"/>
             </w:tcBorders>
           </w:tcPr>
           <w:p>
@@ -8092,8 +8323,8 @@
             <w:tcW w:type="dxa" w:w="9029"/>
             <w:shd w:val="clear" w:color="auto" w:fill="A7DC85"/>
             <w:tcMar>
-              <w:top w:w="115" w:type="dxa"/>
-              <w:bottom w:w="115" w:type="dxa"/>
+              <w:top w:w="120" w:type="dxa"/>
+              <w:bottom w:w="120" w:type="dxa"/>
               <w:left w:w="120" w:type="dxa"/>
               <w:right w:w="120" w:type="dxa"/>
               <w:start w:w="130" w:type="dxa"/>
@@ -8101,10 +8332,12 @@
             </w:tcMar>
             <w:vAlign w:val="center"/>
             <w:tcBorders>
-              <w:top w:val="single" w:sz="10" w:space="0" w:color="A7DC85"/>
-              <w:left w:val="single" w:sz="10" w:space="0" w:color="A7DC85"/>
-              <w:bottom w:val="single" w:sz="10" w:space="0" w:color="A7DC85"/>
-              <w:right w:val="single" w:sz="10" w:space="0" w:color="A7DC85"/>
+              <w:top w:val="nil" w:sz="0" w:space="0" w:color="A7DC85"/>
+              <w:left w:val="nil" w:sz="0" w:space="0" w:color="A7DC85"/>
+              <w:bottom w:val="nil" w:sz="0" w:space="0" w:color="A7DC85"/>
+              <w:right w:val="nil" w:sz="0" w:space="0" w:color="A7DC85"/>
+              <w:insideH w:val="nil" w:sz="0" w:space="0" w:color="A7DC85"/>
+              <w:insideV w:val="nil" w:sz="0" w:space="0" w:color="A7DC85"/>
             </w:tcBorders>
           </w:tcPr>
           <w:p>
@@ -8166,7 +8399,13 @@
     </w:p>
     <w:p>
       <w:pPr>
-        <w:spacing w:before="560" w:after="80"/>
+        <w:spacing w:before="0" w:after="280" w:lineRule="exact" w:line="20"/>
+        <w:jc w:val="left"/>
+      </w:pPr>
+    </w:p>
+    <w:p>
+      <w:pPr>
+        <w:spacing w:before="0" w:after="80"/>
         <w:jc w:val="center"/>
       </w:pPr>
       <w:r>
@@ -8212,6 +8451,7 @@
       <w:r>
         <w:rPr>
           <w:rFonts w:ascii="Cambria" w:hAnsi="Cambria" w:eastAsia="Cambria" w:cs="Cambria"/>
+          <w:b w:val="0"/>
           <w:i/>
           <w:color w:val="555559"/>
           <w:sz w:val="18"/>
@@ -8248,8 +8488,8 @@
             <w:tcW w:type="dxa" w:w="9029"/>
             <w:shd w:val="clear" w:color="auto" w:fill="FFC499"/>
             <w:tcMar>
-              <w:top w:w="115" w:type="dxa"/>
-              <w:bottom w:w="115" w:type="dxa"/>
+              <w:top w:w="120" w:type="dxa"/>
+              <w:bottom w:w="120" w:type="dxa"/>
               <w:left w:w="120" w:type="dxa"/>
               <w:right w:w="120" w:type="dxa"/>
               <w:start w:w="130" w:type="dxa"/>
@@ -8257,10 +8497,12 @@
             </w:tcMar>
             <w:vAlign w:val="center"/>
             <w:tcBorders>
-              <w:top w:val="single" w:sz="10" w:space="0" w:color="FFC499"/>
-              <w:left w:val="single" w:sz="10" w:space="0" w:color="FFC499"/>
-              <w:bottom w:val="single" w:sz="10" w:space="0" w:color="FFC499"/>
-              <w:right w:val="single" w:sz="10" w:space="0" w:color="FFC499"/>
+              <w:top w:val="nil" w:sz="0" w:space="0" w:color="FFC499"/>
+              <w:left w:val="nil" w:sz="0" w:space="0" w:color="FFC499"/>
+              <w:bottom w:val="nil" w:sz="0" w:space="0" w:color="FFC499"/>
+              <w:right w:val="nil" w:sz="0" w:space="0" w:color="FFC499"/>
+              <w:insideH w:val="nil" w:sz="0" w:space="0" w:color="FFC499"/>
+              <w:insideV w:val="nil" w:sz="0" w:space="0" w:color="FFC499"/>
             </w:tcBorders>
           </w:tcPr>
           <w:p>
@@ -8306,8 +8548,8 @@
             <w:tcW w:type="dxa" w:w="9029"/>
             <w:shd w:val="clear" w:color="auto" w:fill="A7DC85"/>
             <w:tcMar>
-              <w:top w:w="115" w:type="dxa"/>
-              <w:bottom w:w="115" w:type="dxa"/>
+              <w:top w:w="120" w:type="dxa"/>
+              <w:bottom w:w="120" w:type="dxa"/>
               <w:left w:w="120" w:type="dxa"/>
               <w:right w:w="120" w:type="dxa"/>
               <w:start w:w="130" w:type="dxa"/>
@@ -8315,10 +8557,12 @@
             </w:tcMar>
             <w:vAlign w:val="center"/>
             <w:tcBorders>
-              <w:top w:val="single" w:sz="10" w:space="0" w:color="A7DC85"/>
-              <w:left w:val="single" w:sz="10" w:space="0" w:color="A7DC85"/>
-              <w:bottom w:val="single" w:sz="10" w:space="0" w:color="A7DC85"/>
-              <w:right w:val="single" w:sz="10" w:space="0" w:color="A7DC85"/>
+              <w:top w:val="nil" w:sz="0" w:space="0" w:color="A7DC85"/>
+              <w:left w:val="nil" w:sz="0" w:space="0" w:color="A7DC85"/>
+              <w:bottom w:val="nil" w:sz="0" w:space="0" w:color="A7DC85"/>
+              <w:right w:val="nil" w:sz="0" w:space="0" w:color="A7DC85"/>
+              <w:insideH w:val="nil" w:sz="0" w:space="0" w:color="A7DC85"/>
+              <w:insideV w:val="nil" w:sz="0" w:space="0" w:color="A7DC85"/>
             </w:tcBorders>
           </w:tcPr>
           <w:p>
@@ -8364,8 +8608,8 @@
             <w:tcW w:type="dxa" w:w="9029"/>
             <w:shd w:val="clear" w:color="auto" w:fill="91C3DF"/>
             <w:tcMar>
-              <w:top w:w="115" w:type="dxa"/>
-              <w:bottom w:w="115" w:type="dxa"/>
+              <w:top w:w="120" w:type="dxa"/>
+              <w:bottom w:w="120" w:type="dxa"/>
               <w:left w:w="120" w:type="dxa"/>
               <w:right w:w="120" w:type="dxa"/>
               <w:start w:w="130" w:type="dxa"/>
@@ -8373,10 +8617,12 @@
             </w:tcMar>
             <w:vAlign w:val="center"/>
             <w:tcBorders>
-              <w:top w:val="single" w:sz="10" w:space="0" w:color="91C3DF"/>
-              <w:left w:val="single" w:sz="10" w:space="0" w:color="91C3DF"/>
-              <w:bottom w:val="single" w:sz="10" w:space="0" w:color="91C3DF"/>
-              <w:right w:val="single" w:sz="10" w:space="0" w:color="91C3DF"/>
+              <w:top w:val="nil" w:sz="0" w:space="0" w:color="91C3DF"/>
+              <w:left w:val="nil" w:sz="0" w:space="0" w:color="91C3DF"/>
+              <w:bottom w:val="nil" w:sz="0" w:space="0" w:color="91C3DF"/>
+              <w:right w:val="nil" w:sz="0" w:space="0" w:color="91C3DF"/>
+              <w:insideH w:val="nil" w:sz="0" w:space="0" w:color="91C3DF"/>
+              <w:insideV w:val="nil" w:sz="0" w:space="0" w:color="91C3DF"/>
             </w:tcBorders>
           </w:tcPr>
           <w:p>
@@ -8422,8 +8668,8 @@
             <w:tcW w:type="dxa" w:w="9029"/>
             <w:shd w:val="clear" w:color="auto" w:fill="FFC499"/>
             <w:tcMar>
-              <w:top w:w="115" w:type="dxa"/>
-              <w:bottom w:w="115" w:type="dxa"/>
+              <w:top w:w="120" w:type="dxa"/>
+              <w:bottom w:w="120" w:type="dxa"/>
               <w:left w:w="120" w:type="dxa"/>
               <w:right w:w="120" w:type="dxa"/>
               <w:start w:w="130" w:type="dxa"/>
@@ -8431,10 +8677,12 @@
             </w:tcMar>
             <w:vAlign w:val="center"/>
             <w:tcBorders>
-              <w:top w:val="single" w:sz="10" w:space="0" w:color="FFC499"/>
-              <w:left w:val="single" w:sz="10" w:space="0" w:color="FFC499"/>
-              <w:bottom w:val="single" w:sz="10" w:space="0" w:color="FFC499"/>
-              <w:right w:val="single" w:sz="10" w:space="0" w:color="FFC499"/>
+              <w:top w:val="nil" w:sz="0" w:space="0" w:color="FFC499"/>
+              <w:left w:val="nil" w:sz="0" w:space="0" w:color="FFC499"/>
+              <w:bottom w:val="nil" w:sz="0" w:space="0" w:color="FFC499"/>
+              <w:right w:val="nil" w:sz="0" w:space="0" w:color="FFC499"/>
+              <w:insideH w:val="nil" w:sz="0" w:space="0" w:color="FFC499"/>
+              <w:insideV w:val="nil" w:sz="0" w:space="0" w:color="FFC499"/>
             </w:tcBorders>
           </w:tcPr>
           <w:p>
@@ -8465,7 +8713,7 @@
     </w:tbl>
     <w:p>
       <w:pPr>
-        <w:spacing w:before="0" w:after="160" w:lineRule="exact" w:line="20"/>
+        <w:spacing w:before="0" w:after="180" w:lineRule="exact" w:line="20"/>
         <w:jc w:val="left"/>
       </w:pPr>
     </w:p>
@@ -8520,7 +8768,7 @@
     </w:tbl>
     <w:p>
       <w:pPr>
-        <w:spacing w:before="0" w:after="160" w:lineRule="exact" w:line="20"/>
+        <w:spacing w:before="0" w:after="180" w:lineRule="exact" w:line="20"/>
         <w:jc w:val="left"/>
       </w:pPr>
     </w:p>
@@ -8597,6 +8845,8 @@
               <w:left w:val="single" w:sz="6" w:space="0" w:color="FF8016"/>
               <w:bottom w:val="single" w:sz="6" w:space="0" w:color="FF8016"/>
               <w:right w:val="single" w:sz="6" w:space="0" w:color="FF8016"/>
+              <w:insideH w:val="single" w:sz="6" w:space="0" w:color="FF8016"/>
+              <w:insideV w:val="single" w:sz="6" w:space="0" w:color="FF8016"/>
             </w:tcBorders>
           </w:tcPr>
           <w:p>
@@ -8630,6 +8880,8 @@
               <w:left w:val="single" w:sz="6" w:space="0" w:color="FF8016"/>
               <w:bottom w:val="single" w:sz="6" w:space="0" w:color="FF8016"/>
               <w:right w:val="single" w:sz="6" w:space="0" w:color="FF8016"/>
+              <w:insideH w:val="single" w:sz="6" w:space="0" w:color="FF8016"/>
+              <w:insideV w:val="single" w:sz="6" w:space="0" w:color="FF8016"/>
             </w:tcBorders>
           </w:tcPr>
           <w:p>
@@ -8663,6 +8915,8 @@
               <w:left w:val="single" w:sz="6" w:space="0" w:color="FF8016"/>
               <w:bottom w:val="single" w:sz="6" w:space="0" w:color="FF8016"/>
               <w:right w:val="single" w:sz="6" w:space="0" w:color="FF8016"/>
+              <w:insideH w:val="single" w:sz="6" w:space="0" w:color="FF8016"/>
+              <w:insideV w:val="single" w:sz="6" w:space="0" w:color="FF8016"/>
             </w:tcBorders>
           </w:tcPr>
           <w:p>
@@ -8696,6 +8950,8 @@
               <w:left w:val="single" w:sz="6" w:space="0" w:color="FF8016"/>
               <w:bottom w:val="single" w:sz="6" w:space="0" w:color="FF8016"/>
               <w:right w:val="single" w:sz="6" w:space="0" w:color="FF8016"/>
+              <w:insideH w:val="single" w:sz="6" w:space="0" w:color="FF8016"/>
+              <w:insideV w:val="single" w:sz="6" w:space="0" w:color="FF8016"/>
             </w:tcBorders>
           </w:tcPr>
           <w:p>
@@ -8729,6 +8985,8 @@
               <w:left w:val="single" w:sz="6" w:space="0" w:color="FF8016"/>
               <w:bottom w:val="single" w:sz="6" w:space="0" w:color="FF8016"/>
               <w:right w:val="single" w:sz="6" w:space="0" w:color="FF8016"/>
+              <w:insideH w:val="single" w:sz="6" w:space="0" w:color="FF8016"/>
+              <w:insideV w:val="single" w:sz="6" w:space="0" w:color="FF8016"/>
             </w:tcBorders>
           </w:tcPr>
           <w:p>
@@ -8764,6 +9022,8 @@
               <w:left w:val="single" w:sz="5" w:space="0" w:color="D9D9D9"/>
               <w:bottom w:val="single" w:sz="5" w:space="0" w:color="D9D9D9"/>
               <w:right w:val="single" w:sz="5" w:space="0" w:color="D9D9D9"/>
+              <w:insideH w:val="single" w:sz="5" w:space="0" w:color="D9D9D9"/>
+              <w:insideV w:val="single" w:sz="5" w:space="0" w:color="D9D9D9"/>
             </w:tcBorders>
           </w:tcPr>
           <w:p>
@@ -8797,6 +9057,8 @@
               <w:left w:val="single" w:sz="5" w:space="0" w:color="D9D9D9"/>
               <w:bottom w:val="single" w:sz="5" w:space="0" w:color="D9D9D9"/>
               <w:right w:val="single" w:sz="5" w:space="0" w:color="D9D9D9"/>
+              <w:insideH w:val="single" w:sz="5" w:space="0" w:color="D9D9D9"/>
+              <w:insideV w:val="single" w:sz="5" w:space="0" w:color="D9D9D9"/>
             </w:tcBorders>
           </w:tcPr>
           <w:p>
@@ -8830,6 +9092,8 @@
               <w:left w:val="single" w:sz="5" w:space="0" w:color="D9D9D9"/>
               <w:bottom w:val="single" w:sz="5" w:space="0" w:color="D9D9D9"/>
               <w:right w:val="single" w:sz="5" w:space="0" w:color="D9D9D9"/>
+              <w:insideH w:val="single" w:sz="5" w:space="0" w:color="D9D9D9"/>
+              <w:insideV w:val="single" w:sz="5" w:space="0" w:color="D9D9D9"/>
             </w:tcBorders>
           </w:tcPr>
           <w:p>
@@ -8863,6 +9127,8 @@
               <w:left w:val="single" w:sz="5" w:space="0" w:color="D9D9D9"/>
               <w:bottom w:val="single" w:sz="5" w:space="0" w:color="D9D9D9"/>
               <w:right w:val="single" w:sz="5" w:space="0" w:color="D9D9D9"/>
+              <w:insideH w:val="single" w:sz="5" w:space="0" w:color="D9D9D9"/>
+              <w:insideV w:val="single" w:sz="5" w:space="0" w:color="D9D9D9"/>
             </w:tcBorders>
           </w:tcPr>
           <w:p>
@@ -8896,6 +9162,8 @@
               <w:left w:val="single" w:sz="5" w:space="0" w:color="D9D9D9"/>
               <w:bottom w:val="single" w:sz="5" w:space="0" w:color="D9D9D9"/>
               <w:right w:val="single" w:sz="5" w:space="0" w:color="D9D9D9"/>
+              <w:insideH w:val="single" w:sz="5" w:space="0" w:color="D9D9D9"/>
+              <w:insideV w:val="single" w:sz="5" w:space="0" w:color="D9D9D9"/>
             </w:tcBorders>
           </w:tcPr>
           <w:p>
@@ -8931,6 +9199,8 @@
               <w:left w:val="single" w:sz="5" w:space="0" w:color="D9D9D9"/>
               <w:bottom w:val="single" w:sz="5" w:space="0" w:color="D9D9D9"/>
               <w:right w:val="single" w:sz="5" w:space="0" w:color="D9D9D9"/>
+              <w:insideH w:val="single" w:sz="5" w:space="0" w:color="D9D9D9"/>
+              <w:insideV w:val="single" w:sz="5" w:space="0" w:color="D9D9D9"/>
             </w:tcBorders>
           </w:tcPr>
           <w:p>
@@ -8964,6 +9234,8 @@
               <w:left w:val="single" w:sz="5" w:space="0" w:color="D9D9D9"/>
               <w:bottom w:val="single" w:sz="5" w:space="0" w:color="D9D9D9"/>
               <w:right w:val="single" w:sz="5" w:space="0" w:color="D9D9D9"/>
+              <w:insideH w:val="single" w:sz="5" w:space="0" w:color="D9D9D9"/>
+              <w:insideV w:val="single" w:sz="5" w:space="0" w:color="D9D9D9"/>
             </w:tcBorders>
           </w:tcPr>
           <w:p>
@@ -8997,6 +9269,8 @@
               <w:left w:val="single" w:sz="5" w:space="0" w:color="D9D9D9"/>
               <w:bottom w:val="single" w:sz="5" w:space="0" w:color="D9D9D9"/>
               <w:right w:val="single" w:sz="5" w:space="0" w:color="D9D9D9"/>
+              <w:insideH w:val="single" w:sz="5" w:space="0" w:color="D9D9D9"/>
+              <w:insideV w:val="single" w:sz="5" w:space="0" w:color="D9D9D9"/>
             </w:tcBorders>
           </w:tcPr>
           <w:p>
@@ -9030,6 +9304,8 @@
               <w:left w:val="single" w:sz="5" w:space="0" w:color="D9D9D9"/>
               <w:bottom w:val="single" w:sz="5" w:space="0" w:color="D9D9D9"/>
               <w:right w:val="single" w:sz="5" w:space="0" w:color="D9D9D9"/>
+              <w:insideH w:val="single" w:sz="5" w:space="0" w:color="D9D9D9"/>
+              <w:insideV w:val="single" w:sz="5" w:space="0" w:color="D9D9D9"/>
             </w:tcBorders>
           </w:tcPr>
           <w:p>
@@ -9063,6 +9339,8 @@
               <w:left w:val="single" w:sz="5" w:space="0" w:color="D9D9D9"/>
               <w:bottom w:val="single" w:sz="5" w:space="0" w:color="D9D9D9"/>
               <w:right w:val="single" w:sz="5" w:space="0" w:color="D9D9D9"/>
+              <w:insideH w:val="single" w:sz="5" w:space="0" w:color="D9D9D9"/>
+              <w:insideV w:val="single" w:sz="5" w:space="0" w:color="D9D9D9"/>
             </w:tcBorders>
           </w:tcPr>
           <w:p>
@@ -9098,6 +9376,8 @@
               <w:left w:val="single" w:sz="5" w:space="0" w:color="D9D9D9"/>
               <w:bottom w:val="single" w:sz="5" w:space="0" w:color="D9D9D9"/>
               <w:right w:val="single" w:sz="5" w:space="0" w:color="D9D9D9"/>
+              <w:insideH w:val="single" w:sz="5" w:space="0" w:color="D9D9D9"/>
+              <w:insideV w:val="single" w:sz="5" w:space="0" w:color="D9D9D9"/>
             </w:tcBorders>
           </w:tcPr>
           <w:p>
@@ -9131,6 +9411,8 @@
               <w:left w:val="single" w:sz="5" w:space="0" w:color="D9D9D9"/>
               <w:bottom w:val="single" w:sz="5" w:space="0" w:color="D9D9D9"/>
               <w:right w:val="single" w:sz="5" w:space="0" w:color="D9D9D9"/>
+              <w:insideH w:val="single" w:sz="5" w:space="0" w:color="D9D9D9"/>
+              <w:insideV w:val="single" w:sz="5" w:space="0" w:color="D9D9D9"/>
             </w:tcBorders>
           </w:tcPr>
           <w:p>
@@ -9164,6 +9446,8 @@
               <w:left w:val="single" w:sz="5" w:space="0" w:color="D9D9D9"/>
               <w:bottom w:val="single" w:sz="5" w:space="0" w:color="D9D9D9"/>
               <w:right w:val="single" w:sz="5" w:space="0" w:color="D9D9D9"/>
+              <w:insideH w:val="single" w:sz="5" w:space="0" w:color="D9D9D9"/>
+              <w:insideV w:val="single" w:sz="5" w:space="0" w:color="D9D9D9"/>
             </w:tcBorders>
           </w:tcPr>
           <w:p>
@@ -9197,6 +9481,8 @@
               <w:left w:val="single" w:sz="5" w:space="0" w:color="D9D9D9"/>
               <w:bottom w:val="single" w:sz="5" w:space="0" w:color="D9D9D9"/>
               <w:right w:val="single" w:sz="5" w:space="0" w:color="D9D9D9"/>
+              <w:insideH w:val="single" w:sz="5" w:space="0" w:color="D9D9D9"/>
+              <w:insideV w:val="single" w:sz="5" w:space="0" w:color="D9D9D9"/>
             </w:tcBorders>
           </w:tcPr>
           <w:p>
@@ -9230,6 +9516,8 @@
               <w:left w:val="single" w:sz="5" w:space="0" w:color="D9D9D9"/>
               <w:bottom w:val="single" w:sz="5" w:space="0" w:color="D9D9D9"/>
               <w:right w:val="single" w:sz="5" w:space="0" w:color="D9D9D9"/>
+              <w:insideH w:val="single" w:sz="5" w:space="0" w:color="D9D9D9"/>
+              <w:insideV w:val="single" w:sz="5" w:space="0" w:color="D9D9D9"/>
             </w:tcBorders>
           </w:tcPr>
           <w:p>
@@ -9265,6 +9553,8 @@
               <w:left w:val="single" w:sz="5" w:space="0" w:color="D9D9D9"/>
               <w:bottom w:val="single" w:sz="5" w:space="0" w:color="D9D9D9"/>
               <w:right w:val="single" w:sz="5" w:space="0" w:color="D9D9D9"/>
+              <w:insideH w:val="single" w:sz="5" w:space="0" w:color="D9D9D9"/>
+              <w:insideV w:val="single" w:sz="5" w:space="0" w:color="D9D9D9"/>
             </w:tcBorders>
           </w:tcPr>
           <w:p>
@@ -9298,6 +9588,8 @@
               <w:left w:val="single" w:sz="5" w:space="0" w:color="D9D9D9"/>
               <w:bottom w:val="single" w:sz="5" w:space="0" w:color="D9D9D9"/>
               <w:right w:val="single" w:sz="5" w:space="0" w:color="D9D9D9"/>
+              <w:insideH w:val="single" w:sz="5" w:space="0" w:color="D9D9D9"/>
+              <w:insideV w:val="single" w:sz="5" w:space="0" w:color="D9D9D9"/>
             </w:tcBorders>
           </w:tcPr>
           <w:p>
@@ -9331,6 +9623,8 @@
               <w:left w:val="single" w:sz="5" w:space="0" w:color="D9D9D9"/>
               <w:bottom w:val="single" w:sz="5" w:space="0" w:color="D9D9D9"/>
               <w:right w:val="single" w:sz="5" w:space="0" w:color="D9D9D9"/>
+              <w:insideH w:val="single" w:sz="5" w:space="0" w:color="D9D9D9"/>
+              <w:insideV w:val="single" w:sz="5" w:space="0" w:color="D9D9D9"/>
             </w:tcBorders>
           </w:tcPr>
           <w:p>
@@ -9364,6 +9658,8 @@
               <w:left w:val="single" w:sz="5" w:space="0" w:color="D9D9D9"/>
               <w:bottom w:val="single" w:sz="5" w:space="0" w:color="D9D9D9"/>
               <w:right w:val="single" w:sz="5" w:space="0" w:color="D9D9D9"/>
+              <w:insideH w:val="single" w:sz="5" w:space="0" w:color="D9D9D9"/>
+              <w:insideV w:val="single" w:sz="5" w:space="0" w:color="D9D9D9"/>
             </w:tcBorders>
           </w:tcPr>
           <w:p>
@@ -9397,6 +9693,8 @@
               <w:left w:val="single" w:sz="5" w:space="0" w:color="D9D9D9"/>
               <w:bottom w:val="single" w:sz="5" w:space="0" w:color="D9D9D9"/>
               <w:right w:val="single" w:sz="5" w:space="0" w:color="D9D9D9"/>
+              <w:insideH w:val="single" w:sz="5" w:space="0" w:color="D9D9D9"/>
+              <w:insideV w:val="single" w:sz="5" w:space="0" w:color="D9D9D9"/>
             </w:tcBorders>
           </w:tcPr>
           <w:p>
@@ -9432,6 +9730,8 @@
               <w:left w:val="single" w:sz="5" w:space="0" w:color="D9D9D9"/>
               <w:bottom w:val="single" w:sz="5" w:space="0" w:color="D9D9D9"/>
               <w:right w:val="single" w:sz="5" w:space="0" w:color="D9D9D9"/>
+              <w:insideH w:val="single" w:sz="5" w:space="0" w:color="D9D9D9"/>
+              <w:insideV w:val="single" w:sz="5" w:space="0" w:color="D9D9D9"/>
             </w:tcBorders>
           </w:tcPr>
           <w:p>
@@ -9465,6 +9765,8 @@
               <w:left w:val="single" w:sz="5" w:space="0" w:color="D9D9D9"/>
               <w:bottom w:val="single" w:sz="5" w:space="0" w:color="D9D9D9"/>
               <w:right w:val="single" w:sz="5" w:space="0" w:color="D9D9D9"/>
+              <w:insideH w:val="single" w:sz="5" w:space="0" w:color="D9D9D9"/>
+              <w:insideV w:val="single" w:sz="5" w:space="0" w:color="D9D9D9"/>
             </w:tcBorders>
           </w:tcPr>
           <w:p>
@@ -9498,6 +9800,8 @@
               <w:left w:val="single" w:sz="5" w:space="0" w:color="D9D9D9"/>
               <w:bottom w:val="single" w:sz="5" w:space="0" w:color="D9D9D9"/>
               <w:right w:val="single" w:sz="5" w:space="0" w:color="D9D9D9"/>
+              <w:insideH w:val="single" w:sz="5" w:space="0" w:color="D9D9D9"/>
+              <w:insideV w:val="single" w:sz="5" w:space="0" w:color="D9D9D9"/>
             </w:tcBorders>
           </w:tcPr>
           <w:p>
@@ -9531,6 +9835,8 @@
               <w:left w:val="single" w:sz="5" w:space="0" w:color="D9D9D9"/>
               <w:bottom w:val="single" w:sz="5" w:space="0" w:color="D9D9D9"/>
               <w:right w:val="single" w:sz="5" w:space="0" w:color="D9D9D9"/>
+              <w:insideH w:val="single" w:sz="5" w:space="0" w:color="D9D9D9"/>
+              <w:insideV w:val="single" w:sz="5" w:space="0" w:color="D9D9D9"/>
             </w:tcBorders>
           </w:tcPr>
           <w:p>
@@ -9564,6 +9870,8 @@
               <w:left w:val="single" w:sz="5" w:space="0" w:color="D9D9D9"/>
               <w:bottom w:val="single" w:sz="5" w:space="0" w:color="D9D9D9"/>
               <w:right w:val="single" w:sz="5" w:space="0" w:color="D9D9D9"/>
+              <w:insideH w:val="single" w:sz="5" w:space="0" w:color="D9D9D9"/>
+              <w:insideV w:val="single" w:sz="5" w:space="0" w:color="D9D9D9"/>
             </w:tcBorders>
           </w:tcPr>
           <w:p>
@@ -9599,6 +9907,8 @@
               <w:left w:val="single" w:sz="5" w:space="0" w:color="D9D9D9"/>
               <w:bottom w:val="single" w:sz="5" w:space="0" w:color="D9D9D9"/>
               <w:right w:val="single" w:sz="5" w:space="0" w:color="D9D9D9"/>
+              <w:insideH w:val="single" w:sz="5" w:space="0" w:color="D9D9D9"/>
+              <w:insideV w:val="single" w:sz="5" w:space="0" w:color="D9D9D9"/>
             </w:tcBorders>
           </w:tcPr>
           <w:p>
@@ -9632,6 +9942,8 @@
               <w:left w:val="single" w:sz="5" w:space="0" w:color="D9D9D9"/>
               <w:bottom w:val="single" w:sz="5" w:space="0" w:color="D9D9D9"/>
               <w:right w:val="single" w:sz="5" w:space="0" w:color="D9D9D9"/>
+              <w:insideH w:val="single" w:sz="5" w:space="0" w:color="D9D9D9"/>
+              <w:insideV w:val="single" w:sz="5" w:space="0" w:color="D9D9D9"/>
             </w:tcBorders>
           </w:tcPr>
           <w:p>
@@ -9665,6 +9977,8 @@
               <w:left w:val="single" w:sz="5" w:space="0" w:color="D9D9D9"/>
               <w:bottom w:val="single" w:sz="5" w:space="0" w:color="D9D9D9"/>
               <w:right w:val="single" w:sz="5" w:space="0" w:color="D9D9D9"/>
+              <w:insideH w:val="single" w:sz="5" w:space="0" w:color="D9D9D9"/>
+              <w:insideV w:val="single" w:sz="5" w:space="0" w:color="D9D9D9"/>
             </w:tcBorders>
           </w:tcPr>
           <w:p>
@@ -9698,6 +10012,8 @@
               <w:left w:val="single" w:sz="5" w:space="0" w:color="D9D9D9"/>
               <w:bottom w:val="single" w:sz="5" w:space="0" w:color="D9D9D9"/>
               <w:right w:val="single" w:sz="5" w:space="0" w:color="D9D9D9"/>
+              <w:insideH w:val="single" w:sz="5" w:space="0" w:color="D9D9D9"/>
+              <w:insideV w:val="single" w:sz="5" w:space="0" w:color="D9D9D9"/>
             </w:tcBorders>
           </w:tcPr>
           <w:p>
@@ -9731,6 +10047,8 @@
               <w:left w:val="single" w:sz="5" w:space="0" w:color="D9D9D9"/>
               <w:bottom w:val="single" w:sz="5" w:space="0" w:color="D9D9D9"/>
               <w:right w:val="single" w:sz="5" w:space="0" w:color="D9D9D9"/>
+              <w:insideH w:val="single" w:sz="5" w:space="0" w:color="D9D9D9"/>
+              <w:insideV w:val="single" w:sz="5" w:space="0" w:color="D9D9D9"/>
             </w:tcBorders>
           </w:tcPr>
           <w:p>
@@ -9766,6 +10084,8 @@
               <w:left w:val="single" w:sz="5" w:space="0" w:color="D9D9D9"/>
               <w:bottom w:val="single" w:sz="5" w:space="0" w:color="D9D9D9"/>
               <w:right w:val="single" w:sz="5" w:space="0" w:color="D9D9D9"/>
+              <w:insideH w:val="single" w:sz="5" w:space="0" w:color="D9D9D9"/>
+              <w:insideV w:val="single" w:sz="5" w:space="0" w:color="D9D9D9"/>
             </w:tcBorders>
           </w:tcPr>
           <w:p>
@@ -9799,6 +10119,8 @@
               <w:left w:val="single" w:sz="5" w:space="0" w:color="D9D9D9"/>
               <w:bottom w:val="single" w:sz="5" w:space="0" w:color="D9D9D9"/>
               <w:right w:val="single" w:sz="5" w:space="0" w:color="D9D9D9"/>
+              <w:insideH w:val="single" w:sz="5" w:space="0" w:color="D9D9D9"/>
+              <w:insideV w:val="single" w:sz="5" w:space="0" w:color="D9D9D9"/>
             </w:tcBorders>
           </w:tcPr>
           <w:p>
@@ -9832,6 +10154,8 @@
               <w:left w:val="single" w:sz="5" w:space="0" w:color="D9D9D9"/>
               <w:bottom w:val="single" w:sz="5" w:space="0" w:color="D9D9D9"/>
               <w:right w:val="single" w:sz="5" w:space="0" w:color="D9D9D9"/>
+              <w:insideH w:val="single" w:sz="5" w:space="0" w:color="D9D9D9"/>
+              <w:insideV w:val="single" w:sz="5" w:space="0" w:color="D9D9D9"/>
             </w:tcBorders>
           </w:tcPr>
           <w:p>
@@ -9865,6 +10189,8 @@
               <w:left w:val="single" w:sz="5" w:space="0" w:color="D9D9D9"/>
               <w:bottom w:val="single" w:sz="5" w:space="0" w:color="D9D9D9"/>
               <w:right w:val="single" w:sz="5" w:space="0" w:color="D9D9D9"/>
+              <w:insideH w:val="single" w:sz="5" w:space="0" w:color="D9D9D9"/>
+              <w:insideV w:val="single" w:sz="5" w:space="0" w:color="D9D9D9"/>
             </w:tcBorders>
           </w:tcPr>
           <w:p>
@@ -9898,6 +10224,8 @@
               <w:left w:val="single" w:sz="5" w:space="0" w:color="D9D9D9"/>
               <w:bottom w:val="single" w:sz="5" w:space="0" w:color="D9D9D9"/>
               <w:right w:val="single" w:sz="5" w:space="0" w:color="D9D9D9"/>
+              <w:insideH w:val="single" w:sz="5" w:space="0" w:color="D9D9D9"/>
+              <w:insideV w:val="single" w:sz="5" w:space="0" w:color="D9D9D9"/>
             </w:tcBorders>
           </w:tcPr>
           <w:p>
@@ -9933,6 +10261,8 @@
               <w:left w:val="single" w:sz="5" w:space="0" w:color="D9D9D9"/>
               <w:bottom w:val="single" w:sz="5" w:space="0" w:color="D9D9D9"/>
               <w:right w:val="single" w:sz="5" w:space="0" w:color="D9D9D9"/>
+              <w:insideH w:val="single" w:sz="5" w:space="0" w:color="D9D9D9"/>
+              <w:insideV w:val="single" w:sz="5" w:space="0" w:color="D9D9D9"/>
             </w:tcBorders>
           </w:tcPr>
           <w:p>
@@ -9966,6 +10296,8 @@
               <w:left w:val="single" w:sz="5" w:space="0" w:color="D9D9D9"/>
               <w:bottom w:val="single" w:sz="5" w:space="0" w:color="D9D9D9"/>
               <w:right w:val="single" w:sz="5" w:space="0" w:color="D9D9D9"/>
+              <w:insideH w:val="single" w:sz="5" w:space="0" w:color="D9D9D9"/>
+              <w:insideV w:val="single" w:sz="5" w:space="0" w:color="D9D9D9"/>
             </w:tcBorders>
           </w:tcPr>
           <w:p>
@@ -9999,6 +10331,8 @@
               <w:left w:val="single" w:sz="5" w:space="0" w:color="D9D9D9"/>
               <w:bottom w:val="single" w:sz="5" w:space="0" w:color="D9D9D9"/>
               <w:right w:val="single" w:sz="5" w:space="0" w:color="D9D9D9"/>
+              <w:insideH w:val="single" w:sz="5" w:space="0" w:color="D9D9D9"/>
+              <w:insideV w:val="single" w:sz="5" w:space="0" w:color="D9D9D9"/>
             </w:tcBorders>
           </w:tcPr>
           <w:p>
@@ -10032,6 +10366,8 @@
               <w:left w:val="single" w:sz="5" w:space="0" w:color="D9D9D9"/>
               <w:bottom w:val="single" w:sz="5" w:space="0" w:color="D9D9D9"/>
               <w:right w:val="single" w:sz="5" w:space="0" w:color="D9D9D9"/>
+              <w:insideH w:val="single" w:sz="5" w:space="0" w:color="D9D9D9"/>
+              <w:insideV w:val="single" w:sz="5" w:space="0" w:color="D9D9D9"/>
             </w:tcBorders>
           </w:tcPr>
           <w:p>
@@ -10065,6 +10401,8 @@
               <w:left w:val="single" w:sz="5" w:space="0" w:color="D9D9D9"/>
               <w:bottom w:val="single" w:sz="5" w:space="0" w:color="D9D9D9"/>
               <w:right w:val="single" w:sz="5" w:space="0" w:color="D9D9D9"/>
+              <w:insideH w:val="single" w:sz="5" w:space="0" w:color="D9D9D9"/>
+              <w:insideV w:val="single" w:sz="5" w:space="0" w:color="D9D9D9"/>
             </w:tcBorders>
           </w:tcPr>
           <w:p>
@@ -10100,6 +10438,8 @@
               <w:left w:val="single" w:sz="5" w:space="0" w:color="D9D9D9"/>
               <w:bottom w:val="single" w:sz="5" w:space="0" w:color="D9D9D9"/>
               <w:right w:val="single" w:sz="5" w:space="0" w:color="D9D9D9"/>
+              <w:insideH w:val="single" w:sz="5" w:space="0" w:color="D9D9D9"/>
+              <w:insideV w:val="single" w:sz="5" w:space="0" w:color="D9D9D9"/>
             </w:tcBorders>
           </w:tcPr>
           <w:p>
@@ -10133,6 +10473,8 @@
               <w:left w:val="single" w:sz="5" w:space="0" w:color="D9D9D9"/>
               <w:bottom w:val="single" w:sz="5" w:space="0" w:color="D9D9D9"/>
               <w:right w:val="single" w:sz="5" w:space="0" w:color="D9D9D9"/>
+              <w:insideH w:val="single" w:sz="5" w:space="0" w:color="D9D9D9"/>
+              <w:insideV w:val="single" w:sz="5" w:space="0" w:color="D9D9D9"/>
             </w:tcBorders>
           </w:tcPr>
           <w:p>
@@ -10166,6 +10508,8 @@
               <w:left w:val="single" w:sz="5" w:space="0" w:color="D9D9D9"/>
               <w:bottom w:val="single" w:sz="5" w:space="0" w:color="D9D9D9"/>
               <w:right w:val="single" w:sz="5" w:space="0" w:color="D9D9D9"/>
+              <w:insideH w:val="single" w:sz="5" w:space="0" w:color="D9D9D9"/>
+              <w:insideV w:val="single" w:sz="5" w:space="0" w:color="D9D9D9"/>
             </w:tcBorders>
           </w:tcPr>
           <w:p>
@@ -10199,6 +10543,8 @@
               <w:left w:val="single" w:sz="5" w:space="0" w:color="D9D9D9"/>
               <w:bottom w:val="single" w:sz="5" w:space="0" w:color="D9D9D9"/>
               <w:right w:val="single" w:sz="5" w:space="0" w:color="D9D9D9"/>
+              <w:insideH w:val="single" w:sz="5" w:space="0" w:color="D9D9D9"/>
+              <w:insideV w:val="single" w:sz="5" w:space="0" w:color="D9D9D9"/>
             </w:tcBorders>
           </w:tcPr>
           <w:p>
@@ -10232,6 +10578,8 @@
               <w:left w:val="single" w:sz="5" w:space="0" w:color="D9D9D9"/>
               <w:bottom w:val="single" w:sz="5" w:space="0" w:color="D9D9D9"/>
               <w:right w:val="single" w:sz="5" w:space="0" w:color="D9D9D9"/>
+              <w:insideH w:val="single" w:sz="5" w:space="0" w:color="D9D9D9"/>
+              <w:insideV w:val="single" w:sz="5" w:space="0" w:color="D9D9D9"/>
             </w:tcBorders>
           </w:tcPr>
           <w:p>
@@ -10267,6 +10615,8 @@
               <w:left w:val="single" w:sz="5" w:space="0" w:color="D9D9D9"/>
               <w:bottom w:val="single" w:sz="5" w:space="0" w:color="D9D9D9"/>
               <w:right w:val="single" w:sz="5" w:space="0" w:color="D9D9D9"/>
+              <w:insideH w:val="single" w:sz="5" w:space="0" w:color="D9D9D9"/>
+              <w:insideV w:val="single" w:sz="5" w:space="0" w:color="D9D9D9"/>
             </w:tcBorders>
           </w:tcPr>
           <w:p>
@@ -10300,6 +10650,8 @@
               <w:left w:val="single" w:sz="5" w:space="0" w:color="D9D9D9"/>
               <w:bottom w:val="single" w:sz="5" w:space="0" w:color="D9D9D9"/>
               <w:right w:val="single" w:sz="5" w:space="0" w:color="D9D9D9"/>
+              <w:insideH w:val="single" w:sz="5" w:space="0" w:color="D9D9D9"/>
+              <w:insideV w:val="single" w:sz="5" w:space="0" w:color="D9D9D9"/>
             </w:tcBorders>
           </w:tcPr>
           <w:p>
@@ -10333,6 +10685,8 @@
               <w:left w:val="single" w:sz="5" w:space="0" w:color="D9D9D9"/>
               <w:bottom w:val="single" w:sz="5" w:space="0" w:color="D9D9D9"/>
               <w:right w:val="single" w:sz="5" w:space="0" w:color="D9D9D9"/>
+              <w:insideH w:val="single" w:sz="5" w:space="0" w:color="D9D9D9"/>
+              <w:insideV w:val="single" w:sz="5" w:space="0" w:color="D9D9D9"/>
             </w:tcBorders>
           </w:tcPr>
           <w:p>
@@ -10366,6 +10720,8 @@
               <w:left w:val="single" w:sz="5" w:space="0" w:color="D9D9D9"/>
               <w:bottom w:val="single" w:sz="5" w:space="0" w:color="D9D9D9"/>
               <w:right w:val="single" w:sz="5" w:space="0" w:color="D9D9D9"/>
+              <w:insideH w:val="single" w:sz="5" w:space="0" w:color="D9D9D9"/>
+              <w:insideV w:val="single" w:sz="5" w:space="0" w:color="D9D9D9"/>
             </w:tcBorders>
           </w:tcPr>
           <w:p>
@@ -10399,6 +10755,8 @@
               <w:left w:val="single" w:sz="5" w:space="0" w:color="D9D9D9"/>
               <w:bottom w:val="single" w:sz="5" w:space="0" w:color="D9D9D9"/>
               <w:right w:val="single" w:sz="5" w:space="0" w:color="D9D9D9"/>
+              <w:insideH w:val="single" w:sz="5" w:space="0" w:color="D9D9D9"/>
+              <w:insideV w:val="single" w:sz="5" w:space="0" w:color="D9D9D9"/>
             </w:tcBorders>
           </w:tcPr>
           <w:p>
@@ -10434,6 +10792,8 @@
               <w:left w:val="single" w:sz="5" w:space="0" w:color="D9D9D9"/>
               <w:bottom w:val="single" w:sz="5" w:space="0" w:color="D9D9D9"/>
               <w:right w:val="single" w:sz="5" w:space="0" w:color="D9D9D9"/>
+              <w:insideH w:val="single" w:sz="5" w:space="0" w:color="D9D9D9"/>
+              <w:insideV w:val="single" w:sz="5" w:space="0" w:color="D9D9D9"/>
             </w:tcBorders>
           </w:tcPr>
           <w:p>
@@ -10467,6 +10827,8 @@
               <w:left w:val="single" w:sz="5" w:space="0" w:color="D9D9D9"/>
               <w:bottom w:val="single" w:sz="5" w:space="0" w:color="D9D9D9"/>
               <w:right w:val="single" w:sz="5" w:space="0" w:color="D9D9D9"/>
+              <w:insideH w:val="single" w:sz="5" w:space="0" w:color="D9D9D9"/>
+              <w:insideV w:val="single" w:sz="5" w:space="0" w:color="D9D9D9"/>
             </w:tcBorders>
           </w:tcPr>
           <w:p>
@@ -10500,6 +10862,8 @@
               <w:left w:val="single" w:sz="5" w:space="0" w:color="D9D9D9"/>
               <w:bottom w:val="single" w:sz="5" w:space="0" w:color="D9D9D9"/>
               <w:right w:val="single" w:sz="5" w:space="0" w:color="D9D9D9"/>
+              <w:insideH w:val="single" w:sz="5" w:space="0" w:color="D9D9D9"/>
+              <w:insideV w:val="single" w:sz="5" w:space="0" w:color="D9D9D9"/>
             </w:tcBorders>
           </w:tcPr>
           <w:p>
@@ -10533,6 +10897,8 @@
               <w:left w:val="single" w:sz="5" w:space="0" w:color="D9D9D9"/>
               <w:bottom w:val="single" w:sz="5" w:space="0" w:color="D9D9D9"/>
               <w:right w:val="single" w:sz="5" w:space="0" w:color="D9D9D9"/>
+              <w:insideH w:val="single" w:sz="5" w:space="0" w:color="D9D9D9"/>
+              <w:insideV w:val="single" w:sz="5" w:space="0" w:color="D9D9D9"/>
             </w:tcBorders>
           </w:tcPr>
           <w:p>
@@ -10566,6 +10932,8 @@
               <w:left w:val="single" w:sz="5" w:space="0" w:color="D9D9D9"/>
               <w:bottom w:val="single" w:sz="5" w:space="0" w:color="D9D9D9"/>
               <w:right w:val="single" w:sz="5" w:space="0" w:color="D9D9D9"/>
+              <w:insideH w:val="single" w:sz="5" w:space="0" w:color="D9D9D9"/>
+              <w:insideV w:val="single" w:sz="5" w:space="0" w:color="D9D9D9"/>
             </w:tcBorders>
           </w:tcPr>
           <w:p>
@@ -10601,6 +10969,8 @@
               <w:left w:val="single" w:sz="5" w:space="0" w:color="D9D9D9"/>
               <w:bottom w:val="single" w:sz="5" w:space="0" w:color="D9D9D9"/>
               <w:right w:val="single" w:sz="5" w:space="0" w:color="D9D9D9"/>
+              <w:insideH w:val="single" w:sz="5" w:space="0" w:color="D9D9D9"/>
+              <w:insideV w:val="single" w:sz="5" w:space="0" w:color="D9D9D9"/>
             </w:tcBorders>
           </w:tcPr>
           <w:p>
@@ -10634,6 +11004,8 @@
               <w:left w:val="single" w:sz="5" w:space="0" w:color="D9D9D9"/>
               <w:bottom w:val="single" w:sz="5" w:space="0" w:color="D9D9D9"/>
               <w:right w:val="single" w:sz="5" w:space="0" w:color="D9D9D9"/>
+              <w:insideH w:val="single" w:sz="5" w:space="0" w:color="D9D9D9"/>
+              <w:insideV w:val="single" w:sz="5" w:space="0" w:color="D9D9D9"/>
             </w:tcBorders>
           </w:tcPr>
           <w:p>
@@ -10667,6 +11039,8 @@
               <w:left w:val="single" w:sz="5" w:space="0" w:color="D9D9D9"/>
               <w:bottom w:val="single" w:sz="5" w:space="0" w:color="D9D9D9"/>
               <w:right w:val="single" w:sz="5" w:space="0" w:color="D9D9D9"/>
+              <w:insideH w:val="single" w:sz="5" w:space="0" w:color="D9D9D9"/>
+              <w:insideV w:val="single" w:sz="5" w:space="0" w:color="D9D9D9"/>
             </w:tcBorders>
           </w:tcPr>
           <w:p>
@@ -10700,6 +11074,8 @@
               <w:left w:val="single" w:sz="5" w:space="0" w:color="D9D9D9"/>
               <w:bottom w:val="single" w:sz="5" w:space="0" w:color="D9D9D9"/>
               <w:right w:val="single" w:sz="5" w:space="0" w:color="D9D9D9"/>
+              <w:insideH w:val="single" w:sz="5" w:space="0" w:color="D9D9D9"/>
+              <w:insideV w:val="single" w:sz="5" w:space="0" w:color="D9D9D9"/>
             </w:tcBorders>
           </w:tcPr>
           <w:p>
@@ -10733,6 +11109,8 @@
               <w:left w:val="single" w:sz="5" w:space="0" w:color="D9D9D9"/>
               <w:bottom w:val="single" w:sz="5" w:space="0" w:color="D9D9D9"/>
               <w:right w:val="single" w:sz="5" w:space="0" w:color="D9D9D9"/>
+              <w:insideH w:val="single" w:sz="5" w:space="0" w:color="D9D9D9"/>
+              <w:insideV w:val="single" w:sz="5" w:space="0" w:color="D9D9D9"/>
             </w:tcBorders>
           </w:tcPr>
           <w:p>
@@ -10768,6 +11146,8 @@
               <w:left w:val="single" w:sz="5" w:space="0" w:color="D9D9D9"/>
               <w:bottom w:val="single" w:sz="5" w:space="0" w:color="D9D9D9"/>
               <w:right w:val="single" w:sz="5" w:space="0" w:color="D9D9D9"/>
+              <w:insideH w:val="single" w:sz="5" w:space="0" w:color="D9D9D9"/>
+              <w:insideV w:val="single" w:sz="5" w:space="0" w:color="D9D9D9"/>
             </w:tcBorders>
           </w:tcPr>
           <w:p>
@@ -10801,6 +11181,8 @@
               <w:left w:val="single" w:sz="5" w:space="0" w:color="D9D9D9"/>
               <w:bottom w:val="single" w:sz="5" w:space="0" w:color="D9D9D9"/>
               <w:right w:val="single" w:sz="5" w:space="0" w:color="D9D9D9"/>
+              <w:insideH w:val="single" w:sz="5" w:space="0" w:color="D9D9D9"/>
+              <w:insideV w:val="single" w:sz="5" w:space="0" w:color="D9D9D9"/>
             </w:tcBorders>
           </w:tcPr>
           <w:p>
@@ -10834,6 +11216,8 @@
               <w:left w:val="single" w:sz="5" w:space="0" w:color="D9D9D9"/>
               <w:bottom w:val="single" w:sz="5" w:space="0" w:color="D9D9D9"/>
               <w:right w:val="single" w:sz="5" w:space="0" w:color="D9D9D9"/>
+              <w:insideH w:val="single" w:sz="5" w:space="0" w:color="D9D9D9"/>
+              <w:insideV w:val="single" w:sz="5" w:space="0" w:color="D9D9D9"/>
             </w:tcBorders>
           </w:tcPr>
           <w:p>
@@ -10867,6 +11251,8 @@
               <w:left w:val="single" w:sz="5" w:space="0" w:color="D9D9D9"/>
               <w:bottom w:val="single" w:sz="5" w:space="0" w:color="D9D9D9"/>
               <w:right w:val="single" w:sz="5" w:space="0" w:color="D9D9D9"/>
+              <w:insideH w:val="single" w:sz="5" w:space="0" w:color="D9D9D9"/>
+              <w:insideV w:val="single" w:sz="5" w:space="0" w:color="D9D9D9"/>
             </w:tcBorders>
           </w:tcPr>
           <w:p>
@@ -10900,6 +11286,8 @@
               <w:left w:val="single" w:sz="5" w:space="0" w:color="D9D9D9"/>
               <w:bottom w:val="single" w:sz="5" w:space="0" w:color="D9D9D9"/>
               <w:right w:val="single" w:sz="5" w:space="0" w:color="D9D9D9"/>
+              <w:insideH w:val="single" w:sz="5" w:space="0" w:color="D9D9D9"/>
+              <w:insideV w:val="single" w:sz="5" w:space="0" w:color="D9D9D9"/>
             </w:tcBorders>
           </w:tcPr>
           <w:p>
@@ -10935,6 +11323,8 @@
               <w:left w:val="single" w:sz="5" w:space="0" w:color="D9D9D9"/>
               <w:bottom w:val="single" w:sz="5" w:space="0" w:color="D9D9D9"/>
               <w:right w:val="single" w:sz="5" w:space="0" w:color="D9D9D9"/>
+              <w:insideH w:val="single" w:sz="5" w:space="0" w:color="D9D9D9"/>
+              <w:insideV w:val="single" w:sz="5" w:space="0" w:color="D9D9D9"/>
             </w:tcBorders>
           </w:tcPr>
           <w:p>
@@ -10968,6 +11358,8 @@
               <w:left w:val="single" w:sz="5" w:space="0" w:color="D9D9D9"/>
               <w:bottom w:val="single" w:sz="5" w:space="0" w:color="D9D9D9"/>
               <w:right w:val="single" w:sz="5" w:space="0" w:color="D9D9D9"/>
+              <w:insideH w:val="single" w:sz="5" w:space="0" w:color="D9D9D9"/>
+              <w:insideV w:val="single" w:sz="5" w:space="0" w:color="D9D9D9"/>
             </w:tcBorders>
           </w:tcPr>
           <w:p>
@@ -11001,6 +11393,8 @@
               <w:left w:val="single" w:sz="5" w:space="0" w:color="D9D9D9"/>
               <w:bottom w:val="single" w:sz="5" w:space="0" w:color="D9D9D9"/>
               <w:right w:val="single" w:sz="5" w:space="0" w:color="D9D9D9"/>
+              <w:insideH w:val="single" w:sz="5" w:space="0" w:color="D9D9D9"/>
+              <w:insideV w:val="single" w:sz="5" w:space="0" w:color="D9D9D9"/>
             </w:tcBorders>
           </w:tcPr>
           <w:p>
@@ -11034,6 +11428,8 @@
               <w:left w:val="single" w:sz="5" w:space="0" w:color="D9D9D9"/>
               <w:bottom w:val="single" w:sz="5" w:space="0" w:color="D9D9D9"/>
               <w:right w:val="single" w:sz="5" w:space="0" w:color="D9D9D9"/>
+              <w:insideH w:val="single" w:sz="5" w:space="0" w:color="D9D9D9"/>
+              <w:insideV w:val="single" w:sz="5" w:space="0" w:color="D9D9D9"/>
             </w:tcBorders>
           </w:tcPr>
           <w:p>
@@ -11067,6 +11463,8 @@
               <w:left w:val="single" w:sz="5" w:space="0" w:color="D9D9D9"/>
               <w:bottom w:val="single" w:sz="5" w:space="0" w:color="D9D9D9"/>
               <w:right w:val="single" w:sz="5" w:space="0" w:color="D9D9D9"/>
+              <w:insideH w:val="single" w:sz="5" w:space="0" w:color="D9D9D9"/>
+              <w:insideV w:val="single" w:sz="5" w:space="0" w:color="D9D9D9"/>
             </w:tcBorders>
           </w:tcPr>
           <w:p>
@@ -11102,6 +11500,8 @@
               <w:left w:val="single" w:sz="5" w:space="0" w:color="D9D9D9"/>
               <w:bottom w:val="single" w:sz="5" w:space="0" w:color="D9D9D9"/>
               <w:right w:val="single" w:sz="5" w:space="0" w:color="D9D9D9"/>
+              <w:insideH w:val="single" w:sz="5" w:space="0" w:color="D9D9D9"/>
+              <w:insideV w:val="single" w:sz="5" w:space="0" w:color="D9D9D9"/>
             </w:tcBorders>
           </w:tcPr>
           <w:p>
@@ -11135,6 +11535,8 @@
               <w:left w:val="single" w:sz="5" w:space="0" w:color="D9D9D9"/>
               <w:bottom w:val="single" w:sz="5" w:space="0" w:color="D9D9D9"/>
               <w:right w:val="single" w:sz="5" w:space="0" w:color="D9D9D9"/>
+              <w:insideH w:val="single" w:sz="5" w:space="0" w:color="D9D9D9"/>
+              <w:insideV w:val="single" w:sz="5" w:space="0" w:color="D9D9D9"/>
             </w:tcBorders>
           </w:tcPr>
           <w:p>
@@ -11168,6 +11570,8 @@
               <w:left w:val="single" w:sz="5" w:space="0" w:color="D9D9D9"/>
               <w:bottom w:val="single" w:sz="5" w:space="0" w:color="D9D9D9"/>
               <w:right w:val="single" w:sz="5" w:space="0" w:color="D9D9D9"/>
+              <w:insideH w:val="single" w:sz="5" w:space="0" w:color="D9D9D9"/>
+              <w:insideV w:val="single" w:sz="5" w:space="0" w:color="D9D9D9"/>
             </w:tcBorders>
           </w:tcPr>
           <w:p>
@@ -11201,6 +11605,8 @@
               <w:left w:val="single" w:sz="5" w:space="0" w:color="D9D9D9"/>
               <w:bottom w:val="single" w:sz="5" w:space="0" w:color="D9D9D9"/>
               <w:right w:val="single" w:sz="5" w:space="0" w:color="D9D9D9"/>
+              <w:insideH w:val="single" w:sz="5" w:space="0" w:color="D9D9D9"/>
+              <w:insideV w:val="single" w:sz="5" w:space="0" w:color="D9D9D9"/>
             </w:tcBorders>
           </w:tcPr>
           <w:p>
@@ -11234,6 +11640,8 @@
               <w:left w:val="single" w:sz="5" w:space="0" w:color="D9D9D9"/>
               <w:bottom w:val="single" w:sz="5" w:space="0" w:color="D9D9D9"/>
               <w:right w:val="single" w:sz="5" w:space="0" w:color="D9D9D9"/>
+              <w:insideH w:val="single" w:sz="5" w:space="0" w:color="D9D9D9"/>
+              <w:insideV w:val="single" w:sz="5" w:space="0" w:color="D9D9D9"/>
             </w:tcBorders>
           </w:tcPr>
           <w:p>

</xml_diff>